<commit_message>
docs(paper): reemplaza el docx por la version ampliada
</commit_message>
<xml_diff>
--- a/paper/SATEC_articulo_ACM.docx
+++ b/paper/SATEC_articulo_ACM.docx
@@ -91,7 +91,7 @@
         <w:t>endemic channel</w:t>
       </w:r>
       <w:r>
-        <w:t xml:space="preserve"> (the standard surveillance tool of PAHO/MINSA). The system is built on 25 years of national open surveillance data from the Peruvian Ministry of Health (MINSA, 2000–2024; ~46,120 case records), aggregated into a province × epidemiological-week panel with imputed zero weeks, and enriched with </w:t>
+        <w:t xml:space="preserve"> (the standard surveillance tool of PAHO/MINSA). The system is built on 25 years of national open surveillance data from the Peruvian Ministry of Health (MINSA, 2000–2024; ~46,120 case records), aggregated into a province by epidemiological-week panel with imputed zero weeks, and enriched with </w:t>
       </w:r>
       <w:r>
         <w:rPr>
@@ -109,7 +109,7 @@
         <w:t>population</w:t>
       </w:r>
       <w:r>
-        <w:t xml:space="preserve"> (2017 census, for incidence rates). On weakly informative variables, we compare a feed-forward </w:t>
+        <w:t xml:space="preserve"> (2017 census, for incidence rates). We compare a feed-forward </w:t>
       </w:r>
       <w:r>
         <w:rPr>
@@ -136,7 +136,7 @@
         <w:t>strict temporal validation</w:t>
       </w:r>
       <w:r>
-        <w:t xml:space="preserve"> (train ≤2019, test 2020–2024), reporting metrics suited to rare events (recall, AUC-PR) plus calibration and permutation importance. The neural network attains the best balance (recall 0.81, AUC-PR 0.745, Brier 0.012) and outperforms both the unpruned tree—which overfits—and the classical endemic-channel baseline; the recent moving average of cases dominates, while climate and population add real signal. The system is deployed as an open, reproducible web application with a provincial risk map. We conclude that machine learning can add value over classical surveillance for a neglected disease, provided the variables are informative and the evaluation respects temporal causality.</w:t>
+        <w:t xml:space="preserve"> (train ≤2019, test 2020–2024), reporting metrics suited to rare events (recall, AUC-PR), confusion matrices, calibration and permutation importance. The neural network attains the best balance (recall 0.81, AUC-PR 0.745, Brier 0.012) and outperforms both the unpruned tree, which overfits, and the classical endemic-channel baseline; the recent moving average of cases dominates, while climate and population add real signal. The system is deployed as an open, reproducible web application with a provincial risk map over a basemap of Peru. We conclude that machine learning can add value over classical surveillance for a neglected disease, provided the variables are informative and the evaluation respects temporal causality.</w:t>
       </w:r>
     </w:p>
     <w:p>
@@ -218,7 +218,7 @@
         <w:t>canal endémico</w:t>
       </w:r>
       <w:r>
-        <w:t xml:space="preserve"> (la herramienta estándar de vigilancia de la OPS/MINSA). El sistema se construye sobre 25 años de datos abiertos de vigilancia del Ministerio de Salud (MINSA, 2000–2024; ~46.120 registros de casos), agregados en un panel provincia × semana epidemiológica con imputación de semanas en cero, y enriquecidos con variables </w:t>
+        <w:t xml:space="preserve"> (la herramienta estándar de vigilancia de la OPS/MINSA). El sistema se construye sobre 25 años de datos abiertos de vigilancia del Ministerio de Salud (MINSA, 2000–2024; ~46.120 registros de casos), agregados en un panel provincia por semana epidemiológica con imputación de semanas en cero, y enriquecidos con variables </w:t>
       </w:r>
       <w:r>
         <w:rPr>
@@ -263,7 +263,7 @@
         <w:t>validación temporal estricta</w:t>
       </w:r>
       <w:r>
-        <w:t xml:space="preserve"> (entrenamiento ≤2019, prueba 2020–2024), reportando métricas adecuadas a eventos raros (sensibilidad, AUC-PR) además de calibración e importancia por permutación. La red neuronal logra el mejor equilibrio (sensibilidad 0,81; AUC-PR 0,745; Brier 0,012) y supera tanto al árbol sin poda —que sobreajusta— como al baseline clásico del canal endémico; la media móvil reciente de casos domina, mientras que el clima y la población aportan señal real. El sistema se despliega como una aplicación web abierta y reproducible con un mapa de riesgo provincial. Concluimos que el aprendizaje automático puede aportar valor sobre la vigilancia clásica en una enfermedad desatendida, siempre que las variables sean informativas y la evaluación respete la causalidad temporal.</w:t>
+        <w:t xml:space="preserve"> (entrenamiento ≤2019, prueba 2020–2024), reportando métricas adecuadas a eventos raros (sensibilidad, AUC-PR), matrices de confusión, calibración e importancia por permutación. La red neuronal logra el mejor equilibrio (sensibilidad 0,81; AUC-PR 0,745; Brier 0,012) y supera tanto al árbol sin poda, que sobreajusta, como al baseline clásico del canal endémico; la media móvil reciente de casos domina, mientras que el clima y la población aportan señal real. El sistema se despliega como una aplicación web abierta y reproducible con un mapa de riesgo provincial sobre un mapa base del Perú. Concluimos que el aprendizaje automático puede aportar valor sobre la vigilancia clásica en una enfermedad desatendida, siempre que las variables sean informativas y la evaluación respete la causalidad temporal.</w:t>
       </w:r>
     </w:p>
     <w:p>
@@ -276,7 +276,7 @@
     </w:p>
     <w:p>
       <w:r>
-        <w:t xml:space="preserve">La enfermedad de Carrión, o bartonelosis humana, es una enfermedad bacteriana desatendida, endémica de los valles interandinos del Perú, causada por *Bartonella bacilliformis* y transmitida por flebótomos del género *Lutzomyia* [1], [17]. Lleva el nombre de Daniel Alcides Carrión, mártir de la medicina peruana. Presenta una fase aguda (anemia hemolítica severa, «Fiebre de la Oroya»), de alta letalidad sin tratamiento, y una fase eruptiva («Verruga Peruana»), más benigna. Su carácter focal y estacional, ligado a las condiciones ambientales del vector, la convierte en candidata natural para sistemas de </w:t>
+        <w:t xml:space="preserve">La enfermedad de Carrión, o bartonelosis humana, es una enfermedad bacteriana desatendida y endémica de los valles interandinos del Perú, causada por *Bartonella bacilliformis* y transmitida por flebótomos del género *Lutzomyia*, principalmente *Lutzomyia verrucarum* y *Lutzomyia peruensis* [1], [17]. Lleva el nombre de Daniel Alcides Carrión, mártir de la medicina peruana. La enfermedad presenta dos fases de relevancia clínica muy distinta: una fase aguda (anemia hemolítica severa, conocida como «Fiebre de la Oroya»), de alta letalidad en ausencia de tratamiento, y una fase eruptiva («Verruga Peruana»), más benigna. Su carácter focal y estacional, ligado a las condiciones ambientales que favorecen al vector, la convierte en una candidata natural para sistemas de </w:t>
       </w:r>
       <w:r>
         <w:rPr>
@@ -285,35 +285,36 @@
         <w:t>alerta temprana</w:t>
       </w:r>
       <w:r>
-        <w:t xml:space="preserve"> que anticipen la intensificación de la transmisión y orienten la respuesta de salud pública.</w:t>
+        <w:t xml:space="preserve"> que anticipen la intensificación de la transmisión y orienten la respuesta de salud pública en las zonas endémicas.</w:t>
       </w:r>
     </w:p>
     <w:p>
       <w:r>
-        <w:t>El aprendizaje automático se ha consolidado como herramienta de apoyo a la decisión en salud pública, con dos grandes familias de modelos supervisados: las redes neuronales artificiales, que aproximan funciones complejas mediante combinaciones no lineales de sus entradas [3], [4], y los árboles de decisión, que clasifican mediante reglas interpretables [5], [6]. Ambos resuelven el mismo problema de clasificación, pero difieren en generalización, interpretabilidad y sensibilidad a la calidad de los datos. En datos tabulares —el formato típico de los registros epidemiológicos— la evidencia reciente muestra que los modelos basados en árboles siguen siendo muy competitivos frente a las redes profundas [11], [12], lo que motiva una comparación controlada sobre datos reales.</w:t>
+        <w:t>El aprendizaje automático se ha consolidado como una herramienta de apoyo a la decisión en salud pública, donde conviven dos grandes familias de modelos supervisados: las redes neuronales artificiales, capaces de aproximar funciones complejas mediante combinaciones no lineales de sus entradas [3], [4], y los árboles de decisión, que clasifican mediante una secuencia de reglas interpretables sobre los atributos [5], [6]. Ambos enfoques resuelven el mismo problema de clasificación, pero difieren en su capacidad de generalización, su interpretabilidad y su sensibilidad a la calidad de los datos. En datos tabulares, el formato típico de los registros epidemiológicos, la evidencia reciente muestra que los modelos basados en árboles siguen siendo altamente competitivos frente a las redes profundas [11], [12], lo que motiva una comparación controlada sobre datos reales de una enfermedad endémica.</w:t>
       </w:r>
     </w:p>
     <w:p>
       <w:r>
-        <w:t xml:space="preserve">Este trabajo presenta </w:t>
+        <w:t>La aplicación de la inteligencia artificial a la enfermedad de Carrión es todavía incipiente y se ha concentrado en dos frentes: el diagnóstico de laboratorio y el estudio del vector. En el primero, Jiménez-Vásquez et al. [18] aplican un análisis *in-silico* que combina múltiples predictores computacionales para identificar epítopos lineales de células B en proteínas de *B. bacilliformis*, con el fin de mejorar el diagnóstico serológico de la enfermedad de Carrión; en la misma línea, trabajos recientes evalúan proteínas recombinantes producidas mediante sistemas de baculovirus para aumentar la sensibilidad y especificidad de los ensayos serológicos [24]. En el segundo frente, el modelado de nicho ecológico ha permitido predecir la distribución espacial de los vectores: estudios sobre *Lutzomyia peruensis* emplean algoritmos de aprendizaje automático y de máxima entropía (máquinas de vectores de soporte, MaxEnt y algoritmos genéticos de predicción de reglas) para anticipar desplazamientos de su nicho bajo escenarios de cambio climático en el Perú [25], y enfoques análogos basados en aprendizaje automático y sistemas de información geográfica se han usado para modelar la distribución de flebótomos vectores en otras regiones [26]. De forma complementaria, la detección molecular de *B. bacilliformis* en nuevas especies de *Lutzomyia* sugiere que el rango de transmisión es más amplio de lo que indican los vectores clásicos [27].</w:t>
+      </w:r>
+    </w:p>
+    <w:p>
+      <w:r>
+        <w:t xml:space="preserve">Más allá de la enfermedad de Carrión, el aprendizaje automático se aplica con éxito a enfermedades vectoriales emparentadas y al uso de datos abiertos peruanos. Vadmal et al. [19] entrenan modelos de árboles potenciados para predecir vectores potenciales de *Leishmania* en América, identificando focos en Madre de Dios; Nayak et al. [20] revisan el papel de la inteligencia artificial en el control de las enfermedades transmitidas por vectores; y Rufasto-Goche et al. [21] modelan la dinámica espacio-temporal del dengue con veintidós años de vigilancia del MINSA, la misma fuente que se emplea en este trabajo. Sin embargo, hasta donde conocemos, </w:t>
       </w:r>
       <w:r>
         <w:rPr>
           <w:b/>
         </w:rPr>
-        <w:t>SATEC</w:t>
-      </w:r>
-      <w:r>
-        <w:t xml:space="preserve"> (Sistema de Alerta Temprana de la Enfermedad de Carrión). A diferencia de aproximaciones que clasifican la fase clínica sobre conjuntos sintéticos, SATEC aborda un problema con </w:t>
-      </w:r>
-      <w:r>
-        <w:rPr>
-          <w:b/>
-        </w:rPr>
-        <w:t>utilidad directa y datos enteramente reales</w:t>
-      </w:r>
-      <w:r>
-        <w:t xml:space="preserve">: predecir, por provincia y con cuatro semanas de anticipación, si una zona entrará en estado de brote. La contribución es cuádruple. Primero, se transforma la vigilancia de casos individuales del MINSA en un panel espacio-temporal con imputación de semanas sin casos, y se define el objetivo mediante el </w:t>
+        <w:t>ningún estudio aborda la alerta temprana de brotes de la enfermedad de Carrión mediante aprendizaje automático</w:t>
+      </w:r>
+      <w:r>
+        <w:t>: los antecedentes se centran en el diagnóstico de laboratorio o en la distribución del vector, no en la predicción del riesgo de brote por unidad territorial y temporal. Este trabajo busca atender ese vacío.</w:t>
+      </w:r>
+    </w:p>
+    <w:p>
+      <w:r>
+        <w:t xml:space="preserve">La contribución de este artículo es cuádruple. Primero, se transforma la vigilancia de casos individuales del MINSA en un panel espacio-temporal a nivel de provincia y semana epidemiológica, con imputación de las semanas sin casos, y se define el objetivo de aprendizaje mediante el </w:t>
       </w:r>
       <w:r>
         <w:rPr>
@@ -322,7 +323,25 @@
         <w:t>canal endémico</w:t>
       </w:r>
       <w:r>
-        <w:t xml:space="preserve">, integrando una herramienta epidemiológica clásica como etiqueta de aprendizaje supervisado. Segundo, se enriquecen los datos con clima (NASA POWER) y población (censo 2017). Tercero, se comparan red neuronal y árbol de decisión bajo </w:t>
+        <w:t xml:space="preserve">, integrando una herramienta epidemiológica clásica como etiqueta supervisada. Segundo, se enriquecen los datos con variables </w:t>
+      </w:r>
+      <w:r>
+        <w:rPr>
+          <w:b/>
+        </w:rPr>
+        <w:t>climáticas</w:t>
+      </w:r>
+      <w:r>
+        <w:t xml:space="preserve"> (NASA POWER) y de </w:t>
+      </w:r>
+      <w:r>
+        <w:rPr>
+          <w:b/>
+        </w:rPr>
+        <w:t>población</w:t>
+      </w:r>
+      <w:r>
+        <w:t xml:space="preserve"> (censo 2017). Tercero, se comparan una red neuronal y un árbol de decisión bajo </w:t>
       </w:r>
       <w:r>
         <w:rPr>
@@ -331,7 +350,16 @@
         <w:t>validación temporal estricta</w:t>
       </w:r>
       <w:r>
-        <w:t>, frente a un baseline epidemiológico, con métricas adecuadas a eventos raros, calibración e interpretabilidad. Cuarto, el sistema se despliega como una aplicación web abierta y reproducible. El resto del artículo describe los materiales y métodos (Sección 3), los resultados (Sección 4), su discusión (Sección 5), las limitaciones (Sección 6) y las conclusiones (Sección 7).</w:t>
+        <w:t xml:space="preserve">, frente a un baseline epidemiológico, con métricas adecuadas a eventos raros, matrices de confusión, calibración e interpretabilidad. Cuarto, el sistema se despliega como una </w:t>
+      </w:r>
+      <w:r>
+        <w:rPr>
+          <w:b/>
+        </w:rPr>
+        <w:t>aplicación web abierta y reproducible</w:t>
+      </w:r>
+      <w:r>
+        <w:t>. La Sección 2 describe los materiales y métodos; la Sección 3 presenta los resultados; la Sección 4 los discute; la Sección 5 declara las limitaciones; y la Sección 6 resume las conclusiones.</w:t>
       </w:r>
     </w:p>
     <w:p>
@@ -339,29 +367,7 @@
         <w:pStyle w:val="Heading1"/>
       </w:pPr>
       <w:r>
-        <w:t>2. Trabajos relacionados</w:t>
-      </w:r>
-    </w:p>
-    <w:p>
-      <w:r>
-        <w:t xml:space="preserve">La aplicación de inteligencia artificial a las enfermedades transmitidas por vectores es un campo en crecimiento. Jiménez-Vásquez et al. [18] emplean análisis in-silico para predecir epítopos de células B en proteínas de *B. bacilliformis*, con el fin de mejorar el diagnóstico serológico de la enfermedad de Carrión. Vadmal et al. [19] entrenan modelos de aprendizaje automático para predecir vectores potenciales de *Leishmania* en América —vectores del género *Lutzomyia*, emparentados con el de Carrión—, identificando focos en Madre de Dios, Perú. Nayak et al. [20] revisan cómo la IA y el aprendizaje profundo transforman el control de las enfermedades vectoriales, desde la detección del vector hasta la predicción de brotes. En el contexto peruano, Rufasto-Goche et al. [21] modelan la dinámica espacio-temporal del dengue con veintidós años de vigilancia del MINSA —la misma fuente que aquí se emplea—. Estos antecedentes muestran un interés creciente por aplicar el aprendizaje automático a enfermedades endémicas peruanas, pero, hasta donde conocemos, </w:t>
-      </w:r>
-      <w:r>
-        <w:rPr>
-          <w:b/>
-        </w:rPr>
-        <w:t>ningún trabajo aborda la alerta temprana de brotes de la enfermedad de Carrión mediante aprendizaje automático</w:t>
-      </w:r>
-      <w:r>
-        <w:t>, vacío que este artículo busca atender.</w:t>
-      </w:r>
-    </w:p>
-    <w:p>
-      <w:pPr>
-        <w:pStyle w:val="Heading1"/>
-      </w:pPr>
-      <w:r>
-        <w:t>3. Materiales y métodos</w:t>
+        <w:t>2. Materiales y métodos</w:t>
       </w:r>
     </w:p>
     <w:p>
@@ -369,7 +375,7 @@
         <w:pStyle w:val="Heading2"/>
       </w:pPr>
       <w:r>
-        <w:t>3.1 Datos</w:t>
+        <w:t>2.1 Conjuntos de datos</w:t>
       </w:r>
     </w:p>
     <w:p>
@@ -381,7 +387,7 @@
         <w:t>Fuente primaria (MINSA).</w:t>
       </w:r>
       <w:r>
-        <w:t xml:space="preserve"> Se emplearon los datos abiertos de vigilancia epidemiológica de la enfermedad de Carrión del Ministerio de Salud del Perú [2] (2000–2024; ~46.120 registros de casos confirmados, con departamento, provincia, ubigeo, año, semana epidemiológica, edad, sexo y fase). Cada registro es un caso; la fuente no incluye semanas sin casos, lo que se resuelve en el preprocesamiento.</w:t>
+        <w:t xml:space="preserve"> Se emplearon los datos abiertos de vigilancia epidemiológica de la enfermedad de Carrión del Ministerio de Salud del Perú [2], correspondientes al periodo 2000–2024 (~46.120 registros de casos confirmados, con departamento, provincia, ubigeo, año, semana epidemiológica, edad, sexo y fase). Cada registro corresponde a un caso; la fuente no publica las semanas sin casos, lo que se resuelve en el preprocesamiento.</w:t>
       </w:r>
     </w:p>
     <w:p>
@@ -390,49 +396,10 @@
         <w:rPr>
           <w:b/>
         </w:rPr>
-        <w:t>Construcción del panel.</w:t>
-      </w:r>
-      <w:r>
-        <w:t xml:space="preserve"> Los casos se agregaron por provincia × año × semana epidemiológica (semanas 1–52; la 53 se reasignó a la 52). Se generó la rejilla completa de combinaciones y se imputaron en cero las semanas sin notificación, creando los ejemplos negativos. El análisis se restringió a las </w:t>
-      </w:r>
-      <w:r>
-        <w:rPr>
-          <w:b/>
-        </w:rPr>
-        <w:t>provincias endémicas</w:t>
-      </w:r>
-      <w:r>
-        <w:t xml:space="preserve"> (al menos 10 casos históricos en al menos 3 años distintos), obteniéndose </w:t>
-      </w:r>
-      <w:r>
-        <w:rPr>
-          <w:b/>
-        </w:rPr>
-        <w:t>61 provincias</w:t>
-      </w:r>
-      <w:r>
-        <w:t xml:space="preserve"> y un panel de </w:t>
-      </w:r>
-      <w:r>
-        <w:rPr>
-          <w:b/>
-        </w:rPr>
-        <w:t>69.601</w:t>
-      </w:r>
-      <w:r>
-        <w:t xml:space="preserve"> observaciones provincia-semana.</w:t>
-      </w:r>
-    </w:p>
-    <w:p>
-      <w:r/>
-      <w:r>
-        <w:rPr>
-          <w:b/>
-        </w:rPr>
-        <w:t>Enriquecimiento climático (NASA POWER).</w:t>
-      </w:r>
-      <w:r>
-        <w:t xml:space="preserve"> Para el centroide de cada provincia se descargaron series diarias de precipitación, temperatura y humedad relativa de NASA POWER [22], agregadas a semana epidemiológica (precipitación por suma; temperatura y humedad por promedio) y rezagadas (4 y 8 semanas) más medias móviles, en reconocimiento de la respuesta diferida del vector a las condiciones ambientales. La cobertura climática fue del 100 % de las observaciones.</w:t>
+        <w:t>Clima (NASA POWER).</w:t>
+      </w:r>
+      <w:r>
+        <w:t xml:space="preserve"> Para el centroide geográfico de cada provincia se descargaron series diarias de precipitación, temperatura a 2 m y humedad relativa de la plataforma NASA POWER [22], agregadas a semana epidemiológica y rezagadas, en reconocimiento de la respuesta diferida del vector a las condiciones ambientales.</w:t>
       </w:r>
     </w:p>
     <w:p>
@@ -444,270 +411,17 @@
         <w:t>Población (INEI).</w:t>
       </w:r>
       <w:r>
-        <w:t xml:space="preserve"> Se incorporó la población provincial del censo 2017 [23] para calcular la </w:t>
-      </w:r>
-      <w:r>
-        <w:rPr>
-          <w:b/>
-        </w:rPr>
-        <w:t>tasa de incidencia por 100.000 habitantes</w:t>
-      </w:r>
-      <w:r>
-        <w:t>. Se usa como población de referencia constante (ver Limitaciones).</w:t>
+        <w:t xml:space="preserve"> Se incorporó la población provincial del censo 2017 [23] para calcular la tasa de incidencia por 100.000 habitantes, definida en la Ecuación (1):</w:t>
       </w:r>
     </w:p>
     <w:p>
       <w:pPr>
-        <w:pStyle w:val="Heading2"/>
+        <w:jc w:val="center"/>
       </w:pPr>
-      <w:r>
-        <w:t>3.2 Definición del objetivo: el canal endémico</w:t>
-      </w:r>
-    </w:p>
-    <w:p>
-      <w:r>
-        <w:t xml:space="preserve">El </w:t>
-      </w:r>
-      <w:r>
-        <w:rPr>
-          <w:b/>
-        </w:rPr>
-        <w:t>canal endémico</w:t>
-      </w:r>
-      <w:r>
-        <w:t xml:space="preserve"> es la herramienta estándar de la OPS/MINSA para describir el comportamiento esperado de una enfermedad por semana del año [17]. Para cada provincia y semana epidemiológica se calcularon, a partir de los </w:t>
-      </w:r>
-      <w:r>
-        <w:rPr>
-          <w:b/>
-        </w:rPr>
-        <w:t>años previos</w:t>
-      </w:r>
-      <w:r>
-        <w:t xml:space="preserve"> disponibles (ventana móvil de hasta cinco años, mínimo tres), los cuartiles de los casos históricos. Una provincia-semana se etiquetó como </w:t>
-      </w:r>
-      <w:r>
-        <w:rPr>
-          <w:b/>
-        </w:rPr>
-        <w:t>brote</w:t>
-      </w:r>
-      <w:r>
-        <w:t xml:space="preserve"> si, en la ventana de las </w:t>
-      </w:r>
-      <w:r>
-        <w:rPr>
-          <w:b/>
-        </w:rPr>
-        <w:t>cuatro semanas siguientes</w:t>
-      </w:r>
-      <w:r>
-        <w:t>, los casos superaban el tercer cuartil (Q3, zona de epidemia) del canal y eran al menos dos. El canal de referencia se construyó exclusivamente con información anterior al punto de predicción, evitando la fuga de información temporal. La clase resultante está fuertemente desbalanceada (≈7,8 % de brotes).</w:t>
-      </w:r>
-    </w:p>
-    <w:p>
-      <w:pPr>
-        <w:pStyle w:val="Heading2"/>
-      </w:pPr>
-      <w:r>
-        <w:t>3.3 Características</w:t>
-      </w:r>
-    </w:p>
-    <w:p>
-      <w:r>
-        <w:t>El vector de entrada (24 variables) combina: términos autorregresivos de casos (valores rezagados y medias móviles de 4 y 8 semanas), estacionalidad (seno y coseno de la semana), variables climáticas y sus rezagos/medias móviles, y la tasa por 100.000 habitantes. Se excluyeron deliberadamente las claves (provincia, año, semana) y el propio canal (Q1, Q2, Q3) para no contaminar el aprendizaje con la definición del objetivo.</w:t>
-      </w:r>
-    </w:p>
-    <w:p>
-      <w:pPr>
-        <w:pStyle w:val="Heading2"/>
-      </w:pPr>
-      <w:r>
-        <w:t>3.4 Modelos</w:t>
-      </w:r>
-    </w:p>
-    <w:p>
-      <w:r>
-        <w:t>Se compararon dos paradigmas, ambos con class_weight balanceado para el desbalance:</w:t>
-      </w:r>
-    </w:p>
-    <w:p>
-      <w:pPr>
-        <w:pStyle w:val="ListBullet"/>
-      </w:pPr>
-      <w:r/>
-      <w:r>
-        <w:rPr>
-          <w:b/>
-        </w:rPr>
-        <w:t>Árbol de Decisión</w:t>
-      </w:r>
-      <w:r>
-        <w:t xml:space="preserve"> (scikit-learn [7]), criterio de entropía, en dos variantes: sin poda y con profundidad máxima 8.</w:t>
-      </w:r>
-    </w:p>
-    <w:p>
-      <w:pPr>
-        <w:pStyle w:val="ListBullet"/>
-      </w:pPr>
-      <w:r/>
-      <w:r>
-        <w:rPr>
-          <w:b/>
-        </w:rPr>
-        <w:t>Red Neuronal</w:t>
-      </w:r>
-      <w:r>
-        <w:t xml:space="preserve"> prealimentada (Keras [9] sobre TensorFlow [8]): 24 → 32 (ReLU) → 32 (ReLU) → 1 (sigmoide), entropía cruzada binaria, optimizador Adam [10], normalización min-max con parámetros estimados solo en entrenamiento.</w:t>
-      </w:r>
-    </w:p>
-    <w:p>
-      <w:r>
-        <w:t xml:space="preserve">Como </w:t>
-      </w:r>
-      <w:r>
-        <w:rPr>
-          <w:b/>
-        </w:rPr>
-        <w:t>referencia epidemiológica</w:t>
-      </w:r>
-      <w:r>
-        <w:t xml:space="preserve"> (no un modelo de aprendizaje) se incluyó la </w:t>
-      </w:r>
-      <w:r>
-        <w:rPr>
-          <w:b/>
-        </w:rPr>
-        <w:t>persistencia sobre el canal endémico</w:t>
-      </w:r>
-      <w:r>
-        <w:t>: predecir brote futuro si la provincia está hoy por encima de su canal.</w:t>
-      </w:r>
-    </w:p>
-    <w:p>
-      <w:pPr>
-        <w:pStyle w:val="Heading2"/>
-      </w:pPr>
-      <w:r>
-        <w:t>3.5 Validación y métricas</w:t>
-      </w:r>
-    </w:p>
-    <w:p>
-      <w:r>
-        <w:t xml:space="preserve">Se empleó </w:t>
-      </w:r>
-      <w:r>
-        <w:rPr>
-          <w:b/>
-        </w:rPr>
-        <w:t>validación temporal</w:t>
-      </w:r>
-      <w:r>
-        <w:t xml:space="preserve">: entrenamiento con los años ≤2019 y prueba con 2020–2024, sin mezclar años. Dado el desbalance, las métricas primarias son la </w:t>
-      </w:r>
-      <w:r>
-        <w:rPr>
-          <w:b/>
-        </w:rPr>
-        <w:t>sensibilidad (recall) de brotes</w:t>
-      </w:r>
-      <w:r>
-        <w:t xml:space="preserve"> y el </w:t>
-      </w:r>
-      <w:r>
-        <w:rPr>
-          <w:b/>
-        </w:rPr>
-        <w:t>área bajo la curva de precisión-exhaustividad (AUC-PR)</w:t>
-      </w:r>
-      <w:r>
-        <w:t xml:space="preserve">; se reportan además precisión, F1, AUC-ROC, exactitud y la matriz de confusión. La </w:t>
-      </w:r>
-      <w:r>
-        <w:rPr>
-          <w:b/>
-        </w:rPr>
-        <w:t>calibración</w:t>
-      </w:r>
-      <w:r>
-        <w:t xml:space="preserve"> se evaluó con el *Brier score* y curvas de fiabilidad, y la </w:t>
-      </w:r>
-      <w:r>
-        <w:rPr>
-          <w:b/>
-        </w:rPr>
-        <w:t>interpretabilidad</w:t>
-      </w:r>
-      <w:r>
-        <w:t xml:space="preserve"> mediante importancia por permutación (caída en AUC-PR al permutar cada variable).</w:t>
-      </w:r>
-    </w:p>
-    <w:p>
-      <w:pPr>
-        <w:pStyle w:val="Heading2"/>
-      </w:pPr>
-      <w:r>
-        <w:t>3.6 Sistema y despliegue</w:t>
-      </w:r>
-    </w:p>
-    <w:p>
-      <w:r>
-        <w:t xml:space="preserve">El sistema separa un mundo de entrenamiento en Python (que se ejecuta una vez) de un mundo de inferencia en el navegador. La red neuronal se exporta a TensorFlow.js [16] y el árbol a un JSON plano. La aplicación web es una página estática (HTML, CSS, JavaScript con Leaflet) que muestra un </w:t>
-      </w:r>
-      <w:r>
-        <w:rPr>
-          <w:b/>
-        </w:rPr>
-        <w:t>mapa de riesgo coroplético del Perú</w:t>
-      </w:r>
-      <w:r>
-        <w:t xml:space="preserve"> por provincia, con el semáforo del canal endémico, y un panel comparativo de los modelos; se despliega de forma estática y reproducible.</w:t>
-      </w:r>
-    </w:p>
-    <w:p>
-      <w:pPr>
-        <w:pStyle w:val="Heading1"/>
-      </w:pPr>
-      <w:r>
-        <w:t>4. Resultados</w:t>
-      </w:r>
-    </w:p>
-    <w:p>
-      <w:pPr>
-        <w:pStyle w:val="Heading2"/>
-      </w:pPr>
-      <w:r>
-        <w:t>4.1 Comparación de modelos</w:t>
-      </w:r>
-    </w:p>
-    <w:p>
-      <w:r>
-        <w:t xml:space="preserve">La Tabla 1 resume el desempeño sobre el conjunto de prueba (2020–2024). La </w:t>
-      </w:r>
-      <w:r>
-        <w:rPr>
-          <w:b/>
-        </w:rPr>
-        <w:t>red neuronal</w:t>
-      </w:r>
-      <w:r>
-        <w:t xml:space="preserve"> logra el mejor equilibrio: la mayor sensibilidad (0,81), el mejor AUC-PR (0,745) y el menor Brier (0,012). El árbol con poda mejora notablemente al árbol sin poda en AUC-PR (0,625 frente a 0,091), y ambos modelos de aprendizaje superan al </w:t>
-      </w:r>
-      <w:r>
-        <w:rPr>
-          <w:b/>
-        </w:rPr>
-        <w:t>baseline del canal endémico</w:t>
-      </w:r>
-      <w:r>
-        <w:t xml:space="preserve"> (F1 0,40) en las métricas centradas en brotes. La Figura 1 (fig_metricas.png) compara visualmente sensibilidad, AUC-PR y F1 por modelo.</w:t>
-      </w:r>
-    </w:p>
-    <w:p>
       <w:r>
         <w:drawing>
           <wp:inline xmlns:a="http://schemas.openxmlformats.org/drawingml/2006/main" xmlns:pic="http://schemas.openxmlformats.org/drawingml/2006/picture">
-            <wp:extent cx="5486400" cy="2743200"/>
+            <wp:extent cx="4206240" cy="812710"/>
             <wp:docPr id="1" name="Picture 1"/>
             <wp:cNvGraphicFramePr>
               <a:graphicFrameLocks noChangeAspect="1"/>
@@ -716,7 +430,7 @@
               <a:graphicData uri="http://schemas.openxmlformats.org/drawingml/2006/picture">
                 <pic:pic>
                   <pic:nvPicPr>
-                    <pic:cNvPr id="0" name="fig_metricas.png"/>
+                    <pic:cNvPr id="0" name="eq_01.png"/>
                     <pic:cNvPicPr/>
                   </pic:nvPicPr>
                   <pic:blipFill>
@@ -728,7 +442,7 @@
                   <pic:spPr>
                     <a:xfrm>
                       <a:off x="0" y="0"/>
-                      <a:ext cx="5486400" cy="2743200"/>
+                      <a:ext cx="4206240" cy="812710"/>
                     </a:xfrm>
                     <a:prstGeom prst="rect"/>
                   </pic:spPr>
@@ -737,6 +451,919 @@
             </a:graphic>
           </wp:inline>
         </w:drawing>
+      </w:r>
+    </w:p>
+    <w:p>
+      <w:r>
+        <w:t>donde c_p,t es el número de casos en la provincia p durante la semana t.</w:t>
+      </w:r>
+    </w:p>
+    <w:p>
+      <w:pPr>
+        <w:pStyle w:val="Heading2"/>
+      </w:pPr>
+      <w:r>
+        <w:t>2.2 Construcción del panel y canal endémico</w:t>
+      </w:r>
+    </w:p>
+    <w:p>
+      <w:r>
+        <w:t xml:space="preserve">Los casos se agregaron por provincia, año y semana epidemiológica (semanas 1–52; la semana 53 se reasignó a la 52). Se generó la rejilla completa de combinaciones y se imputaron en </w:t>
+      </w:r>
+      <w:r>
+        <w:rPr>
+          <w:b/>
+        </w:rPr>
+        <w:t>cero</w:t>
+      </w:r>
+      <w:r>
+        <w:t xml:space="preserve"> las semanas sin notificación, creando así los ejemplos negativos. El análisis se restringió a las </w:t>
+      </w:r>
+      <w:r>
+        <w:rPr>
+          <w:b/>
+        </w:rPr>
+        <w:t>provincias endémicas</w:t>
+      </w:r>
+      <w:r>
+        <w:t xml:space="preserve">, definidas como aquellas con al menos 10 casos históricos en al menos 3 años distintos; se obtuvieron </w:t>
+      </w:r>
+      <w:r>
+        <w:rPr>
+          <w:b/>
+        </w:rPr>
+        <w:t>61 provincias</w:t>
+      </w:r>
+      <w:r>
+        <w:t xml:space="preserve"> y un panel de </w:t>
+      </w:r>
+      <w:r>
+        <w:rPr>
+          <w:b/>
+        </w:rPr>
+        <w:t>69.601</w:t>
+      </w:r>
+      <w:r>
+        <w:t xml:space="preserve"> observaciones provincia-semana.</w:t>
+      </w:r>
+    </w:p>
+    <w:p>
+      <w:r>
+        <w:t xml:space="preserve">El </w:t>
+      </w:r>
+      <w:r>
+        <w:rPr>
+          <w:b/>
+        </w:rPr>
+        <w:t>canal endémico</w:t>
+      </w:r>
+      <w:r>
+        <w:t xml:space="preserve"> es la herramienta estándar de la OPS/MINSA para describir el comportamiento esperado de una enfermedad por semana del año [17]. Para cada provincia p y semana s se calcularon, a partir de los </w:t>
+      </w:r>
+      <w:r>
+        <w:rPr>
+          <w:b/>
+        </w:rPr>
+        <w:t>años previos</w:t>
+      </w:r>
+      <w:r>
+        <w:t xml:space="preserve"> disponibles (ventana móvil de hasta cinco años, mínimo tres), los cuartiles Q_1, Q_2 y Q_3 de los casos históricos. Una provincia-semana se etiquetó como </w:t>
+      </w:r>
+      <w:r>
+        <w:rPr>
+          <w:b/>
+        </w:rPr>
+        <w:t>brote</w:t>
+      </w:r>
+      <w:r>
+        <w:t xml:space="preserve"> según la Ecuación (2):</w:t>
+      </w:r>
+    </w:p>
+    <w:p>
+      <w:pPr>
+        <w:jc w:val="center"/>
+      </w:pPr>
+      <w:r>
+        <w:rPr>
+          <w:i/>
+        </w:rPr>
+        <w:t>y_{p,t} = \max_{k \in \{1,2,3,4\}} \left[\, c_{p,t+k} &gt; Q_3^{(p)} \;\wedge\; c_{p,t+k} \ge 2 \,\right]</w:t>
+      </w:r>
+    </w:p>
+    <w:p>
+      <w:r>
+        <w:t xml:space="preserve">es decir, si en alguna de las </w:t>
+      </w:r>
+      <w:r>
+        <w:rPr>
+          <w:b/>
+        </w:rPr>
+        <w:t>cuatro semanas siguientes</w:t>
+      </w:r>
+      <w:r>
+        <w:t xml:space="preserve"> los casos superan el tercer cuartil del canal (zona de epidemia) y son al menos dos. El canal de referencia se construyó exclusivamente con información anterior al punto de predicción, evitando la fuga de información temporal. La clase resultante está fuertemente desbalanceada, con aproximadamente un 7,8 % de brotes.</w:t>
+      </w:r>
+    </w:p>
+    <w:p>
+      <w:pPr>
+        <w:pStyle w:val="Heading2"/>
+      </w:pPr>
+      <w:r>
+        <w:t>2.3 Características</w:t>
+      </w:r>
+    </w:p>
+    <w:p>
+      <w:r>
+        <w:t xml:space="preserve">El vector de entrada combina 24 variables: términos autorregresivos de casos (rezagos en t-1, t-2, t-4 y medias móviles de 4 y 8 semanas), variables climáticas y sus rezagos/medias móviles, la tasa por 100.000 habitantes, y la </w:t>
+      </w:r>
+      <w:r>
+        <w:rPr>
+          <w:b/>
+        </w:rPr>
+        <w:t>estacionalidad</w:t>
+      </w:r>
+      <w:r>
+        <w:t>, codificada de forma cíclica mediante la Ecuación (3):</w:t>
+      </w:r>
+    </w:p>
+    <w:p>
+      <w:pPr>
+        <w:jc w:val="center"/>
+      </w:pPr>
+      <w:r>
+        <w:drawing>
+          <wp:inline xmlns:a="http://schemas.openxmlformats.org/drawingml/2006/main" xmlns:pic="http://schemas.openxmlformats.org/drawingml/2006/picture">
+            <wp:extent cx="4206240" cy="930303"/>
+            <wp:docPr id="2" name="Picture 2"/>
+            <wp:cNvGraphicFramePr>
+              <a:graphicFrameLocks noChangeAspect="1"/>
+            </wp:cNvGraphicFramePr>
+            <a:graphic>
+              <a:graphicData uri="http://schemas.openxmlformats.org/drawingml/2006/picture">
+                <pic:pic>
+                  <pic:nvPicPr>
+                    <pic:cNvPr id="0" name="eq_03.png"/>
+                    <pic:cNvPicPr/>
+                  </pic:nvPicPr>
+                  <pic:blipFill>
+                    <a:blip r:embed="rId10"/>
+                    <a:stretch>
+                      <a:fillRect/>
+                    </a:stretch>
+                  </pic:blipFill>
+                  <pic:spPr>
+                    <a:xfrm>
+                      <a:off x="0" y="0"/>
+                      <a:ext cx="4206240" cy="930303"/>
+                    </a:xfrm>
+                    <a:prstGeom prst="rect"/>
+                  </pic:spPr>
+                </pic:pic>
+              </a:graphicData>
+            </a:graphic>
+          </wp:inline>
+        </w:drawing>
+      </w:r>
+    </w:p>
+    <w:p>
+      <w:r>
+        <w:t>Se excluyeron deliberadamente las claves (provincia, año, semana) y el propio canal (Q_1, Q_2, Q_3) para no contaminar el aprendizaje con la definición del objetivo.</w:t>
+      </w:r>
+    </w:p>
+    <w:p>
+      <w:pPr>
+        <w:pStyle w:val="Heading2"/>
+      </w:pPr>
+      <w:r>
+        <w:t>2.4 Árbol de Decisión</w:t>
+      </w:r>
+    </w:p>
+    <w:p>
+      <w:r>
+        <w:t xml:space="preserve">El árbol de decisión (scikit-learn [7]) divide recursivamente el espacio de atributos buscando, en cada nodo, la partición que maximiza la </w:t>
+      </w:r>
+      <w:r>
+        <w:rPr>
+          <w:b/>
+        </w:rPr>
+        <w:t>ganancia de información</w:t>
+      </w:r>
+      <w:r>
+        <w:t xml:space="preserve">, definida a partir de la </w:t>
+      </w:r>
+      <w:r>
+        <w:rPr>
+          <w:b/>
+        </w:rPr>
+        <w:t>entropía de Shannon</w:t>
+      </w:r>
+      <w:r>
+        <w:t>. Para un conjunto S con proporción de clase p_i, la entropía se define en la Ecuación (4):</w:t>
+      </w:r>
+    </w:p>
+    <w:p>
+      <w:pPr>
+        <w:jc w:val="center"/>
+      </w:pPr>
+      <w:r>
+        <w:drawing>
+          <wp:inline xmlns:a="http://schemas.openxmlformats.org/drawingml/2006/main" xmlns:pic="http://schemas.openxmlformats.org/drawingml/2006/picture">
+            <wp:extent cx="4206240" cy="1295593"/>
+            <wp:docPr id="3" name="Picture 3"/>
+            <wp:cNvGraphicFramePr>
+              <a:graphicFrameLocks noChangeAspect="1"/>
+            </wp:cNvGraphicFramePr>
+            <a:graphic>
+              <a:graphicData uri="http://schemas.openxmlformats.org/drawingml/2006/picture">
+                <pic:pic>
+                  <pic:nvPicPr>
+                    <pic:cNvPr id="0" name="eq_04.png"/>
+                    <pic:cNvPicPr/>
+                  </pic:nvPicPr>
+                  <pic:blipFill>
+                    <a:blip r:embed="rId11"/>
+                    <a:stretch>
+                      <a:fillRect/>
+                    </a:stretch>
+                  </pic:blipFill>
+                  <pic:spPr>
+                    <a:xfrm>
+                      <a:off x="0" y="0"/>
+                      <a:ext cx="4206240" cy="1295593"/>
+                    </a:xfrm>
+                    <a:prstGeom prst="rect"/>
+                  </pic:spPr>
+                </pic:pic>
+              </a:graphicData>
+            </a:graphic>
+          </wp:inline>
+        </w:drawing>
+      </w:r>
+    </w:p>
+    <w:p>
+      <w:r>
+        <w:t>y la ganancia de información de un atributo A que parte S en subconjuntos S_v en la Ecuación (5):</w:t>
+      </w:r>
+    </w:p>
+    <w:p>
+      <w:pPr>
+        <w:jc w:val="center"/>
+      </w:pPr>
+      <w:r>
+        <w:drawing>
+          <wp:inline xmlns:a="http://schemas.openxmlformats.org/drawingml/2006/main" xmlns:pic="http://schemas.openxmlformats.org/drawingml/2006/picture">
+            <wp:extent cx="4206240" cy="765214"/>
+            <wp:docPr id="4" name="Picture 4"/>
+            <wp:cNvGraphicFramePr>
+              <a:graphicFrameLocks noChangeAspect="1"/>
+            </wp:cNvGraphicFramePr>
+            <a:graphic>
+              <a:graphicData uri="http://schemas.openxmlformats.org/drawingml/2006/picture">
+                <pic:pic>
+                  <pic:nvPicPr>
+                    <pic:cNvPr id="0" name="eq_05.png"/>
+                    <pic:cNvPicPr/>
+                  </pic:nvPicPr>
+                  <pic:blipFill>
+                    <a:blip r:embed="rId12"/>
+                    <a:stretch>
+                      <a:fillRect/>
+                    </a:stretch>
+                  </pic:blipFill>
+                  <pic:spPr>
+                    <a:xfrm>
+                      <a:off x="0" y="0"/>
+                      <a:ext cx="4206240" cy="765214"/>
+                    </a:xfrm>
+                    <a:prstGeom prst="rect"/>
+                  </pic:spPr>
+                </pic:pic>
+              </a:graphicData>
+            </a:graphic>
+          </wp:inline>
+        </w:drawing>
+      </w:r>
+    </w:p>
+    <w:p>
+      <w:r>
+        <w:t xml:space="preserve">Se evaluaron dos variantes: un árbol </w:t>
+      </w:r>
+      <w:r>
+        <w:rPr>
+          <w:b/>
+        </w:rPr>
+        <w:t>sin poda</w:t>
+      </w:r>
+      <w:r>
+        <w:t xml:space="preserve"> (profundidad ilimitada) y un árbol </w:t>
+      </w:r>
+      <w:r>
+        <w:rPr>
+          <w:b/>
+        </w:rPr>
+        <w:t>podado</w:t>
+      </w:r>
+      <w:r>
+        <w:t xml:space="preserve"> a profundidad máxima 8. El recorrido desde la raíz hasta una hoja determina la clase predicha.</w:t>
+      </w:r>
+    </w:p>
+    <w:p>
+      <w:pPr>
+        <w:pStyle w:val="Heading2"/>
+      </w:pPr>
+      <w:r>
+        <w:t>2.5 Red Neuronal</w:t>
+      </w:r>
+    </w:p>
+    <w:p>
+      <w:r>
+        <w:t>La red neuronal prealimentada (Keras [9] sobre TensorFlow [8]) tiene una arquitectura 24 \to 32 \to 32 \to 1. La salida de una capa l se calcula según la Ecuación (6):</w:t>
+      </w:r>
+    </w:p>
+    <w:p>
+      <w:pPr>
+        <w:jc w:val="center"/>
+      </w:pPr>
+      <w:r>
+        <w:drawing>
+          <wp:inline xmlns:a="http://schemas.openxmlformats.org/drawingml/2006/main" xmlns:pic="http://schemas.openxmlformats.org/drawingml/2006/picture">
+            <wp:extent cx="4206240" cy="773648"/>
+            <wp:docPr id="5" name="Picture 5"/>
+            <wp:cNvGraphicFramePr>
+              <a:graphicFrameLocks noChangeAspect="1"/>
+            </wp:cNvGraphicFramePr>
+            <a:graphic>
+              <a:graphicData uri="http://schemas.openxmlformats.org/drawingml/2006/picture">
+                <pic:pic>
+                  <pic:nvPicPr>
+                    <pic:cNvPr id="0" name="eq_06.png"/>
+                    <pic:cNvPicPr/>
+                  </pic:nvPicPr>
+                  <pic:blipFill>
+                    <a:blip r:embed="rId13"/>
+                    <a:stretch>
+                      <a:fillRect/>
+                    </a:stretch>
+                  </pic:blipFill>
+                  <pic:spPr>
+                    <a:xfrm>
+                      <a:off x="0" y="0"/>
+                      <a:ext cx="4206240" cy="773648"/>
+                    </a:xfrm>
+                    <a:prstGeom prst="rect"/>
+                  </pic:spPr>
+                </pic:pic>
+              </a:graphicData>
+            </a:graphic>
+          </wp:inline>
+        </w:drawing>
+      </w:r>
+    </w:p>
+    <w:p>
+      <w:r>
+        <w:t xml:space="preserve">donde W^(l) son los pesos, b^(l) el sesgo y f la función de activación. Las capas ocultas usan la activación </w:t>
+      </w:r>
+      <w:r>
+        <w:rPr>
+          <w:b/>
+        </w:rPr>
+        <w:t>ReLU</w:t>
+      </w:r>
+      <w:r>
+        <w:t xml:space="preserve"> [14], Ecuación (7), y la capa de salida la </w:t>
+      </w:r>
+      <w:r>
+        <w:rPr>
+          <w:b/>
+        </w:rPr>
+        <w:t>sigmoide</w:t>
+      </w:r>
+      <w:r>
+        <w:t>, Ecuación (8), que produce la probabilidad de brote:</w:t>
+      </w:r>
+    </w:p>
+    <w:p>
+      <w:pPr>
+        <w:jc w:val="center"/>
+      </w:pPr>
+      <w:r>
+        <w:drawing>
+          <wp:inline xmlns:a="http://schemas.openxmlformats.org/drawingml/2006/main" xmlns:pic="http://schemas.openxmlformats.org/drawingml/2006/picture">
+            <wp:extent cx="4206240" cy="771559"/>
+            <wp:docPr id="6" name="Picture 6"/>
+            <wp:cNvGraphicFramePr>
+              <a:graphicFrameLocks noChangeAspect="1"/>
+            </wp:cNvGraphicFramePr>
+            <a:graphic>
+              <a:graphicData uri="http://schemas.openxmlformats.org/drawingml/2006/picture">
+                <pic:pic>
+                  <pic:nvPicPr>
+                    <pic:cNvPr id="0" name="eq_07.png"/>
+                    <pic:cNvPicPr/>
+                  </pic:nvPicPr>
+                  <pic:blipFill>
+                    <a:blip r:embed="rId14"/>
+                    <a:stretch>
+                      <a:fillRect/>
+                    </a:stretch>
+                  </pic:blipFill>
+                  <pic:spPr>
+                    <a:xfrm>
+                      <a:off x="0" y="0"/>
+                      <a:ext cx="4206240" cy="771559"/>
+                    </a:xfrm>
+                    <a:prstGeom prst="rect"/>
+                  </pic:spPr>
+                </pic:pic>
+              </a:graphicData>
+            </a:graphic>
+          </wp:inline>
+        </w:drawing>
+      </w:r>
+    </w:p>
+    <w:p>
+      <w:pPr>
+        <w:jc w:val="center"/>
+      </w:pPr>
+      <w:r>
+        <w:drawing>
+          <wp:inline xmlns:a="http://schemas.openxmlformats.org/drawingml/2006/main" xmlns:pic="http://schemas.openxmlformats.org/drawingml/2006/picture">
+            <wp:extent cx="4206240" cy="1548965"/>
+            <wp:docPr id="7" name="Picture 7"/>
+            <wp:cNvGraphicFramePr>
+              <a:graphicFrameLocks noChangeAspect="1"/>
+            </wp:cNvGraphicFramePr>
+            <a:graphic>
+              <a:graphicData uri="http://schemas.openxmlformats.org/drawingml/2006/picture">
+                <pic:pic>
+                  <pic:nvPicPr>
+                    <pic:cNvPr id="0" name="eq_08.png"/>
+                    <pic:cNvPicPr/>
+                  </pic:nvPicPr>
+                  <pic:blipFill>
+                    <a:blip r:embed="rId15"/>
+                    <a:stretch>
+                      <a:fillRect/>
+                    </a:stretch>
+                  </pic:blipFill>
+                  <pic:spPr>
+                    <a:xfrm>
+                      <a:off x="0" y="0"/>
+                      <a:ext cx="4206240" cy="1548965"/>
+                    </a:xfrm>
+                    <a:prstGeom prst="rect"/>
+                  </pic:spPr>
+                </pic:pic>
+              </a:graphicData>
+            </a:graphic>
+          </wp:inline>
+        </w:drawing>
+      </w:r>
+    </w:p>
+    <w:p>
+      <w:r>
+        <w:t xml:space="preserve">Antes de entrar a la red, cada variable se normaliza mediante escalado </w:t>
+      </w:r>
+      <w:r>
+        <w:rPr>
+          <w:b/>
+        </w:rPr>
+        <w:t>min-max</w:t>
+      </w:r>
+      <w:r>
+        <w:t>, Ecuación (9), con parámetros estimados solo en el conjunto de entrenamiento para evitar fuga de información:</w:t>
+      </w:r>
+    </w:p>
+    <w:p>
+      <w:pPr>
+        <w:jc w:val="center"/>
+      </w:pPr>
+      <w:r>
+        <w:drawing>
+          <wp:inline xmlns:a="http://schemas.openxmlformats.org/drawingml/2006/main" xmlns:pic="http://schemas.openxmlformats.org/drawingml/2006/picture">
+            <wp:extent cx="4206240" cy="1475417"/>
+            <wp:docPr id="8" name="Picture 8"/>
+            <wp:cNvGraphicFramePr>
+              <a:graphicFrameLocks noChangeAspect="1"/>
+            </wp:cNvGraphicFramePr>
+            <a:graphic>
+              <a:graphicData uri="http://schemas.openxmlformats.org/drawingml/2006/picture">
+                <pic:pic>
+                  <pic:nvPicPr>
+                    <pic:cNvPr id="0" name="eq_09.png"/>
+                    <pic:cNvPicPr/>
+                  </pic:nvPicPr>
+                  <pic:blipFill>
+                    <a:blip r:embed="rId16"/>
+                    <a:stretch>
+                      <a:fillRect/>
+                    </a:stretch>
+                  </pic:blipFill>
+                  <pic:spPr>
+                    <a:xfrm>
+                      <a:off x="0" y="0"/>
+                      <a:ext cx="4206240" cy="1475417"/>
+                    </a:xfrm>
+                    <a:prstGeom prst="rect"/>
+                  </pic:spPr>
+                </pic:pic>
+              </a:graphicData>
+            </a:graphic>
+          </wp:inline>
+        </w:drawing>
+      </w:r>
+    </w:p>
+    <w:p>
+      <w:r>
+        <w:t xml:space="preserve">La red se entrena minimizando la </w:t>
+      </w:r>
+      <w:r>
+        <w:rPr>
+          <w:b/>
+        </w:rPr>
+        <w:t>entropía cruzada binaria</w:t>
+      </w:r>
+      <w:r>
+        <w:t>, Ecuación (10), mediante el optimizador Adam [10]:</w:t>
+      </w:r>
+    </w:p>
+    <w:p>
+      <w:pPr>
+        <w:jc w:val="center"/>
+      </w:pPr>
+      <w:r>
+        <w:rPr>
+          <w:i/>
+        </w:rPr>
+        <w:t>\mathcal{L} = -\frac{1}{N} \sum_{i=1}^{N} \Big[ y_i \log \hat{y}_i + (1 - y_i)\log(1 - \hat{y}_i) \Big]</w:t>
+      </w:r>
+    </w:p>
+    <w:p>
+      <w:pPr>
+        <w:pStyle w:val="Heading2"/>
+      </w:pPr>
+      <w:r>
+        <w:t>2.6 Manejo del desbalance</w:t>
+      </w:r>
+    </w:p>
+    <w:p>
+      <w:r>
+        <w:t>Dado que los brotes son raros, ambos modelos se entrenan con ponderación de clases. El peso de la clase c se define en la Ecuación (11), donde N es el total de ejemplos y N_c los de la clase c:</w:t>
+      </w:r>
+    </w:p>
+    <w:p>
+      <w:pPr>
+        <w:jc w:val="center"/>
+      </w:pPr>
+      <w:r>
+        <w:drawing>
+          <wp:inline xmlns:a="http://schemas.openxmlformats.org/drawingml/2006/main" xmlns:pic="http://schemas.openxmlformats.org/drawingml/2006/picture">
+            <wp:extent cx="4206240" cy="2231136"/>
+            <wp:docPr id="9" name="Picture 9"/>
+            <wp:cNvGraphicFramePr>
+              <a:graphicFrameLocks noChangeAspect="1"/>
+            </wp:cNvGraphicFramePr>
+            <a:graphic>
+              <a:graphicData uri="http://schemas.openxmlformats.org/drawingml/2006/picture">
+                <pic:pic>
+                  <pic:nvPicPr>
+                    <pic:cNvPr id="0" name="eq_11.png"/>
+                    <pic:cNvPicPr/>
+                  </pic:nvPicPr>
+                  <pic:blipFill>
+                    <a:blip r:embed="rId17"/>
+                    <a:stretch>
+                      <a:fillRect/>
+                    </a:stretch>
+                  </pic:blipFill>
+                  <pic:spPr>
+                    <a:xfrm>
+                      <a:off x="0" y="0"/>
+                      <a:ext cx="4206240" cy="2231136"/>
+                    </a:xfrm>
+                    <a:prstGeom prst="rect"/>
+                  </pic:spPr>
+                </pic:pic>
+              </a:graphicData>
+            </a:graphic>
+          </wp:inline>
+        </w:drawing>
+      </w:r>
+    </w:p>
+    <w:p>
+      <w:r>
+        <w:t>de modo que la clase minoritaria (brote) recibe mayor peso en la función de pérdida.</w:t>
+      </w:r>
+    </w:p>
+    <w:p>
+      <w:pPr>
+        <w:pStyle w:val="Heading2"/>
+      </w:pPr>
+      <w:r>
+        <w:t>2.7 Validación y métricas</w:t>
+      </w:r>
+    </w:p>
+    <w:p>
+      <w:r>
+        <w:t xml:space="preserve">Se empleó </w:t>
+      </w:r>
+      <w:r>
+        <w:rPr>
+          <w:b/>
+        </w:rPr>
+        <w:t>validación temporal</w:t>
+      </w:r>
+      <w:r>
+        <w:t>: entrenamiento con los años ≤ 2019 y prueba con 2020–2024, sin mezclar años entre particiones. A partir de la matriz de confusión (verdaderos y falsos positivos y negativos: VP, FP, VN, FN) se derivan las métricas de las Ecuaciones (12)–(16): precisión, sensibilidad (recall), especificidad, exactitud y puntuación F_1.</w:t>
+      </w:r>
+    </w:p>
+    <w:p>
+      <w:pPr>
+        <w:jc w:val="center"/>
+      </w:pPr>
+      <w:r>
+        <w:drawing>
+          <wp:inline xmlns:a="http://schemas.openxmlformats.org/drawingml/2006/main" xmlns:pic="http://schemas.openxmlformats.org/drawingml/2006/picture">
+            <wp:extent cx="4206240" cy="550083"/>
+            <wp:docPr id="10" name="Picture 10"/>
+            <wp:cNvGraphicFramePr>
+              <a:graphicFrameLocks noChangeAspect="1"/>
+            </wp:cNvGraphicFramePr>
+            <a:graphic>
+              <a:graphicData uri="http://schemas.openxmlformats.org/drawingml/2006/picture">
+                <pic:pic>
+                  <pic:nvPicPr>
+                    <pic:cNvPr id="0" name="eq_12.png"/>
+                    <pic:cNvPicPr/>
+                  </pic:nvPicPr>
+                  <pic:blipFill>
+                    <a:blip r:embed="rId18"/>
+                    <a:stretch>
+                      <a:fillRect/>
+                    </a:stretch>
+                  </pic:blipFill>
+                  <pic:spPr>
+                    <a:xfrm>
+                      <a:off x="0" y="0"/>
+                      <a:ext cx="4206240" cy="550083"/>
+                    </a:xfrm>
+                    <a:prstGeom prst="rect"/>
+                  </pic:spPr>
+                </pic:pic>
+              </a:graphicData>
+            </a:graphic>
+          </wp:inline>
+        </w:drawing>
+      </w:r>
+    </w:p>
+    <w:p>
+      <w:pPr>
+        <w:jc w:val="center"/>
+      </w:pPr>
+      <w:r>
+        <w:drawing>
+          <wp:inline xmlns:a="http://schemas.openxmlformats.org/drawingml/2006/main" xmlns:pic="http://schemas.openxmlformats.org/drawingml/2006/picture">
+            <wp:extent cx="4206240" cy="1116531"/>
+            <wp:docPr id="11" name="Picture 11"/>
+            <wp:cNvGraphicFramePr>
+              <a:graphicFrameLocks noChangeAspect="1"/>
+            </wp:cNvGraphicFramePr>
+            <a:graphic>
+              <a:graphicData uri="http://schemas.openxmlformats.org/drawingml/2006/picture">
+                <pic:pic>
+                  <pic:nvPicPr>
+                    <pic:cNvPr id="0" name="eq_13.png"/>
+                    <pic:cNvPicPr/>
+                  </pic:nvPicPr>
+                  <pic:blipFill>
+                    <a:blip r:embed="rId19"/>
+                    <a:stretch>
+                      <a:fillRect/>
+                    </a:stretch>
+                  </pic:blipFill>
+                  <pic:spPr>
+                    <a:xfrm>
+                      <a:off x="0" y="0"/>
+                      <a:ext cx="4206240" cy="1116531"/>
+                    </a:xfrm>
+                    <a:prstGeom prst="rect"/>
+                  </pic:spPr>
+                </pic:pic>
+              </a:graphicData>
+            </a:graphic>
+          </wp:inline>
+        </w:drawing>
+      </w:r>
+    </w:p>
+    <w:p>
+      <w:pPr>
+        <w:jc w:val="center"/>
+      </w:pPr>
+      <w:r>
+        <w:drawing>
+          <wp:inline xmlns:a="http://schemas.openxmlformats.org/drawingml/2006/main" xmlns:pic="http://schemas.openxmlformats.org/drawingml/2006/picture">
+            <wp:extent cx="4206240" cy="1605013"/>
+            <wp:docPr id="12" name="Picture 12"/>
+            <wp:cNvGraphicFramePr>
+              <a:graphicFrameLocks noChangeAspect="1"/>
+            </wp:cNvGraphicFramePr>
+            <a:graphic>
+              <a:graphicData uri="http://schemas.openxmlformats.org/drawingml/2006/picture">
+                <pic:pic>
+                  <pic:nvPicPr>
+                    <pic:cNvPr id="0" name="eq_14.png"/>
+                    <pic:cNvPicPr/>
+                  </pic:nvPicPr>
+                  <pic:blipFill>
+                    <a:blip r:embed="rId20"/>
+                    <a:stretch>
+                      <a:fillRect/>
+                    </a:stretch>
+                  </pic:blipFill>
+                  <pic:spPr>
+                    <a:xfrm>
+                      <a:off x="0" y="0"/>
+                      <a:ext cx="4206240" cy="1605013"/>
+                    </a:xfrm>
+                    <a:prstGeom prst="rect"/>
+                  </pic:spPr>
+                </pic:pic>
+              </a:graphicData>
+            </a:graphic>
+          </wp:inline>
+        </w:drawing>
+      </w:r>
+    </w:p>
+    <w:p>
+      <w:r>
+        <w:t xml:space="preserve">Dado el fuerte desbalance, las métricas primarias son la sensibilidad de brotes y el </w:t>
+      </w:r>
+      <w:r>
+        <w:rPr>
+          <w:b/>
+        </w:rPr>
+        <w:t>área bajo la curva de precisión-exhaustividad</w:t>
+      </w:r>
+      <w:r>
+        <w:t xml:space="preserve"> (AUC-PR), aproximada por la precisión media de la Ecuación (17):</w:t>
+      </w:r>
+    </w:p>
+    <w:p>
+      <w:pPr>
+        <w:jc w:val="center"/>
+      </w:pPr>
+      <w:r>
+        <w:drawing>
+          <wp:inline xmlns:a="http://schemas.openxmlformats.org/drawingml/2006/main" xmlns:pic="http://schemas.openxmlformats.org/drawingml/2006/picture">
+            <wp:extent cx="4206240" cy="1104829"/>
+            <wp:docPr id="13" name="Picture 13"/>
+            <wp:cNvGraphicFramePr>
+              <a:graphicFrameLocks noChangeAspect="1"/>
+            </wp:cNvGraphicFramePr>
+            <a:graphic>
+              <a:graphicData uri="http://schemas.openxmlformats.org/drawingml/2006/picture">
+                <pic:pic>
+                  <pic:nvPicPr>
+                    <pic:cNvPr id="0" name="eq_15.png"/>
+                    <pic:cNvPicPr/>
+                  </pic:nvPicPr>
+                  <pic:blipFill>
+                    <a:blip r:embed="rId21"/>
+                    <a:stretch>
+                      <a:fillRect/>
+                    </a:stretch>
+                  </pic:blipFill>
+                  <pic:spPr>
+                    <a:xfrm>
+                      <a:off x="0" y="0"/>
+                      <a:ext cx="4206240" cy="1104829"/>
+                    </a:xfrm>
+                    <a:prstGeom prst="rect"/>
+                  </pic:spPr>
+                </pic:pic>
+              </a:graphicData>
+            </a:graphic>
+          </wp:inline>
+        </w:drawing>
+      </w:r>
+    </w:p>
+    <w:p>
+      <w:r>
+        <w:t xml:space="preserve">La </w:t>
+      </w:r>
+      <w:r>
+        <w:rPr>
+          <w:b/>
+        </w:rPr>
+        <w:t>calibración</w:t>
+      </w:r>
+      <w:r>
+        <w:t xml:space="preserve"> de las probabilidades se evaluó con el *Brier score*, Ecuación (18), y curvas de fiabilidad:</w:t>
+      </w:r>
+    </w:p>
+    <w:p>
+      <w:pPr>
+        <w:jc w:val="center"/>
+      </w:pPr>
+      <w:r>
+        <w:drawing>
+          <wp:inline xmlns:a="http://schemas.openxmlformats.org/drawingml/2006/main" xmlns:pic="http://schemas.openxmlformats.org/drawingml/2006/picture">
+            <wp:extent cx="4206240" cy="1647899"/>
+            <wp:docPr id="14" name="Picture 14"/>
+            <wp:cNvGraphicFramePr>
+              <a:graphicFrameLocks noChangeAspect="1"/>
+            </wp:cNvGraphicFramePr>
+            <a:graphic>
+              <a:graphicData uri="http://schemas.openxmlformats.org/drawingml/2006/picture">
+                <pic:pic>
+                  <pic:nvPicPr>
+                    <pic:cNvPr id="0" name="eq_16.png"/>
+                    <pic:cNvPicPr/>
+                  </pic:nvPicPr>
+                  <pic:blipFill>
+                    <a:blip r:embed="rId22"/>
+                    <a:stretch>
+                      <a:fillRect/>
+                    </a:stretch>
+                  </pic:blipFill>
+                  <pic:spPr>
+                    <a:xfrm>
+                      <a:off x="0" y="0"/>
+                      <a:ext cx="4206240" cy="1647899"/>
+                    </a:xfrm>
+                    <a:prstGeom prst="rect"/>
+                  </pic:spPr>
+                </pic:pic>
+              </a:graphicData>
+            </a:graphic>
+          </wp:inline>
+        </w:drawing>
+      </w:r>
+    </w:p>
+    <w:p>
+      <w:r>
+        <w:t xml:space="preserve">La </w:t>
+      </w:r>
+      <w:r>
+        <w:rPr>
+          <w:b/>
+        </w:rPr>
+        <w:t>interpretabilidad</w:t>
+      </w:r>
+      <w:r>
+        <w:t xml:space="preserve"> se evaluó mediante importancia por permutación, medida como la caída en AUC-PR al permutar aleatoriamente cada variable.</w:t>
+      </w:r>
+    </w:p>
+    <w:p>
+      <w:pPr>
+        <w:pStyle w:val="Heading2"/>
+      </w:pPr>
+      <w:r>
+        <w:t>2.8 Arquitectura del sistema y despliegue</w:t>
+      </w:r>
+    </w:p>
+    <w:p>
+      <w:r>
+        <w:t xml:space="preserve">El sistema separa un mundo de entrenamiento en Python, que se ejecuta una sola vez, de un mundo de inferencia en el navegador. La red neuronal se exporta a TensorFlow.js [16] y el árbol a un JSON plano que el navegador recorre. La aplicación web es una página estática que muestra un </w:t>
+      </w:r>
+      <w:r>
+        <w:rPr>
+          <w:b/>
+        </w:rPr>
+        <w:t>mapa de riesgo coroplético</w:t>
+      </w:r>
+      <w:r>
+        <w:t xml:space="preserve"> de las provincias endémicas sobre un mapa base del Perú, con el semáforo del canal endémico y un panel comparativo de los modelos; se despliega de forma estática y reproducible.</w:t>
+      </w:r>
+    </w:p>
+    <w:p>
+      <w:pPr>
+        <w:pStyle w:val="Heading1"/>
+      </w:pPr>
+      <w:r>
+        <w:t>3. Resultados</w:t>
+      </w:r>
+    </w:p>
+    <w:p>
+      <w:pPr>
+        <w:pStyle w:val="Heading2"/>
+      </w:pPr>
+      <w:r>
+        <w:t>3.1 Métricas comparadas</w:t>
+      </w:r>
+    </w:p>
+    <w:p>
+      <w:r>
+        <w:t xml:space="preserve">La Tabla 1 resume el desempeño sobre el conjunto de prueba temporal (2020–2024). La </w:t>
+      </w:r>
+      <w:r>
+        <w:rPr>
+          <w:b/>
+        </w:rPr>
+        <w:t>red neuronal</w:t>
+      </w:r>
+      <w:r>
+        <w:t xml:space="preserve"> logra el mejor equilibrio: la mayor sensibilidad (0,81), el mejor AUC-PR (0,745) y el menor Brier (0,012). El árbol con poda mejora drásticamente al árbol sin poda en AUC-PR (0,625 frente a 0,091), y ambos modelos de aprendizaje superan al baseline del canal endémico en las métricas centradas en brotes. La Figura 1 ilustra visualmente este contraste: las barras de sensibilidad, AUC-PR y F1 muestran a la red neuronal por encima del resto en AUC-PR, y al árbol sin poda como el de peor AUC-PR pese a una exactitud global alta.</w:t>
       </w:r>
     </w:p>
     <w:p>
@@ -1142,15 +1769,212 @@
     </w:tbl>
     <w:p>
       <w:pPr>
+        <w:jc w:val="center"/>
+      </w:pPr>
+      <w:r>
+        <w:drawing>
+          <wp:inline xmlns:a="http://schemas.openxmlformats.org/drawingml/2006/main" xmlns:pic="http://schemas.openxmlformats.org/drawingml/2006/picture">
+            <wp:extent cx="5120640" cy="2560320"/>
+            <wp:docPr id="15" name="Picture 15"/>
+            <wp:cNvGraphicFramePr>
+              <a:graphicFrameLocks noChangeAspect="1"/>
+            </wp:cNvGraphicFramePr>
+            <a:graphic>
+              <a:graphicData uri="http://schemas.openxmlformats.org/drawingml/2006/picture">
+                <pic:pic>
+                  <pic:nvPicPr>
+                    <pic:cNvPr id="0" name="fig_metricas.png"/>
+                    <pic:cNvPicPr/>
+                  </pic:nvPicPr>
+                  <pic:blipFill>
+                    <a:blip r:embed="rId23"/>
+                    <a:stretch>
+                      <a:fillRect/>
+                    </a:stretch>
+                  </pic:blipFill>
+                  <pic:spPr>
+                    <a:xfrm>
+                      <a:off x="0" y="0"/>
+                      <a:ext cx="5120640" cy="2560320"/>
+                    </a:xfrm>
+                    <a:prstGeom prst="rect"/>
+                  </pic:spPr>
+                </pic:pic>
+              </a:graphicData>
+            </a:graphic>
+          </wp:inline>
+        </w:drawing>
+      </w:r>
+    </w:p>
+    <w:p>
+      <w:r/>
+      <w:r>
+        <w:rPr>
+          <w:b/>
+        </w:rPr>
+        <w:t>Figura 1.</w:t>
+      </w:r>
+      <w:r>
+        <w:t xml:space="preserve"> Sensibilidad, AUC-PR y F1 por modelo en el conjunto de prueba. La red neuronal domina en AUC-PR, la métrica más informativa ante el fuerte desbalance de clases; el árbol sin poda exhibe el AUC-PR más bajo. Elaboración propia.</w:t>
+      </w:r>
+    </w:p>
+    <w:p>
+      <w:pPr>
         <w:pStyle w:val="Heading2"/>
       </w:pPr>
       <w:r>
-        <w:t>4.2 Brecha de generalización</w:t>
+        <w:t>3.2 Matrices de confusión</w:t>
       </w:r>
     </w:p>
     <w:p>
       <w:r>
-        <w:t xml:space="preserve">La Figura 2 (fig_brecha.png) muestra la brecha entre exactitud de entrenamiento y de prueba. El </w:t>
+        <w:t xml:space="preserve">La Figura 2 presenta las matrices de confusión de la red neuronal y del árbol podado sobre los 15.616 ejemplos de prueba, de los cuales 42 corresponden a brotes reales. La red neuronal recupera </w:t>
+      </w:r>
+      <w:r>
+        <w:rPr>
+          <w:b/>
+        </w:rPr>
+        <w:t>34 de los 42 brotes</w:t>
+      </w:r>
+      <w:r>
+        <w:t xml:space="preserve"> (verdaderos positivos), a costa de 98 falsas alarmas; el árbol podado recupera 30 brotes con 389 falsas alarmas. La diferencia en falsos positivos explica la mayor precisión de la red y su mejor F1, aun cuando ambos modelos priorizan no dejar pasar brotes (alta sensibilidad), un comportamiento deseable en un sistema de alerta donde el costo de un brote no detectado es alto.</w:t>
+      </w:r>
+    </w:p>
+    <w:p>
+      <w:pPr>
+        <w:jc w:val="center"/>
+      </w:pPr>
+      <w:r>
+        <w:drawing>
+          <wp:inline xmlns:a="http://schemas.openxmlformats.org/drawingml/2006/main" xmlns:pic="http://schemas.openxmlformats.org/drawingml/2006/picture">
+            <wp:extent cx="5120640" cy="2141359"/>
+            <wp:docPr id="16" name="Picture 16"/>
+            <wp:cNvGraphicFramePr>
+              <a:graphicFrameLocks noChangeAspect="1"/>
+            </wp:cNvGraphicFramePr>
+            <a:graphic>
+              <a:graphicData uri="http://schemas.openxmlformats.org/drawingml/2006/picture">
+                <pic:pic>
+                  <pic:nvPicPr>
+                    <pic:cNvPr id="0" name="fig_confusion.png"/>
+                    <pic:cNvPicPr/>
+                  </pic:nvPicPr>
+                  <pic:blipFill>
+                    <a:blip r:embed="rId24"/>
+                    <a:stretch>
+                      <a:fillRect/>
+                    </a:stretch>
+                  </pic:blipFill>
+                  <pic:spPr>
+                    <a:xfrm>
+                      <a:off x="0" y="0"/>
+                      <a:ext cx="5120640" cy="2141359"/>
+                    </a:xfrm>
+                    <a:prstGeom prst="rect"/>
+                  </pic:spPr>
+                </pic:pic>
+              </a:graphicData>
+            </a:graphic>
+          </wp:inline>
+        </w:drawing>
+      </w:r>
+    </w:p>
+    <w:p>
+      <w:r/>
+      <w:r>
+        <w:rPr>
+          <w:b/>
+        </w:rPr>
+        <w:t>Figura 2.</w:t>
+      </w:r>
+      <w:r>
+        <w:t xml:space="preserve"> Matrices de confusión de la red neuronal (izquierda) y el árbol podado (derecha) sobre el conjunto de prueba. Las filas son la condición observada y las columnas la predicción. Elaboración propia.</w:t>
+      </w:r>
+    </w:p>
+    <w:p>
+      <w:pPr>
+        <w:pStyle w:val="Heading2"/>
+      </w:pPr>
+      <w:r>
+        <w:t>3.3 Métricas derivadas de la matriz de confusión</w:t>
+      </w:r>
+    </w:p>
+    <w:p>
+      <w:r>
+        <w:t xml:space="preserve">La Figura 3 desglosa, por modelo, las cuatro métricas derivadas de la Ecuación (12)–(16): precisión, sensibilidad, F1 y especificidad. Se observa el </w:t>
+      </w:r>
+      <w:r>
+        <w:rPr>
+          <w:b/>
+        </w:rPr>
+        <w:t>compromiso característico</w:t>
+      </w:r>
+      <w:r>
+        <w:t xml:space="preserve"> de los problemas desbalanceados: todos los modelos alcanzan una especificidad muy alta (predicen bien la ausencia de brote, la clase mayoritaria), mientras que la precisión es baja porque las pocas alertas positivas incluyen falsas alarmas. La red neuronal ofrece la combinación más equilibrada entre sensibilidad y precisión.</w:t>
+      </w:r>
+    </w:p>
+    <w:p>
+      <w:pPr>
+        <w:jc w:val="center"/>
+      </w:pPr>
+      <w:r>
+        <w:drawing>
+          <wp:inline xmlns:a="http://schemas.openxmlformats.org/drawingml/2006/main" xmlns:pic="http://schemas.openxmlformats.org/drawingml/2006/picture">
+            <wp:extent cx="5120640" cy="2420666"/>
+            <wp:docPr id="17" name="Picture 17"/>
+            <wp:cNvGraphicFramePr>
+              <a:graphicFrameLocks noChangeAspect="1"/>
+            </wp:cNvGraphicFramePr>
+            <a:graphic>
+              <a:graphicData uri="http://schemas.openxmlformats.org/drawingml/2006/picture">
+                <pic:pic>
+                  <pic:nvPicPr>
+                    <pic:cNvPr id="0" name="fig_f1.png"/>
+                    <pic:cNvPicPr/>
+                  </pic:nvPicPr>
+                  <pic:blipFill>
+                    <a:blip r:embed="rId25"/>
+                    <a:stretch>
+                      <a:fillRect/>
+                    </a:stretch>
+                  </pic:blipFill>
+                  <pic:spPr>
+                    <a:xfrm>
+                      <a:off x="0" y="0"/>
+                      <a:ext cx="5120640" cy="2420666"/>
+                    </a:xfrm>
+                    <a:prstGeom prst="rect"/>
+                  </pic:spPr>
+                </pic:pic>
+              </a:graphicData>
+            </a:graphic>
+          </wp:inline>
+        </w:drawing>
+      </w:r>
+    </w:p>
+    <w:p>
+      <w:r/>
+      <w:r>
+        <w:rPr>
+          <w:b/>
+        </w:rPr>
+        <w:t>Figura 3.</w:t>
+      </w:r>
+      <w:r>
+        <w:t xml:space="preserve"> Precisión, sensibilidad, F1 y especificidad por modelo. La especificidad es alta en todos los casos; la red neuronal equilibra mejor sensibilidad y precisión. Elaboración propia.</w:t>
+      </w:r>
+    </w:p>
+    <w:p>
+      <w:pPr>
+        <w:pStyle w:val="Heading2"/>
+      </w:pPr>
+      <w:r>
+        <w:t>3.4 Brecha de generalización</w:t>
+      </w:r>
+    </w:p>
+    <w:p>
+      <w:r>
+        <w:t xml:space="preserve">La Figura 4 hace explícita la brecha entre la exactitud de entrenamiento y la de prueba. El </w:t>
       </w:r>
       <w:r>
         <w:rPr>
@@ -1159,15 +1983,18 @@
         <w:t>árbol sin poda</w:t>
       </w:r>
       <w:r>
-        <w:t xml:space="preserve"> memoriza el pasado (exactitud de entrenamiento ≈0,999) y se desploma en AUC-PR sobre datos nuevos (0,091): la firma inequívoca del sobreajuste. La poda y, sobre todo, la red neuronal generalizan de forma mucho más estable.</w:t>
+        <w:t xml:space="preserve"> memoriza el pasado, con una exactitud de entrenamiento cercana a 0,999, y se desploma en AUC-PR sobre datos nuevos (0,091): la firma inequívoca del sobreajuste. La poda y, sobre todo, la red neuronal, generalizan de forma mucho más estable, lo que confirma sobre datos reales la advertencia metodológica de que una exactitud alta puede ser engañosa cuando las clases están desbalanceadas.</w:t>
       </w:r>
     </w:p>
     <w:p>
+      <w:pPr>
+        <w:jc w:val="center"/>
+      </w:pPr>
       <w:r>
         <w:drawing>
           <wp:inline xmlns:a="http://schemas.openxmlformats.org/drawingml/2006/main" xmlns:pic="http://schemas.openxmlformats.org/drawingml/2006/picture">
-            <wp:extent cx="5486400" cy="2743200"/>
-            <wp:docPr id="2" name="Picture 2"/>
+            <wp:extent cx="5120640" cy="2560320"/>
+            <wp:docPr id="18" name="Picture 18"/>
             <wp:cNvGraphicFramePr>
               <a:graphicFrameLocks noChangeAspect="1"/>
             </wp:cNvGraphicFramePr>
@@ -1179,7 +2006,7 @@
                     <pic:cNvPicPr/>
                   </pic:nvPicPr>
                   <pic:blipFill>
-                    <a:blip r:embed="rId10"/>
+                    <a:blip r:embed="rId26"/>
                     <a:stretch>
                       <a:fillRect/>
                     </a:stretch>
@@ -1187,7 +2014,7 @@
                   <pic:spPr>
                     <a:xfrm>
                       <a:off x="0" y="0"/>
-                      <a:ext cx="5486400" cy="2743200"/>
+                      <a:ext cx="5120640" cy="2560320"/>
                     </a:xfrm>
                     <a:prstGeom prst="rect"/>
                   </pic:spPr>
@@ -1199,24 +2026,39 @@
       </w:r>
     </w:p>
     <w:p>
+      <w:r/>
+      <w:r>
+        <w:rPr>
+          <w:b/>
+        </w:rPr>
+        <w:t>Figura 4.</w:t>
+      </w:r>
+      <w:r>
+        <w:t xml:space="preserve"> Brecha de generalización (diferencia entre exactitud de entrenamiento y de prueba) por modelo. Valores altos indican memorización; el árbol sin poda es el caso extremo. Elaboración propia.</w:t>
+      </w:r>
+    </w:p>
+    <w:p>
       <w:pPr>
         <w:pStyle w:val="Heading2"/>
       </w:pPr>
       <w:r>
-        <w:t>4.3 Calibración</w:t>
+        <w:t>3.5 Calibración</w:t>
       </w:r>
     </w:p>
     <w:p>
       <w:r>
-        <w:t>La Figura 3 (fig_calibracion.png) presenta las curvas de fiabilidad. Los *Brier scores* son bajos (0,012–0,015), favorecidos por la baja prevalencia; la red neuronal presenta la mejor calibración global, aunque con margen de mejora en los deciles de alta probabilidad, donde los brotes son escasos.</w:t>
+        <w:t>La Figura 5 presenta las curvas de fiabilidad de la red neuronal y el árbol podado. Una curva próxima a la diagonal indica que las probabilidades predichas coinciden con las frecuencias observadas. Los *Brier scores* son bajos (0,012–0,015), favorecidos por la baja prevalencia de brotes; la red neuronal presenta la mejor calibración global, aunque con margen de mejora en los deciles de alta probabilidad, donde los brotes son escasos y la estimación es más ruidosa.</w:t>
       </w:r>
     </w:p>
     <w:p>
+      <w:pPr>
+        <w:jc w:val="center"/>
+      </w:pPr>
       <w:r>
         <w:drawing>
           <wp:inline xmlns:a="http://schemas.openxmlformats.org/drawingml/2006/main" xmlns:pic="http://schemas.openxmlformats.org/drawingml/2006/picture">
-            <wp:extent cx="5486400" cy="5486400"/>
-            <wp:docPr id="3" name="Picture 3"/>
+            <wp:extent cx="5120640" cy="5120640"/>
+            <wp:docPr id="19" name="Picture 19"/>
             <wp:cNvGraphicFramePr>
               <a:graphicFrameLocks noChangeAspect="1"/>
             </wp:cNvGraphicFramePr>
@@ -1228,7 +2070,7 @@
                     <pic:cNvPicPr/>
                   </pic:nvPicPr>
                   <pic:blipFill>
-                    <a:blip r:embed="rId11"/>
+                    <a:blip r:embed="rId27"/>
                     <a:stretch>
                       <a:fillRect/>
                     </a:stretch>
@@ -1236,7 +2078,7 @@
                   <pic:spPr>
                     <a:xfrm>
                       <a:off x="0" y="0"/>
-                      <a:ext cx="5486400" cy="5486400"/>
+                      <a:ext cx="5120640" cy="5120640"/>
                     </a:xfrm>
                     <a:prstGeom prst="rect"/>
                   </pic:spPr>
@@ -1248,16 +2090,28 @@
       </w:r>
     </w:p>
     <w:p>
+      <w:r/>
+      <w:r>
+        <w:rPr>
+          <w:b/>
+        </w:rPr>
+        <w:t>Figura 5.</w:t>
+      </w:r>
+      <w:r>
+        <w:t xml:space="preserve"> Curvas de calibración de la red neuronal y el árbol podado frente a la calibración perfecta (diagonal). Elaboración propia.</w:t>
+      </w:r>
+    </w:p>
+    <w:p>
       <w:pPr>
         <w:pStyle w:val="Heading2"/>
       </w:pPr>
       <w:r>
-        <w:t>4.4 Importancia de variables</w:t>
+        <w:t>3.6 Importancia de variables</w:t>
       </w:r>
     </w:p>
     <w:p>
       <w:r>
-        <w:t xml:space="preserve">La Figura 4 (fig_importancia.png) reporta la importancia por permutación de la red neuronal. La </w:t>
+        <w:t xml:space="preserve">La Figura 6 reporta la importancia por permutación de la red neuronal. La </w:t>
       </w:r>
       <w:r>
         <w:rPr>
@@ -1266,7 +2120,7 @@
         <w:t>media móvil de ocho semanas de casos</w:t>
       </w:r>
       <w:r>
-        <w:t xml:space="preserve"> es el predictor dominante, seguida del número de casos actuales y de la media móvil de cuatro semanas. De manera relevante para la hipótesis de enriquecimiento, la </w:t>
+        <w:t xml:space="preserve"> es el predictor dominante, seguida del número de casos actuales y de la media móvil de cuatro semanas: la historia reciente de la transmisión es, como cabía esperar, el factor más informativo. De manera relevante para la hipótesis de enriquecimiento, la </w:t>
       </w:r>
       <w:r>
         <w:rPr>
@@ -1275,7 +2129,7 @@
         <w:t>tasa por 100.000 habitantes</w:t>
       </w:r>
       <w:r>
-        <w:t xml:space="preserve"> (población) figura entre las cinco variables más importantes, y la </w:t>
+        <w:t xml:space="preserve"> figura entre las cinco variables más importantes, y la </w:t>
       </w:r>
       <w:r>
         <w:rPr>
@@ -1284,15 +2138,18 @@
         <w:t>temperatura</w:t>
       </w:r>
       <w:r>
-        <w:t xml:space="preserve"> (media móvil) aporta señal apreciable: clima y población contribuyen, más allá de la autocorrelación de casos.</w:t>
+        <w:t xml:space="preserve"> (media móvil) aporta señal apreciable. Esto indica que el clima y la estructura poblacional contribuyen a la predicción más allá de la mera autocorrelación de los casos, lo que respalda la integración multifuente para una enfermedad sensible a las condiciones ambientales del vector.</w:t>
       </w:r>
     </w:p>
     <w:p>
+      <w:pPr>
+        <w:jc w:val="center"/>
+      </w:pPr>
       <w:r>
         <w:drawing>
           <wp:inline xmlns:a="http://schemas.openxmlformats.org/drawingml/2006/main" xmlns:pic="http://schemas.openxmlformats.org/drawingml/2006/picture">
-            <wp:extent cx="5486400" cy="4114800"/>
-            <wp:docPr id="4" name="Picture 4"/>
+            <wp:extent cx="5120640" cy="3840480"/>
+            <wp:docPr id="20" name="Picture 20"/>
             <wp:cNvGraphicFramePr>
               <a:graphicFrameLocks noChangeAspect="1"/>
             </wp:cNvGraphicFramePr>
@@ -1304,7 +2161,7 @@
                     <pic:cNvPicPr/>
                   </pic:nvPicPr>
                   <pic:blipFill>
-                    <a:blip r:embed="rId12"/>
+                    <a:blip r:embed="rId28"/>
                     <a:stretch>
                       <a:fillRect/>
                     </a:stretch>
@@ -1312,7 +2169,7 @@
                   <pic:spPr>
                     <a:xfrm>
                       <a:off x="0" y="0"/>
-                      <a:ext cx="5486400" cy="4114800"/>
+                      <a:ext cx="5120640" cy="3840480"/>
                     </a:xfrm>
                     <a:prstGeom prst="rect"/>
                   </pic:spPr>
@@ -1324,33 +2181,39 @@
       </w:r>
     </w:p>
     <w:p>
+      <w:r/>
+      <w:r>
+        <w:rPr>
+          <w:b/>
+        </w:rPr>
+        <w:t>Figura 6.</w:t>
+      </w:r>
+      <w:r>
+        <w:t xml:space="preserve"> Importancia por permutación de la red neuronal (caída en AUC-PR al permutar cada variable). La media móvil de casos domina; la tasa poblacional y la temperatura aportan señal. Elaboración propia.</w:t>
+      </w:r>
+    </w:p>
+    <w:p>
       <w:pPr>
         <w:pStyle w:val="Heading2"/>
       </w:pPr>
       <w:r>
-        <w:t>4.5 El sistema interactivo</w:t>
+        <w:t>3.7 El sistema interactivo</w:t>
       </w:r>
     </w:p>
     <w:p>
       <w:r>
-        <w:t xml:space="preserve">La aplicación web materializa los resultados en un </w:t>
-      </w:r>
-      <w:r>
-        <w:rPr>
-          <w:b/>
-        </w:rPr>
-        <w:t>mapa de riesgo del Perú</w:t>
-      </w:r>
-      <w:r>
-        <w:t xml:space="preserve"> donde cada provincia endémica se colorea según su nivel de alerta (bajo/medio/alto) para la semana más reciente; al seleccionar una provincia se muestran la probabilidad de la red neuronal, la decisión del árbol y los casos notificados. La Figura 5 (cap_mapa_riesgo.png) muestra una captura de la aplicación. El sistema es de uso libre y su código y datos son reproducibles.</w:t>
+        <w:t>La Figura 7 muestra la aplicación web resultante: un mapa de riesgo de las provincias endémicas sobre un mapa base del Perú, donde cada provincia se colorea según su nivel de alerta (bajo, medio o alto) para la semana más reciente. Al seleccionar una provincia, el panel lateral muestra la probabilidad de brote estimada por la red neuronal, la decisión del árbol y los casos notificados, lo que permite a un usuario de salud pública comparar de un vistazo ambos paradigmas sobre una zona concreta. El sistema es de uso libre y su código y datos son reproducibles.</w:t>
       </w:r>
     </w:p>
     <w:p>
+      <w:pPr>
+        <w:jc w:val="center"/>
+      </w:pPr>
       <w:r>
         <w:drawing>
           <wp:inline xmlns:a="http://schemas.openxmlformats.org/drawingml/2006/main" xmlns:pic="http://schemas.openxmlformats.org/drawingml/2006/picture">
-            <wp:extent cx="5486400" cy="2781247"/>
-            <wp:docPr id="5" name="Picture 5"/>
+            <wp:extent cx="5120640" cy="2595831"/>
+            <wp:docPr id="21" name="Picture 21"/>
             <wp:cNvGraphicFramePr>
               <a:graphicFrameLocks noChangeAspect="1"/>
             </wp:cNvGraphicFramePr>
@@ -1362,7 +2225,7 @@
                     <pic:cNvPicPr/>
                   </pic:nvPicPr>
                   <pic:blipFill>
-                    <a:blip r:embed="rId13"/>
+                    <a:blip r:embed="rId29"/>
                     <a:stretch>
                       <a:fillRect/>
                     </a:stretch>
@@ -1370,7 +2233,7 @@
                   <pic:spPr>
                     <a:xfrm>
                       <a:off x="0" y="0"/>
-                      <a:ext cx="5486400" cy="2781247"/>
+                      <a:ext cx="5120640" cy="2595831"/>
                     </a:xfrm>
                     <a:prstGeom prst="rect"/>
                   </pic:spPr>
@@ -1382,48 +2245,15 @@
       </w:r>
     </w:p>
     <w:p>
-      <w:pPr>
-        <w:pStyle w:val="Heading1"/>
-      </w:pPr>
-      <w:r>
-        <w:t>5. Discusión</w:t>
-      </w:r>
-    </w:p>
-    <w:p>
-      <w:r>
-        <w:t xml:space="preserve">Tres conclusiones emergen de los resultados. Primero, </w:t>
-      </w:r>
+      <w:r/>
       <w:r>
         <w:rPr>
           <w:b/>
         </w:rPr>
-        <w:t>el aprendizaje automático aporta valor sobre la vigilancia clásica</w:t>
-      </w:r>
-      <w:r>
-        <w:t xml:space="preserve">: la red neuronal supera al canal endémico en sensibilidad y AUC-PR, anticipando brotes que la regla clásica no captura. Segundo, </w:t>
-      </w:r>
-      <w:r>
-        <w:rPr>
-          <w:b/>
-        </w:rPr>
-        <w:t>la calidad y la causalidad de las variables son decisivas</w:t>
-      </w:r>
-      <w:r>
-        <w:t xml:space="preserve">: el árbol sin poda alcanza una exactitud engañosamente alta en entrenamiento pero fracasa en datos nuevos, lo que subraya la necesidad de validación temporal y de métricas adecuadas a eventos raros, en lugar de la exactitud. Tercero, </w:t>
-      </w:r>
-      <w:r>
-        <w:rPr>
-          <w:b/>
-        </w:rPr>
-        <w:t>el enriquecimiento es útil</w:t>
-      </w:r>
-      <w:r>
-        <w:t>: la población (tasa) y el clima aparecen entre los predictores más importantes, lo que respalda la integración multifuente para una enfermedad sensible a las condiciones ambientales del vector.</w:t>
-      </w:r>
-    </w:p>
-    <w:p>
-      <w:r>
-        <w:t>En términos de paradigmas, la red neuronal resultó preferible para este problema desbalanceado y ruidoso, mientras que el árbol —especialmente sin poda— ilustra los riesgos del sobreajuste. La elección, sin embargo, no debería guiarse solo por la exactitud, sino también por la interpretabilidad requerida: el árbol ofrece reglas legibles, valiosas para la comunicación con tomadores de decisión.</w:t>
+        <w:t>Figura 7.</w:t>
+      </w:r>
+      <w:r>
+        <w:t xml:space="preserve"> Interfaz de SATEC: mapa de riesgo provincial sobre el mapa base del Perú, con el detalle de la provincia de Ocros (Áncash) en nivel de alerta medio. Captura de la aplicación desarrollada (elaboración propia).</w:t>
       </w:r>
     </w:p>
     <w:p>
@@ -1431,48 +2261,44 @@
         <w:pStyle w:val="Heading1"/>
       </w:pPr>
       <w:r>
-        <w:t>6. Limitaciones</w:t>
+        <w:t>4. Discusión</w:t>
       </w:r>
     </w:p>
     <w:p>
       <w:r>
-        <w:t xml:space="preserve">Conviene declarar las limitaciones con franqueza. (i) Los datos son de </w:t>
+        <w:t xml:space="preserve">Tres conclusiones emergen de los resultados. Primero, </w:t>
       </w:r>
       <w:r>
         <w:rPr>
           <w:b/>
         </w:rPr>
-        <w:t>vigilancia pasiva</w:t>
-      </w:r>
-      <w:r>
-        <w:t xml:space="preserve">, sujetos a subnotificación y a cambios en la definición de caso a lo largo de 25 años. (ii) La población se tomó del </w:t>
+        <w:t>el aprendizaje automático aporta valor sobre la vigilancia clásica</w:t>
+      </w:r>
+      <w:r>
+        <w:t xml:space="preserve">: la red neuronal supera al canal endémico en sensibilidad y AUC-PR, anticipando brotes que la regla clásica no captura, lo que sugiere que un sistema de alerta basado en datos puede complementar la vigilancia rutinaria de la enfermedad de Carrión. Segundo, </w:t>
       </w:r>
       <w:r>
         <w:rPr>
           <w:b/>
         </w:rPr>
-        <w:t>censo 2017 como referencia constante</w:t>
-      </w:r>
-      <w:r>
-        <w:t xml:space="preserve">, sin capturar la dinámica interanual. (iii) Las variables climáticas se asignaron por </w:t>
+        <w:t>la calidad y la causalidad de las variables son decisivas</w:t>
+      </w:r>
+      <w:r>
+        <w:t xml:space="preserve">: el árbol sin poda alcanza una exactitud engañosamente alta en entrenamiento pero fracasa en datos nuevos, lo que subraya la necesidad de la validación temporal y de métricas adecuadas a eventos raros (AUC-PR, sensibilidad) en lugar de la exactitud. Tercero, </w:t>
       </w:r>
       <w:r>
         <w:rPr>
           <w:b/>
         </w:rPr>
-        <w:t>centroide provincial</w:t>
-      </w:r>
-      <w:r>
-        <w:t xml:space="preserve">, sin resolver microclimas. (iv) El sistema </w:t>
-      </w:r>
-      <w:r>
-        <w:rPr>
-          <w:b/>
-        </w:rPr>
-        <w:t>no realiza diagnóstico clínico individual</w:t>
-      </w:r>
-      <w:r>
-        <w:t>: es una herramienta de apoyo a la vigilancia y no sustituye la confirmación de laboratorio. (v) Se empleó una única partición temporal; una validación de origen móvil con múltiples cortes fortalecería las conclusiones.</w:t>
+        <w:t>el enriquecimiento es útil</w:t>
+      </w:r>
+      <w:r>
+        <w:t>: la tasa poblacional y la temperatura aparecen entre los predictores más importantes, coherente con la biología de un vector sensible al clima.</w:t>
+      </w:r>
+    </w:p>
+    <w:p>
+      <w:r>
+        <w:t>En términos de paradigmas, la red neuronal resultó preferible para este problema desbalanceado y ruidoso, mientras que el árbol, especialmente sin poda, ilustra los riesgos del sobreajuste. La elección, sin embargo, no debería guiarse solo por el desempeño: el árbol ofrece reglas legibles, valiosas para comunicar a los tomadores de decisión por qué una provincia entra en alerta, mientras que la red opera como una caja negra cuya interpretación requiere métodos adicionales como la importancia por permutación.</w:t>
       </w:r>
     </w:p>
     <w:p>
@@ -1480,21 +2306,48 @@
         <w:pStyle w:val="Heading1"/>
       </w:pPr>
       <w:r>
-        <w:t>7. Conclusiones</w:t>
+        <w:t>5. Limitaciones</w:t>
       </w:r>
     </w:p>
     <w:p>
       <w:r>
-        <w:t xml:space="preserve">Se presentó </w:t>
+        <w:t xml:space="preserve">Conviene declarar las limitaciones con franqueza. Los datos provienen de </w:t>
       </w:r>
       <w:r>
         <w:rPr>
           <w:b/>
         </w:rPr>
-        <w:t>SATEC</w:t>
-      </w:r>
-      <w:r>
-        <w:t>, el primer sistema de alerta temprana de brotes de la enfermedad de Carrión basado en aprendizaje automático, construido sobre datos reales de vigilancia del MINSA enriquecidos con clima y población, y validado de forma temporalmente honesta. La red neuronal superó al árbol de decisión y al canal endémico clásico en las métricas centradas en brotes; el árbol sin poda evidenció sobreajuste; y el clima y la población aportaron señal predictiva real. El sistema es reproducible y desplegable sin servidor, lo que lo hace útil como instrumento de apoyo a la vigilancia de una enfermedad desatendida. El trabajo futuro incluye la validación de origen móvil, modelos de ensamble (bosques aleatorios, potenciación de gradiente), granularidad distrital, modelos secuenciales y la validación prospectiva en campo con una Dirección Regional de Salud.</w:t>
+        <w:t>vigilancia pasiva</w:t>
+      </w:r>
+      <w:r>
+        <w:t xml:space="preserve">, sujeta a subnotificación y a posibles cambios en la definición de caso a lo largo de 25 años. La población se tomó del </w:t>
+      </w:r>
+      <w:r>
+        <w:rPr>
+          <w:b/>
+        </w:rPr>
+        <w:t>censo 2017 como referencia constante</w:t>
+      </w:r>
+      <w:r>
+        <w:t xml:space="preserve">, sin capturar la dinámica interanual. Las variables climáticas se asignaron por </w:t>
+      </w:r>
+      <w:r>
+        <w:rPr>
+          <w:b/>
+        </w:rPr>
+        <w:t>centroide provincial</w:t>
+      </w:r>
+      <w:r>
+        <w:t xml:space="preserve">, sin resolver microclimas dentro de provincias extensas. El sistema </w:t>
+      </w:r>
+      <w:r>
+        <w:rPr>
+          <w:b/>
+        </w:rPr>
+        <w:t>no realiza diagnóstico clínico individual</w:t>
+      </w:r>
+      <w:r>
+        <w:t>: es una herramienta de apoyo a la vigilancia y no sustituye la confirmación de laboratorio. Finalmente, se empleó una única partición temporal; una validación de origen móvil con múltiples cortes fortalecería las conclusiones.</w:t>
       </w:r>
     </w:p>
     <w:p>
@@ -1502,12 +2355,66 @@
         <w:pStyle w:val="Heading1"/>
       </w:pPr>
       <w:r>
-        <w:t>Agradecimientos</w:t>
+        <w:t>6. Conclusiones</w:t>
       </w:r>
     </w:p>
     <w:p>
       <w:r>
-        <w:t>A la Escuela Profesional de Ingeniería de Sistemas de la Universidad Nacional Tecnológica de Lima Sur (UNTELS) y, de manera especial, al Mg. Raúl E. Huarote Zegarra, docente del curso de Sistemas Inteligentes, por su orientación. Al MINSA por la publicación de los datos abiertos de vigilancia, y al personal de salud que sostiene la vigilancia de la enfermedad de Carrión.</w:t>
+        <w:t xml:space="preserve">La enfermedad de Carrión sigue siendo una amenaza desatendida para las poblaciones rurales de los valles interandinos del Perú, donde su fase aguda puede ser letal si no se trata a tiempo. Este trabajo presentó </w:t>
+      </w:r>
+      <w:r>
+        <w:rPr>
+          <w:b/>
+        </w:rPr>
+        <w:t>SATEC</w:t>
+      </w:r>
+      <w:r>
+        <w:t xml:space="preserve">, el primer sistema de alerta temprana de brotes de la enfermedad de Carrión basado en aprendizaje automático, construido íntegramente sobre datos reales de vigilancia del MINSA enriquecidos con clima y población, y validado de forma temporalmente honesta. Para la enfermedad de Carrión en concreto, los hallazgos indican que: (i) es posible </w:t>
+      </w:r>
+      <w:r>
+        <w:rPr>
+          <w:b/>
+        </w:rPr>
+        <w:t>anticipar con cuatro semanas la entrada de una provincia en zona de epidemia</w:t>
+      </w:r>
+      <w:r>
+        <w:t xml:space="preserve"> del canal endémico con una sensibilidad del 81 %, lo que abre la puerta a focalizar la vigilancia y los recursos en las zonas y semanas de mayor riesgo; (ii) la </w:t>
+      </w:r>
+      <w:r>
+        <w:rPr>
+          <w:b/>
+        </w:rPr>
+        <w:t>dinámica reciente de casos</w:t>
+      </w:r>
+      <w:r>
+        <w:t xml:space="preserve">, junto con la </w:t>
+      </w:r>
+      <w:r>
+        <w:rPr>
+          <w:b/>
+        </w:rPr>
+        <w:t>temperatura</w:t>
+      </w:r>
+      <w:r>
+        <w:t xml:space="preserve"> y la </w:t>
+      </w:r>
+      <w:r>
+        <w:rPr>
+          <w:b/>
+        </w:rPr>
+        <w:t>densidad poblacional</w:t>
+      </w:r>
+      <w:r>
+        <w:t xml:space="preserve">, son los factores más asociados al riesgo de brote, en consonancia con la ecología del vector *Lutzomyia*; y (iii) un modelo de aprendizaje automático puede </w:t>
+      </w:r>
+      <w:r>
+        <w:rPr>
+          <w:b/>
+        </w:rPr>
+        <w:t>superar al canal endémico clásico</w:t>
+      </w:r>
+      <w:r>
+        <w:t xml:space="preserve"> que hoy guía la vigilancia, sin reemplazarlo, sino complementándolo con una capa predictiva. El sistema resultante es reproducible, verificable y desplegable sin servidor, lo que lo hace viable como instrumento de apoyo para las Direcciones Regionales de Salud de las zonas endémicas. Como trabajo futuro se plantea la validación de origen móvil, la incorporación de modelos de ensamble y de variables entomológicas, el descenso a granularidad distrital y la validación prospectiva en campo, así como la articulación con los esfuerzos de diagnóstico serológico y de modelado del vector que hoy concentran la investigación computacional sobre la enfermedad de Carrión.</w:t>
       </w:r>
     </w:p>
     <w:p>
@@ -1515,12 +2422,12 @@
         <w:pStyle w:val="Heading1"/>
       </w:pPr>
       <w:r>
-        <w:t>Disponibilidad de datos y código</w:t>
+        <w:t>Agradecimientos</w:t>
       </w:r>
     </w:p>
     <w:p>
       <w:r>
-        <w:t>Los datos de vigilancia provienen de los datos abiertos del MINSA [2]; el clima, de NASA POWER [22]; la población, del INEI [23]; los límites provinciales, de un repositorio GeoJSON público. El código del pipeline, los modelos y la aplicación web son reproducibles de extremo a extremo con Python 3.12 y se acompañan de pruebas automatizadas.</w:t>
+        <w:t>Los autores agradecen a la Escuela Profesional de Ingeniería de Sistemas de la Universidad Nacional Tecnológica de Lima Sur (UNTELS) por el apoyo institucional, y al Ministerio de Salud del Perú (MINSA) por la publicación de los datos abiertos de vigilancia epidemiológica que hicieron posible este estudio. Asimismo, reconocen la labor del personal de salud que sostiene la vigilancia de la enfermedad de Carrión en las zonas endémicas del país.</w:t>
       </w:r>
     </w:p>
     <w:p>
@@ -1528,122 +2435,155 @@
         <w:pStyle w:val="Heading1"/>
       </w:pPr>
       <w:r>
-        <w:t>Referencias</w:t>
+        <w:t>Disponibilidad de datos y código</w:t>
       </w:r>
     </w:p>
     <w:p>
       <w:r>
-        <w:t>[1] C. Maguiña Vargas, «Bartonelosis o enfermedad de Carrión: nuevos aspectos de una vieja enfermedad», *Acta Médica Peruana*, vol. 26, n.º 1, 2009.</w:t>
+        <w:t>Los datos de vigilancia provienen de los datos abiertos del MINSA [2]; las variables climáticas, de NASA POWER [22]; la población, del censo del INEI [23]; y los límites provinciales, de un repositorio GeoJSON público. El código del pipeline de datos, los modelos y la aplicación web son reproducibles de extremo a extremo con Python 3.12 y se acompañan de pruebas automatizadas.</w:t>
       </w:r>
     </w:p>
     <w:p>
-      <w:r>
-        <w:t>[2] Ministerio de Salud del Perú, «Vigilancia epidemiológica de la enfermedad de Carrión, 2000–2024», Plataforma Nacional de Datos Abiertos. https://www.datosabiertos.gob.pe</w:t>
+      <w:pPr>
+        <w:pStyle w:val="Heading1"/>
+      </w:pPr>
+      <w:r>
+        <w:t>Referencias</w:t>
       </w:r>
     </w:p>
     <w:p>
       <w:r>
-        <w:t>[3] Y. LeCun, Y. Bengio y G. Hinton, «Deep learning», *Nature*, vol. 521, pp. 436–444, 2015.</w:t>
+        <w:t>[1] C. Maguiña Vargas, «Bartonelosis o enfermedad de Carrión: nuevos aspectos de una vieja enfermedad», *Acta Médica Peruana*, vol. 26, n.º 1, 2009.</w:t>
       </w:r>
     </w:p>
     <w:p>
       <w:r>
-        <w:t>[4] I. Goodfellow, Y. Bengio y A. Courville, *Deep Learning*. MIT Press, 2016.</w:t>
+        <w:t>[2] Ministerio de Salud del Perú, «Vigilancia epidemiológica de la enfermedad de Carrión, 2000–2024», Plataforma Nacional de Datos Abiertos. https://www.datosabiertos.gob.pe</w:t>
       </w:r>
     </w:p>
     <w:p>
       <w:r>
-        <w:t>[5] L. Breiman, J. Friedman, R. Olshen y C. Stone, *Classification and Regression Trees*. Wadsworth, 1984.</w:t>
+        <w:t>[3] Y. LeCun, Y. Bengio y G. Hinton, «Deep learning», *Nature*, vol. 521, pp. 436–444, 2015.</w:t>
       </w:r>
     </w:p>
     <w:p>
       <w:r>
-        <w:t>[6] J. R. Quinlan, «Induction of decision trees», *Machine Learning*, vol. 1, n.º 1, pp. 81–106, 1986.</w:t>
+        <w:t>[4] I. Goodfellow, Y. Bengio y A. Courville, *Deep Learning*. MIT Press, 2016.</w:t>
       </w:r>
     </w:p>
     <w:p>
       <w:r>
-        <w:t>[7] F. Pedregosa et al., «Scikit-learn: Machine learning in Python», *JMLR*, vol. 12, pp. 2825–2830, 2011.</w:t>
+        <w:t>[5] L. Breiman, J. Friedman, R. Olshen y C. Stone, *Classification and Regression Trees*. Wadsworth, 1984.</w:t>
       </w:r>
     </w:p>
     <w:p>
       <w:r>
-        <w:t>[8] M. Abadi et al., «TensorFlow: Large-scale machine learning on heterogeneous systems», 2015. https://www.tensorflow.org</w:t>
+        <w:t>[6] J. R. Quinlan, «Induction of decision trees», *Machine Learning*, vol. 1, n.º 1, pp. 81–106, 1986.</w:t>
       </w:r>
     </w:p>
     <w:p>
       <w:r>
-        <w:t>[9] F. Chollet et al., «Keras», 2015. https://keras.io</w:t>
+        <w:t>[7] F. Pedregosa et al., «Scikit-learn: Machine learning in Python», *JMLR*, vol. 12, pp. 2825–2830, 2011.</w:t>
       </w:r>
     </w:p>
     <w:p>
       <w:r>
-        <w:t>[10] D. P. Kingma y J. Ba, «Adam: A method for stochastic optimization», en *ICLR*, 2015.</w:t>
+        <w:t>[8] M. Abadi et al., «TensorFlow: Large-scale machine learning on heterogeneous systems», 2015. https://www.tensorflow.org</w:t>
       </w:r>
     </w:p>
     <w:p>
       <w:r>
-        <w:t>[11] L. Grinsztajn, E. Oyallon y G. Varoquaux, «Why do tree-based models still outperform deep learning on typical tabular data?», en *NeurIPS*, 2022.</w:t>
+        <w:t>[9] F. Chollet et al., «Keras», 2015. https://keras.io</w:t>
       </w:r>
     </w:p>
     <w:p>
       <w:r>
-        <w:t>[12] R. Shwartz-Ziv y A. Armon, «Tabular data: Deep learning is not all you need», *Information Fusion*, vol. 81, pp. 84–90, 2022.</w:t>
+        <w:t>[10] D. P. Kingma y J. Ba, «Adam: A method for stochastic optimization», en *ICLR*, 2015.</w:t>
       </w:r>
     </w:p>
     <w:p>
       <w:r>
-        <w:t>[13] T. Hastie, R. Tibshirani y J. Friedman, *The Elements of Statistical Learning*, 2.ª ed. Springer, 2009.</w:t>
+        <w:t>[11] L. Grinsztajn, E. Oyallon y G. Varoquaux, «Why do tree-based models still outperform deep learning on typical tabular data?», en *NeurIPS*, 2022.</w:t>
       </w:r>
     </w:p>
     <w:p>
       <w:r>
-        <w:t>[14] V. Nair y G. E. Hinton, «Rectified linear units improve restricted Boltzmann machines», en *ICML*, 2010.</w:t>
+        <w:t>[12] R. Shwartz-Ziv y A. Armon, «Tabular data: Deep learning is not all you need», *Information Fusion*, vol. 81, pp. 84–90, 2022.</w:t>
       </w:r>
     </w:p>
     <w:p>
       <w:r>
-        <w:t>[15] N. Srivastava et al., «Dropout: A simple way to prevent neural networks from overfitting», *JMLR*, vol. 15, pp. 1929–1958, 2014.</w:t>
+        <w:t>[13] T. Hastie, R. Tibshirani y J. Friedman, *The Elements of Statistical Learning*, 2.ª ed. Springer, 2009.</w:t>
       </w:r>
     </w:p>
     <w:p>
       <w:r>
-        <w:t>[16] D. Smilkov et al., «TensorFlow.js: Machine learning for the web and beyond», en *MLSys*, 2019.</w:t>
+        <w:t>[14] V. Nair y G. E. Hinton, «Rectified linear units improve restricted Boltzmann machines», en *ICML*, 2010.</w:t>
       </w:r>
     </w:p>
     <w:p>
       <w:r>
-        <w:t>[17] Organización Panamericana de la Salud, «Bartonelosis (enfermedad de Carrión)» y metodología del canal endémico. https://www.paho.org</w:t>
+        <w:t>[15] N. Srivastava et al., «Dropout: A simple way to prevent neural networks from overfitting», *JMLR*, vol. 15, pp. 1929–1958, 2014.</w:t>
       </w:r>
     </w:p>
     <w:p>
       <w:r>
-        <w:t>[18] V. Jiménez-Vásquez et al., «In-silico identification of linear B-cell epitopes in specific proteins of *Bartonella bacilliformis* for the serological diagnosis of Carrion's disease», *PLOS Neglected Tropical Diseases*, vol. 17, n.º 5, e0011321, 2023.</w:t>
+        <w:t>[16] D. Smilkov et al., «TensorFlow.js: Machine learning for the web and beyond», en *MLSys*, 2019.</w:t>
       </w:r>
     </w:p>
     <w:p>
       <w:r>
-        <w:t>[19] G. M. Vadmal et al., «Data-driven predictions of potential Leishmania vectors in the Americas», *PLOS Neglected Tropical Diseases*, vol. 17, n.º 2, e0010749, 2023.</w:t>
+        <w:t>[17] Organización Panamericana de la Salud, «Bartonelosis (enfermedad de Carrión)» y metodología del canal endémico. https://www.paho.org</w:t>
       </w:r>
     </w:p>
     <w:p>
       <w:r>
-        <w:t>[20] B. Nayak et al., «Artificial intelligence (AI): a new window to revamp the vector-borne disease control», *Parasitology Research*, vol. 122, n.º 2, pp. 369–379, 2023.</w:t>
+        <w:t>[18] V. Jiménez-Vásquez, K. D. Calvay-Sánchez, Y. Zárate-Sulca y G. Mendoza-Mujica, «In-silico identification of linear B-cell epitopes in specific proteins of *Bartonella bacilliformis* for the serological diagnosis of Carrion's disease», *PLOS Neglected Tropical Diseases*, vol. 17, n.º 5, e0011321, 2023.</w:t>
       </w:r>
     </w:p>
     <w:p>
       <w:r>
-        <w:t>[21] K. S. Rufasto-Goche et al., «Epidemiological dynamics of dengue in Peru: Temporal and spatial drivers between 2000 and 2022», *PLOS One*, vol. 20, n.º 3, e0319708, 2025.</w:t>
+        <w:t>[19] G. M. Vadmal et al., «Data-driven predictions of potential Leishmania vectors in the Americas», *PLOS Neglected Tropical Diseases*, vol. 17, n.º 2, e0010749, 2023.</w:t>
       </w:r>
     </w:p>
     <w:p>
       <w:r>
-        <w:t>[22] NASA Langley Research Center, «POWER: Prediction Of Worldwide Energy Resources», API de datos meteorológicos. https://power.larc.nasa.gov</w:t>
+        <w:t>[20] B. Nayak et al., «Artificial intelligence (AI): a new window to revamp the vector-borne disease control», *Parasitology Research*, vol. 122, n.º 2, pp. 369–379, 2023.</w:t>
       </w:r>
     </w:p>
     <w:p>
       <w:r>
+        <w:t>[21] K. S. Rufasto-Goche et al., «Epidemiological dynamics of dengue in Peru: Temporal and spatial drivers between 2000 and 2022», *PLOS One*, vol. 20, n.º 3, e0319708, 2025.</w:t>
+      </w:r>
+    </w:p>
+    <w:p>
+      <w:r>
+        <w:t>[22] NASA Langley Research Center, «POWER: Prediction Of Worldwide Energy Resources», API de datos meteorológicos. https://power.larc.nasa.gov</w:t>
+      </w:r>
+    </w:p>
+    <w:p>
+      <w:r>
         <w:t>[23] Instituto Nacional de Estadística e Informática (INEI), «Censos Nacionales 2017: XII de Población y VII de Vivienda», Lima, Perú.</w:t>
+      </w:r>
+    </w:p>
+    <w:p>
+      <w:r>
+        <w:t>[24] Estudio sobre producción de proteínas de *Bartonella bacilliformis* asistida por baculovirus para mejorar el diagnóstico serológico de la enfermedad de Carrión, *PLOS Neglected Tropical Diseases*, 2024.</w:t>
+      </w:r>
+    </w:p>
+    <w:p>
+      <w:r>
+        <w:t>[25] D. Moo-Llanes et al., «Shifts in the ecological niche of *Lutzomyia peruensis* under climate change scenarios in Peru», *Medical and Veterinary Entomology*, 2017.</w:t>
+      </w:r>
+    </w:p>
+    <w:p>
+      <w:r>
+        <w:t>[26] A. A. Hanafi-Bojd et al., «Machine learning approaches in GIS-based ecological modeling of the sand fly *Phlebotomus papatasi*, a vector of zoonotic cutaneous leishmaniasis», *Acta Tropica* (ScienceDirect), 2019.</w:t>
+      </w:r>
+    </w:p>
+    <w:p>
+      <w:r>
+        <w:t>[27] J. Del Valle-Mendoza et al., «Molecular detection of *Bartonella bacilliformis* in *Lutzomyia maranonensis* in Cajamarca, Peru: a new potential vector of Carrion's disease?», 2018.</w:t>
       </w:r>
     </w:p>
     <w:sectPr>

</xml_diff>

<commit_message>
docs(paper): párrafos sin sangría y regeneración del .docx ACM final
</commit_message>
<xml_diff>
--- a/paper/SATEC_articulo_ACM.docx
+++ b/paper/SATEC_articulo_ACM.docx
@@ -108,7 +108,7 @@
         <w:t>endemic channel</w:t>
       </w:r>
       <w:r>
-        <w:t xml:space="preserve"> (the standard surveillance tool of PAHO/MINSA). The system is built on 25 years of national open surveillance data from the Peruvian Ministry of Health (MINSA, 2000–2024; ~46,120 case records), aggregated into a province by epidemiological-week panel with imputed zero weeks, and enriched with </w:t>
+        <w:t xml:space="preserve"> (the standard surveillance tool of PAHO/MINSA). The system is built on 25 years of national open surveillance data from the Peruvian Ministry of Health (MINSA, 2000–2024; ~46,120 case records), aggregated into a province-by-epidemiological-week panel with imputed zero weeks, and enriched with </w:t>
       </w:r>
       <w:r>
         <w:rPr>
@@ -126,7 +126,43 @@
         <w:t>population</w:t>
       </w:r>
       <w:r>
-        <w:t xml:space="preserve"> (2017 census, for incidence rates). We compare a feed-forward </w:t>
+        <w:t xml:space="preserve"> (2017 census, for incidence rates). We compare </w:t>
+      </w:r>
+      <w:r>
+        <w:rPr>
+          <w:b/>
+        </w:rPr>
+        <w:t>tree-based models</w:t>
+      </w:r>
+      <w:r>
+        <w:t xml:space="preserve"> —a </w:t>
+      </w:r>
+      <w:r>
+        <w:rPr>
+          <w:b/>
+        </w:rPr>
+        <w:t>Decision Tree</w:t>
+      </w:r>
+      <w:r>
+        <w:t xml:space="preserve">, a </w:t>
+      </w:r>
+      <w:r>
+        <w:rPr>
+          <w:b/>
+        </w:rPr>
+        <w:t>Random Forest</w:t>
+      </w:r>
+      <w:r>
+        <w:t xml:space="preserve"> and </w:t>
+      </w:r>
+      <w:r>
+        <w:rPr>
+          <w:b/>
+        </w:rPr>
+        <w:t>Gradient Boosting</w:t>
+      </w:r>
+      <w:r>
+        <w:t xml:space="preserve"> (scikit-learn)— against a feed-forward </w:t>
       </w:r>
       <w:r>
         <w:rPr>
@@ -135,25 +171,25 @@
         <w:t>Neural Network</w:t>
       </w:r>
       <w:r>
-        <w:t xml:space="preserve"> (Keras) against a </w:t>
-      </w:r>
-      <w:r>
-        <w:rPr>
-          <w:b/>
-        </w:rPr>
-        <w:t>Decision Tree</w:t>
-      </w:r>
-      <w:r>
-        <w:t xml:space="preserve"> (scikit-learn) under </w:t>
-      </w:r>
-      <w:r>
-        <w:rPr>
-          <w:b/>
-        </w:rPr>
-        <w:t>strict temporal validation</w:t>
-      </w:r>
-      <w:r>
-        <w:t xml:space="preserve"> (train ≤2019, test 2020–2024), reporting metrics suited to rare events (recall, AUC-PR), confusion matrices, calibration and permutation importance. The neural network attains the best balance (recall 0.81, AUC-PR 0.745, Brier 0.012) and outperforms both the unpruned tree, which overfits, and the classical endemic-channel baseline; the recent moving average of cases dominates, while climate and population add real signal. The system is deployed as an open, reproducible web application with a provincial risk map over a basemap of Peru. We conclude that machine learning can add value over classical surveillance for a neglected disease, provided the variables are informative and the evaluation respects temporal causality.</w:t>
+        <w:t xml:space="preserve"> (Keras), under </w:t>
+      </w:r>
+      <w:r>
+        <w:rPr>
+          <w:b/>
+        </w:rPr>
+        <w:t>rolling-origin temporal validation</w:t>
+      </w:r>
+      <w:r>
+        <w:t xml:space="preserve"> (yearly test folds, 2016–2024) with the decision threshold tuned on validation, complemented by a single pre-/post-pandemic split. We report metrics suited to rare events (recall, AUC-PR, AUC-ROC, F1 at the tuned threshold), confusion matrices, calibration and permutation importance. The </w:t>
+      </w:r>
+      <w:r>
+        <w:rPr>
+          <w:b/>
+        </w:rPr>
+        <w:t>Random Forest attains the best overall performance</w:t>
+      </w:r>
+      <w:r>
+        <w:t xml:space="preserve"> (F1 0.47, AUC-ROC 0.94, Brier 0.009), narrowly ahead of the neural network, and both clearly outperform the unpruned tree —which overfits— and the classical endemic-channel baseline; the recent moving average of cases dominates the prediction, while climate and population add real signal. We further show that the apparent prevalence of outbreaks collapses from ~10% (≤2019) to ~0.3% in 2020–2024, a footprint of pandemic under-reporting that makes any single recent split misleading and motivates rolling-origin evaluation. The system is deployed as an open, reproducible web application with a provincial risk map over a basemap of Peru. We conclude that machine learning —particularly tree ensembles on tabular surveillance data— can add value over classical surveillance for a neglected disease, provided the variables are informative and the evaluation respects temporal causality.</w:t>
       </w:r>
     </w:p>
     <w:p>
@@ -181,7 +217,7 @@
         <w:t xml:space="preserve">Keywords: </w:t>
       </w:r>
       <w:r>
-        <w:t>enfermedad de Carrión; bartonelosis; alerta temprana; redes neuronales; árboles de decisión; canal endémico; vigilancia epidemiológica; aprendizaje automático; Perú.</w:t>
+        <w:t>Carrión's disease; bartonellosis; early warning; neural networks; decision trees; random forest; gradient boosting; endemic channel; epidemiological surveillance; machine learning; Peru.</w:t>
       </w:r>
     </w:p>
     <w:p>
@@ -280,7 +316,43 @@
         <w:t>población</w:t>
       </w:r>
       <w:r>
-        <w:t xml:space="preserve"> (censo 2017, para tasas de incidencia). Se comparan una </w:t>
+        <w:t xml:space="preserve"> (censo 2017, para tasas de incidencia). Se comparan </w:t>
+      </w:r>
+      <w:r>
+        <w:rPr>
+          <w:b/>
+        </w:rPr>
+        <w:t>modelos basados en árboles</w:t>
+      </w:r>
+      <w:r>
+        <w:t xml:space="preserve"> —un </w:t>
+      </w:r>
+      <w:r>
+        <w:rPr>
+          <w:b/>
+        </w:rPr>
+        <w:t>Árbol de Decisión</w:t>
+      </w:r>
+      <w:r>
+        <w:t xml:space="preserve">, un </w:t>
+      </w:r>
+      <w:r>
+        <w:rPr>
+          <w:b/>
+        </w:rPr>
+        <w:t>Random Forest</w:t>
+      </w:r>
+      <w:r>
+        <w:t xml:space="preserve"> y </w:t>
+      </w:r>
+      <w:r>
+        <w:rPr>
+          <w:b/>
+        </w:rPr>
+        <w:t>Gradient Boosting</w:t>
+      </w:r>
+      <w:r>
+        <w:t xml:space="preserve"> (scikit-learn)— frente a una </w:t>
       </w:r>
       <w:r>
         <w:rPr>
@@ -289,25 +361,40 @@
         <w:t>Red Neuronal</w:t>
       </w:r>
       <w:r>
-        <w:t xml:space="preserve"> prealimentada (Keras) y un </w:t>
-      </w:r>
-      <w:r>
-        <w:rPr>
-          <w:b/>
-        </w:rPr>
-        <w:t>Árbol de Decisión</w:t>
-      </w:r>
-      <w:r>
-        <w:t xml:space="preserve"> (scikit-learn) bajo </w:t>
-      </w:r>
-      <w:r>
-        <w:rPr>
-          <w:b/>
-        </w:rPr>
-        <w:t>validación temporal estricta</w:t>
-      </w:r>
-      <w:r>
-        <w:t xml:space="preserve"> (entrenamiento ≤2019, prueba 2020–2024), reportando métricas adecuadas a eventos raros (sensibilidad, AUC-PR), matrices de confusión, calibración e importancia por permutación. La red neuronal logra el mejor equilibrio (sensibilidad 0,81; AUC-PR 0,745; Brier 0,012) y supera tanto al árbol sin poda, que sobreajusta, como al baseline clásico del canal endémico; la media móvil reciente de casos domina, mientras que el clima y la población aportan señal real. El sistema se despliega como una aplicación web abierta y reproducible con un mapa de riesgo provincial sobre un mapa base del Perú. Concluimos que el aprendizaje automático puede aportar valor sobre la vigilancia clásica en una enfermedad desatendida, siempre que las variables sean informativas y la evaluación respete la causalidad temporal.</w:t>
+        <w:t xml:space="preserve"> prealimentada (Keras), bajo </w:t>
+      </w:r>
+      <w:r>
+        <w:rPr>
+          <w:b/>
+        </w:rPr>
+        <w:t>validación temporal de origen móvil</w:t>
+      </w:r>
+      <w:r>
+        <w:t xml:space="preserve"> (cortes anuales de prueba, 2016–2024) con el umbral de decisión ajustado en validación, complementada con una partición única pre/pospandemia. Se reportan métricas adecuadas a eventos raros (sensibilidad, AUC-PR, AUC-ROC, F1 en el umbral óptimo), matrices de confusión, calibración e importancia por permutación. El </w:t>
+      </w:r>
+      <w:r>
+        <w:rPr>
+          <w:b/>
+        </w:rPr>
+        <w:t>Random Forest logra el mejor desempeño global</w:t>
+      </w:r>
+      <w:r>
+        <w:t xml:space="preserve"> (F1 0,47; AUC-ROC 0,94; Brier 0,009), por delante de la red neuronal por un margen estrecho, y ambos superan con claridad al árbol sin poda —que sobreajusta— y al baseline clásico del canal endémico; la media móvil reciente de casos domina la predicción, mientras que el clima y la población aportan señal real. Mostramos además que la prevalencia aparente de brotes se desploma del ~10 % (≤2019) al ~0,3 % en 2020–2024, huella de la subnotificación pandémica que vuelve engañosa cualquier partición reciente única y motiva la evaluación de origen móvil. El sistema se despliega como una aplicación web abierta y reproducible con un mapa de riesgo provincial sobre un mapa base del Perú. Concluimos que el aprendizaje automático —en particular los ensambles de árboles sobre datos tabulares de vigilancia— puede aportar valor sobre la vigilancia clásica en una enfermedad desatendida, siempre que las variables sean informativas y la evaluación respete la causalidad temporal.</w:t>
+      </w:r>
+    </w:p>
+    <w:p>
+      <w:pPr>
+        <w:pStyle w:val="Para"/>
+        <w:ind w:firstLine="0"/>
+      </w:pPr>
+      <w:r>
+        <w:rPr>
+          <w:b/>
+        </w:rPr>
+        <w:t>Palabras clave:</w:t>
+      </w:r>
+      <w:r>
+        <w:t xml:space="preserve"> enfermedad de Carrión; bartonelosis; alerta temprana; redes neuronales; árboles de decisión; Random Forest; Gradient Boosting; canal endémico; vigilancia epidemiológica; aprendizaje automático; Perú.</w:t>
       </w:r>
     </w:p>
     <w:p>
@@ -321,6 +408,7 @@
     <w:p>
       <w:pPr>
         <w:pStyle w:val="PostHeadPara"/>
+        <w:ind w:firstLine="0"/>
       </w:pPr>
       <w:r>
         <w:t xml:space="preserve">La enfermedad de Carrión, o bartonelosis humana, es una enfermedad bacteriana desatendida y endémica de los valles interandinos del Perú, causada por </w:t>
@@ -359,7 +447,7 @@
         <w:t>Lutzomyia peruensis</w:t>
       </w:r>
       <w:r>
-        <w:t xml:space="preserve"> [1], [17]. Lleva el nombre de Daniel Alcides Carrión, mártir de la medicina peruana. La enfermedad presenta dos fases de relevancia clínica muy distinta: una fase aguda (anemia hemolítica severa, conocida como «Fiebre de la Oroya»), de alta letalidad en ausencia de tratamiento, y una fase eruptiva («Verruga Peruana»), más benigna. Su carácter focal y estacional, ligado a las condiciones ambientales que favorecen al vector, la convierte en una candidata natural para sistemas de </w:t>
+        <w:t xml:space="preserve"> [1], [2]. Lleva el nombre de Daniel Alcides Carrión, mártir de la medicina peruana. La enfermedad presenta dos fases de relevancia clínica muy distinta: una fase aguda (anemia hemolítica severa, conocida como «Fiebre de la Oroya»), de alta letalidad en ausencia de tratamiento, y una fase eruptiva («Verruga Peruana»), más benigna. Su carácter focal y estacional, ligado a las condiciones ambientales que favorecen al vector, la convierte en una candidata natural para sistemas de </w:t>
       </w:r>
       <w:r>
         <w:rPr>
@@ -374,17 +462,19 @@
     <w:p>
       <w:pPr>
         <w:pStyle w:val="Para"/>
-      </w:pPr>
-      <w:r>
-        <w:t>El aprendizaje automático se ha consolidado como una herramienta de apoyo a la decisión en salud pública, donde conviven dos grandes familias de modelos supervisados: las redes neuronales artificiales, capaces de aproximar funciones complejas mediante combinaciones no lineales de sus entradas [3], [4], y los árboles de decisión, que clasifican mediante una secuencia de reglas interpretables sobre los atributos [5], [6]. Ambos enfoques resuelven el mismo problema de clasificación, pero difieren en su capacidad de generalización, su interpretabilidad y su sensibilidad a la calidad de los datos. En datos tabulares, el formato típico de los registros epidemiológicos, la evidencia reciente muestra que los modelos basados en árboles siguen siendo altamente competitivos frente a las redes profundas [11], [12], lo que motiva una comparación controlada sobre datos reales de una enfermedad endémica.</w:t>
+        <w:ind w:firstLine="0"/>
+      </w:pPr>
+      <w:r>
+        <w:t>El aprendizaje automático se ha consolidado como una herramienta de apoyo a la decisión en salud pública, donde conviven dos grandes familias de modelos supervisados: las redes neuronales artificiales, capaces de aproximar funciones complejas mediante combinaciones no lineales de sus entradas [3], [4], y los árboles de decisión, que clasifican mediante una secuencia de reglas interpretables sobre los atributos [5], [6]. Ambos enfoques resuelven el mismo problema de clasificación, pero difieren en su capacidad de generalización, su interpretabilidad y su sensibilidad a la calidad de los datos. En datos tabulares, el formato típico de los registros epidemiológicos, la evidencia reciente muestra que los modelos basados en árboles siguen siendo altamente competitivos frente a las redes profundas [7], [8], lo que motiva una comparación controlada sobre datos reales de una enfermedad endémica.</w:t>
       </w:r>
     </w:p>
     <w:p>
       <w:pPr>
         <w:pStyle w:val="Para"/>
-      </w:pPr>
-      <w:r>
-        <w:t xml:space="preserve">La aplicación de la inteligencia artificial a la enfermedad de Carrión es todavía incipiente y se ha concentrado en dos frentes: el diagnóstico de laboratorio y el estudio del vector. En el primero, Jiménez-Vásquez et al. [18] aplican un análisis </w:t>
+        <w:ind w:firstLine="0"/>
+      </w:pPr>
+      <w:r>
+        <w:t xml:space="preserve">La aplicación de la inteligencia artificial a la enfermedad de Carrión es todavía incipiente y se ha concentrado en dos frentes: el diagnóstico de laboratorio y el estudio del vector. En el primero, Jiménez-Vásquez et al. [9] aplican un análisis </w:t>
       </w:r>
       <w:r>
         <w:rPr>
@@ -402,7 +492,7 @@
         <w:t>B. bacilliformis</w:t>
       </w:r>
       <w:r>
-        <w:t xml:space="preserve">, con el fin de mejorar el diagnóstico serológico de la enfermedad de Carrión; en la misma línea, trabajos recientes evalúan proteínas recombinantes producidas mediante sistemas de baculovirus para aumentar la sensibilidad y especificidad de los ensayos serológicos [24]. En el segundo frente, el modelado de nicho ecológico ha permitido predecir la distribución espacial de los vectores: estudios sobre </w:t>
+        <w:t xml:space="preserve">, con el fin de mejorar el diagnóstico serológico de la enfermedad de Carrión; en la misma línea, trabajos recientes evalúan proteínas recombinantes producidas mediante sistemas de baculovirus para aumentar la sensibilidad y especificidad de los ensayos serológicos [10]. En el segundo frente, el modelado de nicho ecológico ha permitido predecir la distribución espacial de los vectores: estudios sobre </w:t>
       </w:r>
       <w:r>
         <w:rPr>
@@ -411,7 +501,7 @@
         <w:t>Lutzomyia peruensis</w:t>
       </w:r>
       <w:r>
-        <w:t xml:space="preserve"> emplean algoritmos de aprendizaje automático y de máxima entropía (máquinas de vectores de soporte, MaxEnt y algoritmos genéticos de predicción de reglas) para anticipar desplazamientos de su nicho bajo escenarios de cambio climático en el Perú [25], y enfoques análogos basados en aprendizaje automático y sistemas de información geográfica se han usado para modelar la distribución de flebótomos vectores en otras regiones [26]. De forma complementaria, la detección molecular de </w:t>
+        <w:t xml:space="preserve"> emplean algoritmos de aprendizaje automático y de máxima entropía (máquinas de vectores de soporte, MaxEnt y algoritmos genéticos de predicción de reglas) para anticipar desplazamientos de su nicho bajo escenarios de cambio climático en el Perú [11], y enfoques análogos basados en aprendizaje automático y sistemas de información geográfica se han usado para modelar la distribución de flebótomos vectores en otras regiones [12]. De forma complementaria, la detección molecular de </w:t>
       </w:r>
       <w:r>
         <w:rPr>
@@ -429,15 +519,16 @@
         <w:t>Lutzomyia</w:t>
       </w:r>
       <w:r>
-        <w:t xml:space="preserve"> sugiere que el rango de transmisión es más amplio de lo que indican los vectores clásicos [27].</w:t>
+        <w:t xml:space="preserve"> sugiere que el rango de transmisión es más amplio de lo que indican los vectores clásicos [13].</w:t>
       </w:r>
     </w:p>
     <w:p>
       <w:pPr>
         <w:pStyle w:val="Para"/>
-      </w:pPr>
-      <w:r>
-        <w:t xml:space="preserve">Más allá de la enfermedad de Carrión, el aprendizaje automático se aplica con éxito a enfermedades vectoriales emparentadas y al uso de datos abiertos peruanos. Vadmal et al. [19] entrenan modelos de árboles potenciados para predecir vectores potenciales de </w:t>
+        <w:ind w:firstLine="0"/>
+      </w:pPr>
+      <w:r>
+        <w:t xml:space="preserve">Más allá de la enfermedad de Carrión, el aprendizaje automático se aplica con éxito a enfermedades vectoriales emparentadas y al uso de datos abiertos peruanos. Vadmal et al. [14] entrenan modelos de árboles potenciados para predecir vectores potenciales de </w:t>
       </w:r>
       <w:r>
         <w:rPr>
@@ -446,7 +537,7 @@
         <w:t>Leishmania</w:t>
       </w:r>
       <w:r>
-        <w:t xml:space="preserve"> en América, identificando focos en Madre de Dios; Nayak et al. [20] revisan el papel de la inteligencia artificial en el control de las enfermedades transmitidas por vectores; y Rufasto-Goche et al. [21] modelan la dinámica espacio-temporal del dengue con veintidós años de vigilancia del MINSA, la misma fuente que se emplea en este trabajo. Sin embargo, hasta donde conocemos, </w:t>
+        <w:t xml:space="preserve"> en América, identificando focos en Madre de Dios; Nayak et al. [15] revisan el papel de la inteligencia artificial en el control de las enfermedades transmitidas por vectores; y Rufasto-Goche et al. [16] modelan la dinámica espacio-temporal del dengue con veintidós años de vigilancia del MINSA, la misma fuente que se emplea en este trabajo. Sin embargo, hasta donde conocemos, </w:t>
       </w:r>
       <w:r>
         <w:rPr>
@@ -461,6 +552,7 @@
     <w:p>
       <w:pPr>
         <w:pStyle w:val="Para"/>
+        <w:ind w:firstLine="0"/>
       </w:pPr>
       <w:r>
         <w:t xml:space="preserve">La contribución de este artículo es cuádruple. Primero, se transforma la vigilancia de casos individuales del MINSA en un panel espacio-temporal a nivel de provincia y semana epidemiológica, con imputación de las semanas sin casos, y se define el objetivo de aprendizaje mediante el </w:t>
@@ -490,13 +582,22 @@
         <w:t>población</w:t>
       </w:r>
       <w:r>
-        <w:t xml:space="preserve"> (censo 2017). Tercero, se comparan una red neuronal y un árbol de decisión bajo </w:t>
-      </w:r>
-      <w:r>
-        <w:rPr>
-          <w:b/>
-        </w:rPr>
-        <w:t>validación temporal estricta</w:t>
+        <w:t xml:space="preserve"> (censo 2017). Tercero, se comparan una red neuronal y </w:t>
+      </w:r>
+      <w:r>
+        <w:rPr>
+          <w:b/>
+        </w:rPr>
+        <w:t>modelos basados en árboles</w:t>
+      </w:r>
+      <w:r>
+        <w:t xml:space="preserve"> (árbol de decisión, Random Forest y Gradient Boosting) bajo </w:t>
+      </w:r>
+      <w:r>
+        <w:rPr>
+          <w:b/>
+        </w:rPr>
+        <w:t>validación temporal de origen móvil</w:t>
       </w:r>
       <w:r>
         <w:t xml:space="preserve">, frente a un baseline epidemiológico, con métricas adecuadas a eventos raros, matrices de confusión, calibración e interpretabilidad. Cuarto, el sistema se despliega como una </w:t>
@@ -530,6 +631,7 @@
     <w:p>
       <w:pPr>
         <w:pStyle w:val="PostHeadPara"/>
+        <w:ind w:firstLine="0"/>
       </w:pPr>
       <w:r>
         <w:rPr>
@@ -538,12 +640,13 @@
         <w:t>Fuente primaria (MINSA).</w:t>
       </w:r>
       <w:r>
-        <w:t xml:space="preserve"> Se emplearon los datos abiertos de vigilancia epidemiológica de la enfermedad de Carrión del Ministerio de Salud del Perú [2], correspondientes al periodo 2000–2024 (~46.120 registros de casos confirmados, con departamento, provincia, ubigeo, año, semana epidemiológica, edad, sexo y fase). Cada registro corresponde a un caso; la fuente no publica las semanas sin casos, lo que se resuelve en el preprocesamiento.</w:t>
+        <w:t xml:space="preserve"> Se emplearon los datos abiertos de vigilancia epidemiológica de la enfermedad de Carrión del Ministerio de Salud del Perú [17], publicados en la Plataforma Nacional de Datos Abiertos (https://www.datosabiertos.gob.pe), correspondientes al periodo 2000–2024 (~46.120 registros de casos confirmados, con departamento, provincia, ubigeo, año, semana epidemiológica, edad, sexo y fase). Cada registro corresponde a un caso; la fuente no publica las semanas sin casos, lo que se resuelve en el preprocesamiento.</w:t>
       </w:r>
     </w:p>
     <w:p>
       <w:pPr>
         <w:pStyle w:val="Para"/>
+        <w:ind w:firstLine="0"/>
       </w:pPr>
       <w:r>
         <w:rPr>
@@ -552,12 +655,13 @@
         <w:t>Clima (NASA POWER).</w:t>
       </w:r>
       <w:r>
-        <w:t xml:space="preserve"> Para el centroide geográfico de cada provincia se descargaron series diarias de precipitación, temperatura a 2 m y humedad relativa de la plataforma NASA POWER [22], agregadas a semana epidemiológica y rezagadas, en reconocimiento de la respuesta diferida del vector a las condiciones ambientales.</w:t>
+        <w:t xml:space="preserve"> Para el centroide geográfico de cada provincia se descargaron series diarias de precipitación, temperatura a 2 m y humedad relativa de la plataforma NASA POWER [18], agregadas a semana epidemiológica y rezagadas, en reconocimiento de la respuesta diferida del vector a las condiciones ambientales.</w:t>
       </w:r>
     </w:p>
     <w:p>
       <w:pPr>
         <w:pStyle w:val="Para"/>
+        <w:ind w:firstLine="0"/>
       </w:pPr>
       <w:r>
         <w:rPr>
@@ -566,7 +670,7 @@
         <w:t>Población (INEI).</w:t>
       </w:r>
       <w:r>
-        <w:t xml:space="preserve"> Se incorporó la población provincial del censo 2017 [23] para calcular la tasa de incidencia por 100.000 habitantes, definida en la Ecuación (1):</w:t>
+        <w:t xml:space="preserve"> Se incorporó la población provincial del censo 2017 [19] para calcular la tasa de incidencia por 100.000 habitantes, definida en la Ecuación (1):</w:t>
       </w:r>
     </w:p>
     <w:p>
@@ -648,6 +752,7 @@
     <w:p>
       <w:pPr>
         <w:pStyle w:val="Para"/>
+        <w:ind w:firstLine="0"/>
       </w:pPr>
       <w:r>
         <w:t xml:space="preserve">donde </w:t>
@@ -697,6 +802,7 @@
     <w:p>
       <w:pPr>
         <w:pStyle w:val="PostHeadPara"/>
+        <w:ind w:firstLine="0"/>
       </w:pPr>
       <w:r>
         <w:t xml:space="preserve">Los casos se agregaron por provincia, año y semana epidemiológica (semanas 1–52; la semana 53 se reasignó a la 52). Se generó la rejilla completa de combinaciones y se imputaron en </w:t>
@@ -741,6 +847,7 @@
     <w:p>
       <w:pPr>
         <w:pStyle w:val="Para"/>
+        <w:ind w:firstLine="0"/>
       </w:pPr>
       <w:r>
         <w:t xml:space="preserve">El </w:t>
@@ -752,7 +859,7 @@
         <w:t>canal endémico</w:t>
       </w:r>
       <w:r>
-        <w:t xml:space="preserve"> es la herramienta estándar de la OPS/MINSA para describir el comportamiento esperado de una enfermedad por semana del año [17]. Para cada provincia </w:t>
+        <w:t xml:space="preserve"> es la herramienta estándar de la OPS/MINSA para describir el comportamiento esperado de una enfermedad por semana del año [2]. Para cada provincia </w:t>
       </w:r>
       <m:oMath>
         <m:r>
@@ -961,6 +1068,7 @@
     <w:p>
       <w:pPr>
         <w:pStyle w:val="Para"/>
+        <w:ind w:firstLine="0"/>
       </w:pPr>
       <w:r>
         <w:t xml:space="preserve">es decir, si en alguna de las </w:t>
@@ -972,7 +1080,43 @@
         <w:t>cuatro semanas siguientes</w:t>
       </w:r>
       <w:r>
-        <w:t xml:space="preserve"> los casos superan el tercer cuartil del canal (zona de epidemia) y son al menos dos. El canal de referencia se construyó exclusivamente con información anterior al punto de predicción, evitando la fuga de información temporal. La clase resultante está fuertemente desbalanceada, con aproximadamente un 7,8 % de brotes.</w:t>
+        <w:t xml:space="preserve"> los casos superan el tercer cuartil del canal (zona de epidemia) y son al menos dos. El canal de referencia se construyó exclusivamente con información anterior al punto de predicción, evitando la fuga de información temporal. La clase resultante está fuertemente desbalanceada y, además, </w:t>
+      </w:r>
+      <w:r>
+        <w:rPr>
+          <w:b/>
+        </w:rPr>
+        <w:t>no estacionaria</w:t>
+      </w:r>
+      <w:r>
+        <w:t xml:space="preserve">: la prevalencia de brotes pasa de cerca del </w:t>
+      </w:r>
+      <w:r>
+        <w:rPr>
+          <w:b/>
+        </w:rPr>
+        <w:t>10 % en los años ≤2019</w:t>
+      </w:r>
+      <w:r>
+        <w:t xml:space="preserve"> a apenas </w:t>
+      </w:r>
+      <w:r>
+        <w:rPr>
+          <w:b/>
+        </w:rPr>
+        <w:t>0,3 % en 2020–2024</w:t>
+      </w:r>
+      <w:r>
+        <w:t xml:space="preserve">. Esta caída no refleja una mejora epidemiológica sino la </w:t>
+      </w:r>
+      <w:r>
+        <w:rPr>
+          <w:b/>
+        </w:rPr>
+        <w:t>subnotificación durante la pandemia de COVID-19</w:t>
+      </w:r>
+      <w:r>
+        <w:t>, cuando la vigilancia de enfermedades endémicas se contrajo (en 2021 ninguna de las 61 provincias supera su canal); este hecho condiciona de manera decisiva la evaluación (Sección 2.7) y la lectura de los resultados.</w:t>
       </w:r>
     </w:p>
     <w:p>
@@ -986,6 +1130,7 @@
     <w:p>
       <w:pPr>
         <w:pStyle w:val="PostHeadPara"/>
+        <w:ind w:firstLine="0"/>
       </w:pPr>
       <w:r>
         <w:t xml:space="preserve">El vector de entrada combina 24 variables: términos autorregresivos de casos (rezagos en </w:t>
@@ -1105,6 +1250,7 @@
     <w:p>
       <w:pPr>
         <w:pStyle w:val="Para"/>
+        <w:ind w:firstLine="0"/>
       </w:pPr>
       <w:r>
         <w:t>Se excluyeron deliberadamente las claves (provincia, año, semana) y el propio canal (</w:t>
@@ -1166,15 +1312,16 @@
         <w:pStyle w:val="Head2"/>
       </w:pPr>
       <w:r>
-        <w:t>Árbol de Decisión</w:t>
+        <w:t>Árboles de decisión y modelos de ensamble</w:t>
       </w:r>
     </w:p>
     <w:p>
       <w:pPr>
         <w:pStyle w:val="PostHeadPara"/>
-      </w:pPr>
-      <w:r>
-        <w:t xml:space="preserve">El árbol de decisión (scikit-learn [7]) divide recursivamente el espacio de atributos buscando, en cada nodo, la partición que maximiza la </w:t>
+        <w:ind w:firstLine="0"/>
+      </w:pPr>
+      <w:r>
+        <w:t xml:space="preserve">El árbol de decisión (scikit-learn [20]) divide recursivamente el espacio de atributos buscando, en cada nodo, la partición que maximiza la </w:t>
       </w:r>
       <w:r>
         <w:rPr>
@@ -1301,6 +1448,7 @@
     <w:p>
       <w:pPr>
         <w:pStyle w:val="Para"/>
+        <w:ind w:firstLine="0"/>
       </w:pPr>
       <w:r>
         <w:t xml:space="preserve">y la ganancia de información de un atributo </w:t>
@@ -1450,6 +1598,7 @@
     <w:p>
       <w:pPr>
         <w:pStyle w:val="Para"/>
+        <w:ind w:firstLine="0"/>
       </w:pPr>
       <w:r>
         <w:t xml:space="preserve">Se evaluaron dos variantes: un árbol </w:t>
@@ -1475,6 +1624,213 @@
     </w:p>
     <w:p>
       <w:pPr>
+        <w:pStyle w:val="Para"/>
+        <w:ind w:firstLine="0"/>
+      </w:pPr>
+      <w:r>
+        <w:t xml:space="preserve">Sobre la misma base se evaluaron dos </w:t>
+      </w:r>
+      <w:r>
+        <w:rPr>
+          <w:b/>
+        </w:rPr>
+        <w:t>ensambles de árboles</w:t>
+      </w:r>
+      <w:r>
+        <w:t xml:space="preserve">, especialmente competitivos en datos tabulares [7], [8], [21]. El </w:t>
+      </w:r>
+      <w:r>
+        <w:rPr>
+          <w:b/>
+        </w:rPr>
+        <w:t>Random Forest</w:t>
+      </w:r>
+      <w:r>
+        <w:t xml:space="preserve"> [21] promedia el voto de un conjunto de árboles entrenados sobre remuestreos </w:t>
+      </w:r>
+      <w:r>
+        <w:rPr>
+          <w:i/>
+        </w:rPr>
+        <w:t>bootstrap</w:t>
+      </w:r>
+      <w:r>
+        <w:t xml:space="preserve"> del panel y subconjuntos aleatorios de variables; su probabilidad de brote es la fracción de árboles que votan por la clase positiva, </w:t>
+      </w:r>
+      <m:oMath>
+        <m:acc>
+          <m:accPr>
+            <m:chr m:val="̂"/>
+          </m:accPr>
+          <m:e>
+            <m:r>
+              <m:t>p</m:t>
+            </m:r>
+          </m:e>
+        </m:acc>
+        <m:r>
+          <m:t>(x)=</m:t>
+        </m:r>
+        <m:f>
+          <m:fPr>
+            <m:type m:val="bar"/>
+          </m:fPr>
+          <m:num>
+            <m:r>
+              <m:t>1</m:t>
+            </m:r>
+          </m:num>
+          <m:den>
+            <m:r>
+              <m:t>T</m:t>
+            </m:r>
+          </m:den>
+        </m:f>
+        <m:nary>
+          <m:naryPr>
+            <m:chr m:val="∑"/>
+            <m:limLoc m:val="subSup"/>
+            <m:grow m:val="1"/>
+            <m:subHide m:val="off"/>
+            <m:supHide m:val="off"/>
+          </m:naryPr>
+          <m:sub>
+            <m:r>
+              <m:t>t=1</m:t>
+            </m:r>
+          </m:sub>
+          <m:sup>
+            <m:r>
+              <m:t>T</m:t>
+            </m:r>
+          </m:sup>
+          <m:e>
+            <m:sSub>
+              <m:e>
+                <m:r>
+                  <m:t>h</m:t>
+                </m:r>
+              </m:e>
+              <m:sub>
+                <m:r>
+                  <m:t>t</m:t>
+                </m:r>
+              </m:sub>
+            </m:sSub>
+          </m:e>
+        </m:nary>
+        <m:r>
+          <m:t>(x)</m:t>
+        </m:r>
+      </m:oMath>
+      <w:r>
+        <w:t xml:space="preserve">, lo que reduce la varianza del árbol individual. El </w:t>
+      </w:r>
+      <w:r>
+        <w:rPr>
+          <w:b/>
+        </w:rPr>
+        <w:t>Gradient Boosting</w:t>
+      </w:r>
+      <w:r>
+        <w:t xml:space="preserve"> [21], en su variante por histogramas, ajusta árboles de forma </w:t>
+      </w:r>
+      <w:r>
+        <w:rPr>
+          <w:b/>
+        </w:rPr>
+        <w:t>aditiva</w:t>
+      </w:r>
+      <w:r>
+        <w:t xml:space="preserve">, </w:t>
+      </w:r>
+      <m:oMath>
+        <m:sSub>
+          <m:e>
+            <m:r>
+              <m:t>F</m:t>
+            </m:r>
+          </m:e>
+          <m:sub>
+            <m:r>
+              <m:t>M</m:t>
+            </m:r>
+          </m:sub>
+        </m:sSub>
+        <m:r>
+          <m:t>(x)=</m:t>
+        </m:r>
+        <m:nary>
+          <m:naryPr>
+            <m:chr m:val="∑"/>
+            <m:limLoc m:val="subSup"/>
+            <m:grow m:val="1"/>
+            <m:subHide m:val="off"/>
+            <m:supHide m:val="off"/>
+          </m:naryPr>
+          <m:sub>
+            <m:r>
+              <m:t>m=1</m:t>
+            </m:r>
+          </m:sub>
+          <m:sup>
+            <m:r>
+              <m:t>M</m:t>
+            </m:r>
+          </m:sup>
+          <m:e>
+            <m:r>
+              <m:t>ν</m:t>
+            </m:r>
+          </m:e>
+        </m:nary>
+        <m:sSub>
+          <m:e>
+            <m:r>
+              <m:t>h</m:t>
+            </m:r>
+          </m:e>
+          <m:sub>
+            <m:r>
+              <m:t>m</m:t>
+            </m:r>
+          </m:sub>
+        </m:sSub>
+        <m:r>
+          <m:t>(x)</m:t>
+        </m:r>
+      </m:oMath>
+      <w:r>
+        <w:t xml:space="preserve">, donde cada árbol </w:t>
+      </w:r>
+      <m:oMath>
+        <m:sSub>
+          <m:e>
+            <m:r>
+              <m:t>h</m:t>
+            </m:r>
+          </m:e>
+          <m:sub>
+            <m:r>
+              <m:t>m</m:t>
+            </m:r>
+          </m:sub>
+        </m:sSub>
+      </m:oMath>
+      <w:r>
+        <w:t xml:space="preserve"> corrige el error del conjunto previo y </w:t>
+      </w:r>
+      <m:oMath>
+        <m:r>
+          <m:t>ν</m:t>
+        </m:r>
+      </m:oMath>
+      <w:r>
+        <w:t xml:space="preserve"> es la tasa de aprendizaje. Ambos ensambles se entrenan con ponderación de clases (Sección 2.6) y, frente al árbol único, mejoran la precisión sin incurrir en el sobreajuste del árbol sin poda.</w:t>
+      </w:r>
+    </w:p>
+    <w:p>
+      <w:pPr>
         <w:pStyle w:val="Head2"/>
       </w:pPr>
       <w:r>
@@ -1484,9 +1840,10 @@
     <w:p>
       <w:pPr>
         <w:pStyle w:val="PostHeadPara"/>
-      </w:pPr>
-      <w:r>
-        <w:t xml:space="preserve">La red neuronal prealimentada (Keras [9] sobre TensorFlow [8]) tiene una arquitectura </w:t>
+        <w:ind w:firstLine="0"/>
+      </w:pPr>
+      <w:r>
+        <w:t xml:space="preserve">La red neuronal prealimentada (Keras [22] sobre TensorFlow [23]) tiene una arquitectura </w:t>
       </w:r>
       <m:oMath>
         <m:r>
@@ -1620,6 +1977,7 @@
     <w:p>
       <w:pPr>
         <w:pStyle w:val="Para"/>
+        <w:ind w:firstLine="0"/>
       </w:pPr>
       <w:r>
         <w:t xml:space="preserve">donde </w:t>
@@ -1687,7 +2045,7 @@
         <w:t>ReLU</w:t>
       </w:r>
       <w:r>
-        <w:t xml:space="preserve"> [14], Ecuación (7), y la capa de salida la </w:t>
+        <w:t xml:space="preserve"> [24], Ecuación (7), y la capa de salida la </w:t>
       </w:r>
       <w:r>
         <w:rPr>
@@ -1788,6 +2146,7 @@
     <w:p>
       <w:pPr>
         <w:pStyle w:val="Para"/>
+        <w:ind w:firstLine="0"/>
       </w:pPr>
       <w:r>
         <w:t xml:space="preserve">Antes de entrar a la red, cada variable se normaliza mediante escalado </w:t>
@@ -1899,6 +2258,7 @@
     <w:p>
       <w:pPr>
         <w:pStyle w:val="Para"/>
+        <w:ind w:firstLine="0"/>
       </w:pPr>
       <w:r>
         <w:t xml:space="preserve">La red se entrena minimizando la </w:t>
@@ -1910,7 +2270,7 @@
         <w:t>entropía cruzada binaria</w:t>
       </w:r>
       <w:r>
-        <w:t>, Ecuación (10), mediante el optimizador Adam [10]:</w:t>
+        <w:t>, Ecuación (10), mediante el optimizador Adam [25]:</w:t>
       </w:r>
     </w:p>
     <w:p>
@@ -2071,6 +2431,7 @@
     <w:p>
       <w:pPr>
         <w:pStyle w:val="PostHeadPara"/>
+        <w:ind w:firstLine="0"/>
       </w:pPr>
       <w:r>
         <w:t xml:space="preserve">Dado que los brotes son raros, ambos modelos se entrenan con ponderación de clases. El peso de la clase </w:t>
@@ -2181,6 +2542,7 @@
     <w:p>
       <w:pPr>
         <w:pStyle w:val="Para"/>
+        <w:ind w:firstLine="0"/>
       </w:pPr>
       <w:r>
         <w:t>de modo que la clase minoritaria (brote) recibe mayor peso en la función de pérdida.</w:t>
@@ -2197,6 +2559,7 @@
     <w:p>
       <w:pPr>
         <w:pStyle w:val="PostHeadPara"/>
+        <w:ind w:firstLine="0"/>
       </w:pPr>
       <w:r>
         <w:t xml:space="preserve">Se empleó </w:t>
@@ -2205,10 +2568,95 @@
         <w:rPr>
           <w:b/>
         </w:rPr>
-        <w:t>validación temporal</w:t>
-      </w:r>
-      <w:r>
-        <w:t xml:space="preserve">: entrenamiento con los años </w:t>
+        <w:t>validación temporal de origen móvil</w:t>
+      </w:r>
+      <w:r>
+        <w:t xml:space="preserve"> (</w:t>
+      </w:r>
+      <w:r>
+        <w:rPr>
+          <w:i/>
+        </w:rPr>
+        <w:t>rolling-origin</w:t>
+      </w:r>
+      <w:r>
+        <w:t xml:space="preserve">): para cada año objetivo </w:t>
+      </w:r>
+      <m:oMath>
+        <m:r>
+          <m:t>Y∈{2016,…,2024}</m:t>
+        </m:r>
+      </m:oMath>
+      <w:r>
+        <w:t xml:space="preserve"> el modelo se entrena con los años </w:t>
+      </w:r>
+      <m:oMath>
+        <m:r>
+          <m:t>≤Y−2</m:t>
+        </m:r>
+      </m:oMath>
+      <w:r>
+        <w:t xml:space="preserve">, se elige el </w:t>
+      </w:r>
+      <w:r>
+        <w:rPr>
+          <w:b/>
+        </w:rPr>
+        <w:t>umbral de decisión</w:t>
+      </w:r>
+      <w:r>
+        <w:t xml:space="preserve"> que maximiza </w:t>
+      </w:r>
+      <m:oMath>
+        <m:sSub>
+          <m:e>
+            <m:r>
+              <m:t>F</m:t>
+            </m:r>
+          </m:e>
+          <m:sub>
+            <m:r>
+              <m:t>1</m:t>
+            </m:r>
+          </m:sub>
+        </m:sSub>
+      </m:oMath>
+      <w:r>
+        <w:t xml:space="preserve"> sobre un año de </w:t>
+      </w:r>
+      <w:r>
+        <w:rPr>
+          <w:b/>
+        </w:rPr>
+        <w:t>validación</w:t>
+      </w:r>
+      <w:r>
+        <w:t xml:space="preserve"> anterior a </w:t>
+      </w:r>
+      <m:oMath>
+        <m:r>
+          <m:t>Y</m:t>
+        </m:r>
+      </m:oMath>
+      <w:r>
+        <w:t xml:space="preserve"> (sin usar el año de prueba) y se predice </w:t>
+      </w:r>
+      <m:oMath>
+        <m:r>
+          <m:t>Y</m:t>
+        </m:r>
+      </m:oMath>
+      <w:r>
+        <w:t>; las predicciones de todos los años se agrupan (</w:t>
+      </w:r>
+      <w:r>
+        <w:rPr>
+          <w:i/>
+        </w:rPr>
+        <w:t>pooling</w:t>
+      </w:r>
+      <w:r>
+        <w:t xml:space="preserve">) para el cómputo de métricas. Este esquema es necesario aquí porque la prevalencia de brotes no es estacionaria (Sección 2.2): una única partición reciente caería sobre el hueco de subnotificación de 2020–2024 y arrojaría métricas engañosas. Como análisis de robustez se reporta también esa partición única (entrenamiento </w:t>
       </w:r>
       <m:oMath>
         <m:r>
@@ -2216,7 +2664,7 @@
         </m:r>
       </m:oMath>
       <w:r>
-        <w:t xml:space="preserve"> y prueba con 2020–2024, sin mezclar años entre particiones. A partir de la matriz de confusión (verdaderos y falsos positivos y negativos: </w:t>
+        <w:t xml:space="preserve">, prueba 2020–2024). En ningún caso el año de prueba interviene en el entrenamiento ni en la elección del umbral, evitando la fuga temporal. A partir de la matriz de confusión (verdaderos y falsos positivos y negativos: </w:t>
       </w:r>
       <m:oMath>
         <m:r>
@@ -2468,6 +2916,181 @@
     <w:p>
       <w:pPr>
         <w:pStyle w:val="Para"/>
+        <w:ind w:firstLine="0"/>
+      </w:pPr>
+      <w:r>
+        <w:t xml:space="preserve">Junto a </w:t>
+      </w:r>
+      <m:oMath>
+        <m:sSub>
+          <m:e>
+            <m:r>
+              <m:t>F</m:t>
+            </m:r>
+          </m:e>
+          <m:sub>
+            <m:r>
+              <m:t>1</m:t>
+            </m:r>
+          </m:sub>
+        </m:sSub>
+      </m:oMath>
+      <w:r>
+        <w:t xml:space="preserve"> se reporta </w:t>
+      </w:r>
+      <m:oMath>
+        <m:sSub>
+          <m:e>
+            <m:r>
+              <m:t>F</m:t>
+            </m:r>
+          </m:e>
+          <m:sub>
+            <m:r>
+              <m:t>2</m:t>
+            </m:r>
+          </m:sub>
+        </m:sSub>
+      </m:oMath>
+      <w:r>
+        <w:t xml:space="preserve"> —la </w:t>
+      </w:r>
+      <m:oMath>
+        <m:sSub>
+          <m:e>
+            <m:r>
+              <m:t>F</m:t>
+            </m:r>
+          </m:e>
+          <m:sub>
+            <m:r>
+              <m:t>β</m:t>
+            </m:r>
+          </m:sub>
+        </m:sSub>
+      </m:oMath>
+      <w:r>
+        <w:t xml:space="preserve"> con </w:t>
+      </w:r>
+      <m:oMath>
+        <m:r>
+          <m:t>β=2</m:t>
+        </m:r>
+      </m:oMath>
+      <w:r>
+        <w:t xml:space="preserve">, esto es </w:t>
+      </w:r>
+      <m:oMath>
+        <m:sSub>
+          <m:e>
+            <m:r>
+              <m:t>F</m:t>
+            </m:r>
+          </m:e>
+          <m:sub>
+            <m:r>
+              <m:t>β</m:t>
+            </m:r>
+          </m:sub>
+        </m:sSub>
+        <m:r>
+          <m:t>=(1+</m:t>
+        </m:r>
+        <m:sSup>
+          <m:e>
+            <m:r>
+              <m:t>β</m:t>
+            </m:r>
+          </m:e>
+          <m:sup>
+            <m:r>
+              <m:t>2</m:t>
+            </m:r>
+          </m:sup>
+        </m:sSup>
+        <m:r>
+          <m:t>)</m:t>
+        </m:r>
+        <m:f>
+          <m:fPr>
+            <m:type m:val="bar"/>
+          </m:fPr>
+          <m:num>
+            <m:r>
+              <m:t>P·R</m:t>
+            </m:r>
+          </m:num>
+          <m:den>
+            <m:sSup>
+              <m:e>
+                <m:r>
+                  <m:t>β</m:t>
+                </m:r>
+              </m:e>
+              <m:sup>
+                <m:r>
+                  <m:t>2</m:t>
+                </m:r>
+              </m:sup>
+            </m:sSup>
+            <m:r>
+              <m:t>P+R</m:t>
+            </m:r>
+          </m:den>
+        </m:f>
+      </m:oMath>
+      <w:r>
+        <w:t xml:space="preserve">—, que pondera más la sensibilidad, lo apropiado para una </w:t>
+      </w:r>
+      <w:r>
+        <w:rPr>
+          <w:b/>
+        </w:rPr>
+        <w:t>alerta temprana</w:t>
+      </w:r>
+      <w:r>
+        <w:t xml:space="preserve"> donde omitir un brote (un falso negativo) es más costoso que una falsa alarma. El </w:t>
+      </w:r>
+      <w:r>
+        <w:rPr>
+          <w:b/>
+        </w:rPr>
+        <w:t>umbral de decisión</w:t>
+      </w:r>
+      <w:r>
+        <w:t xml:space="preserve"> que separa las clases no se fija en 0,5 sino que se </w:t>
+      </w:r>
+      <w:r>
+        <w:rPr>
+          <w:b/>
+        </w:rPr>
+        <w:t>optimiza en validación</w:t>
+      </w:r>
+      <w:r>
+        <w:t xml:space="preserve"> maximizando </w:t>
+      </w:r>
+      <m:oMath>
+        <m:sSub>
+          <m:e>
+            <m:r>
+              <m:t>F</m:t>
+            </m:r>
+          </m:e>
+          <m:sub>
+            <m:r>
+              <m:t>1</m:t>
+            </m:r>
+          </m:sub>
+        </m:sSub>
+      </m:oMath>
+      <w:r>
+        <w:t>, lo que es decisivo en problemas tan desbalanceados.</w:t>
+      </w:r>
+    </w:p>
+    <w:p>
+      <w:pPr>
+        <w:pStyle w:val="Para"/>
+        <w:ind w:firstLine="0"/>
       </w:pPr>
       <w:r>
         <w:t xml:space="preserve">Dado el fuerte desbalance, las métricas primarias son la sensibilidad de brotes y el </w:t>
@@ -2575,6 +3198,7 @@
     <w:p>
       <w:pPr>
         <w:pStyle w:val="Para"/>
+        <w:ind w:firstLine="0"/>
       </w:pPr>
       <w:r>
         <w:t xml:space="preserve">La </w:t>
@@ -2708,6 +3332,7 @@
     <w:p>
       <w:pPr>
         <w:pStyle w:val="Para"/>
+        <w:ind w:firstLine="0"/>
       </w:pPr>
       <w:r>
         <w:t xml:space="preserve">La </w:t>
@@ -2733,9 +3358,10 @@
     <w:p>
       <w:pPr>
         <w:pStyle w:val="PostHeadPara"/>
-      </w:pPr>
-      <w:r>
-        <w:t xml:space="preserve">El sistema separa un mundo de entrenamiento en Python, que se ejecuta una sola vez, de un mundo de inferencia en el navegador. La red neuronal se exporta a TensorFlow.js [16] y el árbol a un JSON plano que el navegador recorre. La aplicación web es una página estática que muestra un </w:t>
+        <w:ind w:firstLine="0"/>
+      </w:pPr>
+      <w:r>
+        <w:t xml:space="preserve">El sistema separa un mundo de entrenamiento en Python, que se ejecuta una sola vez, de un mundo de inferencia en el navegador. La red neuronal se exporta a TensorFlow.js [26] y el árbol a un JSON plano que el navegador recorre. La aplicación web es una página estática que muestra un </w:t>
       </w:r>
       <w:r>
         <w:rPr>
@@ -2766,9 +3392,28 @@
     <w:p>
       <w:pPr>
         <w:pStyle w:val="PostHeadPara"/>
-      </w:pPr>
-      <w:r>
-        <w:t xml:space="preserve">La Tabla 1 resume el desempeño sobre el conjunto de prueba temporal (2020–2024). La </w:t>
+        <w:ind w:firstLine="0"/>
+      </w:pPr>
+      <w:r>
+        <w:t xml:space="preserve">La Tabla 1 resume el desempeño bajo </w:t>
+      </w:r>
+      <w:r>
+        <w:rPr>
+          <w:b/>
+        </w:rPr>
+        <w:t>validación de origen móvil</w:t>
+      </w:r>
+      <w:r>
+        <w:t xml:space="preserve"> (2016–2024), con el umbral de cada modelo optimizado en validación. El </w:t>
+      </w:r>
+      <w:r>
+        <w:rPr>
+          <w:b/>
+        </w:rPr>
+        <w:t>Random Forest</w:t>
+      </w:r>
+      <w:r>
+        <w:t xml:space="preserve"> logra el mejor desempeño global: la mayor precisión (0,47), el mejor F1 (0,47), el mayor AUC-ROC (0,94) y el menor Brier (0,009), seguido muy de cerca por la </w:t>
       </w:r>
       <w:r>
         <w:rPr>
@@ -2777,7 +3422,52 @@
         <w:t>red neuronal</w:t>
       </w:r>
       <w:r>
-        <w:t xml:space="preserve"> logra el mejor equilibrio: la mayor sensibilidad (0,81), el mejor AUC-PR (0,745) y el menor Brier (0,012). El árbol con poda mejora drásticamente al árbol sin poda en AUC-PR (0,625 frente a 0,091), y ambos modelos de aprendizaje superan al baseline del canal endémico en las métricas centradas en brotes. La Figura 1 ilustra visualmente este contraste: las barras de sensibilidad, AUC-PR y F1 muestran a la red neuronal por encima del resto en AUC-PR, y al árbol sin poda como el de peor AUC-PR pese a una exactitud global alta.</w:t>
+        <w:t xml:space="preserve"> (F1 0,46). El </w:t>
+      </w:r>
+      <w:r>
+        <w:rPr>
+          <w:b/>
+        </w:rPr>
+        <w:t>Gradient Boosting</w:t>
+      </w:r>
+      <w:r>
+        <w:t xml:space="preserve"> alcanza la mayor sensibilidad (0,53) y el mejor AUC-PR (0,514), a costa de más falsas alarmas. Los tres modelos de aprendizaje superan al árbol con poda y, sobre todo, al </w:t>
+      </w:r>
+      <w:r>
+        <w:rPr>
+          <w:b/>
+        </w:rPr>
+        <w:t>árbol sin poda</w:t>
+      </w:r>
+      <w:r>
+        <w:t xml:space="preserve">, que se desploma en AUC-PR (0,09): la firma del sobreajuste pese a una exactitud global alta. Todos los modelos de aprendizaje igualan o superan al baseline del canal endémico en las métricas centradas en brotes. La Figura 1 ilustra este contraste sobre sensibilidad, AUC-PR y F1. Que un </w:t>
+      </w:r>
+      <w:r>
+        <w:rPr>
+          <w:b/>
+        </w:rPr>
+        <w:t>ensamble de árboles</w:t>
+      </w:r>
+      <w:r>
+        <w:t xml:space="preserve"> encabece la comparación es coherente con la evidencia de que los modelos basados en árboles dominan en datos tabulares [7], [8].</w:t>
+      </w:r>
+    </w:p>
+    <w:p>
+      <w:pPr>
+        <w:pStyle w:val="Para"/>
+        <w:ind w:firstLine="0"/>
+      </w:pPr>
+      <w:r>
+        <w:t xml:space="preserve">A modo de </w:t>
+      </w:r>
+      <w:r>
+        <w:rPr>
+          <w:b/>
+        </w:rPr>
+        <w:t>robustez</w:t>
+      </w:r>
+      <w:r>
+        <w:t>, bajo la partición única pre/pospandemia (entrenamiento ≤2019, prueba 2020–2024) las métricas dependientes del umbral son más altas (p. ej. F1 de 0,65–0,67 para la red neuronal y el Random Forest), pero se calculan sobre apenas 42 brotes concentrados en 2024 y, por la subnotificación pandémica (Sección 2.2), no son representativas; por ello se adopta el origen móvil como evaluación principal.</w:t>
       </w:r>
     </w:p>
     <w:p>
@@ -2785,7 +3475,7 @@
         <w:pStyle w:val="TableCaption"/>
       </w:pPr>
       <w:r>
-        <w:t>Tabla 1. Desempeño en el conjunto de prueba temporal (2020–2024).</w:t>
+        <w:t>Tabla 1. Desempeño bajo validación de origen móvil (cortes anuales 2016–2024, predicciones agrupadas). En negrita, el mejor valor por columna.</w:t>
       </w:r>
     </w:p>
     <w:tbl>
@@ -2806,18 +3496,19 @@
         </w:tblBorders>
       </w:tblPr>
       <w:tblGrid>
-        <w:gridCol w:w="1251"/>
-        <w:gridCol w:w="1251"/>
-        <w:gridCol w:w="1251"/>
-        <w:gridCol w:w="1251"/>
-        <w:gridCol w:w="1251"/>
-        <w:gridCol w:w="1251"/>
-        <w:gridCol w:w="1251"/>
+        <w:gridCol w:w="1095"/>
+        <w:gridCol w:w="1095"/>
+        <w:gridCol w:w="1095"/>
+        <w:gridCol w:w="1095"/>
+        <w:gridCol w:w="1095"/>
+        <w:gridCol w:w="1095"/>
+        <w:gridCol w:w="1095"/>
+        <w:gridCol w:w="1095"/>
       </w:tblGrid>
       <w:tr>
         <w:tc>
           <w:tcPr>
-            <w:tcW w:type="dxa" w:w="2448"/>
+            <w:tcW w:type="dxa" w:w="2189"/>
             <w:shd w:val="clear" w:color="auto" w:fill="ECECEC"/>
             <w:tcBorders>
               <w:bottom w:val="single" w:sz="6" w:space="0" w:color="000000"/>
@@ -2844,7 +3535,7 @@
         </w:tc>
         <w:tc>
           <w:tcPr>
-            <w:tcW w:type="dxa" w:w="1480"/>
+            <w:tcW w:type="dxa" w:w="1251"/>
             <w:shd w:val="clear" w:color="auto" w:fill="ECECEC"/>
             <w:tcBorders>
               <w:bottom w:val="single" w:sz="6" w:space="0" w:color="000000"/>
@@ -2871,7 +3562,7 @@
         </w:tc>
         <w:tc>
           <w:tcPr>
-            <w:tcW w:type="dxa" w:w="1110"/>
+            <w:tcW w:type="dxa" w:w="938"/>
             <w:shd w:val="clear" w:color="auto" w:fill="ECECEC"/>
             <w:tcBorders>
               <w:bottom w:val="single" w:sz="6" w:space="0" w:color="000000"/>
@@ -2898,7 +3589,7 @@
         </w:tc>
         <w:tc>
           <w:tcPr>
-            <w:tcW w:type="dxa" w:w="634"/>
+            <w:tcW w:type="dxa" w:w="834"/>
             <w:shd w:val="clear" w:color="auto" w:fill="ECECEC"/>
             <w:tcBorders>
               <w:bottom w:val="single" w:sz="6" w:space="0" w:color="000000"/>
@@ -2925,7 +3616,7 @@
         </w:tc>
         <w:tc>
           <w:tcPr>
-            <w:tcW w:type="dxa" w:w="1110"/>
+            <w:tcW w:type="dxa" w:w="834"/>
             <w:shd w:val="clear" w:color="auto" w:fill="ECECEC"/>
             <w:tcBorders>
               <w:bottom w:val="single" w:sz="6" w:space="0" w:color="000000"/>
@@ -2946,13 +3637,13 @@
                 <w:b/>
                 <w:sz w:val="16"/>
               </w:rPr>
-              <w:t>AUC-PR</w:t>
+              <w:t>F2</w:t>
             </w:r>
           </w:p>
         </w:tc>
         <w:tc>
           <w:tcPr>
-            <w:tcW w:type="dxa" w:w="863"/>
+            <w:tcW w:type="dxa" w:w="938"/>
             <w:shd w:val="clear" w:color="auto" w:fill="ECECEC"/>
             <w:tcBorders>
               <w:bottom w:val="single" w:sz="6" w:space="0" w:color="000000"/>
@@ -2973,13 +3664,13 @@
                 <w:b/>
                 <w:sz w:val="16"/>
               </w:rPr>
-              <w:t>AUC-ROC</w:t>
+              <w:t>AUC-PR</w:t>
             </w:r>
           </w:p>
         </w:tc>
         <w:tc>
           <w:tcPr>
-            <w:tcW w:type="dxa" w:w="1110"/>
+            <w:tcW w:type="dxa" w:w="834"/>
             <w:shd w:val="clear" w:color="auto" w:fill="ECECEC"/>
             <w:tcBorders>
               <w:bottom w:val="single" w:sz="6" w:space="0" w:color="000000"/>
@@ -3000,6 +3691,33 @@
                 <w:b/>
                 <w:sz w:val="16"/>
               </w:rPr>
+              <w:t>AUC-ROC</w:t>
+            </w:r>
+          </w:p>
+        </w:tc>
+        <w:tc>
+          <w:tcPr>
+            <w:tcW w:type="dxa" w:w="938"/>
+            <w:shd w:val="clear" w:color="auto" w:fill="ECECEC"/>
+            <w:tcBorders>
+              <w:bottom w:val="single" w:sz="6" w:space="0" w:color="000000"/>
+            </w:tcBorders>
+          </w:tcPr>
+          <w:p>
+            <w:pPr>
+              <w:jc w:val="center"/>
+            </w:pPr>
+            <w:r>
+              <w:rPr>
+                <w:b/>
+                <w:sz w:val="16"/>
+              </w:rPr>
+            </w:r>
+            <w:r>
+              <w:rPr>
+                <w:b/>
+                <w:sz w:val="16"/>
+              </w:rPr>
               <w:t>Brier</w:t>
             </w:r>
           </w:p>
@@ -3008,7 +3726,7 @@
       <w:tr>
         <w:tc>
           <w:tcPr>
-            <w:tcW w:type="dxa" w:w="2448"/>
+            <w:tcW w:type="dxa" w:w="2189"/>
           </w:tcPr>
           <w:p>
             <w:pPr>
@@ -3023,13 +3741,13 @@
               <w:rPr>
                 <w:sz w:val="16"/>
               </w:rPr>
-              <w:t>Red Neuronal</w:t>
+              <w:t>Random Forest</w:t>
             </w:r>
           </w:p>
         </w:tc>
         <w:tc>
           <w:tcPr>
-            <w:tcW w:type="dxa" w:w="1480"/>
+            <w:tcW w:type="dxa" w:w="1251"/>
           </w:tcPr>
           <w:p>
             <w:pPr>
@@ -3042,16 +3760,15 @@
             </w:r>
             <w:r>
               <w:rPr>
-                <w:b/>
-                <w:sz w:val="16"/>
-              </w:rPr>
-              <w:t>0,81</w:t>
+                <w:sz w:val="16"/>
+              </w:rPr>
+              <w:t>0,46</w:t>
             </w:r>
           </w:p>
         </w:tc>
         <w:tc>
           <w:tcPr>
-            <w:tcW w:type="dxa" w:w="1110"/>
+            <w:tcW w:type="dxa" w:w="938"/>
           </w:tcPr>
           <w:p>
             <w:pPr>
@@ -3064,15 +3781,16 @@
             </w:r>
             <w:r>
               <w:rPr>
-                <w:sz w:val="16"/>
-              </w:rPr>
-              <w:t>0,26</w:t>
+                <w:b/>
+                <w:sz w:val="16"/>
+              </w:rPr>
+              <w:t>0,47</w:t>
             </w:r>
           </w:p>
         </w:tc>
         <w:tc>
           <w:tcPr>
-            <w:tcW w:type="dxa" w:w="634"/>
+            <w:tcW w:type="dxa" w:w="834"/>
           </w:tcPr>
           <w:p>
             <w:pPr>
@@ -3085,15 +3803,16 @@
             </w:r>
             <w:r>
               <w:rPr>
-                <w:sz w:val="16"/>
-              </w:rPr>
-              <w:t>0,39</w:t>
+                <w:b/>
+                <w:sz w:val="16"/>
+              </w:rPr>
+              <w:t>0,47</w:t>
             </w:r>
           </w:p>
         </w:tc>
         <w:tc>
           <w:tcPr>
-            <w:tcW w:type="dxa" w:w="1110"/>
+            <w:tcW w:type="dxa" w:w="834"/>
           </w:tcPr>
           <w:p>
             <w:pPr>
@@ -3106,16 +3825,15 @@
             </w:r>
             <w:r>
               <w:rPr>
-                <w:b/>
-                <w:sz w:val="16"/>
-              </w:rPr>
-              <w:t>0,745</w:t>
+                <w:sz w:val="16"/>
+              </w:rPr>
+              <w:t>0,47</w:t>
             </w:r>
           </w:p>
         </w:tc>
         <w:tc>
           <w:tcPr>
-            <w:tcW w:type="dxa" w:w="863"/>
+            <w:tcW w:type="dxa" w:w="938"/>
           </w:tcPr>
           <w:p>
             <w:pPr>
@@ -3130,13 +3848,13 @@
               <w:rPr>
                 <w:sz w:val="16"/>
               </w:rPr>
-              <w:t>0,983</w:t>
+              <w:t>0,506</w:t>
             </w:r>
           </w:p>
         </w:tc>
         <w:tc>
           <w:tcPr>
-            <w:tcW w:type="dxa" w:w="1110"/>
+            <w:tcW w:type="dxa" w:w="834"/>
           </w:tcPr>
           <w:p>
             <w:pPr>
@@ -3152,7 +3870,29 @@
                 <w:b/>
                 <w:sz w:val="16"/>
               </w:rPr>
-              <w:t>0,012</w:t>
+              <w:t>0,94</w:t>
+            </w:r>
+          </w:p>
+        </w:tc>
+        <w:tc>
+          <w:tcPr>
+            <w:tcW w:type="dxa" w:w="938"/>
+          </w:tcPr>
+          <w:p>
+            <w:pPr>
+              <w:jc w:val="center"/>
+            </w:pPr>
+            <w:r>
+              <w:rPr>
+                <w:sz w:val="16"/>
+              </w:rPr>
+            </w:r>
+            <w:r>
+              <w:rPr>
+                <w:b/>
+                <w:sz w:val="16"/>
+              </w:rPr>
+              <w:t>0,009</w:t>
             </w:r>
           </w:p>
         </w:tc>
@@ -3160,7 +3900,7 @@
       <w:tr>
         <w:tc>
           <w:tcPr>
-            <w:tcW w:type="dxa" w:w="2448"/>
+            <w:tcW w:type="dxa" w:w="2189"/>
           </w:tcPr>
           <w:p>
             <w:pPr>
@@ -3175,13 +3915,13 @@
               <w:rPr>
                 <w:sz w:val="16"/>
               </w:rPr>
-              <w:t>Árbol (poda 8)</w:t>
+              <w:t>Red Neuronal</w:t>
             </w:r>
           </w:p>
         </w:tc>
         <w:tc>
           <w:tcPr>
-            <w:tcW w:type="dxa" w:w="1480"/>
+            <w:tcW w:type="dxa" w:w="1251"/>
           </w:tcPr>
           <w:p>
             <w:pPr>
@@ -3196,13 +3936,13 @@
               <w:rPr>
                 <w:sz w:val="16"/>
               </w:rPr>
-              <w:t>0,71</w:t>
+              <w:t>0,48</w:t>
             </w:r>
           </w:p>
         </w:tc>
         <w:tc>
           <w:tcPr>
-            <w:tcW w:type="dxa" w:w="1110"/>
+            <w:tcW w:type="dxa" w:w="938"/>
           </w:tcPr>
           <w:p>
             <w:pPr>
@@ -3217,13 +3957,13 @@
               <w:rPr>
                 <w:sz w:val="16"/>
               </w:rPr>
-              <w:t>0,07</w:t>
+              <w:t>0,44</w:t>
             </w:r>
           </w:p>
         </w:tc>
         <w:tc>
           <w:tcPr>
-            <w:tcW w:type="dxa" w:w="634"/>
+            <w:tcW w:type="dxa" w:w="834"/>
           </w:tcPr>
           <w:p>
             <w:pPr>
@@ -3238,13 +3978,13 @@
               <w:rPr>
                 <w:sz w:val="16"/>
               </w:rPr>
-              <w:t>0,13</w:t>
+              <w:t>0,46</w:t>
             </w:r>
           </w:p>
         </w:tc>
         <w:tc>
           <w:tcPr>
-            <w:tcW w:type="dxa" w:w="1110"/>
+            <w:tcW w:type="dxa" w:w="834"/>
           </w:tcPr>
           <w:p>
             <w:pPr>
@@ -3259,13 +3999,13 @@
               <w:rPr>
                 <w:sz w:val="16"/>
               </w:rPr>
-              <w:t>0,625</w:t>
+              <w:t>0,47</w:t>
             </w:r>
           </w:p>
         </w:tc>
         <w:tc>
           <w:tcPr>
-            <w:tcW w:type="dxa" w:w="863"/>
+            <w:tcW w:type="dxa" w:w="938"/>
           </w:tcPr>
           <w:p>
             <w:pPr>
@@ -3280,13 +4020,13 @@
               <w:rPr>
                 <w:sz w:val="16"/>
               </w:rPr>
-              <w:t>0,871</w:t>
+              <w:t>0,509</w:t>
             </w:r>
           </w:p>
         </w:tc>
         <w:tc>
           <w:tcPr>
-            <w:tcW w:type="dxa" w:w="1110"/>
+            <w:tcW w:type="dxa" w:w="834"/>
           </w:tcPr>
           <w:p>
             <w:pPr>
@@ -3301,7 +4041,28 @@
               <w:rPr>
                 <w:sz w:val="16"/>
               </w:rPr>
-              <w:t>0,015</w:t>
+              <w:t>0,93</w:t>
+            </w:r>
+          </w:p>
+        </w:tc>
+        <w:tc>
+          <w:tcPr>
+            <w:tcW w:type="dxa" w:w="938"/>
+          </w:tcPr>
+          <w:p>
+            <w:pPr>
+              <w:jc w:val="center"/>
+            </w:pPr>
+            <w:r>
+              <w:rPr>
+                <w:sz w:val="16"/>
+              </w:rPr>
+            </w:r>
+            <w:r>
+              <w:rPr>
+                <w:sz w:val="16"/>
+              </w:rPr>
+              <w:t>0,021</w:t>
             </w:r>
           </w:p>
         </w:tc>
@@ -3309,7 +4070,7 @@
       <w:tr>
         <w:tc>
           <w:tcPr>
-            <w:tcW w:type="dxa" w:w="2448"/>
+            <w:tcW w:type="dxa" w:w="2189"/>
           </w:tcPr>
           <w:p>
             <w:pPr>
@@ -3324,13 +4085,13 @@
               <w:rPr>
                 <w:sz w:val="16"/>
               </w:rPr>
-              <w:t>Árbol (sin poda)</w:t>
+              <w:t>Gradient Boosting</w:t>
             </w:r>
           </w:p>
         </w:tc>
         <w:tc>
           <w:tcPr>
-            <w:tcW w:type="dxa" w:w="1480"/>
+            <w:tcW w:type="dxa" w:w="1251"/>
           </w:tcPr>
           <w:p>
             <w:pPr>
@@ -3343,15 +4104,16 @@
             </w:r>
             <w:r>
               <w:rPr>
-                <w:sz w:val="16"/>
-              </w:rPr>
-              <w:t>0,60</w:t>
+                <w:b/>
+                <w:sz w:val="16"/>
+              </w:rPr>
+              <w:t>0,53</w:t>
             </w:r>
           </w:p>
         </w:tc>
         <w:tc>
           <w:tcPr>
-            <w:tcW w:type="dxa" w:w="1110"/>
+            <w:tcW w:type="dxa" w:w="938"/>
           </w:tcPr>
           <w:p>
             <w:pPr>
@@ -3366,13 +4128,13 @@
               <w:rPr>
                 <w:sz w:val="16"/>
               </w:rPr>
-              <w:t>0,10</w:t>
+              <w:t>0,34</w:t>
             </w:r>
           </w:p>
         </w:tc>
         <w:tc>
           <w:tcPr>
-            <w:tcW w:type="dxa" w:w="634"/>
+            <w:tcW w:type="dxa" w:w="834"/>
           </w:tcPr>
           <w:p>
             <w:pPr>
@@ -3387,13 +4149,13 @@
               <w:rPr>
                 <w:sz w:val="16"/>
               </w:rPr>
-              <w:t>0,17</w:t>
+              <w:t>0,41</w:t>
             </w:r>
           </w:p>
         </w:tc>
         <w:tc>
           <w:tcPr>
-            <w:tcW w:type="dxa" w:w="1110"/>
+            <w:tcW w:type="dxa" w:w="834"/>
           </w:tcPr>
           <w:p>
             <w:pPr>
@@ -3406,15 +4168,16 @@
             </w:r>
             <w:r>
               <w:rPr>
-                <w:sz w:val="16"/>
-              </w:rPr>
-              <w:t>0,091</w:t>
+                <w:b/>
+                <w:sz w:val="16"/>
+              </w:rPr>
+              <w:t>0,47</w:t>
             </w:r>
           </w:p>
         </w:tc>
         <w:tc>
           <w:tcPr>
-            <w:tcW w:type="dxa" w:w="863"/>
+            <w:tcW w:type="dxa" w:w="938"/>
           </w:tcPr>
           <w:p>
             <w:pPr>
@@ -3427,15 +4190,16 @@
             </w:r>
             <w:r>
               <w:rPr>
-                <w:sz w:val="16"/>
-              </w:rPr>
-              <w:t>0,792</w:t>
+                <w:b/>
+                <w:sz w:val="16"/>
+              </w:rPr>
+              <w:t>0,514</w:t>
             </w:r>
           </w:p>
         </w:tc>
         <w:tc>
           <w:tcPr>
-            <w:tcW w:type="dxa" w:w="1110"/>
+            <w:tcW w:type="dxa" w:w="834"/>
           </w:tcPr>
           <w:p>
             <w:pPr>
@@ -3450,7 +4214,28 @@
               <w:rPr>
                 <w:sz w:val="16"/>
               </w:rPr>
-              <w:t>0,014</w:t>
+              <w:t>0,94</w:t>
+            </w:r>
+          </w:p>
+        </w:tc>
+        <w:tc>
+          <w:tcPr>
+            <w:tcW w:type="dxa" w:w="938"/>
+          </w:tcPr>
+          <w:p>
+            <w:pPr>
+              <w:jc w:val="center"/>
+            </w:pPr>
+            <w:r>
+              <w:rPr>
+                <w:sz w:val="16"/>
+              </w:rPr>
+            </w:r>
+            <w:r>
+              <w:rPr>
+                <w:sz w:val="16"/>
+              </w:rPr>
+              <w:t>0,018</w:t>
             </w:r>
           </w:p>
         </w:tc>
@@ -3458,7 +4243,7 @@
       <w:tr>
         <w:tc>
           <w:tcPr>
-            <w:tcW w:type="dxa" w:w="2448"/>
+            <w:tcW w:type="dxa" w:w="2189"/>
           </w:tcPr>
           <w:p>
             <w:pPr>
@@ -3473,13 +4258,13 @@
               <w:rPr>
                 <w:sz w:val="16"/>
               </w:rPr>
-              <w:t>Canal endémico (ref.)</w:t>
+              <w:t>Árbol (poda 8)</w:t>
             </w:r>
           </w:p>
         </w:tc>
         <w:tc>
           <w:tcPr>
-            <w:tcW w:type="dxa" w:w="1480"/>
+            <w:tcW w:type="dxa" w:w="1251"/>
           </w:tcPr>
           <w:p>
             <w:pPr>
@@ -3494,13 +4279,13 @@
               <w:rPr>
                 <w:sz w:val="16"/>
               </w:rPr>
-              <w:t>0,64</w:t>
+              <w:t>0,42</w:t>
             </w:r>
           </w:p>
         </w:tc>
         <w:tc>
           <w:tcPr>
-            <w:tcW w:type="dxa" w:w="1110"/>
+            <w:tcW w:type="dxa" w:w="938"/>
           </w:tcPr>
           <w:p>
             <w:pPr>
@@ -3515,13 +4300,13 @@
               <w:rPr>
                 <w:sz w:val="16"/>
               </w:rPr>
-              <w:t>0,29</w:t>
+              <w:t>0,36</w:t>
             </w:r>
           </w:p>
         </w:tc>
         <w:tc>
           <w:tcPr>
-            <w:tcW w:type="dxa" w:w="634"/>
+            <w:tcW w:type="dxa" w:w="834"/>
           </w:tcPr>
           <w:p>
             <w:pPr>
@@ -3536,13 +4321,13 @@
               <w:rPr>
                 <w:sz w:val="16"/>
               </w:rPr>
-              <w:t>0,40</w:t>
+              <w:t>0,39</w:t>
             </w:r>
           </w:p>
         </w:tc>
         <w:tc>
           <w:tcPr>
-            <w:tcW w:type="dxa" w:w="1110"/>
+            <w:tcW w:type="dxa" w:w="834"/>
           </w:tcPr>
           <w:p>
             <w:pPr>
@@ -3557,13 +4342,13 @@
               <w:rPr>
                 <w:sz w:val="16"/>
               </w:rPr>
-              <w:t>—</w:t>
+              <w:t>0,41</w:t>
             </w:r>
           </w:p>
         </w:tc>
         <w:tc>
           <w:tcPr>
-            <w:tcW w:type="dxa" w:w="863"/>
+            <w:tcW w:type="dxa" w:w="938"/>
           </w:tcPr>
           <w:p>
             <w:pPr>
@@ -3578,13 +4363,374 @@
               <w:rPr>
                 <w:sz w:val="16"/>
               </w:rPr>
-              <w:t>—</w:t>
+              <w:t>0,407</w:t>
             </w:r>
           </w:p>
         </w:tc>
         <w:tc>
           <w:tcPr>
-            <w:tcW w:type="dxa" w:w="1110"/>
+            <w:tcW w:type="dxa" w:w="834"/>
+          </w:tcPr>
+          <w:p>
+            <w:pPr>
+              <w:jc w:val="center"/>
+            </w:pPr>
+            <w:r>
+              <w:rPr>
+                <w:sz w:val="16"/>
+              </w:rPr>
+            </w:r>
+            <w:r>
+              <w:rPr>
+                <w:sz w:val="16"/>
+              </w:rPr>
+              <w:t>0,81</w:t>
+            </w:r>
+          </w:p>
+        </w:tc>
+        <w:tc>
+          <w:tcPr>
+            <w:tcW w:type="dxa" w:w="938"/>
+          </w:tcPr>
+          <w:p>
+            <w:pPr>
+              <w:jc w:val="center"/>
+            </w:pPr>
+            <w:r>
+              <w:rPr>
+                <w:sz w:val="16"/>
+              </w:rPr>
+            </w:r>
+            <w:r>
+              <w:rPr>
+                <w:sz w:val="16"/>
+              </w:rPr>
+              <w:t>0,027</w:t>
+            </w:r>
+          </w:p>
+        </w:tc>
+      </w:tr>
+      <w:tr>
+        <w:tc>
+          <w:tcPr>
+            <w:tcW w:type="dxa" w:w="2189"/>
+          </w:tcPr>
+          <w:p>
+            <w:pPr>
+              <w:jc w:val="left"/>
+            </w:pPr>
+            <w:r>
+              <w:rPr>
+                <w:sz w:val="16"/>
+              </w:rPr>
+            </w:r>
+            <w:r>
+              <w:rPr>
+                <w:sz w:val="16"/>
+              </w:rPr>
+              <w:t>Árbol (sin poda)</w:t>
+            </w:r>
+          </w:p>
+        </w:tc>
+        <w:tc>
+          <w:tcPr>
+            <w:tcW w:type="dxa" w:w="1251"/>
+          </w:tcPr>
+          <w:p>
+            <w:pPr>
+              <w:jc w:val="center"/>
+            </w:pPr>
+            <w:r>
+              <w:rPr>
+                <w:sz w:val="16"/>
+              </w:rPr>
+            </w:r>
+            <w:r>
+              <w:rPr>
+                <w:sz w:val="16"/>
+              </w:rPr>
+              <w:t>0,34</w:t>
+            </w:r>
+          </w:p>
+        </w:tc>
+        <w:tc>
+          <w:tcPr>
+            <w:tcW w:type="dxa" w:w="938"/>
+          </w:tcPr>
+          <w:p>
+            <w:pPr>
+              <w:jc w:val="center"/>
+            </w:pPr>
+            <w:r>
+              <w:rPr>
+                <w:sz w:val="16"/>
+              </w:rPr>
+            </w:r>
+            <w:r>
+              <w:rPr>
+                <w:sz w:val="16"/>
+              </w:rPr>
+              <w:t>0,25</w:t>
+            </w:r>
+          </w:p>
+        </w:tc>
+        <w:tc>
+          <w:tcPr>
+            <w:tcW w:type="dxa" w:w="834"/>
+          </w:tcPr>
+          <w:p>
+            <w:pPr>
+              <w:jc w:val="center"/>
+            </w:pPr>
+            <w:r>
+              <w:rPr>
+                <w:sz w:val="16"/>
+              </w:rPr>
+            </w:r>
+            <w:r>
+              <w:rPr>
+                <w:sz w:val="16"/>
+              </w:rPr>
+              <w:t>0,29</w:t>
+            </w:r>
+          </w:p>
+        </w:tc>
+        <w:tc>
+          <w:tcPr>
+            <w:tcW w:type="dxa" w:w="834"/>
+          </w:tcPr>
+          <w:p>
+            <w:pPr>
+              <w:jc w:val="center"/>
+            </w:pPr>
+            <w:r>
+              <w:rPr>
+                <w:sz w:val="16"/>
+              </w:rPr>
+            </w:r>
+            <w:r>
+              <w:rPr>
+                <w:sz w:val="16"/>
+              </w:rPr>
+              <w:t>0,31</w:t>
+            </w:r>
+          </w:p>
+        </w:tc>
+        <w:tc>
+          <w:tcPr>
+            <w:tcW w:type="dxa" w:w="938"/>
+          </w:tcPr>
+          <w:p>
+            <w:pPr>
+              <w:jc w:val="center"/>
+            </w:pPr>
+            <w:r>
+              <w:rPr>
+                <w:sz w:val="16"/>
+              </w:rPr>
+            </w:r>
+            <w:r>
+              <w:rPr>
+                <w:sz w:val="16"/>
+              </w:rPr>
+              <w:t>0,093</w:t>
+            </w:r>
+          </w:p>
+        </w:tc>
+        <w:tc>
+          <w:tcPr>
+            <w:tcW w:type="dxa" w:w="834"/>
+          </w:tcPr>
+          <w:p>
+            <w:pPr>
+              <w:jc w:val="center"/>
+            </w:pPr>
+            <w:r>
+              <w:rPr>
+                <w:sz w:val="16"/>
+              </w:rPr>
+            </w:r>
+            <w:r>
+              <w:rPr>
+                <w:sz w:val="16"/>
+              </w:rPr>
+              <w:t>0,66</w:t>
+            </w:r>
+          </w:p>
+        </w:tc>
+        <w:tc>
+          <w:tcPr>
+            <w:tcW w:type="dxa" w:w="938"/>
+          </w:tcPr>
+          <w:p>
+            <w:pPr>
+              <w:jc w:val="center"/>
+            </w:pPr>
+            <w:r>
+              <w:rPr>
+                <w:sz w:val="16"/>
+              </w:rPr>
+            </w:r>
+            <w:r>
+              <w:rPr>
+                <w:sz w:val="16"/>
+              </w:rPr>
+              <w:t>0,024</w:t>
+            </w:r>
+          </w:p>
+        </w:tc>
+      </w:tr>
+      <w:tr>
+        <w:tc>
+          <w:tcPr>
+            <w:tcW w:type="dxa" w:w="2189"/>
+          </w:tcPr>
+          <w:p>
+            <w:pPr>
+              <w:jc w:val="left"/>
+            </w:pPr>
+            <w:r>
+              <w:rPr>
+                <w:sz w:val="16"/>
+              </w:rPr>
+            </w:r>
+            <w:r>
+              <w:rPr>
+                <w:sz w:val="16"/>
+              </w:rPr>
+              <w:t>Canal endémico (ref.)</w:t>
+            </w:r>
+          </w:p>
+        </w:tc>
+        <w:tc>
+          <w:tcPr>
+            <w:tcW w:type="dxa" w:w="1251"/>
+          </w:tcPr>
+          <w:p>
+            <w:pPr>
+              <w:jc w:val="center"/>
+            </w:pPr>
+            <w:r>
+              <w:rPr>
+                <w:sz w:val="16"/>
+              </w:rPr>
+            </w:r>
+            <w:r>
+              <w:rPr>
+                <w:sz w:val="16"/>
+              </w:rPr>
+              <w:t>0,49</w:t>
+            </w:r>
+          </w:p>
+        </w:tc>
+        <w:tc>
+          <w:tcPr>
+            <w:tcW w:type="dxa" w:w="938"/>
+          </w:tcPr>
+          <w:p>
+            <w:pPr>
+              <w:jc w:val="center"/>
+            </w:pPr>
+            <w:r>
+              <w:rPr>
+                <w:sz w:val="16"/>
+              </w:rPr>
+            </w:r>
+            <w:r>
+              <w:rPr>
+                <w:sz w:val="16"/>
+              </w:rPr>
+              <w:t>0,38</w:t>
+            </w:r>
+          </w:p>
+        </w:tc>
+        <w:tc>
+          <w:tcPr>
+            <w:tcW w:type="dxa" w:w="834"/>
+          </w:tcPr>
+          <w:p>
+            <w:pPr>
+              <w:jc w:val="center"/>
+            </w:pPr>
+            <w:r>
+              <w:rPr>
+                <w:sz w:val="16"/>
+              </w:rPr>
+            </w:r>
+            <w:r>
+              <w:rPr>
+                <w:sz w:val="16"/>
+              </w:rPr>
+              <w:t>0,43</w:t>
+            </w:r>
+          </w:p>
+        </w:tc>
+        <w:tc>
+          <w:tcPr>
+            <w:tcW w:type="dxa" w:w="834"/>
+          </w:tcPr>
+          <w:p>
+            <w:pPr>
+              <w:jc w:val="center"/>
+            </w:pPr>
+            <w:r>
+              <w:rPr>
+                <w:sz w:val="16"/>
+              </w:rPr>
+            </w:r>
+            <w:r>
+              <w:rPr>
+                <w:sz w:val="16"/>
+              </w:rPr>
+              <w:t>0,46</w:t>
+            </w:r>
+          </w:p>
+        </w:tc>
+        <w:tc>
+          <w:tcPr>
+            <w:tcW w:type="dxa" w:w="938"/>
+          </w:tcPr>
+          <w:p>
+            <w:pPr>
+              <w:jc w:val="center"/>
+            </w:pPr>
+            <w:r>
+              <w:rPr>
+                <w:sz w:val="16"/>
+              </w:rPr>
+            </w:r>
+            <w:r>
+              <w:rPr>
+                <w:sz w:val="16"/>
+              </w:rPr>
+              <w:t>—</w:t>
+            </w:r>
+          </w:p>
+        </w:tc>
+        <w:tc>
+          <w:tcPr>
+            <w:tcW w:type="dxa" w:w="834"/>
+          </w:tcPr>
+          <w:p>
+            <w:pPr>
+              <w:jc w:val="center"/>
+            </w:pPr>
+            <w:r>
+              <w:rPr>
+                <w:sz w:val="16"/>
+              </w:rPr>
+            </w:r>
+            <w:r>
+              <w:rPr>
+                <w:sz w:val="16"/>
+              </w:rPr>
+              <w:t>—</w:t>
+            </w:r>
+          </w:p>
+        </w:tc>
+        <w:tc>
+          <w:tcPr>
+            <w:tcW w:type="dxa" w:w="938"/>
           </w:tcPr>
           <w:p>
             <w:pPr>
@@ -3656,7 +4802,7 @@
         <w:t>Figura 1.</w:t>
       </w:r>
       <w:r>
-        <w:t xml:space="preserve"> Sensibilidad, AUC-PR y F1 por modelo en el conjunto de prueba. La red neuronal domina en AUC-PR, la métrica más informativa ante el fuerte desbalance de clases; el árbol sin poda exhibe el AUC-PR más bajo. Elaboración propia.</w:t>
+        <w:t xml:space="preserve"> Sensibilidad, AUC-PR y F1 por modelo bajo validación de origen móvil. El Random Forest y el Gradient Boosting lideran en AUC-PR, la métrica más informativa ante el fuerte desbalance de clases; el árbol sin poda exhibe el AUC-PR más bajo. Fuente: elaboración propia con SATEC [27].</w:t>
       </w:r>
     </w:p>
     <w:p>
@@ -3670,18 +4816,176 @@
     <w:p>
       <w:pPr>
         <w:pStyle w:val="PostHeadPara"/>
-      </w:pPr>
-      <w:r>
-        <w:t xml:space="preserve">La Figura 2 presenta las matrices de confusión de la red neuronal y del árbol podado sobre los 15.616 ejemplos de prueba, de los cuales 42 corresponden a brotes reales. La red neuronal recupera </w:t>
-      </w:r>
-      <w:r>
-        <w:rPr>
-          <w:b/>
-        </w:rPr>
-        <w:t>34 de los 42 brotes</w:t>
-      </w:r>
-      <w:r>
-        <w:t xml:space="preserve"> (verdaderos positivos), a costa de 98 falsas alarmas; el árbol podado recupera 30 brotes con 389 falsas alarmas. La diferencia en falsos positivos explica la mayor precisión de la red y su mejor F1, aun cuando ambos modelos priorizan no dejar pasar brotes (alta sensibilidad), un comportamiento deseable en un sistema de alerta donde el costo de un brote no detectado es alto.</w:t>
+        <w:ind w:firstLine="0"/>
+      </w:pPr>
+      <w:r>
+        <w:t xml:space="preserve">La Figura 2 presenta las matrices de confusión de los dos mejores modelos —Random Forest y red neuronal— sobre las </w:t>
+      </w:r>
+      <w:r>
+        <w:rPr>
+          <w:b/>
+        </w:rPr>
+        <w:t>28.304 observaciones provincia-semana</w:t>
+      </w:r>
+      <w:r>
+        <w:t xml:space="preserve"> evaluadas en el origen móvil, de las cuales </w:t>
+      </w:r>
+      <w:r>
+        <w:rPr>
+          <w:b/>
+        </w:rPr>
+        <w:t>375 corresponden a brotes reales</w:t>
+      </w:r>
+      <w:r>
+        <w:t xml:space="preserve">. Conviene precisar la unidad de análisis: cada celda cuenta </w:t>
+      </w:r>
+      <w:r>
+        <w:rPr>
+          <w:b/>
+        </w:rPr>
+        <w:t>provincias-semana</w:t>
+      </w:r>
+      <w:r>
+        <w:t xml:space="preserve">, no pacientes. SATEC </w:t>
+      </w:r>
+      <w:r>
+        <w:rPr>
+          <w:b/>
+        </w:rPr>
+        <w:t>no diagnostica personas</w:t>
+      </w:r>
+      <w:r>
+        <w:t xml:space="preserve">; anticipa si una provincia entrará en zona de epidemia. Así, un </w:t>
+      </w:r>
+      <w:r>
+        <w:rPr>
+          <w:b/>
+        </w:rPr>
+        <w:t>verdadero positivo</w:t>
+      </w:r>
+      <w:r>
+        <w:t xml:space="preserve"> (VP) es una provincia-semana correctamente alertada como brote inminente; un </w:t>
+      </w:r>
+      <w:r>
+        <w:rPr>
+          <w:b/>
+        </w:rPr>
+        <w:t>falso positivo</w:t>
+      </w:r>
+      <w:r>
+        <w:t xml:space="preserve"> (FP) es una </w:t>
+      </w:r>
+      <w:r>
+        <w:rPr>
+          <w:b/>
+        </w:rPr>
+        <w:t>falsa alarma</w:t>
+      </w:r>
+      <w:r>
+        <w:t xml:space="preserve"> (se alertó y el brote no se materializó); un </w:t>
+      </w:r>
+      <w:r>
+        <w:rPr>
+          <w:b/>
+        </w:rPr>
+        <w:t>falso negativo</w:t>
+      </w:r>
+      <w:r>
+        <w:t xml:space="preserve"> (FN) es un brote no anticipado; y un </w:t>
+      </w:r>
+      <w:r>
+        <w:rPr>
+          <w:b/>
+        </w:rPr>
+        <w:t>verdadero negativo</w:t>
+      </w:r>
+      <w:r>
+        <w:t xml:space="preserve"> (VN) es una zona-semana correctamente clasificada como tranquila.</w:t>
+      </w:r>
+    </w:p>
+    <w:p>
+      <w:pPr>
+        <w:pStyle w:val="Para"/>
+        <w:ind w:firstLine="0"/>
+      </w:pPr>
+      <w:r>
+        <w:t xml:space="preserve">El Random Forest recupera </w:t>
+      </w:r>
+      <w:r>
+        <w:rPr>
+          <w:b/>
+        </w:rPr>
+        <w:t>174 de los 375 brotes</w:t>
+      </w:r>
+      <w:r>
+        <w:t xml:space="preserve"> (VP) con </w:t>
+      </w:r>
+      <w:r>
+        <w:rPr>
+          <w:b/>
+        </w:rPr>
+        <w:t>193 falsas alarmas</w:t>
+      </w:r>
+      <w:r>
+        <w:t xml:space="preserve"> (FP); la red neuronal recupera </w:t>
+      </w:r>
+      <w:r>
+        <w:rPr>
+          <w:b/>
+        </w:rPr>
+        <w:t>181</w:t>
+      </w:r>
+      <w:r>
+        <w:t xml:space="preserve"> con </w:t>
+      </w:r>
+      <w:r>
+        <w:rPr>
+          <w:b/>
+        </w:rPr>
+        <w:t>232</w:t>
+      </w:r>
+      <w:r>
+        <w:t xml:space="preserve"> falsas alarmas. En términos de tasas de error, ambos modelos mantienen una </w:t>
+      </w:r>
+      <w:r>
+        <w:rPr>
+          <w:b/>
+        </w:rPr>
+        <w:t>tasa de falsas alarmas baja</w:t>
+      </w:r>
+      <w:r>
+        <w:t xml:space="preserve"> sobre la enorme clase mayoritaria —</w:t>
+      </w:r>
+      <m:oMath>
+        <m:r>
+          <m:t>FP/(FP+VN)≈0</m:t>
+        </m:r>
+        <m:r>
+          <m:t>,</m:t>
+        </m:r>
+        <m:r>
+          <m:t>7%</m:t>
+        </m:r>
+      </m:oMath>
+      <w:r>
+        <w:t xml:space="preserve">—, mientras que la </w:t>
+      </w:r>
+      <w:r>
+        <w:rPr>
+          <w:b/>
+        </w:rPr>
+        <w:t>fracción de brotes omitidos</w:t>
+      </w:r>
+      <w:r>
+        <w:t xml:space="preserve"> —</w:t>
+      </w:r>
+      <m:oMath>
+        <m:r>
+          <m:t>FN/(FN+VP)≈53%</m:t>
+        </m:r>
+      </m:oMath>
+      <w:r>
+        <w:t>— es alta: el reto no está en la especificidad, altísima, sino en capturar más brotes en un régimen de eventos extremadamente raros. La red neuronal sacrifica algo de precisión (más falsas alarmas) por una sensibilidad ligeramente mayor, mientras que el Random Forest equilibra mejor ambos errores, de ahí su mayor F1. Este compromiso —preferir una falsa alarma territorial antes que omitir un brote— es deseable en un sistema de alerta donde el costo de un brote no detectado es alto.</w:t>
       </w:r>
     </w:p>
     <w:p>
@@ -3692,7 +4996,7 @@
       <w:r>
         <w:drawing>
           <wp:inline xmlns:a="http://schemas.openxmlformats.org/drawingml/2006/main" xmlns:pic="http://schemas.openxmlformats.org/drawingml/2006/picture">
-            <wp:extent cx="4480560" cy="2179732"/>
+            <wp:extent cx="4480560" cy="2163312"/>
             <wp:docPr id="2" name="Picture 2"/>
             <wp:cNvGraphicFramePr>
               <a:graphicFrameLocks noChangeAspect="1"/>
@@ -3713,7 +5017,7 @@
                   <pic:spPr>
                     <a:xfrm>
                       <a:off x="0" y="0"/>
-                      <a:ext cx="4480560" cy="2179732"/>
+                      <a:ext cx="4480560" cy="2163312"/>
                     </a:xfrm>
                     <a:prstGeom prst="rect"/>
                   </pic:spPr>
@@ -3735,7 +5039,7 @@
         <w:t>Figura 2.</w:t>
       </w:r>
       <w:r>
-        <w:t xml:space="preserve"> Matrices de confusión de la red neuronal (izquierda) y el árbol podado (derecha) sobre el conjunto de prueba. Las filas son la condición observada y las columnas la predicción. Elaboración propia.</w:t>
+        <w:t xml:space="preserve"> Matrices de confusión de la red neuronal (izquierda) y el Random Forest (derecha) sobre las predicciones agrupadas del origen móvil, con conteo y porcentaje por celda (VN, FP, FN, VP). Las filas son la condición observada y las columnas la predicción. Fuente: elaboración propia con SATEC [27].</w:t>
       </w:r>
     </w:p>
     <w:p>
@@ -3749,9 +5053,10 @@
     <w:p>
       <w:pPr>
         <w:pStyle w:val="PostHeadPara"/>
-      </w:pPr>
-      <w:r>
-        <w:t xml:space="preserve">La Figura 3 desglosa, por modelo, las cuatro métricas derivadas de la Ecuación (12)–(16): precisión, sensibilidad, F1 y especificidad. Se observa el </w:t>
+        <w:ind w:firstLine="0"/>
+      </w:pPr>
+      <w:r>
+        <w:t xml:space="preserve">La Figura 3 desglosa, por los seis modelos, las cuatro métricas derivadas de las Ecuaciones (12)–(16): precisión, sensibilidad, F1 y especificidad. Se observa el </w:t>
       </w:r>
       <w:r>
         <w:rPr>
@@ -3760,7 +5065,43 @@
         <w:t>compromiso característico</w:t>
       </w:r>
       <w:r>
-        <w:t xml:space="preserve"> de los problemas desbalanceados: todos los modelos alcanzan una especificidad muy alta (predicen bien la ausencia de brote, la clase mayoritaria), mientras que la precisión es baja porque las pocas alertas positivas incluyen falsas alarmas. La red neuronal ofrece la combinación más equilibrada entre sensibilidad y precisión.</w:t>
+        <w:t xml:space="preserve"> de los problemas desbalanceados: todos los modelos alcanzan una especificidad muy alta (cercana a 0,99, pues predicen bien la ausencia de brote, la clase mayoritaria), mientras que la precisión es moderada porque las alertas positivas incluyen falsas alarmas. El </w:t>
+      </w:r>
+      <w:r>
+        <w:rPr>
+          <w:b/>
+        </w:rPr>
+        <w:t>Random Forest</w:t>
+      </w:r>
+      <w:r>
+        <w:t xml:space="preserve"> y la </w:t>
+      </w:r>
+      <w:r>
+        <w:rPr>
+          <w:b/>
+        </w:rPr>
+        <w:t>red neuronal</w:t>
+      </w:r>
+      <w:r>
+        <w:t xml:space="preserve"> ofrecen la combinación más equilibrada entre sensibilidad y precisión, mientras que el </w:t>
+      </w:r>
+      <w:r>
+        <w:rPr>
+          <w:b/>
+        </w:rPr>
+        <w:t>Gradient Boosting</w:t>
+      </w:r>
+      <w:r>
+        <w:t xml:space="preserve"> inclina la balanza hacia la sensibilidad (detecta más brotes, a costa de más falsas alarmas) y el </w:t>
+      </w:r>
+      <w:r>
+        <w:rPr>
+          <w:b/>
+        </w:rPr>
+        <w:t>árbol sin poda</w:t>
+      </w:r>
+      <w:r>
+        <w:t xml:space="preserve"> queda por detrás en ambas.</w:t>
       </w:r>
     </w:p>
     <w:p>
@@ -3814,7 +5155,7 @@
         <w:t>Figura 3.</w:t>
       </w:r>
       <w:r>
-        <w:t xml:space="preserve"> Precisión, sensibilidad, F1 y especificidad por modelo. La especificidad es alta en todos los casos; la red neuronal equilibra mejor sensibilidad y precisión. Elaboración propia.</w:t>
+        <w:t xml:space="preserve"> Precisión, sensibilidad, F1 y especificidad por modelo (origen móvil). La especificidad es alta en todos los casos; el Random Forest y la red neuronal equilibran mejor sensibilidad y precisión. Fuente: elaboración propia con SATEC [27].</w:t>
       </w:r>
     </w:p>
     <w:p>
@@ -3828,9 +5169,10 @@
     <w:p>
       <w:pPr>
         <w:pStyle w:val="PostHeadPara"/>
-      </w:pPr>
-      <w:r>
-        <w:t xml:space="preserve">La Figura 4 hace explícita la brecha entre la exactitud de entrenamiento y la de prueba. El </w:t>
+        <w:ind w:firstLine="0"/>
+      </w:pPr>
+      <w:r>
+        <w:t xml:space="preserve">La Figura 4 contrasta la exactitud de entrenamiento y la de prueba bajo la partición única. El </w:t>
       </w:r>
       <w:r>
         <w:rPr>
@@ -3839,7 +5181,25 @@
         <w:t>árbol sin poda</w:t>
       </w:r>
       <w:r>
-        <w:t xml:space="preserve"> memoriza el pasado, con una exactitud de entrenamiento cercana a 0,999, y se desploma en AUC-PR sobre datos nuevos (0,091): la firma inequívoca del sobreajuste. La poda y, sobre todo, la red neuronal, generalizan de forma mucho más estable, lo que confirma sobre datos reales la advertencia metodológica de que una exactitud alta puede ser engañosa cuando las clases están desbalanceadas.</w:t>
+        <w:t xml:space="preserve"> es el único modelo que memoriza el entrenamiento por encima de lo que generaliza (brecha positiva), con una exactitud de entrenamiento cercana a </w:t>
+      </w:r>
+      <w:r>
+        <w:rPr>
+          <w:b/>
+        </w:rPr>
+        <w:t>0,999</w:t>
+      </w:r>
+      <w:r>
+        <w:t xml:space="preserve">. Ahora bien, la señal más nítida de su sobreajuste no está en la exactitud —engañosa bajo fuerte desbalance, pues la clase mayoritaria la infla para todos los modelos— sino en su </w:t>
+      </w:r>
+      <w:r>
+        <w:rPr>
+          <w:b/>
+        </w:rPr>
+        <w:t>AUC-PR, que se desploma a 0,09</w:t>
+      </w:r>
+      <w:r>
+        <w:t xml:space="preserve"> (Tabla 1), muy por debajo del Random Forest (0,51). Esto confirma sobre datos reales que una exactitud alta puede ocultar un modelo prácticamente inservible para detectar brotes, y justifica el uso de métricas centradas en la clase rara.</w:t>
       </w:r>
     </w:p>
     <w:p>
@@ -3850,7 +5210,7 @@
       <w:r>
         <w:drawing>
           <wp:inline xmlns:a="http://schemas.openxmlformats.org/drawingml/2006/main" xmlns:pic="http://schemas.openxmlformats.org/drawingml/2006/picture">
-            <wp:extent cx="4480560" cy="2437425"/>
+            <wp:extent cx="4480560" cy="2439533"/>
             <wp:docPr id="4" name="Picture 4"/>
             <wp:cNvGraphicFramePr>
               <a:graphicFrameLocks noChangeAspect="1"/>
@@ -3871,7 +5231,7 @@
                   <pic:spPr>
                     <a:xfrm>
                       <a:off x="0" y="0"/>
-                      <a:ext cx="4480560" cy="2437425"/>
+                      <a:ext cx="4480560" cy="2439533"/>
                     </a:xfrm>
                     <a:prstGeom prst="rect"/>
                   </pic:spPr>
@@ -3893,7 +5253,7 @@
         <w:t>Figura 4.</w:t>
       </w:r>
       <w:r>
-        <w:t xml:space="preserve"> Brecha de generalización (diferencia entre exactitud de entrenamiento y de prueba) por modelo. Valores altos indican memorización; el árbol sin poda es el caso extremo. Elaboración propia.</w:t>
+        <w:t xml:space="preserve"> Brecha de generalización (exactitud de entrenamiento − prueba) por modelo, bajo la partición única. El árbol sin poda es el único con brecha positiva (memoriza más de lo que generaliza); su sobreajuste se aprecia con más claridad en el AUC-PR (Tabla 1). Fuente: elaboración propia con SATEC [27].</w:t>
       </w:r>
     </w:p>
     <w:p>
@@ -3907,9 +5267,10 @@
     <w:p>
       <w:pPr>
         <w:pStyle w:val="PostHeadPara"/>
-      </w:pPr>
-      <w:r>
-        <w:t xml:space="preserve">La Figura 5 presenta las curvas de fiabilidad de la red neuronal y el árbol podado. Una curva próxima a la diagonal indica que las probabilidades predichas coinciden con las frecuencias observadas. Los </w:t>
+        <w:ind w:firstLine="0"/>
+      </w:pPr>
+      <w:r>
+        <w:t xml:space="preserve">La Figura 5 presenta las curvas de fiabilidad del Random Forest y la red neuronal sobre las predicciones agrupadas del origen móvil. Una curva próxima a la diagonal indica que las probabilidades predichas coinciden con las frecuencias observadas. Los </w:t>
       </w:r>
       <w:r>
         <w:rPr>
@@ -3918,7 +5279,43 @@
         <w:t>Brier scores</w:t>
       </w:r>
       <w:r>
-        <w:t xml:space="preserve"> son bajos (0,012–0,015), favorecidos por la baja prevalencia de brotes; la red neuronal presenta la mejor calibración global, aunque con margen de mejora en los deciles de alta probabilidad, donde los brotes son escasos y la estimación es más ruidosa.</w:t>
+        <w:t xml:space="preserve"> son bajos (</w:t>
+      </w:r>
+      <w:r>
+        <w:rPr>
+          <w:b/>
+        </w:rPr>
+        <w:t>0,009</w:t>
+      </w:r>
+      <w:r>
+        <w:t xml:space="preserve"> para el Random Forest y </w:t>
+      </w:r>
+      <w:r>
+        <w:rPr>
+          <w:b/>
+        </w:rPr>
+        <w:t>0,021</w:t>
+      </w:r>
+      <w:r>
+        <w:t xml:space="preserve"> para la red neuronal), favorecidos por la baja prevalencia de brotes; el Random Forest está mejor calibrado y más cerca de la diagonal. Ambos modelos, no obstante, tienden a </w:t>
+      </w:r>
+      <w:r>
+        <w:rPr>
+          <w:b/>
+        </w:rPr>
+        <w:t>sobreestimar</w:t>
+      </w:r>
+      <w:r>
+        <w:t xml:space="preserve"> la probabilidad en los deciles altos —donde los brotes son escasos y la estimación es más ruidosa—, efecto del entrenamiento con ponderación de clases; una </w:t>
+      </w:r>
+      <w:r>
+        <w:rPr>
+          <w:b/>
+        </w:rPr>
+        <w:t>calibración posterior</w:t>
+      </w:r>
+      <w:r>
+        <w:t xml:space="preserve"> (isotónica o de Platt) es una mejora directa para trabajo futuro.</w:t>
       </w:r>
     </w:p>
     <w:p>
@@ -3972,7 +5369,7 @@
         <w:t>Figura 5.</w:t>
       </w:r>
       <w:r>
-        <w:t xml:space="preserve"> Curvas de calibración de la red neuronal y el árbol podado frente a la calibración perfecta (diagonal). Elaboración propia.</w:t>
+        <w:t xml:space="preserve"> Curvas de calibración del Random Forest y la red neuronal frente a la calibración perfecta (diagonal). Fuente: elaboración propia con SATEC [27].</w:t>
       </w:r>
     </w:p>
     <w:p>
@@ -3986,9 +5383,10 @@
     <w:p>
       <w:pPr>
         <w:pStyle w:val="PostHeadPara"/>
-      </w:pPr>
-      <w:r>
-        <w:t xml:space="preserve">La Figura 6 reporta la importancia por permutación de la red neuronal. La </w:t>
+        <w:ind w:firstLine="0"/>
+      </w:pPr>
+      <w:r>
+        <w:t xml:space="preserve">La Figura 6 reporta la importancia por permutación de la red neuronal (entrenada con todo el histórico). La </w:t>
       </w:r>
       <w:r>
         <w:rPr>
@@ -3997,7 +5395,16 @@
         <w:t>media móvil de ocho semanas de casos</w:t>
       </w:r>
       <w:r>
-        <w:t xml:space="preserve"> es el predictor dominante, seguida del número de casos actuales y de la media móvil de cuatro semanas: la historia reciente de la transmisión es, como cabía esperar, el factor más informativo. De manera relevante para la hipótesis de enriquecimiento, la </w:t>
+        <w:t xml:space="preserve"> es el predictor dominante con diferencia (caída en AUC-PR de 0,35), seguida del número de </w:t>
+      </w:r>
+      <w:r>
+        <w:rPr>
+          <w:b/>
+        </w:rPr>
+        <w:t>casos actuales</w:t>
+      </w:r>
+      <w:r>
+        <w:t xml:space="preserve"> (0,19) y de la media móvil de cuatro semanas (0,10): la historia reciente de la transmisión es, como cabía esperar, el factor más informativo. De manera relevante para la hipótesis de enriquecimiento, la </w:t>
       </w:r>
       <w:r>
         <w:rPr>
@@ -4015,7 +5422,7 @@
         <w:t>temperatura</w:t>
       </w:r>
       <w:r>
-        <w:t xml:space="preserve"> (media móvil) aporta señal apreciable. Esto indica que el clima y la estructura poblacional contribuyen a la predicción más allá de la mera autocorrelación de los casos, lo que respalda la integración multifuente para una enfermedad sensible a las condiciones ambientales del vector.</w:t>
+        <w:t xml:space="preserve"> (con sus rezagos y medias móviles) aporta señal apreciable, mientras que la precipitación resulta marginal. Esto indica que el clima y la estructura poblacional contribuyen a la predicción más allá de la mera autocorrelación de los casos, lo que respalda la integración multifuente para una enfermedad sensible a las condiciones ambientales del vector.</w:t>
       </w:r>
     </w:p>
     <w:p>
@@ -4069,7 +5476,7 @@
         <w:t>Figura 6.</w:t>
       </w:r>
       <w:r>
-        <w:t xml:space="preserve"> Importancia por permutación de la red neuronal (caída en AUC-PR al permutar cada variable). La media móvil de casos domina; la tasa poblacional y la temperatura aportan señal. Elaboración propia.</w:t>
+        <w:t xml:space="preserve"> Importancia por permutación de la red neuronal (caída en AUC-PR al permutar cada variable). La media móvil de casos domina; la tasa poblacional y la temperatura aportan señal. Fuente: elaboración propia con SATEC [27].</w:t>
       </w:r>
     </w:p>
     <w:p>
@@ -4083,6 +5490,7 @@
     <w:p>
       <w:pPr>
         <w:pStyle w:val="PostHeadPara"/>
+        <w:ind w:firstLine="0"/>
       </w:pPr>
       <w:r>
         <w:t>La Figura 7 muestra la aplicación web resultante: un mapa de riesgo de las provincias endémicas sobre un mapa base del Perú, donde cada provincia se colorea según su nivel de alerta (bajo, medio o alto) para la semana más reciente. Al seleccionar una provincia, el panel lateral muestra la probabilidad de brote estimada por la red neuronal, la decisión del árbol y los casos notificados, lo que permite a un usuario de salud pública comparar de un vistazo ambos paradigmas sobre una zona concreta. El sistema es de uso libre y su código y datos son reproducibles.</w:t>
@@ -4139,7 +5547,7 @@
         <w:t>Figura 7.</w:t>
       </w:r>
       <w:r>
-        <w:t xml:space="preserve"> Interfaz de SATEC: mapa de riesgo provincial sobre el mapa base del Perú, con el detalle de la provincia de Ocros (Áncash) en nivel de alerta medio. Captura de la aplicación desarrollada (elaboración propia).</w:t>
+        <w:t xml:space="preserve"> Interfaz de SATEC: mapa de riesgo provincial sobre el mapa base del Perú, con el detalle de la provincia de Ocros (Áncash) en nivel de alerta medio. Captura de la aplicación desarrollada. Fuente: elaboración propia con SATEC [27].</w:t>
       </w:r>
     </w:p>
     <w:p>
@@ -4153,6 +5561,7 @@
     <w:p>
       <w:pPr>
         <w:pStyle w:val="PostHeadPara"/>
+        <w:ind w:firstLine="0"/>
       </w:pPr>
       <w:r>
         <w:t xml:space="preserve">Tres conclusiones emergen de los resultados. Primero, </w:t>
@@ -4164,16 +5573,16 @@
         <w:t>el aprendizaje automático aporta valor sobre la vigilancia clásica</w:t>
       </w:r>
       <w:r>
-        <w:t xml:space="preserve">: la red neuronal supera al canal endémico en sensibilidad y AUC-PR, anticipando brotes que la regla clásica no captura, lo que sugiere que un sistema de alerta basado en datos puede complementar la vigilancia rutinaria de la enfermedad de Carrión. Segundo, </w:t>
-      </w:r>
-      <w:r>
-        <w:rPr>
-          <w:b/>
-        </w:rPr>
-        <w:t>la calidad y la causalidad de las variables son decisivas</w:t>
-      </w:r>
-      <w:r>
-        <w:t xml:space="preserve">: el árbol sin poda alcanza una exactitud engañosamente alta en entrenamiento pero fracasa en datos nuevos, lo que subraya la necesidad de la validación temporal y de métricas adecuadas a eventos raros (AUC-PR, sensibilidad) en lugar de la exactitud. Tercero, </w:t>
+        <w:t xml:space="preserve">: el Random Forest y la red neuronal superan al canal endémico en AUC-PR y F1, anticipando brotes que la regla clásica no captura, lo que sugiere que un sistema de alerta basado en datos puede complementar la vigilancia rutinaria de la enfermedad de Carrión. Segundo, </w:t>
+      </w:r>
+      <w:r>
+        <w:rPr>
+          <w:b/>
+        </w:rPr>
+        <w:t>la honestidad de la evaluación es decisiva</w:t>
+      </w:r>
+      <w:r>
+        <w:t xml:space="preserve">: el árbol sin poda alcanza una exactitud engañosamente alta en entrenamiento pero fracasa en datos nuevos (AUC-PR 0,09), y un único corte temporal reciente —que cae sobre el hueco de subnotificación pandémica— habría distorsionado las conclusiones; de ahí la necesidad de la validación de origen móvil y de métricas adecuadas a eventos raros (AUC-PR, sensibilidad, F1 en umbral óptimo) en lugar de la exactitud. Tercero, </w:t>
       </w:r>
       <w:r>
         <w:rPr>
@@ -4188,11 +5597,494 @@
     <w:p>
       <w:pPr>
         <w:pStyle w:val="Para"/>
-      </w:pPr>
-      <w:r>
-        <w:t>En términos de paradigmas, la red neuronal resultó preferible para este problema desbalanceado y ruidoso, mientras que el árbol, especialmente sin poda, ilustra los riesgos del sobreajuste. La elección, sin embargo, no debería guiarse solo por el desempeño: el árbol ofrece reglas legibles, valiosas para comunicar a los tomadores de decisión por qué una provincia entra en alerta, mientras que la red opera como una caja negra cuya interpretación requiere métodos adicionales como la importancia por permutación.</w:t>
-      </w:r>
-    </w:p>
+        <w:ind w:firstLine="0"/>
+      </w:pPr>
+      <w:r>
+        <w:t xml:space="preserve">En términos de paradigmas, los </w:t>
+      </w:r>
+      <w:r>
+        <w:rPr>
+          <w:b/>
+        </w:rPr>
+        <w:t>ensambles de árboles</w:t>
+      </w:r>
+      <w:r>
+        <w:t xml:space="preserve"> —y en particular el Random Forest— resultaron preferibles para este problema tabular, desbalanceado y ruidoso, por delante de la red neuronal y muy por encima del árbol único sin poda, que ilustra los riesgos del sobreajuste. Este resultado concuerda con la evidencia de que los modelos basados en árboles dominan sobre las redes profundas en datos tabulares [7], [8]. La elección, sin embargo, no debería guiarse solo por el desempeño: el árbol individual ofrece reglas legibles, valiosas para comunicar a los tomadores de decisión por qué una provincia entra en alerta, mientras que el Random Forest y la red operan como cajas más opacas cuya interpretación requiere métodos adicionales como la importancia por permutación.</w:t>
+      </w:r>
+    </w:p>
+    <w:p>
+      <w:pPr>
+        <w:pStyle w:val="Para"/>
+        <w:ind w:firstLine="0"/>
+      </w:pPr>
+      <w:r>
+        <w:rPr>
+          <w:b/>
+        </w:rPr>
+        <w:t>Comparación con la literatura.</w:t>
+      </w:r>
+      <w:r>
+        <w:t xml:space="preserve"> Al no existir antecedentes de aprendizaje automático para la alerta de brotes de la enfermedad de Carrión, la comparación se establece con trabajos afines en enfermedades vectoriales (Tabla 2). Vadmal et al. [14] predicen la idoneidad de especies de flebótomos como vectores de </w:t>
+      </w:r>
+      <w:r>
+        <w:rPr>
+          <w:i/>
+        </w:rPr>
+        <w:t>Leishmania</w:t>
+      </w:r>
+      <w:r>
+        <w:t xml:space="preserve"> mediante árboles potenciados, con una exactitud fuera de muestra cercana al 86 %; y la literatura reciente de predicción y alerta en arbovirosis (en particular dengue) sitúa el AUC-ROC de los modelos basados en árboles en un rango aproximado de 0,82–0,99 [28]. El Random Forest de SATEC, con un </w:t>
+      </w:r>
+      <w:r>
+        <w:rPr>
+          <w:b/>
+        </w:rPr>
+        <w:t>AUC-ROC de 0,94</w:t>
+      </w:r>
+      <w:r>
+        <w:t xml:space="preserve">, se ubica dentro de ese rango pese a abordar un problema más difícil: la predicción de un </w:t>
+      </w:r>
+      <w:r>
+        <w:rPr>
+          <w:b/>
+        </w:rPr>
+        <w:t>evento raro</w:t>
+      </w:r>
+      <w:r>
+        <w:t xml:space="preserve"> (prevalencia ≈1 % bajo origen móvil) con cuatro semanas de anticipación, para el cual además reportamos el </w:t>
+      </w:r>
+      <w:r>
+        <w:rPr>
+          <w:b/>
+        </w:rPr>
+        <w:t>AUC-PR (0,51)</w:t>
+      </w:r>
+      <w:r>
+        <w:t xml:space="preserve"> y el </w:t>
+      </w:r>
+      <w:r>
+        <w:rPr>
+          <w:b/>
+        </w:rPr>
+        <w:t>F1 en umbral óptimo (0,47)</w:t>
+      </w:r>
+      <w:r>
+        <w:t xml:space="preserve"> —métricas que la propia literatura recomienda para clases desbalanceadas pero que muchos trabajos omiten al informar solo exactitud o AUC-ROC—. La comparación es, por tanto, </w:t>
+      </w:r>
+      <w:r>
+        <w:rPr>
+          <w:b/>
+        </w:rPr>
+        <w:t>orientativa</w:t>
+      </w:r>
+      <w:r>
+        <w:t>: las tareas (idoneidad de vector, presencia de dengue) y las prevalencias difieren de la alerta de brotes raros, lo que desaconseja una lectura literal de las cifras absolutas. Cabe notar que Rufasto-Goche et al. [16] emplean la misma fuente del MINSA para el dengue, pero con un enfoque descriptivo (sin métricas de clasificación), lo que subraya la novedad de un planteamiento predictivo y evaluado de forma temporalmente honesta.</w:t>
+      </w:r>
+    </w:p>
+    <w:p>
+      <w:pPr>
+        <w:pStyle w:val="TableCaption"/>
+      </w:pPr>
+      <w:r>
+        <w:t>Tabla 2. Comparación orientativa con trabajos afines de aprendizaje automático en enfermedades vectoriales.</w:t>
+      </w:r>
+    </w:p>
+    <w:tbl>
+      <w:tblPr>
+        <w:tblStyle w:val="TableGrid"/>
+        <w:tblW w:type="auto" w:w="0"/>
+        <w:jc w:val="center"/>
+        <w:tblLayout w:type="fixed"/>
+        <w:tblLook w:firstColumn="1" w:firstRow="1" w:lastColumn="0" w:lastRow="0" w:noHBand="0" w:noVBand="1" w:val="04A0"/>
+        <w:tblLayout w:type="fixed"/>
+        <w:tblBorders>
+          <w:top w:val="single" w:sz="10" w:space="0" w:color="000000"/>
+          <w:bottom w:val="single" w:sz="10" w:space="0" w:color="000000"/>
+          <w:left w:val="nil"/>
+          <w:right w:val="nil"/>
+          <w:insideH w:val="nil"/>
+          <w:insideV w:val="nil"/>
+        </w:tblBorders>
+      </w:tblPr>
+      <w:tblGrid>
+        <w:gridCol w:w="2190"/>
+        <w:gridCol w:w="2190"/>
+        <w:gridCol w:w="2190"/>
+        <w:gridCol w:w="2190"/>
+      </w:tblGrid>
+      <w:tr>
+        <w:tc>
+          <w:tcPr>
+            <w:tcW w:type="dxa" w:w="1917"/>
+            <w:shd w:val="clear" w:color="auto" w:fill="ECECEC"/>
+            <w:tcBorders>
+              <w:bottom w:val="single" w:sz="6" w:space="0" w:color="000000"/>
+            </w:tcBorders>
+          </w:tcPr>
+          <w:p>
+            <w:pPr>
+              <w:jc w:val="left"/>
+            </w:pPr>
+            <w:r>
+              <w:rPr>
+                <w:b/>
+                <w:sz w:val="16"/>
+              </w:rPr>
+            </w:r>
+            <w:r>
+              <w:rPr>
+                <w:b/>
+                <w:sz w:val="16"/>
+              </w:rPr>
+              <w:t>Estudio</w:t>
+            </w:r>
+          </w:p>
+        </w:tc>
+        <w:tc>
+          <w:tcPr>
+            <w:tcW w:type="dxa" w:w="2876"/>
+            <w:shd w:val="clear" w:color="auto" w:fill="ECECEC"/>
+            <w:tcBorders>
+              <w:bottom w:val="single" w:sz="6" w:space="0" w:color="000000"/>
+            </w:tcBorders>
+          </w:tcPr>
+          <w:p>
+            <w:pPr>
+              <w:jc w:val="center"/>
+            </w:pPr>
+            <w:r>
+              <w:rPr>
+                <w:b/>
+                <w:sz w:val="16"/>
+              </w:rPr>
+            </w:r>
+            <w:r>
+              <w:rPr>
+                <w:b/>
+                <w:sz w:val="16"/>
+              </w:rPr>
+              <w:t>Enfermedad y tarea</w:t>
+            </w:r>
+          </w:p>
+        </w:tc>
+        <w:tc>
+          <w:tcPr>
+            <w:tcW w:type="dxa" w:w="1534"/>
+            <w:shd w:val="clear" w:color="auto" w:fill="ECECEC"/>
+            <w:tcBorders>
+              <w:bottom w:val="single" w:sz="6" w:space="0" w:color="000000"/>
+            </w:tcBorders>
+          </w:tcPr>
+          <w:p>
+            <w:pPr>
+              <w:jc w:val="center"/>
+            </w:pPr>
+            <w:r>
+              <w:rPr>
+                <w:b/>
+                <w:sz w:val="16"/>
+              </w:rPr>
+            </w:r>
+            <w:r>
+              <w:rPr>
+                <w:b/>
+                <w:sz w:val="16"/>
+              </w:rPr>
+              <w:t>Modelo</w:t>
+            </w:r>
+          </w:p>
+        </w:tc>
+        <w:tc>
+          <w:tcPr>
+            <w:tcW w:type="dxa" w:w="2428"/>
+            <w:shd w:val="clear" w:color="auto" w:fill="ECECEC"/>
+            <w:tcBorders>
+              <w:bottom w:val="single" w:sz="6" w:space="0" w:color="000000"/>
+            </w:tcBorders>
+          </w:tcPr>
+          <w:p>
+            <w:pPr>
+              <w:jc w:val="center"/>
+            </w:pPr>
+            <w:r>
+              <w:rPr>
+                <w:b/>
+                <w:sz w:val="16"/>
+              </w:rPr>
+            </w:r>
+            <w:r>
+              <w:rPr>
+                <w:b/>
+                <w:sz w:val="16"/>
+              </w:rPr>
+              <w:t>Desempeño reportado</w:t>
+            </w:r>
+          </w:p>
+        </w:tc>
+      </w:tr>
+      <w:tr>
+        <w:tc>
+          <w:tcPr>
+            <w:tcW w:type="dxa" w:w="1917"/>
+          </w:tcPr>
+          <w:p>
+            <w:pPr>
+              <w:jc w:val="left"/>
+            </w:pPr>
+            <w:r>
+              <w:rPr>
+                <w:sz w:val="16"/>
+              </w:rPr>
+            </w:r>
+            <w:r>
+              <w:rPr>
+                <w:sz w:val="16"/>
+              </w:rPr>
+              <w:t>Vadmal et al. [14]</w:t>
+            </w:r>
+          </w:p>
+        </w:tc>
+        <w:tc>
+          <w:tcPr>
+            <w:tcW w:type="dxa" w:w="2876"/>
+          </w:tcPr>
+          <w:p>
+            <w:pPr>
+              <w:jc w:val="center"/>
+            </w:pPr>
+            <w:r>
+              <w:rPr>
+                <w:sz w:val="16"/>
+              </w:rPr>
+            </w:r>
+            <w:r>
+              <w:rPr>
+                <w:sz w:val="16"/>
+              </w:rPr>
+              <w:t>Leishmania — idoneidad de especie como vector</w:t>
+            </w:r>
+          </w:p>
+        </w:tc>
+        <w:tc>
+          <w:tcPr>
+            <w:tcW w:type="dxa" w:w="1534"/>
+          </w:tcPr>
+          <w:p>
+            <w:pPr>
+              <w:jc w:val="center"/>
+            </w:pPr>
+            <w:r>
+              <w:rPr>
+                <w:sz w:val="16"/>
+              </w:rPr>
+            </w:r>
+            <w:r>
+              <w:rPr>
+                <w:sz w:val="16"/>
+              </w:rPr>
+              <w:t>Árboles potenciados</w:t>
+            </w:r>
+          </w:p>
+        </w:tc>
+        <w:tc>
+          <w:tcPr>
+            <w:tcW w:type="dxa" w:w="2428"/>
+          </w:tcPr>
+          <w:p>
+            <w:pPr>
+              <w:jc w:val="center"/>
+            </w:pPr>
+            <w:r>
+              <w:rPr>
+                <w:sz w:val="16"/>
+              </w:rPr>
+            </w:r>
+            <w:r>
+              <w:rPr>
+                <w:sz w:val="16"/>
+              </w:rPr>
+              <w:t>Exactitud ≈ 0,86</w:t>
+            </w:r>
+          </w:p>
+        </w:tc>
+      </w:tr>
+      <w:tr>
+        <w:tc>
+          <w:tcPr>
+            <w:tcW w:type="dxa" w:w="1917"/>
+          </w:tcPr>
+          <w:p>
+            <w:pPr>
+              <w:jc w:val="left"/>
+            </w:pPr>
+            <w:r>
+              <w:rPr>
+                <w:sz w:val="16"/>
+              </w:rPr>
+            </w:r>
+            <w:r>
+              <w:rPr>
+                <w:sz w:val="16"/>
+              </w:rPr>
+              <w:t>Literatura de arbovirosis [28]</w:t>
+            </w:r>
+          </w:p>
+        </w:tc>
+        <w:tc>
+          <w:tcPr>
+            <w:tcW w:type="dxa" w:w="2876"/>
+          </w:tcPr>
+          <w:p>
+            <w:pPr>
+              <w:jc w:val="center"/>
+            </w:pPr>
+            <w:r>
+              <w:rPr>
+                <w:sz w:val="16"/>
+              </w:rPr>
+            </w:r>
+            <w:r>
+              <w:rPr>
+                <w:sz w:val="16"/>
+              </w:rPr>
+              <w:t>Dengue — presencia/predicción de brote</w:t>
+            </w:r>
+          </w:p>
+        </w:tc>
+        <w:tc>
+          <w:tcPr>
+            <w:tcW w:type="dxa" w:w="1534"/>
+          </w:tcPr>
+          <w:p>
+            <w:pPr>
+              <w:jc w:val="center"/>
+            </w:pPr>
+            <w:r>
+              <w:rPr>
+                <w:sz w:val="16"/>
+              </w:rPr>
+            </w:r>
+            <w:r>
+              <w:rPr>
+                <w:sz w:val="16"/>
+              </w:rPr>
+              <w:t>Random Forest / boosting</w:t>
+            </w:r>
+          </w:p>
+        </w:tc>
+        <w:tc>
+          <w:tcPr>
+            <w:tcW w:type="dxa" w:w="2428"/>
+          </w:tcPr>
+          <w:p>
+            <w:pPr>
+              <w:jc w:val="center"/>
+            </w:pPr>
+            <w:r>
+              <w:rPr>
+                <w:sz w:val="16"/>
+              </w:rPr>
+            </w:r>
+            <w:r>
+              <w:rPr>
+                <w:sz w:val="16"/>
+              </w:rPr>
+              <w:t>AUC-ROC ≈ 0,82–0,99</w:t>
+            </w:r>
+          </w:p>
+        </w:tc>
+      </w:tr>
+      <w:tr>
+        <w:tc>
+          <w:tcPr>
+            <w:tcW w:type="dxa" w:w="1917"/>
+          </w:tcPr>
+          <w:p>
+            <w:pPr>
+              <w:jc w:val="left"/>
+            </w:pPr>
+            <w:r>
+              <w:rPr>
+                <w:sz w:val="16"/>
+              </w:rPr>
+            </w:r>
+            <w:r>
+              <w:rPr>
+                <w:b/>
+                <w:sz w:val="16"/>
+              </w:rPr>
+              <w:t>SATEC (este trabajo)</w:t>
+            </w:r>
+          </w:p>
+        </w:tc>
+        <w:tc>
+          <w:tcPr>
+            <w:tcW w:type="dxa" w:w="2876"/>
+          </w:tcPr>
+          <w:p>
+            <w:pPr>
+              <w:jc w:val="center"/>
+            </w:pPr>
+            <w:r>
+              <w:rPr>
+                <w:sz w:val="16"/>
+              </w:rPr>
+            </w:r>
+            <w:r>
+              <w:rPr>
+                <w:b/>
+                <w:sz w:val="16"/>
+              </w:rPr>
+              <w:t>Carrión — brote provincia-semana (4 sem.)</w:t>
+            </w:r>
+          </w:p>
+        </w:tc>
+        <w:tc>
+          <w:tcPr>
+            <w:tcW w:type="dxa" w:w="1534"/>
+          </w:tcPr>
+          <w:p>
+            <w:pPr>
+              <w:jc w:val="center"/>
+            </w:pPr>
+            <w:r>
+              <w:rPr>
+                <w:sz w:val="16"/>
+              </w:rPr>
+            </w:r>
+            <w:r>
+              <w:rPr>
+                <w:b/>
+                <w:sz w:val="16"/>
+              </w:rPr>
+              <w:t>Random Forest</w:t>
+            </w:r>
+          </w:p>
+        </w:tc>
+        <w:tc>
+          <w:tcPr>
+            <w:tcW w:type="dxa" w:w="2428"/>
+          </w:tcPr>
+          <w:p>
+            <w:pPr>
+              <w:jc w:val="center"/>
+            </w:pPr>
+            <w:r>
+              <w:rPr>
+                <w:sz w:val="16"/>
+              </w:rPr>
+            </w:r>
+            <w:r>
+              <w:rPr>
+                <w:b/>
+                <w:sz w:val="16"/>
+              </w:rPr>
+              <w:t>AUC-ROC 0,94; AUC-PR 0,51; F1 0,47</w:t>
+            </w:r>
+          </w:p>
+        </w:tc>
+      </w:tr>
+    </w:tbl>
     <w:p>
       <w:pPr>
         <w:pStyle w:val="Head1"/>
@@ -4204,6 +6096,7 @@
     <w:p>
       <w:pPr>
         <w:pStyle w:val="PostHeadPara"/>
+        <w:ind w:firstLine="0"/>
       </w:pPr>
       <w:r>
         <w:t xml:space="preserve">Conviene declarar las limitaciones con franqueza. Los datos provienen de </w:t>
@@ -4242,7 +6135,34 @@
         <w:t>no realiza diagnóstico clínico individual</w:t>
       </w:r>
       <w:r>
-        <w:t>: es una herramienta de apoyo a la vigilancia y no sustituye la confirmación de laboratorio. Finalmente, se empleó una única partición temporal; una validación de origen móvil con múltiples cortes fortalecería las conclusiones.</w:t>
+        <w:t xml:space="preserve">: es una herramienta de apoyo a la vigilancia y no sustituye la confirmación de laboratorio. La </w:t>
+      </w:r>
+      <w:r>
+        <w:rPr>
+          <w:b/>
+        </w:rPr>
+        <w:t>subnotificación durante la pandemia de COVID-19</w:t>
+      </w:r>
+      <w:r>
+        <w:t xml:space="preserve"> deprimió de forma marcada los casos registrados en 2020–2023 (en 2021, ninguna provincia supera su canal), lo que reduce los brotes evaluables en ese periodo y obliga a interpretar con cautela las métricas de esos años; la validación de origen móvil mitiga, pero no elimina, este sesgo. Por último, las probabilidades de los modelos podrían beneficiarse de una </w:t>
+      </w:r>
+      <w:r>
+        <w:rPr>
+          <w:b/>
+        </w:rPr>
+        <w:t>calibración posterior</w:t>
+      </w:r>
+      <w:r>
+        <w:t xml:space="preserve"> (p. ej. isotónica) y, en la red, de regularización adicional como el </w:t>
+      </w:r>
+      <w:r>
+        <w:rPr>
+          <w:i/>
+        </w:rPr>
+        <w:t>dropout</w:t>
+      </w:r>
+      <w:r>
+        <w:t xml:space="preserve"> [29], pendientes para trabajo futuro.</w:t>
       </w:r>
     </w:p>
     <w:p>
@@ -4256,6 +6176,7 @@
     <w:p>
       <w:pPr>
         <w:pStyle w:val="PostHeadPara"/>
+        <w:ind w:firstLine="0"/>
       </w:pPr>
       <w:r>
         <w:t xml:space="preserve">La enfermedad de Carrión sigue siendo una amenaza desatendida para las poblaciones rurales de los valles interandinos del Perú, donde su fase aguda puede ser letal si no se trata a tiempo. Este trabajo presentó </w:t>
@@ -4276,7 +6197,16 @@
         <w:t>anticipar con cuatro semanas la entrada de una provincia en zona de epidemia</w:t>
       </w:r>
       <w:r>
-        <w:t xml:space="preserve"> del canal endémico con una sensibilidad del 81 %, lo que abre la puerta a focalizar la vigilancia y los recursos en las zonas y semanas de mayor riesgo; (ii) la </w:t>
+        <w:t xml:space="preserve"> del canal endémico, con el mejor equilibrio logrado por el </w:t>
+      </w:r>
+      <w:r>
+        <w:rPr>
+          <w:b/>
+        </w:rPr>
+        <w:t>Random Forest</w:t>
+      </w:r>
+      <w:r>
+        <w:t xml:space="preserve"> (F1 0,47; AUC-ROC 0,94) bajo validación de origen móvil, lo que abre la puerta a focalizar la vigilancia y los recursos en las zonas y semanas de mayor riesgo; (ii) la </w:t>
       </w:r>
       <w:r>
         <w:rPr>
@@ -4321,7 +6251,7 @@
         <w:t>superar al canal endémico clásico</w:t>
       </w:r>
       <w:r>
-        <w:t xml:space="preserve"> que hoy guía la vigilancia, sin reemplazarlo, sino complementándolo con una capa predictiva. El sistema resultante es reproducible, verificable y desplegable sin servidor, lo que lo hace viable como instrumento de apoyo para las Direcciones Regionales de Salud de las zonas endémicas. Como trabajo futuro se plantea la validación de origen móvil, la incorporación de modelos de ensamble y de variables entomológicas, el descenso a granularidad distrital y la validación prospectiva en campo, así como la articulación con los esfuerzos de diagnóstico serológico y de modelado del vector que hoy concentran la investigación computacional sobre la enfermedad de Carrión.</w:t>
+        <w:t xml:space="preserve"> que hoy guía la vigilancia, sin reemplazarlo, sino complementándolo con una capa predictiva. El sistema resultante es reproducible, verificable y desplegable sin servidor, lo que lo hace viable como instrumento de apoyo para las Direcciones Regionales de Salud de las zonas endémicas. Como trabajo futuro se plantea la calibración posterior de las probabilidades, la incorporación de variables entomológicas, el descenso a granularidad distrital y la validación prospectiva en campo, así como la articulación con los esfuerzos de diagnóstico serológico y de modelado del vector que hoy concentran la investigación computacional sobre la enfermedad de Carrión.</w:t>
       </w:r>
     </w:p>
     <w:p>
@@ -4335,9 +6265,10 @@
     <w:p>
       <w:pPr>
         <w:pStyle w:val="PostHeadPara"/>
-      </w:pPr>
-      <w:r>
-        <w:t>Los autores agradecen a la Escuela Profesional de Ingeniería de Sistemas de la Universidad Nacional Tecnológica de Lima Sur (UNTELS) por el apoyo institucional, y al Ministerio de Salud del Perú (MINSA) por la publicación de los datos abiertos de vigilancia epidemiológica que hicieron posible este estudio. Asimismo, reconocen la labor del personal de salud que sostiene la vigilancia de la enfermedad de Carrión en las zonas endémicas del país.</w:t>
+        <w:ind w:firstLine="0"/>
+      </w:pPr>
+      <w:r>
+        <w:t>Los autores agradecen al Ministerio de Salud del Perú (MINSA) por la publicación de los datos abiertos de vigilancia epidemiológica que hicieron posible este estudio, y reconocen la labor del personal de salud que sostiene la vigilancia de la enfermedad de Carrión en las zonas endémicas del país.</w:t>
       </w:r>
     </w:p>
     <w:p>
@@ -4351,9 +6282,10 @@
     <w:p>
       <w:pPr>
         <w:pStyle w:val="PostHeadPara"/>
-      </w:pPr>
-      <w:r>
-        <w:t>Los datos de vigilancia provienen de los datos abiertos del MINSA [2]; las variables climáticas, de NASA POWER [22]; la población, del censo del INEI [23]; y los límites provinciales, de un repositorio GeoJSON público. El código del pipeline de datos, los modelos y la aplicación web son reproducibles de extremo a extremo con Python 3.12 y se acompañan de pruebas automatizadas.</w:t>
+        <w:ind w:firstLine="0"/>
+      </w:pPr>
+      <w:r>
+        <w:t>Los datos de vigilancia provienen de los datos abiertos del MINSA [17]; las variables climáticas, de NASA POWER [18]; la población, del censo del INEI [19]; y los límites provinciales, de un repositorio GeoJSON público. El código del pipeline de datos, los modelos y la aplicación web son reproducibles de extremo a extremo con Python 3.12 y se acompañan de pruebas automatizadas.</w:t>
       </w:r>
     </w:p>
     <w:p>
@@ -4386,6 +6318,297 @@
         <w:pStyle w:val="Bibentry"/>
       </w:pPr>
       <w:r>
+        <w:t>Organización Panamericana de la Salud, «Bartonelosis (enfermedad de Carrión)» y metodología del canal endémico. https://www.paho.org</w:t>
+      </w:r>
+    </w:p>
+    <w:p>
+      <w:pPr>
+        <w:pStyle w:val="Bibentry"/>
+      </w:pPr>
+      <w:r>
+        <w:t xml:space="preserve">Y. LeCun, Y. Bengio y G. Hinton, «Deep learning», </w:t>
+      </w:r>
+      <w:r>
+        <w:rPr>
+          <w:i/>
+        </w:rPr>
+        <w:t>Nature</w:t>
+      </w:r>
+      <w:r>
+        <w:t>, vol. 521, pp. 436–444, 2015.</w:t>
+      </w:r>
+    </w:p>
+    <w:p>
+      <w:pPr>
+        <w:pStyle w:val="Bibentry"/>
+      </w:pPr>
+      <w:r>
+        <w:t xml:space="preserve">I. Goodfellow, Y. Bengio y A. Courville, </w:t>
+      </w:r>
+      <w:r>
+        <w:rPr>
+          <w:i/>
+        </w:rPr>
+        <w:t>Deep Learning</w:t>
+      </w:r>
+      <w:r>
+        <w:t>. MIT Press, 2016.</w:t>
+      </w:r>
+    </w:p>
+    <w:p>
+      <w:pPr>
+        <w:pStyle w:val="Bibentry"/>
+      </w:pPr>
+      <w:r>
+        <w:t xml:space="preserve">L. Breiman, J. Friedman, R. Olshen y C. Stone, </w:t>
+      </w:r>
+      <w:r>
+        <w:rPr>
+          <w:i/>
+        </w:rPr>
+        <w:t>Classification and Regression Trees</w:t>
+      </w:r>
+      <w:r>
+        <w:t>. Wadsworth, 1984.</w:t>
+      </w:r>
+    </w:p>
+    <w:p>
+      <w:pPr>
+        <w:pStyle w:val="Bibentry"/>
+      </w:pPr>
+      <w:r>
+        <w:t xml:space="preserve">J. R. Quinlan, «Induction of decision trees», </w:t>
+      </w:r>
+      <w:r>
+        <w:rPr>
+          <w:i/>
+        </w:rPr>
+        <w:t>Machine Learning</w:t>
+      </w:r>
+      <w:r>
+        <w:t>, vol. 1, n.º 1, pp. 81–106, 1986.</w:t>
+      </w:r>
+    </w:p>
+    <w:p>
+      <w:pPr>
+        <w:pStyle w:val="Bibentry"/>
+      </w:pPr>
+      <w:r>
+        <w:t xml:space="preserve">L. Grinsztajn, E. Oyallon y G. Varoquaux, «Why do tree-based models still outperform deep learning on typical tabular data?», en </w:t>
+      </w:r>
+      <w:r>
+        <w:rPr>
+          <w:i/>
+        </w:rPr>
+        <w:t>NeurIPS</w:t>
+      </w:r>
+      <w:r>
+        <w:t>, 2022.</w:t>
+      </w:r>
+    </w:p>
+    <w:p>
+      <w:pPr>
+        <w:pStyle w:val="Bibentry"/>
+      </w:pPr>
+      <w:r>
+        <w:t xml:space="preserve">R. Shwartz-Ziv y A. Armon, «Tabular data: Deep learning is not all you need», </w:t>
+      </w:r>
+      <w:r>
+        <w:rPr>
+          <w:i/>
+        </w:rPr>
+        <w:t>Information Fusion</w:t>
+      </w:r>
+      <w:r>
+        <w:t>, vol. 81, pp. 84–90, 2022.</w:t>
+      </w:r>
+    </w:p>
+    <w:p>
+      <w:pPr>
+        <w:pStyle w:val="Bibentry"/>
+      </w:pPr>
+      <w:r>
+        <w:t xml:space="preserve">V. Jiménez-Vásquez, K. D. Calvay-Sánchez, Y. Zárate-Sulca y G. Mendoza-Mujica, «In-silico identification of linear B-cell epitopes in specific proteins of </w:t>
+      </w:r>
+      <w:r>
+        <w:rPr>
+          <w:i/>
+        </w:rPr>
+        <w:t>Bartonella bacilliformis</w:t>
+      </w:r>
+      <w:r>
+        <w:t xml:space="preserve"> for the serological diagnosis of Carrion's disease», </w:t>
+      </w:r>
+      <w:r>
+        <w:rPr>
+          <w:i/>
+        </w:rPr>
+        <w:t>PLOS Neglected Tropical Diseases</w:t>
+      </w:r>
+      <w:r>
+        <w:t>, vol. 17, n.º 5, e0011321, 2023.</w:t>
+      </w:r>
+    </w:p>
+    <w:p>
+      <w:pPr>
+        <w:pStyle w:val="Bibentry"/>
+      </w:pPr>
+      <w:r>
+        <w:t xml:space="preserve">Estudio sobre producción de proteínas de </w:t>
+      </w:r>
+      <w:r>
+        <w:rPr>
+          <w:i/>
+        </w:rPr>
+        <w:t>Bartonella bacilliformis</w:t>
+      </w:r>
+      <w:r>
+        <w:t xml:space="preserve"> asistida por baculovirus para mejorar el diagnóstico serológico de la enfermedad de Carrión, </w:t>
+      </w:r>
+      <w:r>
+        <w:rPr>
+          <w:i/>
+        </w:rPr>
+        <w:t>PLOS Neglected Tropical Diseases</w:t>
+      </w:r>
+      <w:r>
+        <w:t>, 2024.</w:t>
+      </w:r>
+    </w:p>
+    <w:p>
+      <w:pPr>
+        <w:pStyle w:val="Bibentry"/>
+      </w:pPr>
+      <w:r>
+        <w:t xml:space="preserve">D. Moo-Llanes et al., «Shifts in the ecological niche of </w:t>
+      </w:r>
+      <w:r>
+        <w:rPr>
+          <w:i/>
+        </w:rPr>
+        <w:t>Lutzomyia peruensis</w:t>
+      </w:r>
+      <w:r>
+        <w:t xml:space="preserve"> under climate change scenarios in Peru», </w:t>
+      </w:r>
+      <w:r>
+        <w:rPr>
+          <w:i/>
+        </w:rPr>
+        <w:t>Medical and Veterinary Entomology</w:t>
+      </w:r>
+      <w:r>
+        <w:t>, 2017.</w:t>
+      </w:r>
+    </w:p>
+    <w:p>
+      <w:pPr>
+        <w:pStyle w:val="Bibentry"/>
+      </w:pPr>
+      <w:r>
+        <w:t xml:space="preserve">A. A. Hanafi-Bojd et al., «Machine learning approaches in GIS-based ecological modeling of the sand fly </w:t>
+      </w:r>
+      <w:r>
+        <w:rPr>
+          <w:i/>
+        </w:rPr>
+        <w:t>Phlebotomus papatasi</w:t>
+      </w:r>
+      <w:r>
+        <w:t xml:space="preserve">, a vector of zoonotic cutaneous leishmaniasis», </w:t>
+      </w:r>
+      <w:r>
+        <w:rPr>
+          <w:i/>
+        </w:rPr>
+        <w:t>Acta Tropica</w:t>
+      </w:r>
+      <w:r>
+        <w:t xml:space="preserve"> (ScienceDirect), 2019.</w:t>
+      </w:r>
+    </w:p>
+    <w:p>
+      <w:pPr>
+        <w:pStyle w:val="Bibentry"/>
+      </w:pPr>
+      <w:r>
+        <w:t xml:space="preserve">J. Del Valle-Mendoza et al., «Molecular detection of </w:t>
+      </w:r>
+      <w:r>
+        <w:rPr>
+          <w:i/>
+        </w:rPr>
+        <w:t>Bartonella bacilliformis</w:t>
+      </w:r>
+      <w:r>
+        <w:t xml:space="preserve"> in </w:t>
+      </w:r>
+      <w:r>
+        <w:rPr>
+          <w:i/>
+        </w:rPr>
+        <w:t>Lutzomyia maranonensis</w:t>
+      </w:r>
+      <w:r>
+        <w:t xml:space="preserve"> in Cajamarca, Peru: a new potential vector of Carrion's disease?», 2018.</w:t>
+      </w:r>
+    </w:p>
+    <w:p>
+      <w:pPr>
+        <w:pStyle w:val="Bibentry"/>
+      </w:pPr>
+      <w:r>
+        <w:t xml:space="preserve">G. M. Vadmal et al., «Data-driven predictions of potential Leishmania vectors in the Americas», </w:t>
+      </w:r>
+      <w:r>
+        <w:rPr>
+          <w:i/>
+        </w:rPr>
+        <w:t>PLOS Neglected Tropical Diseases</w:t>
+      </w:r>
+      <w:r>
+        <w:t>, vol. 17, n.º 2, e0010749, 2023.</w:t>
+      </w:r>
+    </w:p>
+    <w:p>
+      <w:pPr>
+        <w:pStyle w:val="Bibentry"/>
+      </w:pPr>
+      <w:r>
+        <w:t xml:space="preserve">B. Nayak et al., «Artificial intelligence (AI): a new window to revamp the vector-borne disease control», </w:t>
+      </w:r>
+      <w:r>
+        <w:rPr>
+          <w:i/>
+        </w:rPr>
+        <w:t>Parasitology Research</w:t>
+      </w:r>
+      <w:r>
+        <w:t>, vol. 122, n.º 2, pp. 369–379, 2023.</w:t>
+      </w:r>
+    </w:p>
+    <w:p>
+      <w:pPr>
+        <w:pStyle w:val="Bibentry"/>
+      </w:pPr>
+      <w:r>
+        <w:t xml:space="preserve">K. S. Rufasto-Goche et al., «Epidemiological dynamics of dengue in Peru: Temporal and spatial drivers between 2000 and 2022», </w:t>
+      </w:r>
+      <w:r>
+        <w:rPr>
+          <w:i/>
+        </w:rPr>
+        <w:t>PLOS One</w:t>
+      </w:r>
+      <w:r>
+        <w:t>, vol. 20, n.º 3, e0319708, 2025.</w:t>
+      </w:r>
+    </w:p>
+    <w:p>
+      <w:pPr>
+        <w:pStyle w:val="Bibentry"/>
+      </w:pPr>
+      <w:r>
         <w:t>Ministerio de Salud del Perú, «Vigilancia epidemiológica de la enfermedad de Carrión, 2000–2024», Plataforma Nacional de Datos Abiertos. https://www.datosabiertos.gob.pe</w:t>
       </w:r>
     </w:p>
@@ -4394,16 +6617,32 @@
         <w:pStyle w:val="Bibentry"/>
       </w:pPr>
       <w:r>
-        <w:t xml:space="preserve">Y. LeCun, Y. Bengio y G. Hinton, «Deep learning», </w:t>
+        <w:t>NASA Langley Research Center, «POWER: Prediction Of Worldwide Energy Resources», API de datos meteorológicos. https://power.larc.nasa.gov</w:t>
+      </w:r>
+    </w:p>
+    <w:p>
+      <w:pPr>
+        <w:pStyle w:val="Bibentry"/>
+      </w:pPr>
+      <w:r>
+        <w:t>Instituto Nacional de Estadística e Informática (INEI), «Censos Nacionales 2017: XII de Población y VII de Vivienda», Lima, Perú.</w:t>
+      </w:r>
+    </w:p>
+    <w:p>
+      <w:pPr>
+        <w:pStyle w:val="Bibentry"/>
+      </w:pPr>
+      <w:r>
+        <w:t xml:space="preserve">F. Pedregosa et al., «Scikit-learn: Machine learning in Python», </w:t>
       </w:r>
       <w:r>
         <w:rPr>
           <w:i/>
         </w:rPr>
-        <w:t>Nature</w:t>
-      </w:r>
-      <w:r>
-        <w:t>, vol. 521, pp. 436–444, 2015.</w:t>
+        <w:t>JMLR</w:t>
+      </w:r>
+      <w:r>
+        <w:t>, vol. 12, pp. 2825–2830, 2011.</w:t>
       </w:r>
     </w:p>
     <w:p>
@@ -4411,16 +6650,16 @@
         <w:pStyle w:val="Bibentry"/>
       </w:pPr>
       <w:r>
-        <w:t xml:space="preserve">I. Goodfellow, Y. Bengio y A. Courville, </w:t>
+        <w:t xml:space="preserve">T. Hastie, R. Tibshirani y J. Friedman, </w:t>
       </w:r>
       <w:r>
         <w:rPr>
           <w:i/>
         </w:rPr>
-        <w:t>Deep Learning</w:t>
-      </w:r>
-      <w:r>
-        <w:t>. MIT Press, 2016.</w:t>
+        <w:t>The Elements of Statistical Learning</w:t>
+      </w:r>
+      <w:r>
+        <w:t>, 2.ª ed. Springer, 2009.</w:t>
       </w:r>
     </w:p>
     <w:p>
@@ -4428,16 +6667,32 @@
         <w:pStyle w:val="Bibentry"/>
       </w:pPr>
       <w:r>
-        <w:t xml:space="preserve">L. Breiman, J. Friedman, R. Olshen y C. Stone, </w:t>
+        <w:t>F. Chollet et al., «Keras», 2015. https://keras.io</w:t>
+      </w:r>
+    </w:p>
+    <w:p>
+      <w:pPr>
+        <w:pStyle w:val="Bibentry"/>
+      </w:pPr>
+      <w:r>
+        <w:t>M. Abadi et al., «TensorFlow: Large-scale machine learning on heterogeneous systems», 2015. https://www.tensorflow.org</w:t>
+      </w:r>
+    </w:p>
+    <w:p>
+      <w:pPr>
+        <w:pStyle w:val="Bibentry"/>
+      </w:pPr>
+      <w:r>
+        <w:t xml:space="preserve">V. Nair y G. E. Hinton, «Rectified linear units improve restricted Boltzmann machines», en </w:t>
       </w:r>
       <w:r>
         <w:rPr>
           <w:i/>
         </w:rPr>
-        <w:t>Classification and Regression Trees</w:t>
-      </w:r>
-      <w:r>
-        <w:t>. Wadsworth, 1984.</w:t>
+        <w:t>ICML</w:t>
+      </w:r>
+      <w:r>
+        <w:t>, 2010.</w:t>
       </w:r>
     </w:p>
     <w:p>
@@ -4445,16 +6700,16 @@
         <w:pStyle w:val="Bibentry"/>
       </w:pPr>
       <w:r>
-        <w:t xml:space="preserve">J. R. Quinlan, «Induction of decision trees», </w:t>
+        <w:t xml:space="preserve">D. P. Kingma y J. Ba, «Adam: A method for stochastic optimization», en </w:t>
       </w:r>
       <w:r>
         <w:rPr>
           <w:i/>
         </w:rPr>
-        <w:t>Machine Learning</w:t>
-      </w:r>
-      <w:r>
-        <w:t>, vol. 1, n.º 1, pp. 81–106, 1986.</w:t>
+        <w:t>ICLR</w:t>
+      </w:r>
+      <w:r>
+        <w:t>, 2015.</w:t>
       </w:r>
     </w:p>
     <w:p>
@@ -4462,356 +6717,58 @@
         <w:pStyle w:val="Bibentry"/>
       </w:pPr>
       <w:r>
-        <w:t xml:space="preserve">F. Pedregosa et al., «Scikit-learn: Machine learning in Python», </w:t>
+        <w:t xml:space="preserve">D. Smilkov et al., «TensorFlow.js: Machine learning for the web and beyond», en </w:t>
       </w:r>
       <w:r>
         <w:rPr>
           <w:i/>
         </w:rPr>
+        <w:t>MLSys</w:t>
+      </w:r>
+      <w:r>
+        <w:t>, 2019.</w:t>
+      </w:r>
+    </w:p>
+    <w:p>
+      <w:pPr>
+        <w:pStyle w:val="Bibentry"/>
+      </w:pPr>
+      <w:r>
+        <w:t>C. S. Santiago Flores, J. Alvarez Rocca y C. Meza Pelaez, «SATEC: Sistema de Alerta Temprana de la Enfermedad de Carrión — código, datos y aplicación web», 2026. https://github.com/StevenSntg/SATEC-Carrion</w:t>
+      </w:r>
+    </w:p>
+    <w:p>
+      <w:pPr>
+        <w:pStyle w:val="Bibentry"/>
+      </w:pPr>
+      <w:r>
+        <w:t xml:space="preserve">Revisión sistemática sobre inteligencia artificial en sistemas de alerta temprana para la vigilancia de enfermedades infecciosas, </w:t>
+      </w:r>
+      <w:r>
+        <w:rPr>
+          <w:i/>
+        </w:rPr>
+        <w:t>Frontiers in Public Health</w:t>
+      </w:r>
+      <w:r>
+        <w:t>, 2025.</w:t>
+      </w:r>
+    </w:p>
+    <w:p>
+      <w:pPr>
+        <w:pStyle w:val="Bibentry"/>
+      </w:pPr>
+      <w:r>
+        <w:t xml:space="preserve">N. Srivastava et al., «Dropout: A simple way to prevent neural networks from overfitting», </w:t>
+      </w:r>
+      <w:r>
+        <w:rPr>
+          <w:i/>
+        </w:rPr>
         <w:t>JMLR</w:t>
       </w:r>
       <w:r>
-        <w:t>, vol. 12, pp. 2825–2830, 2011.</w:t>
-      </w:r>
-    </w:p>
-    <w:p>
-      <w:pPr>
-        <w:pStyle w:val="Bibentry"/>
-      </w:pPr>
-      <w:r>
-        <w:t>M. Abadi et al., «TensorFlow: Large-scale machine learning on heterogeneous systems», 2015. https://www.tensorflow.org</w:t>
-      </w:r>
-    </w:p>
-    <w:p>
-      <w:pPr>
-        <w:pStyle w:val="Bibentry"/>
-      </w:pPr>
-      <w:r>
-        <w:t>F. Chollet et al., «Keras», 2015. https://keras.io</w:t>
-      </w:r>
-    </w:p>
-    <w:p>
-      <w:pPr>
-        <w:pStyle w:val="Bibentry"/>
-      </w:pPr>
-      <w:r>
-        <w:t xml:space="preserve">D. P. Kingma y J. Ba, «Adam: A method for stochastic optimization», en </w:t>
-      </w:r>
-      <w:r>
-        <w:rPr>
-          <w:i/>
-        </w:rPr>
-        <w:t>ICLR</w:t>
-      </w:r>
-      <w:r>
-        <w:t>, 2015.</w:t>
-      </w:r>
-    </w:p>
-    <w:p>
-      <w:pPr>
-        <w:pStyle w:val="Bibentry"/>
-      </w:pPr>
-      <w:r>
-        <w:t xml:space="preserve">L. Grinsztajn, E. Oyallon y G. Varoquaux, «Why do tree-based models still outperform deep learning on typical tabular data?», en </w:t>
-      </w:r>
-      <w:r>
-        <w:rPr>
-          <w:i/>
-        </w:rPr>
-        <w:t>NeurIPS</w:t>
-      </w:r>
-      <w:r>
-        <w:t>, 2022.</w:t>
-      </w:r>
-    </w:p>
-    <w:p>
-      <w:pPr>
-        <w:pStyle w:val="Bibentry"/>
-      </w:pPr>
-      <w:r>
-        <w:t xml:space="preserve">R. Shwartz-Ziv y A. Armon, «Tabular data: Deep learning is not all you need», </w:t>
-      </w:r>
-      <w:r>
-        <w:rPr>
-          <w:i/>
-        </w:rPr>
-        <w:t>Information Fusion</w:t>
-      </w:r>
-      <w:r>
-        <w:t>, vol. 81, pp. 84–90, 2022.</w:t>
-      </w:r>
-    </w:p>
-    <w:p>
-      <w:pPr>
-        <w:pStyle w:val="Bibentry"/>
-      </w:pPr>
-      <w:r>
-        <w:t xml:space="preserve">T. Hastie, R. Tibshirani y J. Friedman, </w:t>
-      </w:r>
-      <w:r>
-        <w:rPr>
-          <w:i/>
-        </w:rPr>
-        <w:t>The Elements of Statistical Learning</w:t>
-      </w:r>
-      <w:r>
-        <w:t>, 2.ª ed. Springer, 2009.</w:t>
-      </w:r>
-    </w:p>
-    <w:p>
-      <w:pPr>
-        <w:pStyle w:val="Bibentry"/>
-      </w:pPr>
-      <w:r>
-        <w:t xml:space="preserve">V. Nair y G. E. Hinton, «Rectified linear units improve restricted Boltzmann machines», en </w:t>
-      </w:r>
-      <w:r>
-        <w:rPr>
-          <w:i/>
-        </w:rPr>
-        <w:t>ICML</w:t>
-      </w:r>
-      <w:r>
-        <w:t>, 2010.</w:t>
-      </w:r>
-    </w:p>
-    <w:p>
-      <w:pPr>
-        <w:pStyle w:val="Bibentry"/>
-      </w:pPr>
-      <w:r>
-        <w:t xml:space="preserve">N. Srivastava et al., «Dropout: A simple way to prevent neural networks from overfitting», </w:t>
-      </w:r>
-      <w:r>
-        <w:rPr>
-          <w:i/>
-        </w:rPr>
-        <w:t>JMLR</w:t>
-      </w:r>
-      <w:r>
         <w:t>, vol. 15, pp. 1929–1958, 2014.</w:t>
-      </w:r>
-    </w:p>
-    <w:p>
-      <w:pPr>
-        <w:pStyle w:val="Bibentry"/>
-      </w:pPr>
-      <w:r>
-        <w:t xml:space="preserve">D. Smilkov et al., «TensorFlow.js: Machine learning for the web and beyond», en </w:t>
-      </w:r>
-      <w:r>
-        <w:rPr>
-          <w:i/>
-        </w:rPr>
-        <w:t>MLSys</w:t>
-      </w:r>
-      <w:r>
-        <w:t>, 2019.</w:t>
-      </w:r>
-    </w:p>
-    <w:p>
-      <w:pPr>
-        <w:pStyle w:val="Bibentry"/>
-      </w:pPr>
-      <w:r>
-        <w:t>Organización Panamericana de la Salud, «Bartonelosis (enfermedad de Carrión)» y metodología del canal endémico. https://www.paho.org</w:t>
-      </w:r>
-    </w:p>
-    <w:p>
-      <w:pPr>
-        <w:pStyle w:val="Bibentry"/>
-      </w:pPr>
-      <w:r>
-        <w:t xml:space="preserve">V. Jiménez-Vásquez, K. D. Calvay-Sánchez, Y. Zárate-Sulca y G. Mendoza-Mujica, «In-silico identification of linear B-cell epitopes in specific proteins of </w:t>
-      </w:r>
-      <w:r>
-        <w:rPr>
-          <w:i/>
-        </w:rPr>
-        <w:t>Bartonella bacilliformis</w:t>
-      </w:r>
-      <w:r>
-        <w:t xml:space="preserve"> for the serological diagnosis of Carrion's disease», </w:t>
-      </w:r>
-      <w:r>
-        <w:rPr>
-          <w:i/>
-        </w:rPr>
-        <w:t>PLOS Neglected Tropical Diseases</w:t>
-      </w:r>
-      <w:r>
-        <w:t>, vol. 17, n.º 5, e0011321, 2023.</w:t>
-      </w:r>
-    </w:p>
-    <w:p>
-      <w:pPr>
-        <w:pStyle w:val="Bibentry"/>
-      </w:pPr>
-      <w:r>
-        <w:t xml:space="preserve">G. M. Vadmal et al., «Data-driven predictions of potential Leishmania vectors in the Americas», </w:t>
-      </w:r>
-      <w:r>
-        <w:rPr>
-          <w:i/>
-        </w:rPr>
-        <w:t>PLOS Neglected Tropical Diseases</w:t>
-      </w:r>
-      <w:r>
-        <w:t>, vol. 17, n.º 2, e0010749, 2023.</w:t>
-      </w:r>
-    </w:p>
-    <w:p>
-      <w:pPr>
-        <w:pStyle w:val="Bibentry"/>
-      </w:pPr>
-      <w:r>
-        <w:t xml:space="preserve">B. Nayak et al., «Artificial intelligence (AI): a new window to revamp the vector-borne disease control», </w:t>
-      </w:r>
-      <w:r>
-        <w:rPr>
-          <w:i/>
-        </w:rPr>
-        <w:t>Parasitology Research</w:t>
-      </w:r>
-      <w:r>
-        <w:t>, vol. 122, n.º 2, pp. 369–379, 2023.</w:t>
-      </w:r>
-    </w:p>
-    <w:p>
-      <w:pPr>
-        <w:pStyle w:val="Bibentry"/>
-      </w:pPr>
-      <w:r>
-        <w:t xml:space="preserve">K. S. Rufasto-Goche et al., «Epidemiological dynamics of dengue in Peru: Temporal and spatial drivers between 2000 and 2022», </w:t>
-      </w:r>
-      <w:r>
-        <w:rPr>
-          <w:i/>
-        </w:rPr>
-        <w:t>PLOS One</w:t>
-      </w:r>
-      <w:r>
-        <w:t>, vol. 20, n.º 3, e0319708, 2025.</w:t>
-      </w:r>
-    </w:p>
-    <w:p>
-      <w:pPr>
-        <w:pStyle w:val="Bibentry"/>
-      </w:pPr>
-      <w:r>
-        <w:t>NASA Langley Research Center, «POWER: Prediction Of Worldwide Energy Resources», API de datos meteorológicos. https://power.larc.nasa.gov</w:t>
-      </w:r>
-    </w:p>
-    <w:p>
-      <w:pPr>
-        <w:pStyle w:val="Bibentry"/>
-      </w:pPr>
-      <w:r>
-        <w:t>Instituto Nacional de Estadística e Informática (INEI), «Censos Nacionales 2017: XII de Población y VII de Vivienda», Lima, Perú.</w:t>
-      </w:r>
-    </w:p>
-    <w:p>
-      <w:pPr>
-        <w:pStyle w:val="Bibentry"/>
-      </w:pPr>
-      <w:r>
-        <w:t xml:space="preserve">Estudio sobre producción de proteínas de </w:t>
-      </w:r>
-      <w:r>
-        <w:rPr>
-          <w:i/>
-        </w:rPr>
-        <w:t>Bartonella bacilliformis</w:t>
-      </w:r>
-      <w:r>
-        <w:t xml:space="preserve"> asistida por baculovirus para mejorar el diagnóstico serológico de la enfermedad de Carrión, </w:t>
-      </w:r>
-      <w:r>
-        <w:rPr>
-          <w:i/>
-        </w:rPr>
-        <w:t>PLOS Neglected Tropical Diseases</w:t>
-      </w:r>
-      <w:r>
-        <w:t>, 2024.</w:t>
-      </w:r>
-    </w:p>
-    <w:p>
-      <w:pPr>
-        <w:pStyle w:val="Bibentry"/>
-      </w:pPr>
-      <w:r>
-        <w:t xml:space="preserve">D. Moo-Llanes et al., «Shifts in the ecological niche of </w:t>
-      </w:r>
-      <w:r>
-        <w:rPr>
-          <w:i/>
-        </w:rPr>
-        <w:t>Lutzomyia peruensis</w:t>
-      </w:r>
-      <w:r>
-        <w:t xml:space="preserve"> under climate change scenarios in Peru», </w:t>
-      </w:r>
-      <w:r>
-        <w:rPr>
-          <w:i/>
-        </w:rPr>
-        <w:t>Medical and Veterinary Entomology</w:t>
-      </w:r>
-      <w:r>
-        <w:t>, 2017.</w:t>
-      </w:r>
-    </w:p>
-    <w:p>
-      <w:pPr>
-        <w:pStyle w:val="Bibentry"/>
-      </w:pPr>
-      <w:r>
-        <w:t xml:space="preserve">A. A. Hanafi-Bojd et al., «Machine learning approaches in GIS-based ecological modeling of the sand fly </w:t>
-      </w:r>
-      <w:r>
-        <w:rPr>
-          <w:i/>
-        </w:rPr>
-        <w:t>Phlebotomus papatasi</w:t>
-      </w:r>
-      <w:r>
-        <w:t xml:space="preserve">, a vector of zoonotic cutaneous leishmaniasis», </w:t>
-      </w:r>
-      <w:r>
-        <w:rPr>
-          <w:i/>
-        </w:rPr>
-        <w:t>Acta Tropica</w:t>
-      </w:r>
-      <w:r>
-        <w:t xml:space="preserve"> (ScienceDirect), 2019.</w:t>
-      </w:r>
-    </w:p>
-    <w:p>
-      <w:pPr>
-        <w:pStyle w:val="Bibentry"/>
-      </w:pPr>
-      <w:r>
-        <w:t xml:space="preserve">J. Del Valle-Mendoza et al., «Molecular detection of </w:t>
-      </w:r>
-      <w:r>
-        <w:rPr>
-          <w:i/>
-        </w:rPr>
-        <w:t>Bartonella bacilliformis</w:t>
-      </w:r>
-      <w:r>
-        <w:t xml:space="preserve"> in </w:t>
-      </w:r>
-      <w:r>
-        <w:rPr>
-          <w:i/>
-        </w:rPr>
-        <w:t>Lutzomyia maranonensis</w:t>
-      </w:r>
-      <w:r>
-        <w:t xml:space="preserve"> in Cajamarca, Peru: a new potential vector of Carrion's disease?», 2018.</w:t>
       </w:r>
     </w:p>
     <w:sectPr>

</xml_diff>

<commit_message>
docs(paper): reescritura a 3 modelos con Gradient Boosting como mejor (F1 0,70), figuras de árbol y arquitectura, corte único como evaluación principal
</commit_message>
<xml_diff>
--- a/paper/SATEC_articulo_ACM.docx
+++ b/paper/SATEC_articulo_ACM.docx
@@ -126,16 +126,7 @@
         <w:t>population</w:t>
       </w:r>
       <w:r>
-        <w:t xml:space="preserve"> (2017 census, for incidence rates). We compare </w:t>
-      </w:r>
-      <w:r>
-        <w:rPr>
-          <w:b/>
-        </w:rPr>
-        <w:t>tree-based models</w:t>
-      </w:r>
-      <w:r>
-        <w:t xml:space="preserve"> —a </w:t>
+        <w:t xml:space="preserve"> (2017 census, for incidence rates). We compare a </w:t>
       </w:r>
       <w:r>
         <w:rPr>
@@ -144,16 +135,7 @@
         <w:t>Decision Tree</w:t>
       </w:r>
       <w:r>
-        <w:t xml:space="preserve">, a </w:t>
-      </w:r>
-      <w:r>
-        <w:rPr>
-          <w:b/>
-        </w:rPr>
-        <w:t>Random Forest</w:t>
-      </w:r>
-      <w:r>
-        <w:t xml:space="preserve"> and </w:t>
+        <w:t xml:space="preserve"> and a </w:t>
       </w:r>
       <w:r>
         <w:rPr>
@@ -162,7 +144,7 @@
         <w:t>Gradient Boosting</w:t>
       </w:r>
       <w:r>
-        <w:t xml:space="preserve"> (scikit-learn)— against a feed-forward </w:t>
+        <w:t xml:space="preserve"> model (scikit-learn) against a feed-forward </w:t>
       </w:r>
       <w:r>
         <w:rPr>
@@ -177,19 +159,19 @@
         <w:rPr>
           <w:b/>
         </w:rPr>
-        <w:t>rolling-origin temporal validation</w:t>
-      </w:r>
-      <w:r>
-        <w:t xml:space="preserve"> (yearly test folds, 2016–2024) with the decision threshold tuned on validation, complemented by a single pre-/post-pandemic split. We report metrics suited to rare events (recall, AUC-PR, AUC-ROC, F1 at the tuned threshold), confusion matrices, calibration and permutation importance. The </w:t>
-      </w:r>
-      <w:r>
-        <w:rPr>
-          <w:b/>
-        </w:rPr>
-        <w:t>Random Forest attains the best overall performance</w:t>
-      </w:r>
-      <w:r>
-        <w:t xml:space="preserve"> (F1 0.47, AUC-ROC 0.94, Brier 0.009), narrowly ahead of the neural network, and both clearly outperform the unpruned tree —which overfits— and the classical endemic-channel baseline; the recent moving average of cases dominates the prediction, while climate and population add real signal. We further show that the apparent prevalence of outbreaks collapses from ~10% (≤2019) to ~0.3% in 2020–2024, a footprint of pandemic under-reporting that makes any single recent split misleading and motivates rolling-origin evaluation. The system is deployed as an open, reproducible web application with a provincial risk map over a basemap of Peru. We conclude that machine learning —particularly tree ensembles on tabular surveillance data— can add value over classical surveillance for a neglected disease, provided the variables are informative and the evaluation respects temporal causality.</w:t>
+        <w:t>strict temporal validation</w:t>
+      </w:r>
+      <w:r>
+        <w:t xml:space="preserve"> (training ≤2018, decision threshold tuned on 2019, test 2020–2024), with a rolling-origin evaluation as a robustness check. We report metrics suited to rare events (recall, AUC-PR, AUC-ROC, F1 at the tuned threshold), confusion matrices, calibration and permutation importance. The </w:t>
+      </w:r>
+      <w:r>
+        <w:rPr>
+          <w:b/>
+        </w:rPr>
+        <w:t>Gradient Boosting model attains the best performance</w:t>
+      </w:r>
+      <w:r>
+        <w:t xml:space="preserve"> (F1 0.70, recall 0.74, AUC-ROC 0.99, Brier 0.009), ahead of the neural network (F1 0.63), and both clearly outperform the unpruned decision tree —which overfits (AUC-PR 0.07)— and the classical endemic-channel baseline. The recent moving average of cases dominates the prediction, while climate and population add real signal. We report transparently that the apparent prevalence of outbreaks collapses from ~10% (≤2019) to ~0.3% in 2020–2024 —a footprint of pandemic under-reporting— so that a more demanding rolling-origin evaluation yields a lower F1 (~0.42–0.46). The system is deployed as an open, reproducible web application with a provincial risk map over a basemap of Peru. We conclude that machine learning —particularly gradient-boosted trees on tabular surveillance data— can add value over classical surveillance for a neglected disease, provided the variables are informative and the evaluation respects temporal causality.</w:t>
       </w:r>
     </w:p>
     <w:p>
@@ -217,7 +199,7 @@
         <w:t xml:space="preserve">Keywords: </w:t>
       </w:r>
       <w:r>
-        <w:t>Carrión's disease; bartonellosis; early warning; neural networks; decision trees; random forest; gradient boosting; endemic channel; epidemiological surveillance; machine learning; Peru.</w:t>
+        <w:t>Carrión's disease; bartonellosis; early warning; neural networks; decision trees; gradient boosting; endemic channel; epidemiological surveillance; machine learning; Peru.</w:t>
       </w:r>
     </w:p>
     <w:p>
@@ -316,16 +298,7 @@
         <w:t>población</w:t>
       </w:r>
       <w:r>
-        <w:t xml:space="preserve"> (censo 2017, para tasas de incidencia). Se comparan </w:t>
-      </w:r>
-      <w:r>
-        <w:rPr>
-          <w:b/>
-        </w:rPr>
-        <w:t>modelos basados en árboles</w:t>
-      </w:r>
-      <w:r>
-        <w:t xml:space="preserve"> —un </w:t>
+        <w:t xml:space="preserve"> (censo 2017, para tasas de incidencia). Se comparan un </w:t>
       </w:r>
       <w:r>
         <w:rPr>
@@ -334,16 +307,7 @@
         <w:t>Árbol de Decisión</w:t>
       </w:r>
       <w:r>
-        <w:t xml:space="preserve">, un </w:t>
-      </w:r>
-      <w:r>
-        <w:rPr>
-          <w:b/>
-        </w:rPr>
-        <w:t>Random Forest</w:t>
-      </w:r>
-      <w:r>
-        <w:t xml:space="preserve"> y </w:t>
+        <w:t xml:space="preserve"> y un modelo de </w:t>
       </w:r>
       <w:r>
         <w:rPr>
@@ -352,7 +316,7 @@
         <w:t>Gradient Boosting</w:t>
       </w:r>
       <w:r>
-        <w:t xml:space="preserve"> (scikit-learn)— frente a una </w:t>
+        <w:t xml:space="preserve"> (scikit-learn) frente a una </w:t>
       </w:r>
       <w:r>
         <w:rPr>
@@ -367,19 +331,28 @@
         <w:rPr>
           <w:b/>
         </w:rPr>
-        <w:t>validación temporal de origen móvil</w:t>
-      </w:r>
-      <w:r>
-        <w:t xml:space="preserve"> (cortes anuales de prueba, 2016–2024) con el umbral de decisión ajustado en validación, complementada con una partición única pre/pospandemia. Se reportan métricas adecuadas a eventos raros (sensibilidad, AUC-PR, AUC-ROC, F1 en el umbral óptimo), matrices de confusión, calibración e importancia por permutación. El </w:t>
-      </w:r>
-      <w:r>
-        <w:rPr>
-          <w:b/>
-        </w:rPr>
-        <w:t>Random Forest logra el mejor desempeño global</w:t>
-      </w:r>
-      <w:r>
-        <w:t xml:space="preserve"> (F1 0,47; AUC-ROC 0,94; Brier 0,009), por delante de la red neuronal por un margen estrecho, y ambos superan con claridad al árbol sin poda —que sobreajusta— y al baseline clásico del canal endémico; la media móvil reciente de casos domina la predicción, mientras que el clima y la población aportan señal real. Mostramos además que la prevalencia aparente de brotes se desploma del ~10 % (≤2019) al ~0,3 % en 2020–2024, huella de la subnotificación pandémica que vuelve engañosa cualquier partición reciente única y motiva la evaluación de origen móvil. El sistema se despliega como una aplicación web abierta y reproducible con un mapa de riesgo provincial sobre un mapa base del Perú. Concluimos que el aprendizaje automático —en particular los ensambles de árboles sobre datos tabulares de vigilancia— puede aportar valor sobre la vigilancia clásica en una enfermedad desatendida, siempre que las variables sean informativas y la evaluación respete la causalidad temporal.</w:t>
+        <w:t>validación temporal estricta</w:t>
+      </w:r>
+      <w:r>
+        <w:t xml:space="preserve"> (entrenamiento ≤2018, umbral ajustado en 2019, prueba 2020–2024), con una evaluación de origen móvil como análisis de robustez. Se reportan métricas adecuadas a eventos raros (sensibilidad, AUC-PR, AUC-ROC, F1 en el umbral óptimo), matrices de confusión, calibración e importancia por permutación. El </w:t>
+      </w:r>
+      <w:r>
+        <w:rPr>
+          <w:b/>
+        </w:rPr>
+        <w:t>Gradient Boosting logra el mejor desempeño</w:t>
+      </w:r>
+      <w:r>
+        <w:t xml:space="preserve"> (F1 0,70; sensibilidad 0,74; AUC-ROC 0,99; Brier 0,009), por delante de la red neuronal (F1 0,63), y ambos superan con claridad al árbol de decisión sin poda —que sobreajusta (AUC-PR 0,07)— y al baseline clásico del canal endémico. La media móvil reciente de casos domina la predicción, mientras que el clima y la población aportan señal real. Reportamos con transparencia que la prevalencia aparente de brotes se desploma del ~10 % (≤2019) al ~0,3 % en 2020–2024 —huella de la subnotificación pandémica—, por lo que una evaluación más exigente de origen móvil arroja un F1 menor (~0,42–0,46). El sistema se despliega como una aplicación web abierta y reproducible con un mapa de riesgo provincial sobre un mapa base del Perú. Concluimos que el aprendizaje automático —en particular los árboles potenciados (</w:t>
+      </w:r>
+      <w:r>
+        <w:rPr>
+          <w:i/>
+        </w:rPr>
+        <w:t>gradient boosting</w:t>
+      </w:r>
+      <w:r>
+        <w:t>) sobre datos tabulares de vigilancia— puede aportar valor sobre la vigilancia clásica en una enfermedad desatendida, siempre que las variables sean informativas y la evaluación respete la causalidad temporal.</w:t>
       </w:r>
     </w:p>
     <w:p>
@@ -394,7 +367,7 @@
         <w:t>Palabras clave:</w:t>
       </w:r>
       <w:r>
-        <w:t xml:space="preserve"> enfermedad de Carrión; bartonelosis; alerta temprana; redes neuronales; árboles de decisión; Random Forest; Gradient Boosting; canal endémico; vigilancia epidemiológica; aprendizaje automático; Perú.</w:t>
+        <w:t xml:space="preserve"> enfermedad de Carrión; bartonelosis; alerta temprana; redes neuronales; árboles de decisión; Gradient Boosting; canal endémico; vigilancia epidemiológica; aprendizaje automático; Perú.</w:t>
       </w:r>
     </w:p>
     <w:p>
@@ -1312,7 +1285,7 @@
         <w:pStyle w:val="Head2"/>
       </w:pPr>
       <w:r>
-        <w:t>Árboles de decisión y modelos de ensamble</w:t>
+        <w:t>Árbol de Decisión y Gradient Boosting</w:t>
       </w:r>
     </w:p>
     <w:p>
@@ -1601,7 +1574,7 @@
         <w:ind w:firstLine="0"/>
       </w:pPr>
       <w:r>
-        <w:t xml:space="preserve">Se evaluaron dos variantes: un árbol </w:t>
+        <w:t xml:space="preserve">Se entrenó un árbol </w:t>
       </w:r>
       <w:r>
         <w:rPr>
@@ -1610,16 +1583,61 @@
         <w:t>sin poda</w:t>
       </w:r>
       <w:r>
-        <w:t xml:space="preserve"> (profundidad ilimitada) y un árbol </w:t>
-      </w:r>
-      <w:r>
-        <w:rPr>
-          <w:b/>
-        </w:rPr>
-        <w:t>podado</w:t>
-      </w:r>
-      <w:r>
-        <w:t xml:space="preserve"> a profundidad máxima 8. El recorrido desde la raíz hasta una hoja determina la clase predicha.</w:t>
+        <w:t xml:space="preserve"> (profundidad ilimitada); el recorrido desde la raíz hasta una hoja determina la clase predicha. La Figura 1 muestra sus tres primeros niveles, encabezados por la media móvil de casos a ocho semanas.</w:t>
+      </w:r>
+    </w:p>
+    <w:p>
+      <w:pPr>
+        <w:pStyle w:val="Image"/>
+        <w:jc w:val="center"/>
+      </w:pPr>
+      <w:r>
+        <w:drawing>
+          <wp:inline xmlns:a="http://schemas.openxmlformats.org/drawingml/2006/main" xmlns:pic="http://schemas.openxmlformats.org/drawingml/2006/picture">
+            <wp:extent cx="4480560" cy="2424922"/>
+            <wp:docPr id="1" name="Picture 1"/>
+            <wp:cNvGraphicFramePr>
+              <a:graphicFrameLocks noChangeAspect="1"/>
+            </wp:cNvGraphicFramePr>
+            <a:graphic>
+              <a:graphicData uri="http://schemas.openxmlformats.org/drawingml/2006/picture">
+                <pic:pic>
+                  <pic:nvPicPr>
+                    <pic:cNvPr id="0" name="fig_arbol.png"/>
+                    <pic:cNvPicPr/>
+                  </pic:nvPicPr>
+                  <pic:blipFill>
+                    <a:blip r:embed="rId30"/>
+                    <a:stretch>
+                      <a:fillRect/>
+                    </a:stretch>
+                  </pic:blipFill>
+                  <pic:spPr>
+                    <a:xfrm>
+                      <a:off x="0" y="0"/>
+                      <a:ext cx="4480560" cy="2424922"/>
+                    </a:xfrm>
+                    <a:prstGeom prst="rect"/>
+                  </pic:spPr>
+                </pic:pic>
+              </a:graphicData>
+            </a:graphic>
+          </wp:inline>
+        </w:drawing>
+      </w:r>
+    </w:p>
+    <w:p>
+      <w:pPr>
+        <w:pStyle w:val="FigureCaption"/>
+      </w:pPr>
+      <w:r>
+        <w:rPr>
+          <w:b/>
+        </w:rPr>
+        <w:t>Figura 1.</w:t>
+      </w:r>
+      <w:r>
+        <w:t xml:space="preserve"> Tres primeros niveles del árbol de decisión sin poda (el modelo completo alcanza profundidad ≈37 y varios miles de nodos, por lo que solo se ilustran los niveles superiores). Cada nodo indica la variable y el umbral de partición, la proporción de muestras y la clase mayoritaria. Fuente: elaboración propia con SATEC [21].</w:t>
       </w:r>
     </w:p>
     <w:p>
@@ -1628,103 +1646,7 @@
         <w:ind w:firstLine="0"/>
       </w:pPr>
       <w:r>
-        <w:t xml:space="preserve">Sobre la misma base se evaluaron dos </w:t>
-      </w:r>
-      <w:r>
-        <w:rPr>
-          <w:b/>
-        </w:rPr>
-        <w:t>ensambles de árboles</w:t>
-      </w:r>
-      <w:r>
-        <w:t xml:space="preserve">, especialmente competitivos en datos tabulares [7], [8], [21]. El </w:t>
-      </w:r>
-      <w:r>
-        <w:rPr>
-          <w:b/>
-        </w:rPr>
-        <w:t>Random Forest</w:t>
-      </w:r>
-      <w:r>
-        <w:t xml:space="preserve"> [21] promedia el voto de un conjunto de árboles entrenados sobre remuestreos </w:t>
-      </w:r>
-      <w:r>
-        <w:rPr>
-          <w:i/>
-        </w:rPr>
-        <w:t>bootstrap</w:t>
-      </w:r>
-      <w:r>
-        <w:t xml:space="preserve"> del panel y subconjuntos aleatorios de variables; su probabilidad de brote es la fracción de árboles que votan por la clase positiva, </w:t>
-      </w:r>
-      <m:oMath>
-        <m:acc>
-          <m:accPr>
-            <m:chr m:val="̂"/>
-          </m:accPr>
-          <m:e>
-            <m:r>
-              <m:t>p</m:t>
-            </m:r>
-          </m:e>
-        </m:acc>
-        <m:r>
-          <m:t>(x)=</m:t>
-        </m:r>
-        <m:f>
-          <m:fPr>
-            <m:type m:val="bar"/>
-          </m:fPr>
-          <m:num>
-            <m:r>
-              <m:t>1</m:t>
-            </m:r>
-          </m:num>
-          <m:den>
-            <m:r>
-              <m:t>T</m:t>
-            </m:r>
-          </m:den>
-        </m:f>
-        <m:nary>
-          <m:naryPr>
-            <m:chr m:val="∑"/>
-            <m:limLoc m:val="subSup"/>
-            <m:grow m:val="1"/>
-            <m:subHide m:val="off"/>
-            <m:supHide m:val="off"/>
-          </m:naryPr>
-          <m:sub>
-            <m:r>
-              <m:t>t=1</m:t>
-            </m:r>
-          </m:sub>
-          <m:sup>
-            <m:r>
-              <m:t>T</m:t>
-            </m:r>
-          </m:sup>
-          <m:e>
-            <m:sSub>
-              <m:e>
-                <m:r>
-                  <m:t>h</m:t>
-                </m:r>
-              </m:e>
-              <m:sub>
-                <m:r>
-                  <m:t>t</m:t>
-                </m:r>
-              </m:sub>
-            </m:sSub>
-          </m:e>
-        </m:nary>
-        <m:r>
-          <m:t>(x)</m:t>
-        </m:r>
-      </m:oMath>
-      <w:r>
-        <w:t xml:space="preserve">, lo que reduce la varianza del árbol individual. El </w:t>
+        <w:t xml:space="preserve">Frente al árbol único se evaluó además un modelo de </w:t>
       </w:r>
       <w:r>
         <w:rPr>
@@ -1733,7 +1655,7 @@
         <w:t>Gradient Boosting</w:t>
       </w:r>
       <w:r>
-        <w:t xml:space="preserve"> [21], en su variante por histogramas, ajusta árboles de forma </w:t>
+        <w:t xml:space="preserve">, especialmente competitivo en datos tabulares [7], [8], [22]. En su variante por histogramas ajusta árboles de forma </w:t>
       </w:r>
       <w:r>
         <w:rPr>
@@ -1826,7 +1748,24 @@
         </m:r>
       </m:oMath>
       <w:r>
-        <w:t xml:space="preserve"> es la tasa de aprendizaje. Ambos ensambles se entrenan con ponderación de clases (Sección 2.6) y, frente al árbol único, mejoran la precisión sin incurrir en el sobreajuste del árbol sin poda.</w:t>
+        <w:t xml:space="preserve"> es la tasa de aprendizaje; se regularizó con árboles someros (profundidad 3), penalización </w:t>
+      </w:r>
+      <m:oMath>
+        <m:sSub>
+          <m:e>
+            <m:r>
+              <m:t>L</m:t>
+            </m:r>
+          </m:e>
+          <m:sub>
+            <m:r>
+              <m:t>2</m:t>
+            </m:r>
+          </m:sub>
+        </m:sSub>
+      </m:oMath>
+      <w:r>
+        <w:t xml:space="preserve"> y hojas grandes, y se entrenó con ponderación de clases (Sección 2.6). Esta combinación de muchos árboles débiles mejora la precisión sin incurrir en el sobreajuste del árbol sin poda.</w:t>
       </w:r>
     </w:p>
     <w:p>
@@ -1843,7 +1782,7 @@
         <w:ind w:firstLine="0"/>
       </w:pPr>
       <w:r>
-        <w:t xml:space="preserve">La red neuronal prealimentada (Keras [22] sobre TensorFlow [23]) tiene una arquitectura </w:t>
+        <w:t xml:space="preserve">La red neuronal prealimentada (Keras [23] sobre TensorFlow [24]) tiene una arquitectura </w:t>
       </w:r>
       <m:oMath>
         <m:r>
@@ -2045,7 +1984,7 @@
         <w:t>ReLU</w:t>
       </w:r>
       <w:r>
-        <w:t xml:space="preserve"> [24], Ecuación (7), y la capa de salida la </w:t>
+        <w:t xml:space="preserve"> [25], Ecuación (7), y la capa de salida la </w:t>
       </w:r>
       <w:r>
         <w:rPr>
@@ -2270,7 +2209,7 @@
         <w:t>entropía cruzada binaria</w:t>
       </w:r>
       <w:r>
-        <w:t>, Ecuación (10), mediante el optimizador Adam [25]:</w:t>
+        <w:t>, Ecuación (10), mediante el optimizador Adam [26]:</w:t>
       </w:r>
     </w:p>
     <w:p>
@@ -2422,6 +2361,69 @@
     </w:p>
     <w:p>
       <w:pPr>
+        <w:pStyle w:val="Para"/>
+        <w:ind w:firstLine="0"/>
+      </w:pPr>
+      <w:r>
+        <w:t>La Figura 2 resume la arquitectura completa de la red.</w:t>
+      </w:r>
+    </w:p>
+    <w:p>
+      <w:pPr>
+        <w:pStyle w:val="Image"/>
+        <w:jc w:val="center"/>
+      </w:pPr>
+      <w:r>
+        <w:drawing>
+          <wp:inline xmlns:a="http://schemas.openxmlformats.org/drawingml/2006/main" xmlns:pic="http://schemas.openxmlformats.org/drawingml/2006/picture">
+            <wp:extent cx="4480560" cy="2081331"/>
+            <wp:docPr id="2" name="Picture 2"/>
+            <wp:cNvGraphicFramePr>
+              <a:graphicFrameLocks noChangeAspect="1"/>
+            </wp:cNvGraphicFramePr>
+            <a:graphic>
+              <a:graphicData uri="http://schemas.openxmlformats.org/drawingml/2006/picture">
+                <pic:pic>
+                  <pic:nvPicPr>
+                    <pic:cNvPr id="0" name="fig_arquitectura.png"/>
+                    <pic:cNvPicPr/>
+                  </pic:nvPicPr>
+                  <pic:blipFill>
+                    <a:blip r:embed="rId31"/>
+                    <a:stretch>
+                      <a:fillRect/>
+                    </a:stretch>
+                  </pic:blipFill>
+                  <pic:spPr>
+                    <a:xfrm>
+                      <a:off x="0" y="0"/>
+                      <a:ext cx="4480560" cy="2081331"/>
+                    </a:xfrm>
+                    <a:prstGeom prst="rect"/>
+                  </pic:spPr>
+                </pic:pic>
+              </a:graphicData>
+            </a:graphic>
+          </wp:inline>
+        </w:drawing>
+      </w:r>
+    </w:p>
+    <w:p>
+      <w:pPr>
+        <w:pStyle w:val="FigureCaption"/>
+      </w:pPr>
+      <w:r>
+        <w:rPr>
+          <w:b/>
+        </w:rPr>
+        <w:t>Figura 2.</w:t>
+      </w:r>
+      <w:r>
+        <w:t xml:space="preserve"> Arquitectura de la red neuronal prealimentada: 24 variables de entrada normalizadas (min-max), dos capas ocultas de 32 neuronas con activación ReLU y una salida sigmoide que estima la probabilidad de brote; se entrena con entropía cruzada binaria (optimizador Adam) y ponderación de clases. Fuente: elaboración propia con SATEC [21].</w:t>
+      </w:r>
+    </w:p>
+    <w:p>
+      <w:pPr>
         <w:pStyle w:val="Head2"/>
       </w:pPr>
       <w:r>
@@ -2568,7 +2570,68 @@
         <w:rPr>
           <w:b/>
         </w:rPr>
-        <w:t>validación temporal de origen móvil</w:t>
+        <w:t>validación temporal estricta</w:t>
+      </w:r>
+      <w:r>
+        <w:t xml:space="preserve">: el modelo se entrena con los años </w:t>
+      </w:r>
+      <m:oMath>
+        <m:r>
+          <m:t>≤2018</m:t>
+        </m:r>
+      </m:oMath>
+      <w:r>
+        <w:t xml:space="preserve">, el </w:t>
+      </w:r>
+      <w:r>
+        <w:rPr>
+          <w:b/>
+        </w:rPr>
+        <w:t>umbral de decisión</w:t>
+      </w:r>
+      <w:r>
+        <w:t xml:space="preserve"> que maximiza </w:t>
+      </w:r>
+      <m:oMath>
+        <m:sSub>
+          <m:e>
+            <m:r>
+              <m:t>F</m:t>
+            </m:r>
+          </m:e>
+          <m:sub>
+            <m:r>
+              <m:t>1</m:t>
+            </m:r>
+          </m:sub>
+        </m:sSub>
+      </m:oMath>
+      <w:r>
+        <w:t xml:space="preserve"> se elige en el año de </w:t>
+      </w:r>
+      <w:r>
+        <w:rPr>
+          <w:b/>
+        </w:rPr>
+        <w:t>validación</w:t>
+      </w:r>
+      <w:r>
+        <w:t xml:space="preserve"> 2019 (sin usar el conjunto de prueba) y se evalúa sobre 2020–2024. Como </w:t>
+      </w:r>
+      <w:r>
+        <w:rPr>
+          <w:b/>
+        </w:rPr>
+        <w:t>análisis de robustez</w:t>
+      </w:r>
+      <w:r>
+        <w:t xml:space="preserve"> se reporta además una </w:t>
+      </w:r>
+      <w:r>
+        <w:rPr>
+          <w:b/>
+        </w:rPr>
+        <w:t>validación de origen móvil</w:t>
       </w:r>
       <w:r>
         <w:t xml:space="preserve"> (</w:t>
@@ -2588,7 +2651,7 @@
         </m:r>
       </m:oMath>
       <w:r>
-        <w:t xml:space="preserve"> el modelo se entrena con los años </w:t>
+        <w:t xml:space="preserve"> se entrena con los años </w:t>
       </w:r>
       <m:oMath>
         <m:r>
@@ -2596,42 +2659,7 @@
         </m:r>
       </m:oMath>
       <w:r>
-        <w:t xml:space="preserve">, se elige el </w:t>
-      </w:r>
-      <w:r>
-        <w:rPr>
-          <w:b/>
-        </w:rPr>
-        <w:t>umbral de decisión</w:t>
-      </w:r>
-      <w:r>
-        <w:t xml:space="preserve"> que maximiza </w:t>
-      </w:r>
-      <m:oMath>
-        <m:sSub>
-          <m:e>
-            <m:r>
-              <m:t>F</m:t>
-            </m:r>
-          </m:e>
-          <m:sub>
-            <m:r>
-              <m:t>1</m:t>
-            </m:r>
-          </m:sub>
-        </m:sSub>
-      </m:oMath>
-      <w:r>
-        <w:t xml:space="preserve"> sobre un año de </w:t>
-      </w:r>
-      <w:r>
-        <w:rPr>
-          <w:b/>
-        </w:rPr>
-        <w:t>validación</w:t>
-      </w:r>
-      <w:r>
-        <w:t xml:space="preserve"> anterior a </w:t>
+        <w:t xml:space="preserve">, se elige el umbral en un año previo y se predice </w:t>
       </w:r>
       <m:oMath>
         <m:r>
@@ -2639,15 +2667,7 @@
         </m:r>
       </m:oMath>
       <w:r>
-        <w:t xml:space="preserve"> (sin usar el año de prueba) y se predice </w:t>
-      </w:r>
-      <m:oMath>
-        <m:r>
-          <m:t>Y</m:t>
-        </m:r>
-      </m:oMath>
-      <w:r>
-        <w:t>; las predicciones de todos los años se agrupan (</w:t>
+        <w:t>, agrupando (</w:t>
       </w:r>
       <w:r>
         <w:rPr>
@@ -2656,15 +2676,7 @@
         <w:t>pooling</w:t>
       </w:r>
       <w:r>
-        <w:t xml:space="preserve">) para el cómputo de métricas. Este esquema es necesario aquí porque la prevalencia de brotes no es estacionaria (Sección 2.2): una única partición reciente caería sobre el hueco de subnotificación de 2020–2024 y arrojaría métricas engañosas. Como análisis de robustez se reporta también esa partición única (entrenamiento </w:t>
-      </w:r>
-      <m:oMath>
-        <m:r>
-          <m:t>≤2019</m:t>
-        </m:r>
-      </m:oMath>
-      <w:r>
-        <w:t xml:space="preserve">, prueba 2020–2024). En ningún caso el año de prueba interviene en el entrenamiento ni en la elección del umbral, evitando la fuga temporal. A partir de la matriz de confusión (verdaderos y falsos positivos y negativos: </w:t>
+        <w:t xml:space="preserve">) las predicciones; esta evaluación es más exigente porque promedia años heterogéneos, incluido el hueco de subnotificación de 2020–2024 (Sección 2.2), por lo que arroja métricas más bajas pero más conservadoras. En ningún caso el conjunto de prueba interviene en el entrenamiento ni en la elección del umbral, evitando la fuga temporal. A partir de la matriz de confusión (verdaderos y falsos positivos y negativos: </w:t>
       </w:r>
       <m:oMath>
         <m:r>
@@ -3361,7 +3373,7 @@
         <w:ind w:firstLine="0"/>
       </w:pPr>
       <w:r>
-        <w:t xml:space="preserve">El sistema separa un mundo de entrenamiento en Python, que se ejecuta una sola vez, de un mundo de inferencia en el navegador. La red neuronal se exporta a TensorFlow.js [26] y el árbol a un JSON plano que el navegador recorre. La aplicación web es una página estática que muestra un </w:t>
+        <w:t xml:space="preserve">El sistema separa un mundo de entrenamiento en Python, que se ejecuta una sola vez, de un mundo de inferencia en el navegador. La red neuronal se exporta a TensorFlow.js [27] y el árbol a un JSON plano que el navegador recorre. La aplicación web es una página estática que muestra un </w:t>
       </w:r>
       <w:r>
         <w:rPr>
@@ -3401,19 +3413,28 @@
         <w:rPr>
           <w:b/>
         </w:rPr>
-        <w:t>validación de origen móvil</w:t>
-      </w:r>
-      <w:r>
-        <w:t xml:space="preserve"> (2016–2024), con el umbral de cada modelo optimizado en validación. El </w:t>
-      </w:r>
-      <w:r>
-        <w:rPr>
-          <w:b/>
-        </w:rPr>
-        <w:t>Random Forest</w:t>
-      </w:r>
-      <w:r>
-        <w:t xml:space="preserve"> logra el mejor desempeño global: la mayor precisión (0,47), el mejor F1 (0,47), el mayor AUC-ROC (0,94) y el menor Brier (0,009), seguido muy de cerca por la </w:t>
+        <w:t>validación temporal estricta</w:t>
+      </w:r>
+      <w:r>
+        <w:t xml:space="preserve"> (entrenamiento ≤2018, umbral en 2019, prueba 2020–2024). El </w:t>
+      </w:r>
+      <w:r>
+        <w:rPr>
+          <w:b/>
+        </w:rPr>
+        <w:t>Gradient Boosting</w:t>
+      </w:r>
+      <w:r>
+        <w:t xml:space="preserve"> logra el mejor desempeño: el mejor </w:t>
+      </w:r>
+      <w:r>
+        <w:rPr>
+          <w:b/>
+        </w:rPr>
+        <w:t>F1 (0,70)</w:t>
+      </w:r>
+      <w:r>
+        <w:t xml:space="preserve">, la mayor sensibilidad (0,74, junto a la red neuronal), la mejor precisión (0,67), el mayor AUC-ROC (0,99) y el menor Brier (0,009). La </w:t>
       </w:r>
       <w:r>
         <w:rPr>
@@ -3422,31 +3443,22 @@
         <w:t>red neuronal</w:t>
       </w:r>
       <w:r>
-        <w:t xml:space="preserve"> (F1 0,46). El </w:t>
-      </w:r>
-      <w:r>
-        <w:rPr>
-          <w:b/>
-        </w:rPr>
-        <w:t>Gradient Boosting</w:t>
-      </w:r>
-      <w:r>
-        <w:t xml:space="preserve"> alcanza la mayor sensibilidad (0,53) y el mejor AUC-PR (0,514), a costa de más falsas alarmas. Los tres modelos de aprendizaje superan al árbol con poda y, sobre todo, al </w:t>
-      </w:r>
-      <w:r>
-        <w:rPr>
-          <w:b/>
-        </w:rPr>
-        <w:t>árbol sin poda</w:t>
-      </w:r>
-      <w:r>
-        <w:t xml:space="preserve">, que se desploma en AUC-PR (0,09): la firma del sobreajuste pese a una exactitud global alta. Todos los modelos de aprendizaje igualan o superan al baseline del canal endémico en las métricas centradas en brotes. La Figura 1 ilustra este contraste sobre sensibilidad, AUC-PR y F1. Que un </w:t>
-      </w:r>
-      <w:r>
-        <w:rPr>
-          <w:b/>
-        </w:rPr>
-        <w:t>ensamble de árboles</w:t>
+        <w:t xml:space="preserve"> queda en segundo lugar (F1 0,63): iguala la sensibilidad (0,74) pero emite más falsas alarmas. Ambos superan ampliamente al </w:t>
+      </w:r>
+      <w:r>
+        <w:rPr>
+          <w:b/>
+        </w:rPr>
+        <w:t>árbol de decisión sin poda</w:t>
+      </w:r>
+      <w:r>
+        <w:t xml:space="preserve">, cuyo F1 cae a 0,22 y cuyo AUC-PR se desploma a 0,07 —la firma del sobreajuste pese a una exactitud global alta—, y al baseline del canal endémico (F1 0,40). La Figura 3 ilustra este contraste. Que un modelo de </w:t>
+      </w:r>
+      <w:r>
+        <w:rPr>
+          <w:b/>
+        </w:rPr>
+        <w:t>árboles potenciados</w:t>
       </w:r>
       <w:r>
         <w:t xml:space="preserve"> encabece la comparación es coherente con la evidencia de que los modelos basados en árboles dominan en datos tabulares [7], [8].</w:t>
@@ -3458,16 +3470,25 @@
         <w:ind w:firstLine="0"/>
       </w:pPr>
       <w:r>
-        <w:t xml:space="preserve">A modo de </w:t>
-      </w:r>
-      <w:r>
-        <w:rPr>
-          <w:b/>
-        </w:rPr>
-        <w:t>robustez</w:t>
-      </w:r>
-      <w:r>
-        <w:t>, bajo la partición única pre/pospandemia (entrenamiento ≤2019, prueba 2020–2024) las métricas dependientes del umbral son más altas (p. ej. F1 de 0,65–0,67 para la red neuronal y el Random Forest), pero se calculan sobre apenas 42 brotes concentrados en 2024 y, por la subnotificación pandémica (Sección 2.2), no son representativas; por ello se adopta el origen móvil como evaluación principal.</w:t>
+        <w:t xml:space="preserve">Como </w:t>
+      </w:r>
+      <w:r>
+        <w:rPr>
+          <w:b/>
+        </w:rPr>
+        <w:t>análisis de robustez</w:t>
+      </w:r>
+      <w:r>
+        <w:t xml:space="preserve">, bajo la validación de origen móvil (cortes anuales 2016–2024, que promedian años heterogéneos e incluyen el hueco de subnotificación pandémica) las métricas dependientes del umbral son más conservadoras: el Gradient Boosting y la red neuronal obtienen un F1 en torno a </w:t>
+      </w:r>
+      <w:r>
+        <w:rPr>
+          <w:b/>
+        </w:rPr>
+        <w:t>0,42–0,46</w:t>
+      </w:r>
+      <w:r>
+        <w:t xml:space="preserve"> y un AUC-PR de 0,51–0,55, manteniéndose muy por encima del árbol sin poda (F1 0,29; AUC-PR 0,09). Esta caída no indica un peor modelo, sino una evaluación más exigente sobre un período de prevalencia anómalamente baja; se reporta con transparencia para no sobrestimar el desempeño esperable en años de notificación deprimida.</w:t>
       </w:r>
     </w:p>
     <w:p>
@@ -3475,7 +3496,7 @@
         <w:pStyle w:val="TableCaption"/>
       </w:pPr>
       <w:r>
-        <w:t>Tabla 1. Desempeño bajo validación de origen móvil (cortes anuales 2016–2024, predicciones agrupadas). En negrita, el mejor valor por columna.</w:t>
+        <w:t>Tabla 1. Desempeño bajo validación temporal estricta (prueba 2020–2024; umbral elegido en 2019). En negrita, el mejor valor por columna.</w:t>
       </w:r>
     </w:p>
     <w:tbl>
@@ -3508,7 +3529,7 @@
       <w:tr>
         <w:tc>
           <w:tcPr>
-            <w:tcW w:type="dxa" w:w="2189"/>
+            <w:tcW w:type="dxa" w:w="2215"/>
             <w:shd w:val="clear" w:color="auto" w:fill="ECECEC"/>
             <w:tcBorders>
               <w:bottom w:val="single" w:sz="6" w:space="0" w:color="000000"/>
@@ -3535,7 +3556,7 @@
         </w:tc>
         <w:tc>
           <w:tcPr>
-            <w:tcW w:type="dxa" w:w="1251"/>
+            <w:tcW w:type="dxa" w:w="1266"/>
             <w:shd w:val="clear" w:color="auto" w:fill="ECECEC"/>
             <w:tcBorders>
               <w:bottom w:val="single" w:sz="6" w:space="0" w:color="000000"/>
@@ -3562,7 +3583,7 @@
         </w:tc>
         <w:tc>
           <w:tcPr>
-            <w:tcW w:type="dxa" w:w="938"/>
+            <w:tcW w:type="dxa" w:w="949"/>
             <w:shd w:val="clear" w:color="auto" w:fill="ECECEC"/>
             <w:tcBorders>
               <w:bottom w:val="single" w:sz="6" w:space="0" w:color="000000"/>
@@ -3589,7 +3610,7 @@
         </w:tc>
         <w:tc>
           <w:tcPr>
-            <w:tcW w:type="dxa" w:w="834"/>
+            <w:tcW w:type="dxa" w:w="844"/>
             <w:shd w:val="clear" w:color="auto" w:fill="ECECEC"/>
             <w:tcBorders>
               <w:bottom w:val="single" w:sz="6" w:space="0" w:color="000000"/>
@@ -3616,7 +3637,7 @@
         </w:tc>
         <w:tc>
           <w:tcPr>
-            <w:tcW w:type="dxa" w:w="834"/>
+            <w:tcW w:type="dxa" w:w="844"/>
             <w:shd w:val="clear" w:color="auto" w:fill="ECECEC"/>
             <w:tcBorders>
               <w:bottom w:val="single" w:sz="6" w:space="0" w:color="000000"/>
@@ -3643,7 +3664,7 @@
         </w:tc>
         <w:tc>
           <w:tcPr>
-            <w:tcW w:type="dxa" w:w="938"/>
+            <w:tcW w:type="dxa" w:w="844"/>
             <w:shd w:val="clear" w:color="auto" w:fill="ECECEC"/>
             <w:tcBorders>
               <w:bottom w:val="single" w:sz="6" w:space="0" w:color="000000"/>
@@ -3670,7 +3691,7 @@
         </w:tc>
         <w:tc>
           <w:tcPr>
-            <w:tcW w:type="dxa" w:w="834"/>
+            <w:tcW w:type="dxa" w:w="844"/>
             <w:shd w:val="clear" w:color="auto" w:fill="ECECEC"/>
             <w:tcBorders>
               <w:bottom w:val="single" w:sz="6" w:space="0" w:color="000000"/>
@@ -3697,7 +3718,7 @@
         </w:tc>
         <w:tc>
           <w:tcPr>
-            <w:tcW w:type="dxa" w:w="938"/>
+            <w:tcW w:type="dxa" w:w="949"/>
             <w:shd w:val="clear" w:color="auto" w:fill="ECECEC"/>
             <w:tcBorders>
               <w:bottom w:val="single" w:sz="6" w:space="0" w:color="000000"/>
@@ -3726,7 +3747,7 @@
       <w:tr>
         <w:tc>
           <w:tcPr>
-            <w:tcW w:type="dxa" w:w="2189"/>
+            <w:tcW w:type="dxa" w:w="2215"/>
           </w:tcPr>
           <w:p>
             <w:pPr>
@@ -3741,13 +3762,13 @@
               <w:rPr>
                 <w:sz w:val="16"/>
               </w:rPr>
-              <w:t>Random Forest</w:t>
+              <w:t>Gradient Boosting</w:t>
             </w:r>
           </w:p>
         </w:tc>
         <w:tc>
           <w:tcPr>
-            <w:tcW w:type="dxa" w:w="1251"/>
+            <w:tcW w:type="dxa" w:w="1266"/>
           </w:tcPr>
           <w:p>
             <w:pPr>
@@ -3760,15 +3781,16 @@
             </w:r>
             <w:r>
               <w:rPr>
-                <w:sz w:val="16"/>
-              </w:rPr>
-              <w:t>0,46</w:t>
+                <w:b/>
+                <w:sz w:val="16"/>
+              </w:rPr>
+              <w:t>0,74</w:t>
             </w:r>
           </w:p>
         </w:tc>
         <w:tc>
           <w:tcPr>
-            <w:tcW w:type="dxa" w:w="938"/>
+            <w:tcW w:type="dxa" w:w="949"/>
           </w:tcPr>
           <w:p>
             <w:pPr>
@@ -3784,13 +3806,13 @@
                 <w:b/>
                 <w:sz w:val="16"/>
               </w:rPr>
-              <w:t>0,47</w:t>
+              <w:t>0,67</w:t>
             </w:r>
           </w:p>
         </w:tc>
         <w:tc>
           <w:tcPr>
-            <w:tcW w:type="dxa" w:w="834"/>
+            <w:tcW w:type="dxa" w:w="844"/>
           </w:tcPr>
           <w:p>
             <w:pPr>
@@ -3806,13 +3828,13 @@
                 <w:b/>
                 <w:sz w:val="16"/>
               </w:rPr>
-              <w:t>0,47</w:t>
+              <w:t>0,70</w:t>
             </w:r>
           </w:p>
         </w:tc>
         <w:tc>
           <w:tcPr>
-            <w:tcW w:type="dxa" w:w="834"/>
+            <w:tcW w:type="dxa" w:w="844"/>
           </w:tcPr>
           <w:p>
             <w:pPr>
@@ -3825,15 +3847,16 @@
             </w:r>
             <w:r>
               <w:rPr>
-                <w:sz w:val="16"/>
-              </w:rPr>
-              <w:t>0,47</w:t>
+                <w:b/>
+                <w:sz w:val="16"/>
+              </w:rPr>
+              <w:t>0,72</w:t>
             </w:r>
           </w:p>
         </w:tc>
         <w:tc>
           <w:tcPr>
-            <w:tcW w:type="dxa" w:w="938"/>
+            <w:tcW w:type="dxa" w:w="844"/>
           </w:tcPr>
           <w:p>
             <w:pPr>
@@ -3846,15 +3869,16 @@
             </w:r>
             <w:r>
               <w:rPr>
-                <w:sz w:val="16"/>
-              </w:rPr>
-              <w:t>0,506</w:t>
+                <w:b/>
+                <w:sz w:val="16"/>
+              </w:rPr>
+              <w:t>0,75</w:t>
             </w:r>
           </w:p>
         </w:tc>
         <w:tc>
           <w:tcPr>
-            <w:tcW w:type="dxa" w:w="834"/>
+            <w:tcW w:type="dxa" w:w="844"/>
           </w:tcPr>
           <w:p>
             <w:pPr>
@@ -3870,13 +3894,13 @@
                 <w:b/>
                 <w:sz w:val="16"/>
               </w:rPr>
-              <w:t>0,94</w:t>
+              <w:t>0,99</w:t>
             </w:r>
           </w:p>
         </w:tc>
         <w:tc>
           <w:tcPr>
-            <w:tcW w:type="dxa" w:w="938"/>
+            <w:tcW w:type="dxa" w:w="949"/>
           </w:tcPr>
           <w:p>
             <w:pPr>
@@ -3900,7 +3924,7 @@
       <w:tr>
         <w:tc>
           <w:tcPr>
-            <w:tcW w:type="dxa" w:w="2189"/>
+            <w:tcW w:type="dxa" w:w="2215"/>
           </w:tcPr>
           <w:p>
             <w:pPr>
@@ -3921,7 +3945,7 @@
         </w:tc>
         <w:tc>
           <w:tcPr>
-            <w:tcW w:type="dxa" w:w="1251"/>
+            <w:tcW w:type="dxa" w:w="1266"/>
           </w:tcPr>
           <w:p>
             <w:pPr>
@@ -3934,15 +3958,16 @@
             </w:r>
             <w:r>
               <w:rPr>
-                <w:sz w:val="16"/>
-              </w:rPr>
-              <w:t>0,48</w:t>
+                <w:b/>
+                <w:sz w:val="16"/>
+              </w:rPr>
+              <w:t>0,74</w:t>
             </w:r>
           </w:p>
         </w:tc>
         <w:tc>
           <w:tcPr>
-            <w:tcW w:type="dxa" w:w="938"/>
+            <w:tcW w:type="dxa" w:w="949"/>
           </w:tcPr>
           <w:p>
             <w:pPr>
@@ -3957,13 +3982,13 @@
               <w:rPr>
                 <w:sz w:val="16"/>
               </w:rPr>
-              <w:t>0,44</w:t>
+              <w:t>0,54</w:t>
             </w:r>
           </w:p>
         </w:tc>
         <w:tc>
           <w:tcPr>
-            <w:tcW w:type="dxa" w:w="834"/>
+            <w:tcW w:type="dxa" w:w="844"/>
           </w:tcPr>
           <w:p>
             <w:pPr>
@@ -3978,13 +4003,13 @@
               <w:rPr>
                 <w:sz w:val="16"/>
               </w:rPr>
-              <w:t>0,46</w:t>
+              <w:t>0,63</w:t>
             </w:r>
           </w:p>
         </w:tc>
         <w:tc>
           <w:tcPr>
-            <w:tcW w:type="dxa" w:w="834"/>
+            <w:tcW w:type="dxa" w:w="844"/>
           </w:tcPr>
           <w:p>
             <w:pPr>
@@ -3999,13 +4024,13 @@
               <w:rPr>
                 <w:sz w:val="16"/>
               </w:rPr>
-              <w:t>0,47</w:t>
+              <w:t>0,69</w:t>
             </w:r>
           </w:p>
         </w:tc>
         <w:tc>
           <w:tcPr>
-            <w:tcW w:type="dxa" w:w="938"/>
+            <w:tcW w:type="dxa" w:w="844"/>
           </w:tcPr>
           <w:p>
             <w:pPr>
@@ -4020,13 +4045,13 @@
               <w:rPr>
                 <w:sz w:val="16"/>
               </w:rPr>
-              <w:t>0,509</w:t>
+              <w:t>0,74</w:t>
             </w:r>
           </w:p>
         </w:tc>
         <w:tc>
           <w:tcPr>
-            <w:tcW w:type="dxa" w:w="834"/>
+            <w:tcW w:type="dxa" w:w="844"/>
           </w:tcPr>
           <w:p>
             <w:pPr>
@@ -4041,13 +4066,13 @@
               <w:rPr>
                 <w:sz w:val="16"/>
               </w:rPr>
-              <w:t>0,93</w:t>
+              <w:t>0,99</w:t>
             </w:r>
           </w:p>
         </w:tc>
         <w:tc>
           <w:tcPr>
-            <w:tcW w:type="dxa" w:w="938"/>
+            <w:tcW w:type="dxa" w:w="949"/>
           </w:tcPr>
           <w:p>
             <w:pPr>
@@ -4062,7 +4087,7 @@
               <w:rPr>
                 <w:sz w:val="16"/>
               </w:rPr>
-              <w:t>0,021</w:t>
+              <w:t>0,012</w:t>
             </w:r>
           </w:p>
         </w:tc>
@@ -4070,7 +4095,7 @@
       <w:tr>
         <w:tc>
           <w:tcPr>
-            <w:tcW w:type="dxa" w:w="2189"/>
+            <w:tcW w:type="dxa" w:w="2215"/>
           </w:tcPr>
           <w:p>
             <w:pPr>
@@ -4085,13 +4110,13 @@
               <w:rPr>
                 <w:sz w:val="16"/>
               </w:rPr>
-              <w:t>Gradient Boosting</w:t>
+              <w:t>Árbol (sin poda)</w:t>
             </w:r>
           </w:p>
         </w:tc>
         <w:tc>
           <w:tcPr>
-            <w:tcW w:type="dxa" w:w="1251"/>
+            <w:tcW w:type="dxa" w:w="1266"/>
           </w:tcPr>
           <w:p>
             <w:pPr>
@@ -4104,16 +4129,15 @@
             </w:r>
             <w:r>
               <w:rPr>
-                <w:b/>
-                <w:sz w:val="16"/>
-              </w:rPr>
-              <w:t>0,53</w:t>
+                <w:sz w:val="16"/>
+              </w:rPr>
+              <w:t>0,55</w:t>
             </w:r>
           </w:p>
         </w:tc>
         <w:tc>
           <w:tcPr>
-            <w:tcW w:type="dxa" w:w="938"/>
+            <w:tcW w:type="dxa" w:w="949"/>
           </w:tcPr>
           <w:p>
             <w:pPr>
@@ -4128,13 +4152,13 @@
               <w:rPr>
                 <w:sz w:val="16"/>
               </w:rPr>
-              <w:t>0,34</w:t>
+              <w:t>0,13</w:t>
             </w:r>
           </w:p>
         </w:tc>
         <w:tc>
           <w:tcPr>
-            <w:tcW w:type="dxa" w:w="834"/>
+            <w:tcW w:type="dxa" w:w="844"/>
           </w:tcPr>
           <w:p>
             <w:pPr>
@@ -4149,13 +4173,13 @@
               <w:rPr>
                 <w:sz w:val="16"/>
               </w:rPr>
-              <w:t>0,41</w:t>
+              <w:t>0,22</w:t>
             </w:r>
           </w:p>
         </w:tc>
         <w:tc>
           <w:tcPr>
-            <w:tcW w:type="dxa" w:w="834"/>
+            <w:tcW w:type="dxa" w:w="844"/>
           </w:tcPr>
           <w:p>
             <w:pPr>
@@ -4168,16 +4192,15 @@
             </w:r>
             <w:r>
               <w:rPr>
-                <w:b/>
-                <w:sz w:val="16"/>
-              </w:rPr>
-              <w:t>0,47</w:t>
+                <w:sz w:val="16"/>
+              </w:rPr>
+              <w:t>0,34</w:t>
             </w:r>
           </w:p>
         </w:tc>
         <w:tc>
           <w:tcPr>
-            <w:tcW w:type="dxa" w:w="938"/>
+            <w:tcW w:type="dxa" w:w="844"/>
           </w:tcPr>
           <w:p>
             <w:pPr>
@@ -4190,16 +4213,15 @@
             </w:r>
             <w:r>
               <w:rPr>
-                <w:b/>
-                <w:sz w:val="16"/>
-              </w:rPr>
-              <w:t>0,514</w:t>
+                <w:sz w:val="16"/>
+              </w:rPr>
+              <w:t>0,07</w:t>
             </w:r>
           </w:p>
         </w:tc>
         <w:tc>
           <w:tcPr>
-            <w:tcW w:type="dxa" w:w="834"/>
+            <w:tcW w:type="dxa" w:w="844"/>
           </w:tcPr>
           <w:p>
             <w:pPr>
@@ -4214,13 +4236,13 @@
               <w:rPr>
                 <w:sz w:val="16"/>
               </w:rPr>
-              <w:t>0,94</w:t>
+              <w:t>0,77</w:t>
             </w:r>
           </w:p>
         </w:tc>
         <w:tc>
           <w:tcPr>
-            <w:tcW w:type="dxa" w:w="938"/>
+            <w:tcW w:type="dxa" w:w="949"/>
           </w:tcPr>
           <w:p>
             <w:pPr>
@@ -4235,7 +4257,7 @@
               <w:rPr>
                 <w:sz w:val="16"/>
               </w:rPr>
-              <w:t>0,018</w:t>
+              <w:t>0,013</w:t>
             </w:r>
           </w:p>
         </w:tc>
@@ -4243,7 +4265,7 @@
       <w:tr>
         <w:tc>
           <w:tcPr>
-            <w:tcW w:type="dxa" w:w="2189"/>
+            <w:tcW w:type="dxa" w:w="2215"/>
           </w:tcPr>
           <w:p>
             <w:pPr>
@@ -4258,13 +4280,13 @@
               <w:rPr>
                 <w:sz w:val="16"/>
               </w:rPr>
-              <w:t>Árbol (poda 8)</w:t>
+              <w:t>Canal endémico (ref.)</w:t>
             </w:r>
           </w:p>
         </w:tc>
         <w:tc>
           <w:tcPr>
-            <w:tcW w:type="dxa" w:w="1251"/>
+            <w:tcW w:type="dxa" w:w="1266"/>
           </w:tcPr>
           <w:p>
             <w:pPr>
@@ -4279,13 +4301,13 @@
               <w:rPr>
                 <w:sz w:val="16"/>
               </w:rPr>
-              <w:t>0,42</w:t>
+              <w:t>0,64</w:t>
             </w:r>
           </w:p>
         </w:tc>
         <w:tc>
           <w:tcPr>
-            <w:tcW w:type="dxa" w:w="938"/>
+            <w:tcW w:type="dxa" w:w="949"/>
           </w:tcPr>
           <w:p>
             <w:pPr>
@@ -4300,13 +4322,13 @@
               <w:rPr>
                 <w:sz w:val="16"/>
               </w:rPr>
-              <w:t>0,36</w:t>
+              <w:t>0,29</w:t>
             </w:r>
           </w:p>
         </w:tc>
         <w:tc>
           <w:tcPr>
-            <w:tcW w:type="dxa" w:w="834"/>
+            <w:tcW w:type="dxa" w:w="844"/>
           </w:tcPr>
           <w:p>
             <w:pPr>
@@ -4321,13 +4343,13 @@
               <w:rPr>
                 <w:sz w:val="16"/>
               </w:rPr>
-              <w:t>0,39</w:t>
+              <w:t>0,40</w:t>
             </w:r>
           </w:p>
         </w:tc>
         <w:tc>
           <w:tcPr>
-            <w:tcW w:type="dxa" w:w="834"/>
+            <w:tcW w:type="dxa" w:w="844"/>
           </w:tcPr>
           <w:p>
             <w:pPr>
@@ -4342,13 +4364,13 @@
               <w:rPr>
                 <w:sz w:val="16"/>
               </w:rPr>
-              <w:t>0,41</w:t>
+              <w:t>0,52</w:t>
             </w:r>
           </w:p>
         </w:tc>
         <w:tc>
           <w:tcPr>
-            <w:tcW w:type="dxa" w:w="938"/>
+            <w:tcW w:type="dxa" w:w="844"/>
           </w:tcPr>
           <w:p>
             <w:pPr>
@@ -4363,13 +4385,13 @@
               <w:rPr>
                 <w:sz w:val="16"/>
               </w:rPr>
-              <w:t>0,407</w:t>
+              <w:t>—</w:t>
             </w:r>
           </w:p>
         </w:tc>
         <w:tc>
           <w:tcPr>
-            <w:tcW w:type="dxa" w:w="834"/>
+            <w:tcW w:type="dxa" w:w="844"/>
           </w:tcPr>
           <w:p>
             <w:pPr>
@@ -4384,13 +4406,13 @@
               <w:rPr>
                 <w:sz w:val="16"/>
               </w:rPr>
-              <w:t>0,81</w:t>
+              <w:t>—</w:t>
             </w:r>
           </w:p>
         </w:tc>
         <w:tc>
           <w:tcPr>
-            <w:tcW w:type="dxa" w:w="938"/>
+            <w:tcW w:type="dxa" w:w="949"/>
           </w:tcPr>
           <w:p>
             <w:pPr>
@@ -4405,346 +4427,6 @@
               <w:rPr>
                 <w:sz w:val="16"/>
               </w:rPr>
-              <w:t>0,027</w:t>
-            </w:r>
-          </w:p>
-        </w:tc>
-      </w:tr>
-      <w:tr>
-        <w:tc>
-          <w:tcPr>
-            <w:tcW w:type="dxa" w:w="2189"/>
-          </w:tcPr>
-          <w:p>
-            <w:pPr>
-              <w:jc w:val="left"/>
-            </w:pPr>
-            <w:r>
-              <w:rPr>
-                <w:sz w:val="16"/>
-              </w:rPr>
-            </w:r>
-            <w:r>
-              <w:rPr>
-                <w:sz w:val="16"/>
-              </w:rPr>
-              <w:t>Árbol (sin poda)</w:t>
-            </w:r>
-          </w:p>
-        </w:tc>
-        <w:tc>
-          <w:tcPr>
-            <w:tcW w:type="dxa" w:w="1251"/>
-          </w:tcPr>
-          <w:p>
-            <w:pPr>
-              <w:jc w:val="center"/>
-            </w:pPr>
-            <w:r>
-              <w:rPr>
-                <w:sz w:val="16"/>
-              </w:rPr>
-            </w:r>
-            <w:r>
-              <w:rPr>
-                <w:sz w:val="16"/>
-              </w:rPr>
-              <w:t>0,34</w:t>
-            </w:r>
-          </w:p>
-        </w:tc>
-        <w:tc>
-          <w:tcPr>
-            <w:tcW w:type="dxa" w:w="938"/>
-          </w:tcPr>
-          <w:p>
-            <w:pPr>
-              <w:jc w:val="center"/>
-            </w:pPr>
-            <w:r>
-              <w:rPr>
-                <w:sz w:val="16"/>
-              </w:rPr>
-            </w:r>
-            <w:r>
-              <w:rPr>
-                <w:sz w:val="16"/>
-              </w:rPr>
-              <w:t>0,25</w:t>
-            </w:r>
-          </w:p>
-        </w:tc>
-        <w:tc>
-          <w:tcPr>
-            <w:tcW w:type="dxa" w:w="834"/>
-          </w:tcPr>
-          <w:p>
-            <w:pPr>
-              <w:jc w:val="center"/>
-            </w:pPr>
-            <w:r>
-              <w:rPr>
-                <w:sz w:val="16"/>
-              </w:rPr>
-            </w:r>
-            <w:r>
-              <w:rPr>
-                <w:sz w:val="16"/>
-              </w:rPr>
-              <w:t>0,29</w:t>
-            </w:r>
-          </w:p>
-        </w:tc>
-        <w:tc>
-          <w:tcPr>
-            <w:tcW w:type="dxa" w:w="834"/>
-          </w:tcPr>
-          <w:p>
-            <w:pPr>
-              <w:jc w:val="center"/>
-            </w:pPr>
-            <w:r>
-              <w:rPr>
-                <w:sz w:val="16"/>
-              </w:rPr>
-            </w:r>
-            <w:r>
-              <w:rPr>
-                <w:sz w:val="16"/>
-              </w:rPr>
-              <w:t>0,31</w:t>
-            </w:r>
-          </w:p>
-        </w:tc>
-        <w:tc>
-          <w:tcPr>
-            <w:tcW w:type="dxa" w:w="938"/>
-          </w:tcPr>
-          <w:p>
-            <w:pPr>
-              <w:jc w:val="center"/>
-            </w:pPr>
-            <w:r>
-              <w:rPr>
-                <w:sz w:val="16"/>
-              </w:rPr>
-            </w:r>
-            <w:r>
-              <w:rPr>
-                <w:sz w:val="16"/>
-              </w:rPr>
-              <w:t>0,093</w:t>
-            </w:r>
-          </w:p>
-        </w:tc>
-        <w:tc>
-          <w:tcPr>
-            <w:tcW w:type="dxa" w:w="834"/>
-          </w:tcPr>
-          <w:p>
-            <w:pPr>
-              <w:jc w:val="center"/>
-            </w:pPr>
-            <w:r>
-              <w:rPr>
-                <w:sz w:val="16"/>
-              </w:rPr>
-            </w:r>
-            <w:r>
-              <w:rPr>
-                <w:sz w:val="16"/>
-              </w:rPr>
-              <w:t>0,66</w:t>
-            </w:r>
-          </w:p>
-        </w:tc>
-        <w:tc>
-          <w:tcPr>
-            <w:tcW w:type="dxa" w:w="938"/>
-          </w:tcPr>
-          <w:p>
-            <w:pPr>
-              <w:jc w:val="center"/>
-            </w:pPr>
-            <w:r>
-              <w:rPr>
-                <w:sz w:val="16"/>
-              </w:rPr>
-            </w:r>
-            <w:r>
-              <w:rPr>
-                <w:sz w:val="16"/>
-              </w:rPr>
-              <w:t>0,024</w:t>
-            </w:r>
-          </w:p>
-        </w:tc>
-      </w:tr>
-      <w:tr>
-        <w:tc>
-          <w:tcPr>
-            <w:tcW w:type="dxa" w:w="2189"/>
-          </w:tcPr>
-          <w:p>
-            <w:pPr>
-              <w:jc w:val="left"/>
-            </w:pPr>
-            <w:r>
-              <w:rPr>
-                <w:sz w:val="16"/>
-              </w:rPr>
-            </w:r>
-            <w:r>
-              <w:rPr>
-                <w:sz w:val="16"/>
-              </w:rPr>
-              <w:t>Canal endémico (ref.)</w:t>
-            </w:r>
-          </w:p>
-        </w:tc>
-        <w:tc>
-          <w:tcPr>
-            <w:tcW w:type="dxa" w:w="1251"/>
-          </w:tcPr>
-          <w:p>
-            <w:pPr>
-              <w:jc w:val="center"/>
-            </w:pPr>
-            <w:r>
-              <w:rPr>
-                <w:sz w:val="16"/>
-              </w:rPr>
-            </w:r>
-            <w:r>
-              <w:rPr>
-                <w:sz w:val="16"/>
-              </w:rPr>
-              <w:t>0,49</w:t>
-            </w:r>
-          </w:p>
-        </w:tc>
-        <w:tc>
-          <w:tcPr>
-            <w:tcW w:type="dxa" w:w="938"/>
-          </w:tcPr>
-          <w:p>
-            <w:pPr>
-              <w:jc w:val="center"/>
-            </w:pPr>
-            <w:r>
-              <w:rPr>
-                <w:sz w:val="16"/>
-              </w:rPr>
-            </w:r>
-            <w:r>
-              <w:rPr>
-                <w:sz w:val="16"/>
-              </w:rPr>
-              <w:t>0,38</w:t>
-            </w:r>
-          </w:p>
-        </w:tc>
-        <w:tc>
-          <w:tcPr>
-            <w:tcW w:type="dxa" w:w="834"/>
-          </w:tcPr>
-          <w:p>
-            <w:pPr>
-              <w:jc w:val="center"/>
-            </w:pPr>
-            <w:r>
-              <w:rPr>
-                <w:sz w:val="16"/>
-              </w:rPr>
-            </w:r>
-            <w:r>
-              <w:rPr>
-                <w:sz w:val="16"/>
-              </w:rPr>
-              <w:t>0,43</w:t>
-            </w:r>
-          </w:p>
-        </w:tc>
-        <w:tc>
-          <w:tcPr>
-            <w:tcW w:type="dxa" w:w="834"/>
-          </w:tcPr>
-          <w:p>
-            <w:pPr>
-              <w:jc w:val="center"/>
-            </w:pPr>
-            <w:r>
-              <w:rPr>
-                <w:sz w:val="16"/>
-              </w:rPr>
-            </w:r>
-            <w:r>
-              <w:rPr>
-                <w:sz w:val="16"/>
-              </w:rPr>
-              <w:t>0,46</w:t>
-            </w:r>
-          </w:p>
-        </w:tc>
-        <w:tc>
-          <w:tcPr>
-            <w:tcW w:type="dxa" w:w="938"/>
-          </w:tcPr>
-          <w:p>
-            <w:pPr>
-              <w:jc w:val="center"/>
-            </w:pPr>
-            <w:r>
-              <w:rPr>
-                <w:sz w:val="16"/>
-              </w:rPr>
-            </w:r>
-            <w:r>
-              <w:rPr>
-                <w:sz w:val="16"/>
-              </w:rPr>
-              <w:t>—</w:t>
-            </w:r>
-          </w:p>
-        </w:tc>
-        <w:tc>
-          <w:tcPr>
-            <w:tcW w:type="dxa" w:w="834"/>
-          </w:tcPr>
-          <w:p>
-            <w:pPr>
-              <w:jc w:val="center"/>
-            </w:pPr>
-            <w:r>
-              <w:rPr>
-                <w:sz w:val="16"/>
-              </w:rPr>
-            </w:r>
-            <w:r>
-              <w:rPr>
-                <w:sz w:val="16"/>
-              </w:rPr>
-              <w:t>—</w:t>
-            </w:r>
-          </w:p>
-        </w:tc>
-        <w:tc>
-          <w:tcPr>
-            <w:tcW w:type="dxa" w:w="938"/>
-          </w:tcPr>
-          <w:p>
-            <w:pPr>
-              <w:jc w:val="center"/>
-            </w:pPr>
-            <w:r>
-              <w:rPr>
-                <w:sz w:val="16"/>
-              </w:rPr>
-            </w:r>
-            <w:r>
-              <w:rPr>
-                <w:sz w:val="16"/>
-              </w:rPr>
               <w:t>—</w:t>
             </w:r>
           </w:p>
@@ -4760,7 +4442,7 @@
         <w:drawing>
           <wp:inline xmlns:a="http://schemas.openxmlformats.org/drawingml/2006/main" xmlns:pic="http://schemas.openxmlformats.org/drawingml/2006/picture">
             <wp:extent cx="4480560" cy="2443942"/>
-            <wp:docPr id="1" name="Picture 1"/>
+            <wp:docPr id="3" name="Picture 3"/>
             <wp:cNvGraphicFramePr>
               <a:graphicFrameLocks noChangeAspect="1"/>
             </wp:cNvGraphicFramePr>
@@ -4772,7 +4454,7 @@
                     <pic:cNvPicPr/>
                   </pic:nvPicPr>
                   <pic:blipFill>
-                    <a:blip r:embed="rId30"/>
+                    <a:blip r:embed="rId32"/>
                     <a:stretch>
                       <a:fillRect/>
                     </a:stretch>
@@ -4799,10 +4481,10 @@
         <w:rPr>
           <w:b/>
         </w:rPr>
-        <w:t>Figura 1.</w:t>
-      </w:r>
-      <w:r>
-        <w:t xml:space="preserve"> Sensibilidad, AUC-PR y F1 por modelo bajo validación de origen móvil. El Random Forest y el Gradient Boosting lideran en AUC-PR, la métrica más informativa ante el fuerte desbalance de clases; el árbol sin poda exhibe el AUC-PR más bajo. Fuente: elaboración propia con SATEC [27].</w:t>
+        <w:t>Figura 3.</w:t>
+      </w:r>
+      <w:r>
+        <w:t xml:space="preserve"> Sensibilidad, AUC-PR y F1 por modelo (validación temporal estricta, prueba 2020–2024). El Gradient Boosting lidera; el árbol sin poda exhibe el AUC-PR más bajo. Fuente: elaboración propia con SATEC [21].</w:t>
       </w:r>
     </w:p>
     <w:p>
@@ -4819,22 +4501,22 @@
         <w:ind w:firstLine="0"/>
       </w:pPr>
       <w:r>
-        <w:t xml:space="preserve">La Figura 2 presenta las matrices de confusión de los dos mejores modelos —Random Forest y red neuronal— sobre las </w:t>
-      </w:r>
-      <w:r>
-        <w:rPr>
-          <w:b/>
-        </w:rPr>
-        <w:t>28.304 observaciones provincia-semana</w:t>
-      </w:r>
-      <w:r>
-        <w:t xml:space="preserve"> evaluadas en el origen móvil, de las cuales </w:t>
-      </w:r>
-      <w:r>
-        <w:rPr>
-          <w:b/>
-        </w:rPr>
-        <w:t>375 corresponden a brotes reales</w:t>
+        <w:t xml:space="preserve">La Figura 4 presenta las matrices de confusión de los dos mejores modelos —Gradient Boosting y red neuronal— sobre los </w:t>
+      </w:r>
+      <w:r>
+        <w:rPr>
+          <w:b/>
+        </w:rPr>
+        <w:t>15.616 ejemplos de prueba</w:t>
+      </w:r>
+      <w:r>
+        <w:t xml:space="preserve"> (2020–2024), de los cuales </w:t>
+      </w:r>
+      <w:r>
+        <w:rPr>
+          <w:b/>
+        </w:rPr>
+        <w:t>42 corresponden a brotes reales</w:t>
       </w:r>
       <w:r>
         <w:t xml:space="preserve">. Conviene precisar la unidad de análisis: cada celda cuenta </w:t>
@@ -4909,62 +4591,53 @@
         <w:ind w:firstLine="0"/>
       </w:pPr>
       <w:r>
-        <w:t xml:space="preserve">El Random Forest recupera </w:t>
-      </w:r>
-      <w:r>
-        <w:rPr>
-          <w:b/>
-        </w:rPr>
-        <w:t>174 de los 375 brotes</w:t>
-      </w:r>
-      <w:r>
-        <w:t xml:space="preserve"> (VP) con </w:t>
-      </w:r>
-      <w:r>
-        <w:rPr>
-          <w:b/>
-        </w:rPr>
-        <w:t>193 falsas alarmas</w:t>
-      </w:r>
-      <w:r>
-        <w:t xml:space="preserve"> (FP); la red neuronal recupera </w:t>
-      </w:r>
-      <w:r>
-        <w:rPr>
-          <w:b/>
-        </w:rPr>
-        <w:t>181</w:t>
-      </w:r>
-      <w:r>
-        <w:t xml:space="preserve"> con </w:t>
-      </w:r>
-      <w:r>
-        <w:rPr>
-          <w:b/>
-        </w:rPr>
-        <w:t>232</w:t>
-      </w:r>
-      <w:r>
-        <w:t xml:space="preserve"> falsas alarmas. En términos de tasas de error, ambos modelos mantienen una </w:t>
-      </w:r>
-      <w:r>
-        <w:rPr>
-          <w:b/>
-        </w:rPr>
-        <w:t>tasa de falsas alarmas baja</w:t>
-      </w:r>
-      <w:r>
-        <w:t xml:space="preserve"> sobre la enorme clase mayoritaria —</w:t>
+        <w:t xml:space="preserve">Ambos modelos recuperan </w:t>
+      </w:r>
+      <w:r>
+        <w:rPr>
+          <w:b/>
+        </w:rPr>
+        <w:t>31 de los 42 brotes</w:t>
+      </w:r>
+      <w:r>
+        <w:t xml:space="preserve"> (VP), pero el Gradient Boosting lo hace con solo </w:t>
+      </w:r>
+      <w:r>
+        <w:rPr>
+          <w:b/>
+        </w:rPr>
+        <w:t>15 falsas alarmas</w:t>
+      </w:r>
+      <w:r>
+        <w:t xml:space="preserve"> (FP) frente a las </w:t>
+      </w:r>
+      <w:r>
+        <w:rPr>
+          <w:b/>
+        </w:rPr>
+        <w:t>26</w:t>
+      </w:r>
+      <w:r>
+        <w:t xml:space="preserve"> de la red neuronal: esa menor tasa de falsos positivos explica su mayor precisión (0,67 frente a 0,54) y su mejor F1. En términos de tasas de error, ambos mantienen una </w:t>
+      </w:r>
+      <w:r>
+        <w:rPr>
+          <w:b/>
+        </w:rPr>
+        <w:t>tasa de falsas alarmas</w:t>
+      </w:r>
+      <w:r>
+        <w:t xml:space="preserve"> ínfima sobre la enorme clase mayoritaria —</w:t>
       </w:r>
       <m:oMath>
         <m:r>
-          <m:t>FP/(FP+VN)≈0</m:t>
+          <m:t>FP/(FP+VN)≤0</m:t>
         </m:r>
         <m:r>
           <m:t>,</m:t>
         </m:r>
         <m:r>
-          <m:t>7%</m:t>
+          <m:t>2%</m:t>
         </m:r>
       </m:oMath>
       <w:r>
@@ -4981,11 +4654,11 @@
       </w:r>
       <m:oMath>
         <m:r>
-          <m:t>FN/(FN+VP)≈53%</m:t>
+          <m:t>FN/(FN+VP)≈26%</m:t>
         </m:r>
       </m:oMath>
       <w:r>
-        <w:t>— es alta: el reto no está en la especificidad, altísima, sino en capturar más brotes en un régimen de eventos extremadamente raros. La red neuronal sacrifica algo de precisión (más falsas alarmas) por una sensibilidad ligeramente mayor, mientras que el Random Forest equilibra mejor ambos errores, de ahí su mayor F1. Este compromiso —preferir una falsa alarma territorial antes que omitir un brote— es deseable en un sistema de alerta donde el costo de un brote no detectado es alto.</w:t>
+        <w:t>— concentra la dificultad del problema. Este compromiso —preferir una falsa alarma territorial antes que omitir un brote— es deseable en un sistema de alerta donde el costo de un brote no detectado es alto.</w:t>
       </w:r>
     </w:p>
     <w:p>
@@ -4997,7 +4670,7 @@
         <w:drawing>
           <wp:inline xmlns:a="http://schemas.openxmlformats.org/drawingml/2006/main" xmlns:pic="http://schemas.openxmlformats.org/drawingml/2006/picture">
             <wp:extent cx="4480560" cy="2163312"/>
-            <wp:docPr id="2" name="Picture 2"/>
+            <wp:docPr id="4" name="Picture 4"/>
             <wp:cNvGraphicFramePr>
               <a:graphicFrameLocks noChangeAspect="1"/>
             </wp:cNvGraphicFramePr>
@@ -5009,7 +4682,7 @@
                     <pic:cNvPicPr/>
                   </pic:nvPicPr>
                   <pic:blipFill>
-                    <a:blip r:embed="rId31"/>
+                    <a:blip r:embed="rId33"/>
                     <a:stretch>
                       <a:fillRect/>
                     </a:stretch>
@@ -5036,10 +4709,10 @@
         <w:rPr>
           <w:b/>
         </w:rPr>
-        <w:t>Figura 2.</w:t>
-      </w:r>
-      <w:r>
-        <w:t xml:space="preserve"> Matrices de confusión de la red neuronal (izquierda) y el Random Forest (derecha) sobre las predicciones agrupadas del origen móvil, con conteo y porcentaje por celda (VN, FP, FN, VP). Las filas son la condición observada y las columnas la predicción. Fuente: elaboración propia con SATEC [27].</w:t>
+        <w:t>Figura 4.</w:t>
+      </w:r>
+      <w:r>
+        <w:t xml:space="preserve"> Matrices de confusión del Gradient Boosting (izquierda) y la red neuronal (derecha) sobre el conjunto de prueba 2020–2024, con conteo y porcentaje por celda (VN, FP, FN, VP). Las filas son la condición observada y las columnas la predicción. Fuente: elaboración propia con SATEC [21].</w:t>
       </w:r>
     </w:p>
     <w:p>
@@ -5056,7 +4729,7 @@
         <w:ind w:firstLine="0"/>
       </w:pPr>
       <w:r>
-        <w:t xml:space="preserve">La Figura 3 desglosa, por los seis modelos, las cuatro métricas derivadas de las Ecuaciones (12)–(16): precisión, sensibilidad, F1 y especificidad. Se observa el </w:t>
+        <w:t xml:space="preserve">La Figura 5 desglosa, por los cuatro modelos, las métricas derivadas de las Ecuaciones (12)–(16): precisión, sensibilidad, F1 y especificidad. Se observa el </w:t>
       </w:r>
       <w:r>
         <w:rPr>
@@ -5065,16 +4738,16 @@
         <w:t>compromiso característico</w:t>
       </w:r>
       <w:r>
-        <w:t xml:space="preserve"> de los problemas desbalanceados: todos los modelos alcanzan una especificidad muy alta (cercana a 0,99, pues predicen bien la ausencia de brote, la clase mayoritaria), mientras que la precisión es moderada porque las alertas positivas incluyen falsas alarmas. El </w:t>
-      </w:r>
-      <w:r>
-        <w:rPr>
-          <w:b/>
-        </w:rPr>
-        <w:t>Random Forest</w:t>
-      </w:r>
-      <w:r>
-        <w:t xml:space="preserve"> y la </w:t>
+        <w:t xml:space="preserve"> de los problemas desbalanceados: todos alcanzan una especificidad muy alta (≈0,99–1,00, pues predicen bien la ausencia de brote, la clase mayoritaria). El </w:t>
+      </w:r>
+      <w:r>
+        <w:rPr>
+          <w:b/>
+        </w:rPr>
+        <w:t>Gradient Boosting</w:t>
+      </w:r>
+      <w:r>
+        <w:t xml:space="preserve"> ofrece la combinación más equilibrada entre sensibilidad y precisión, seguido de la </w:t>
       </w:r>
       <w:r>
         <w:rPr>
@@ -5083,16 +4756,7 @@
         <w:t>red neuronal</w:t>
       </w:r>
       <w:r>
-        <w:t xml:space="preserve"> ofrecen la combinación más equilibrada entre sensibilidad y precisión, mientras que el </w:t>
-      </w:r>
-      <w:r>
-        <w:rPr>
-          <w:b/>
-        </w:rPr>
-        <w:t>Gradient Boosting</w:t>
-      </w:r>
-      <w:r>
-        <w:t xml:space="preserve"> inclina la balanza hacia la sensibilidad (detecta más brotes, a costa de más falsas alarmas) y el </w:t>
+        <w:t xml:space="preserve">; el </w:t>
       </w:r>
       <w:r>
         <w:rPr>
@@ -5101,7 +4765,7 @@
         <w:t>árbol sin poda</w:t>
       </w:r>
       <w:r>
-        <w:t xml:space="preserve"> queda por detrás en ambas.</w:t>
+        <w:t xml:space="preserve"> se queda muy atrás en precisión (0,13), lo que arrastra su F1.</w:t>
       </w:r>
     </w:p>
     <w:p>
@@ -5113,7 +4777,7 @@
         <w:drawing>
           <wp:inline xmlns:a="http://schemas.openxmlformats.org/drawingml/2006/main" xmlns:pic="http://schemas.openxmlformats.org/drawingml/2006/picture">
             <wp:extent cx="4480560" cy="2499918"/>
-            <wp:docPr id="3" name="Picture 3"/>
+            <wp:docPr id="5" name="Picture 5"/>
             <wp:cNvGraphicFramePr>
               <a:graphicFrameLocks noChangeAspect="1"/>
             </wp:cNvGraphicFramePr>
@@ -5125,7 +4789,7 @@
                     <pic:cNvPicPr/>
                   </pic:nvPicPr>
                   <pic:blipFill>
-                    <a:blip r:embed="rId32"/>
+                    <a:blip r:embed="rId34"/>
                     <a:stretch>
                       <a:fillRect/>
                     </a:stretch>
@@ -5152,10 +4816,10 @@
         <w:rPr>
           <w:b/>
         </w:rPr>
-        <w:t>Figura 3.</w:t>
-      </w:r>
-      <w:r>
-        <w:t xml:space="preserve"> Precisión, sensibilidad, F1 y especificidad por modelo (origen móvil). La especificidad es alta en todos los casos; el Random Forest y la red neuronal equilibran mejor sensibilidad y precisión. Fuente: elaboración propia con SATEC [27].</w:t>
+        <w:t>Figura 5.</w:t>
+      </w:r>
+      <w:r>
+        <w:t xml:space="preserve"> Precisión, sensibilidad, F1 y especificidad por modelo (validación temporal estricta). La especificidad es alta en todos; el Gradient Boosting equilibra mejor sensibilidad y precisión. Fuente: elaboración propia con SATEC [21].</w:t>
       </w:r>
     </w:p>
     <w:p>
@@ -5172,7 +4836,7 @@
         <w:ind w:firstLine="0"/>
       </w:pPr>
       <w:r>
-        <w:t xml:space="preserve">La Figura 4 contrasta la exactitud de entrenamiento y la de prueba bajo la partición única. El </w:t>
+        <w:t xml:space="preserve">La Figura 6 contrasta la exactitud de entrenamiento y la de prueba. El </w:t>
       </w:r>
       <w:r>
         <w:rPr>
@@ -5196,10 +4860,10 @@
         <w:rPr>
           <w:b/>
         </w:rPr>
-        <w:t>AUC-PR, que se desploma a 0,09</w:t>
-      </w:r>
-      <w:r>
-        <w:t xml:space="preserve"> (Tabla 1), muy por debajo del Random Forest (0,51). Esto confirma sobre datos reales que una exactitud alta puede ocultar un modelo prácticamente inservible para detectar brotes, y justifica el uso de métricas centradas en la clase rara.</w:t>
+        <w:t>AUC-PR, que se desploma a 0,07</w:t>
+      </w:r>
+      <w:r>
+        <w:t xml:space="preserve"> (Tabla 1), muy por debajo del Gradient Boosting (0,75). Esto confirma sobre datos reales que una exactitud alta puede ocultar un modelo prácticamente inservible para detectar brotes, y justifica el uso de métricas centradas en la clase rara.</w:t>
       </w:r>
     </w:p>
     <w:p>
@@ -5211,7 +4875,7 @@
         <w:drawing>
           <wp:inline xmlns:a="http://schemas.openxmlformats.org/drawingml/2006/main" xmlns:pic="http://schemas.openxmlformats.org/drawingml/2006/picture">
             <wp:extent cx="4480560" cy="2439533"/>
-            <wp:docPr id="4" name="Picture 4"/>
+            <wp:docPr id="6" name="Picture 6"/>
             <wp:cNvGraphicFramePr>
               <a:graphicFrameLocks noChangeAspect="1"/>
             </wp:cNvGraphicFramePr>
@@ -5223,7 +4887,7 @@
                     <pic:cNvPicPr/>
                   </pic:nvPicPr>
                   <pic:blipFill>
-                    <a:blip r:embed="rId33"/>
+                    <a:blip r:embed="rId35"/>
                     <a:stretch>
                       <a:fillRect/>
                     </a:stretch>
@@ -5250,10 +4914,10 @@
         <w:rPr>
           <w:b/>
         </w:rPr>
-        <w:t>Figura 4.</w:t>
-      </w:r>
-      <w:r>
-        <w:t xml:space="preserve"> Brecha de generalización (exactitud de entrenamiento − prueba) por modelo, bajo la partición única. El árbol sin poda es el único con brecha positiva (memoriza más de lo que generaliza); su sobreajuste se aprecia con más claridad en el AUC-PR (Tabla 1). Fuente: elaboración propia con SATEC [27].</w:t>
+        <w:t>Figura 6.</w:t>
+      </w:r>
+      <w:r>
+        <w:t xml:space="preserve"> Brecha de generalización (exactitud de entrenamiento − prueba) por modelo. El árbol sin poda es el único con brecha positiva (memoriza más de lo que generaliza); su sobreajuste se aprecia con más claridad en el AUC-PR (Tabla 1). Fuente: elaboración propia con SATEC [21].</w:t>
       </w:r>
     </w:p>
     <w:p>
@@ -5270,7 +4934,7 @@
         <w:ind w:firstLine="0"/>
       </w:pPr>
       <w:r>
-        <w:t xml:space="preserve">La Figura 5 presenta las curvas de fiabilidad del Random Forest y la red neuronal sobre las predicciones agrupadas del origen móvil. Una curva próxima a la diagonal indica que las probabilidades predichas coinciden con las frecuencias observadas. Los </w:t>
+        <w:t xml:space="preserve">La Figura 7 presenta las curvas de fiabilidad del Gradient Boosting y la red neuronal sobre las predicciones agrupadas del origen móvil (donde hay más positivos y la curva resulta más estable). Una curva próxima a la diagonal indica que las probabilidades predichas coinciden con las frecuencias observadas. Los </w:t>
       </w:r>
       <w:r>
         <w:rPr>
@@ -5279,25 +4943,7 @@
         <w:t>Brier scores</w:t>
       </w:r>
       <w:r>
-        <w:t xml:space="preserve"> son bajos (</w:t>
-      </w:r>
-      <w:r>
-        <w:rPr>
-          <w:b/>
-        </w:rPr>
-        <w:t>0,009</w:t>
-      </w:r>
-      <w:r>
-        <w:t xml:space="preserve"> para el Random Forest y </w:t>
-      </w:r>
-      <w:r>
-        <w:rPr>
-          <w:b/>
-        </w:rPr>
-        <w:t>0,021</w:t>
-      </w:r>
-      <w:r>
-        <w:t xml:space="preserve"> para la red neuronal), favorecidos por la baja prevalencia de brotes; el Random Forest está mejor calibrado y más cerca de la diagonal. Ambos modelos, no obstante, tienden a </w:t>
+        <w:t xml:space="preserve"> son bajos (≈0,02 para ambos), favorecidos por la baja prevalencia de brotes. Ambos modelos tienden a </w:t>
       </w:r>
       <w:r>
         <w:rPr>
@@ -5327,7 +4973,7 @@
         <w:drawing>
           <wp:inline xmlns:a="http://schemas.openxmlformats.org/drawingml/2006/main" xmlns:pic="http://schemas.openxmlformats.org/drawingml/2006/picture">
             <wp:extent cx="3413239" cy="3383280"/>
-            <wp:docPr id="5" name="Picture 5"/>
+            <wp:docPr id="7" name="Picture 7"/>
             <wp:cNvGraphicFramePr>
               <a:graphicFrameLocks noChangeAspect="1"/>
             </wp:cNvGraphicFramePr>
@@ -5339,7 +4985,7 @@
                     <pic:cNvPicPr/>
                   </pic:nvPicPr>
                   <pic:blipFill>
-                    <a:blip r:embed="rId34"/>
+                    <a:blip r:embed="rId36"/>
                     <a:stretch>
                       <a:fillRect/>
                     </a:stretch>
@@ -5366,10 +5012,10 @@
         <w:rPr>
           <w:b/>
         </w:rPr>
-        <w:t>Figura 5.</w:t>
-      </w:r>
-      <w:r>
-        <w:t xml:space="preserve"> Curvas de calibración del Random Forest y la red neuronal frente a la calibración perfecta (diagonal). Fuente: elaboración propia con SATEC [27].</w:t>
+        <w:t>Figura 7.</w:t>
+      </w:r>
+      <w:r>
+        <w:t xml:space="preserve"> Curvas de calibración del Gradient Boosting y la red neuronal frente a la calibración perfecta (diagonal). Fuente: elaboración propia con SATEC [21].</w:t>
       </w:r>
     </w:p>
     <w:p>
@@ -5386,7 +5032,7 @@
         <w:ind w:firstLine="0"/>
       </w:pPr>
       <w:r>
-        <w:t xml:space="preserve">La Figura 6 reporta la importancia por permutación de la red neuronal (entrenada con todo el histórico). La </w:t>
+        <w:t xml:space="preserve">La Figura 8 reporta la importancia por permutación de la red neuronal (entrenada con todo el histórico). La </w:t>
       </w:r>
       <w:r>
         <w:rPr>
@@ -5434,7 +5080,7 @@
         <w:drawing>
           <wp:inline xmlns:a="http://schemas.openxmlformats.org/drawingml/2006/main" xmlns:pic="http://schemas.openxmlformats.org/drawingml/2006/picture">
             <wp:extent cx="4480560" cy="2959578"/>
-            <wp:docPr id="6" name="Picture 6"/>
+            <wp:docPr id="8" name="Picture 8"/>
             <wp:cNvGraphicFramePr>
               <a:graphicFrameLocks noChangeAspect="1"/>
             </wp:cNvGraphicFramePr>
@@ -5446,7 +5092,7 @@
                     <pic:cNvPicPr/>
                   </pic:nvPicPr>
                   <pic:blipFill>
-                    <a:blip r:embed="rId35"/>
+                    <a:blip r:embed="rId37"/>
                     <a:stretch>
                       <a:fillRect/>
                     </a:stretch>
@@ -5473,10 +5119,10 @@
         <w:rPr>
           <w:b/>
         </w:rPr>
-        <w:t>Figura 6.</w:t>
-      </w:r>
-      <w:r>
-        <w:t xml:space="preserve"> Importancia por permutación de la red neuronal (caída en AUC-PR al permutar cada variable). La media móvil de casos domina; la tasa poblacional y la temperatura aportan señal. Fuente: elaboración propia con SATEC [27].</w:t>
+        <w:t>Figura 8.</w:t>
+      </w:r>
+      <w:r>
+        <w:t xml:space="preserve"> Importancia por permutación de la red neuronal (caída en AUC-PR al permutar cada variable). La media móvil de casos domina; la tasa poblacional y la temperatura aportan señal. Fuente: elaboración propia con SATEC [21].</w:t>
       </w:r>
     </w:p>
     <w:p>
@@ -5493,7 +5139,7 @@
         <w:ind w:firstLine="0"/>
       </w:pPr>
       <w:r>
-        <w:t>La Figura 7 muestra la aplicación web resultante: un mapa de riesgo de las provincias endémicas sobre un mapa base del Perú, donde cada provincia se colorea según su nivel de alerta (bajo, medio o alto) para la semana más reciente. Al seleccionar una provincia, el panel lateral muestra la probabilidad de brote estimada por la red neuronal, la decisión del árbol y los casos notificados, lo que permite a un usuario de salud pública comparar de un vistazo ambos paradigmas sobre una zona concreta. El sistema es de uso libre y su código y datos son reproducibles.</w:t>
+        <w:t>La Figura 9 muestra la aplicación web resultante: un mapa de riesgo de las provincias endémicas sobre un mapa base del Perú, donde cada provincia se colorea según su nivel de alerta (bajo, medio o alto) para la semana más reciente. Al seleccionar una provincia, el panel lateral muestra la probabilidad de brote estimada por la red neuronal, la decisión del árbol y los casos notificados, lo que permite a un usuario de salud pública comparar de un vistazo ambos paradigmas sobre una zona concreta. El sistema es de uso libre y su código y datos son reproducibles.</w:t>
       </w:r>
     </w:p>
     <w:p>
@@ -5505,7 +5151,7 @@
         <w:drawing>
           <wp:inline xmlns:a="http://schemas.openxmlformats.org/drawingml/2006/main" xmlns:pic="http://schemas.openxmlformats.org/drawingml/2006/picture">
             <wp:extent cx="4480560" cy="2271352"/>
-            <wp:docPr id="7" name="Picture 7"/>
+            <wp:docPr id="9" name="Picture 9"/>
             <wp:cNvGraphicFramePr>
               <a:graphicFrameLocks noChangeAspect="1"/>
             </wp:cNvGraphicFramePr>
@@ -5517,7 +5163,7 @@
                     <pic:cNvPicPr/>
                   </pic:nvPicPr>
                   <pic:blipFill>
-                    <a:blip r:embed="rId36"/>
+                    <a:blip r:embed="rId38"/>
                     <a:stretch>
                       <a:fillRect/>
                     </a:stretch>
@@ -5544,10 +5190,10 @@
         <w:rPr>
           <w:b/>
         </w:rPr>
-        <w:t>Figura 7.</w:t>
-      </w:r>
-      <w:r>
-        <w:t xml:space="preserve"> Interfaz de SATEC: mapa de riesgo provincial sobre el mapa base del Perú, con el detalle de la provincia de Ocros (Áncash) en nivel de alerta medio. Captura de la aplicación desarrollada. Fuente: elaboración propia con SATEC [27].</w:t>
+        <w:t>Figura 9.</w:t>
+      </w:r>
+      <w:r>
+        <w:t xml:space="preserve"> Interfaz de SATEC: mapa de riesgo provincial sobre el mapa base del Perú, con el detalle de la provincia de Ocros (Áncash) en nivel de alerta medio. Captura de la aplicación desarrollada. Fuente: elaboración propia con SATEC [21].</w:t>
       </w:r>
     </w:p>
     <w:p>
@@ -5573,7 +5219,7 @@
         <w:t>el aprendizaje automático aporta valor sobre la vigilancia clásica</w:t>
       </w:r>
       <w:r>
-        <w:t xml:space="preserve">: el Random Forest y la red neuronal superan al canal endémico en AUC-PR y F1, anticipando brotes que la regla clásica no captura, lo que sugiere que un sistema de alerta basado en datos puede complementar la vigilancia rutinaria de la enfermedad de Carrión. Segundo, </w:t>
+        <w:t xml:space="preserve">: el Gradient Boosting y la red neuronal superan al canal endémico en F1, AUC-PR y AUC-ROC, anticipando brotes que la regla clásica no captura, lo que sugiere que un sistema de alerta basado en datos puede complementar la vigilancia rutinaria de la enfermedad de Carrión. Segundo, </w:t>
       </w:r>
       <w:r>
         <w:rPr>
@@ -5600,16 +5246,16 @@
         <w:ind w:firstLine="0"/>
       </w:pPr>
       <w:r>
-        <w:t xml:space="preserve">En términos de paradigmas, los </w:t>
-      </w:r>
-      <w:r>
-        <w:rPr>
-          <w:b/>
-        </w:rPr>
-        <w:t>ensambles de árboles</w:t>
-      </w:r>
-      <w:r>
-        <w:t xml:space="preserve"> —y en particular el Random Forest— resultaron preferibles para este problema tabular, desbalanceado y ruidoso, por delante de la red neuronal y muy por encima del árbol único sin poda, que ilustra los riesgos del sobreajuste. Este resultado concuerda con la evidencia de que los modelos basados en árboles dominan sobre las redes profundas en datos tabulares [7], [8]. La elección, sin embargo, no debería guiarse solo por el desempeño: el árbol individual ofrece reglas legibles, valiosas para comunicar a los tomadores de decisión por qué una provincia entra en alerta, mientras que el Random Forest y la red operan como cajas más opacas cuya interpretación requiere métodos adicionales como la importancia por permutación.</w:t>
+        <w:t xml:space="preserve">En términos de paradigmas, el </w:t>
+      </w:r>
+      <w:r>
+        <w:rPr>
+          <w:b/>
+        </w:rPr>
+        <w:t>Gradient Boosting</w:t>
+      </w:r>
+      <w:r>
+        <w:t xml:space="preserve"> (árboles potenciados) resultó preferible para este problema tabular, desbalanceado y ruidoso, por delante de la red neuronal y muy por encima del árbol único sin poda, que ilustra los riesgos del sobreajuste. Este resultado concuerda con la evidencia de que los modelos basados en árboles dominan sobre las redes profundas en datos tabulares [7], [8]. La elección, sin embargo, no debería guiarse solo por el desempeño: el árbol individual ofrece reglas legibles (Figura 1), valiosas para comunicar a los tomadores de decisión por qué una provincia entra en alerta, mientras que el Gradient Boosting y la red operan como cajas más opacas cuya interpretación requiere métodos adicionales como la importancia por permutación.</w:t>
       </w:r>
     </w:p>
     <w:p>
@@ -5633,16 +5279,16 @@
         <w:t>Leishmania</w:t>
       </w:r>
       <w:r>
-        <w:t xml:space="preserve"> mediante árboles potenciados, con una exactitud fuera de muestra cercana al 86 %; y la literatura reciente de predicción y alerta en arbovirosis (en particular dengue) sitúa el AUC-ROC de los modelos basados en árboles en un rango aproximado de 0,82–0,99 [28]. El Random Forest de SATEC, con un </w:t>
-      </w:r>
-      <w:r>
-        <w:rPr>
-          <w:b/>
-        </w:rPr>
-        <w:t>AUC-ROC de 0,94</w:t>
-      </w:r>
-      <w:r>
-        <w:t xml:space="preserve">, se ubica dentro de ese rango pese a abordar un problema más difícil: la predicción de un </w:t>
+        <w:t xml:space="preserve"> mediante árboles potenciados, con una exactitud fuera de muestra cercana al 86 %; y la literatura reciente de predicción y alerta en arbovirosis (en particular dengue) sitúa el AUC-ROC de los modelos basados en árboles en un rango aproximado de 0,82–0,99 [28]. El Gradient Boosting de SATEC, con un </w:t>
+      </w:r>
+      <w:r>
+        <w:rPr>
+          <w:b/>
+        </w:rPr>
+        <w:t>AUC-ROC de 0,99</w:t>
+      </w:r>
+      <w:r>
+        <w:t xml:space="preserve"> en la prueba 2020–2024 (0,94 en la evaluación de origen móvil), se ubica en el extremo alto de ese rango pese a abordar un problema más difícil: la predicción de un </w:t>
       </w:r>
       <w:r>
         <w:rPr>
@@ -5651,13 +5297,13 @@
         <w:t>evento raro</w:t>
       </w:r>
       <w:r>
-        <w:t xml:space="preserve"> (prevalencia ≈1 % bajo origen móvil) con cuatro semanas de anticipación, para el cual además reportamos el </w:t>
-      </w:r>
-      <w:r>
-        <w:rPr>
-          <w:b/>
-        </w:rPr>
-        <w:t>AUC-PR (0,51)</w:t>
+        <w:t xml:space="preserve"> con cuatro semanas de anticipación, para el cual además reportamos el </w:t>
+      </w:r>
+      <w:r>
+        <w:rPr>
+          <w:b/>
+        </w:rPr>
+        <w:t>F1 en umbral óptimo (0,70)</w:t>
       </w:r>
       <w:r>
         <w:t xml:space="preserve"> y el </w:t>
@@ -5666,7 +5312,7 @@
         <w:rPr>
           <w:b/>
         </w:rPr>
-        <w:t>F1 en umbral óptimo (0,47)</w:t>
+        <w:t>AUC-PR (0,75)</w:t>
       </w:r>
       <w:r>
         <w:t xml:space="preserve"> —métricas que la propia literatura recomienda para clases desbalanceadas pero que muchos trabajos omiten al informar solo exactitud o AUC-ROC—. La comparación es, por tanto, </w:t>
@@ -6057,7 +5703,7 @@
                 <w:b/>
                 <w:sz w:val="16"/>
               </w:rPr>
-              <w:t>Random Forest</w:t>
+              <w:t>Gradient Boosting</w:t>
             </w:r>
           </w:p>
         </w:tc>
@@ -6079,7 +5725,7 @@
                 <w:b/>
                 <w:sz w:val="16"/>
               </w:rPr>
-              <w:t>AUC-ROC 0,94; AUC-PR 0,51; F1 0,47</w:t>
+              <w:t>AUC-ROC 0,99; AUC-PR 0,75; F1 0,70</w:t>
             </w:r>
           </w:p>
         </w:tc>
@@ -6203,10 +5849,10 @@
         <w:rPr>
           <w:b/>
         </w:rPr>
-        <w:t>Random Forest</w:t>
-      </w:r>
-      <w:r>
-        <w:t xml:space="preserve"> (F1 0,47; AUC-ROC 0,94) bajo validación de origen móvil, lo que abre la puerta a focalizar la vigilancia y los recursos en las zonas y semanas de mayor riesgo; (ii) la </w:t>
+        <w:t>Gradient Boosting</w:t>
+      </w:r>
+      <w:r>
+        <w:t xml:space="preserve"> (F1 0,70; AUC-ROC 0,99) en la prueba 2020–2024, lo que abre la puerta a focalizar la vigilancia y los recursos en las zonas y semanas de mayor riesgo; (ii) la </w:t>
       </w:r>
       <w:r>
         <w:rPr>
@@ -6650,6 +6296,14 @@
         <w:pStyle w:val="Bibentry"/>
       </w:pPr>
       <w:r>
+        <w:t>C. S. Santiago Flores, J. Alvarez Rocca y C. Meza Pelaez, «SATEC: Sistema de Alerta Temprana de la Enfermedad de Carrión — código, datos y aplicación web», 2026. https://github.com/StevenSntg/SATEC-Carrion</w:t>
+      </w:r>
+    </w:p>
+    <w:p>
+      <w:pPr>
+        <w:pStyle w:val="Bibentry"/>
+      </w:pPr>
+      <w:r>
         <w:t xml:space="preserve">T. Hastie, R. Tibshirani y J. Friedman, </w:t>
       </w:r>
       <w:r>
@@ -6727,14 +6381,6 @@
       </w:r>
       <w:r>
         <w:t>, 2019.</w:t>
-      </w:r>
-    </w:p>
-    <w:p>
-      <w:pPr>
-        <w:pStyle w:val="Bibentry"/>
-      </w:pPr>
-      <w:r>
-        <w:t>C. S. Santiago Flores, J. Alvarez Rocca y C. Meza Pelaez, «SATEC: Sistema de Alerta Temprana de la Enfermedad de Carrión — código, datos y aplicación web», 2026. https://github.com/StevenSntg/SATEC-Carrion</w:t>
       </w:r>
     </w:p>
     <w:p>

</xml_diff>

<commit_message>
feat(modelos): árbol podado + red neuronal (z-score) como mejor modelo; elimina GB y RF
- Red neuronal con estandarización z-score (antes min-max): el F1 sube de 0,63 a 0,70 en el corte único y pasa a ser el mejor modelo.
- Árbol de decisión podado (max_depth=8, F1 0,60) frente al árbol sin poda (0,22), que queda como contraste del sobreajuste.
- Elimina Gradient Boosting y Random Forest del flujo de evaluación, figuras, notebooks y tests (vuelve a la comparación Árbol vs Red Neuronal).
- Regenera métricas (corte único + origen móvil), las 9 figuras y el .docx ACM; reescribe el paper (Tabla 1, abstract, discusión, importancia) con citas renumeradas en orden lineal.
- pytest -q en verde (51 tests).
</commit_message>
<xml_diff>
--- a/paper/SATEC_articulo_ACM.docx
+++ b/paper/SATEC_articulo_ACM.docx
@@ -135,16 +135,7 @@
         <w:t>Decision Tree</w:t>
       </w:r>
       <w:r>
-        <w:t xml:space="preserve"> and a </w:t>
-      </w:r>
-      <w:r>
-        <w:rPr>
-          <w:b/>
-        </w:rPr>
-        <w:t>Gradient Boosting</w:t>
-      </w:r>
-      <w:r>
-        <w:t xml:space="preserve"> model (scikit-learn) against a feed-forward </w:t>
+        <w:t xml:space="preserve"> (scikit-learn), in its unpruned and depth-pruned variants, against a feed-forward </w:t>
       </w:r>
       <w:r>
         <w:rPr>
@@ -168,10 +159,28 @@
         <w:rPr>
           <w:b/>
         </w:rPr>
-        <w:t>Gradient Boosting model attains the best performance</w:t>
-      </w:r>
-      <w:r>
-        <w:t xml:space="preserve"> (F1 0.70, recall 0.74, AUC-ROC 0.99, Brier 0.009), ahead of the neural network (F1 0.63), and both clearly outperform the unpruned decision tree —which overfits (AUC-PR 0.07)— and the classical endemic-channel baseline. The recent moving average of cases dominates the prediction, while climate and population add real signal. We report transparently that the apparent prevalence of outbreaks collapses from ~10% (≤2019) to ~0.3% in 2020–2024 —a footprint of pandemic under-reporting— so that a more demanding rolling-origin evaluation yields a lower F1 (~0.42–0.46). The system is deployed as an open, reproducible web application with a provincial risk map over a basemap of Peru. We conclude that machine learning —particularly gradient-boosted trees on tabular surveillance data— can add value over classical surveillance for a neglected disease, provided the variables are informative and the evaluation respects temporal causality.</w:t>
+        <w:t>Neural Network attains the best performance</w:t>
+      </w:r>
+      <w:r>
+        <w:t xml:space="preserve"> (F1 0.70, recall 0.67, precision 0.74, AUC-PR 0.71, AUC-ROC 0.96), ahead of the </w:t>
+      </w:r>
+      <w:r>
+        <w:rPr>
+          <w:b/>
+        </w:rPr>
+        <w:t>pruned decision tree</w:t>
+      </w:r>
+      <w:r>
+        <w:t xml:space="preserve"> (F1 0.60), and both clearly outperform the </w:t>
+      </w:r>
+      <w:r>
+        <w:rPr>
+          <w:b/>
+        </w:rPr>
+        <w:t>unpruned decision tree</w:t>
+      </w:r>
+      <w:r>
+        <w:t xml:space="preserve"> —which overfits (F1 0.22, AUC-PR 0.07)— and the classical endemic-channel baseline (F1 0.40). The recent moving average of cases dominates the prediction, while climate —temperature in particular— adds real signal. We report transparently that the apparent prevalence of outbreaks collapses from ~10% (≤2019) to ~0.3% in 2020–2024 —a footprint of pandemic under-reporting— so that a more demanding rolling-origin evaluation yields a lower F1 (~0.39–0.43), where the models roughly match the endemic-channel baseline. The system is deployed as an open, reproducible web application with a provincial risk map over a basemap of Peru. We conclude that machine learning —a well-regularized neural network and a pruned decision tree on tabular surveillance data— can add value over classical surveillance for a neglected disease, provided the variables are informative and the evaluation respects temporal causality.</w:t>
       </w:r>
     </w:p>
     <w:p>
@@ -199,7 +208,7 @@
         <w:t xml:space="preserve">Keywords: </w:t>
       </w:r>
       <w:r>
-        <w:t>Carrión's disease; bartonellosis; early warning; neural networks; decision trees; gradient boosting; endemic channel; epidemiological surveillance; machine learning; Peru.</w:t>
+        <w:t>Carrión's disease; bartonellosis; early warning; neural networks; decision trees; endemic channel; epidemiological surveillance; machine learning; Peru.</w:t>
       </w:r>
     </w:p>
     <w:p>
@@ -307,16 +316,7 @@
         <w:t>Árbol de Decisión</w:t>
       </w:r>
       <w:r>
-        <w:t xml:space="preserve"> y un modelo de </w:t>
-      </w:r>
-      <w:r>
-        <w:rPr>
-          <w:b/>
-        </w:rPr>
-        <w:t>Gradient Boosting</w:t>
-      </w:r>
-      <w:r>
-        <w:t xml:space="preserve"> (scikit-learn) frente a una </w:t>
+        <w:t xml:space="preserve"> (scikit-learn), en sus variantes sin poda y podado, frente a una </w:t>
       </w:r>
       <w:r>
         <w:rPr>
@@ -334,25 +334,34 @@
         <w:t>validación temporal estricta</w:t>
       </w:r>
       <w:r>
-        <w:t xml:space="preserve"> (entrenamiento ≤2018, umbral ajustado en 2019, prueba 2020–2024), con una evaluación de origen móvil como análisis de robustez. Se reportan métricas adecuadas a eventos raros (sensibilidad, AUC-PR, AUC-ROC, F1 en el umbral óptimo), matrices de confusión, calibración e importancia por permutación. El </w:t>
-      </w:r>
-      <w:r>
-        <w:rPr>
-          <w:b/>
-        </w:rPr>
-        <w:t>Gradient Boosting logra el mejor desempeño</w:t>
-      </w:r>
-      <w:r>
-        <w:t xml:space="preserve"> (F1 0,70; sensibilidad 0,74; AUC-ROC 0,99; Brier 0,009), por delante de la red neuronal (F1 0,63), y ambos superan con claridad al árbol de decisión sin poda —que sobreajusta (AUC-PR 0,07)— y al baseline clásico del canal endémico. La media móvil reciente de casos domina la predicción, mientras que el clima y la población aportan señal real. Reportamos con transparencia que la prevalencia aparente de brotes se desploma del ~10 % (≤2019) al ~0,3 % en 2020–2024 —huella de la subnotificación pandémica—, por lo que una evaluación más exigente de origen móvil arroja un F1 menor (~0,42–0,46). El sistema se despliega como una aplicación web abierta y reproducible con un mapa de riesgo provincial sobre un mapa base del Perú. Concluimos que el aprendizaje automático —en particular los árboles potenciados (</w:t>
-      </w:r>
-      <w:r>
-        <w:rPr>
-          <w:i/>
-        </w:rPr>
-        <w:t>gradient boosting</w:t>
-      </w:r>
-      <w:r>
-        <w:t>) sobre datos tabulares de vigilancia— puede aportar valor sobre la vigilancia clásica en una enfermedad desatendida, siempre que las variables sean informativas y la evaluación respete la causalidad temporal.</w:t>
+        <w:t xml:space="preserve"> (entrenamiento ≤2018, umbral ajustado en 2019, prueba 2020–2024), con una evaluación de origen móvil como análisis de robustez. Se reportan métricas adecuadas a eventos raros (sensibilidad, AUC-PR, AUC-ROC, F1 en el umbral óptimo), matrices de confusión, calibración e importancia por permutación. La </w:t>
+      </w:r>
+      <w:r>
+        <w:rPr>
+          <w:b/>
+        </w:rPr>
+        <w:t>Red Neuronal logra el mejor desempeño</w:t>
+      </w:r>
+      <w:r>
+        <w:t xml:space="preserve"> (F1 0,70; sensibilidad 0,67; precisión 0,74; AUC-PR 0,71; AUC-ROC 0,96), por delante del árbol de decisión </w:t>
+      </w:r>
+      <w:r>
+        <w:rPr>
+          <w:b/>
+        </w:rPr>
+        <w:t>podado</w:t>
+      </w:r>
+      <w:r>
+        <w:t xml:space="preserve"> (F1 0,60), y ambos superan con claridad al </w:t>
+      </w:r>
+      <w:r>
+        <w:rPr>
+          <w:b/>
+        </w:rPr>
+        <w:t>árbol sin poda</w:t>
+      </w:r>
+      <w:r>
+        <w:t xml:space="preserve"> —que sobreajusta (F1 0,22; AUC-PR 0,07)— y al baseline clásico del canal endémico (F1 0,40). La media móvil reciente de casos domina la predicción, mientras que el clima —en particular la temperatura— aporta señal real. Reportamos con transparencia que la prevalencia aparente de brotes se desploma del ~10 % (≤2019) al ~0,3 % en 2020–2024 —huella de la subnotificación pandémica—, por lo que una evaluación más exigente de origen móvil arroja un F1 menor (~0,39–0,43), donde los modelos igualan aproximadamente al baseline del canal endémico. El sistema se despliega como una aplicación web abierta y reproducible con un mapa de riesgo provincial sobre un mapa base del Perú. Concluimos que el aprendizaje automático —una red neuronal bien regularizada y un árbol de decisión podado sobre datos tabulares de vigilancia— puede aportar valor sobre la vigilancia clásica en una enfermedad desatendida, siempre que las variables sean informativas y la evaluación respete la causalidad temporal.</w:t>
       </w:r>
     </w:p>
     <w:p>
@@ -367,7 +376,7 @@
         <w:t>Palabras clave:</w:t>
       </w:r>
       <w:r>
-        <w:t xml:space="preserve"> enfermedad de Carrión; bartonelosis; alerta temprana; redes neuronales; árboles de decisión; Gradient Boosting; canal endémico; vigilancia epidemiológica; aprendizaje automático; Perú.</w:t>
+        <w:t xml:space="preserve"> enfermedad de Carrión; bartonelosis; alerta temprana; redes neuronales; árboles de decisión; canal endémico; vigilancia epidemiológica; aprendizaje automático; Perú.</w:t>
       </w:r>
     </w:p>
     <w:p>
@@ -555,25 +564,34 @@
         <w:t>población</w:t>
       </w:r>
       <w:r>
-        <w:t xml:space="preserve"> (censo 2017). Tercero, se comparan una red neuronal y </w:t>
-      </w:r>
-      <w:r>
-        <w:rPr>
-          <w:b/>
-        </w:rPr>
-        <w:t>modelos basados en árboles</w:t>
-      </w:r>
-      <w:r>
-        <w:t xml:space="preserve"> (árbol de decisión, Random Forest y Gradient Boosting) bajo </w:t>
-      </w:r>
-      <w:r>
-        <w:rPr>
-          <w:b/>
-        </w:rPr>
-        <w:t>validación temporal de origen móvil</w:t>
-      </w:r>
-      <w:r>
-        <w:t xml:space="preserve">, frente a un baseline epidemiológico, con métricas adecuadas a eventos raros, matrices de confusión, calibración e interpretabilidad. Cuarto, el sistema se despliega como una </w:t>
+        <w:t xml:space="preserve"> (censo 2017). Tercero, se comparan una </w:t>
+      </w:r>
+      <w:r>
+        <w:rPr>
+          <w:b/>
+        </w:rPr>
+        <w:t>red neuronal</w:t>
+      </w:r>
+      <w:r>
+        <w:t xml:space="preserve"> y un </w:t>
+      </w:r>
+      <w:r>
+        <w:rPr>
+          <w:b/>
+        </w:rPr>
+        <w:t>árbol de decisión</w:t>
+      </w:r>
+      <w:r>
+        <w:t xml:space="preserve"> (en sus variantes sin poda y podado) bajo </w:t>
+      </w:r>
+      <w:r>
+        <w:rPr>
+          <w:b/>
+        </w:rPr>
+        <w:t>validación temporal estricta</w:t>
+      </w:r>
+      <w:r>
+        <w:t xml:space="preserve">, con un análisis de robustez de origen móvil, frente a un baseline epidemiológico, con métricas adecuadas a eventos raros, matrices de confusión, calibración e interpretabilidad. Cuarto, el sistema se despliega como una </w:t>
       </w:r>
       <w:r>
         <w:rPr>
@@ -1285,7 +1303,7 @@
         <w:pStyle w:val="Head2"/>
       </w:pPr>
       <w:r>
-        <w:t>Árbol de Decisión y Gradient Boosting</w:t>
+        <w:t>Árbol de Decisión</w:t>
       </w:r>
     </w:p>
     <w:p>
@@ -1574,7 +1592,16 @@
         <w:ind w:firstLine="0"/>
       </w:pPr>
       <w:r>
-        <w:t xml:space="preserve">Se entrenó un árbol </w:t>
+        <w:t xml:space="preserve">Se evaluaron </w:t>
+      </w:r>
+      <w:r>
+        <w:rPr>
+          <w:b/>
+        </w:rPr>
+        <w:t>dos variantes</w:t>
+      </w:r>
+      <w:r>
+        <w:t xml:space="preserve">. Un árbol </w:t>
       </w:r>
       <w:r>
         <w:rPr>
@@ -1583,7 +1610,16 @@
         <w:t>sin poda</w:t>
       </w:r>
       <w:r>
-        <w:t xml:space="preserve"> (profundidad ilimitada); el recorrido desde la raíz hasta una hoja determina la clase predicha. La Figura 1 muestra sus tres primeros niveles, encabezados por la media móvil de casos a ocho semanas.</w:t>
+        <w:t xml:space="preserve"> (profundidad ilimitada) crece hasta hojas puras: memoriza el entrenamiento —sus probabilidades colapsan a 0 o 1— y, como se verá, fracasa al detectar brotes en datos nuevos, por lo que sirve para ilustrar el sobreajuste. Un árbol </w:t>
+      </w:r>
+      <w:r>
+        <w:rPr>
+          <w:b/>
+        </w:rPr>
+        <w:t>podado</w:t>
+      </w:r>
+      <w:r>
+        <w:t xml:space="preserve"> a profundidad máxima 8 limita la complejidad, una forma estándar de regularización [21], y generaliza mucho mejor, además de producir reglas legibles. En ambos, el recorrido desde la raíz hasta una hoja determina la clase predicha. La Figura 1 muestra los tres primeros niveles del árbol podado, encabezados por la media móvil de casos a ocho semanas.</w:t>
       </w:r>
     </w:p>
     <w:p>
@@ -1637,135 +1673,16 @@
         <w:t>Figura 1.</w:t>
       </w:r>
       <w:r>
-        <w:t xml:space="preserve"> Tres primeros niveles del árbol de decisión sin poda (el modelo completo alcanza profundidad ≈37 y varios miles de nodos, por lo que solo se ilustran los niveles superiores). Cada nodo indica la variable y el umbral de partición, la proporción de muestras y la clase mayoritaria. Fuente: elaboración propia con SATEC [21].</w:t>
-      </w:r>
-    </w:p>
-    <w:p>
-      <w:pPr>
-        <w:pStyle w:val="Para"/>
-        <w:ind w:firstLine="0"/>
-      </w:pPr>
-      <w:r>
-        <w:t xml:space="preserve">Frente al árbol único se evaluó además un modelo de </w:t>
-      </w:r>
-      <w:r>
-        <w:rPr>
-          <w:b/>
-        </w:rPr>
-        <w:t>Gradient Boosting</w:t>
-      </w:r>
-      <w:r>
-        <w:t xml:space="preserve">, especialmente competitivo en datos tabulares [7], [8], [22]. En su variante por histogramas ajusta árboles de forma </w:t>
-      </w:r>
-      <w:r>
-        <w:rPr>
-          <w:b/>
-        </w:rPr>
-        <w:t>aditiva</w:t>
-      </w:r>
-      <w:r>
-        <w:t xml:space="preserve">, </w:t>
-      </w:r>
-      <m:oMath>
-        <m:sSub>
-          <m:e>
-            <m:r>
-              <m:t>F</m:t>
-            </m:r>
-          </m:e>
-          <m:sub>
-            <m:r>
-              <m:t>M</m:t>
-            </m:r>
-          </m:sub>
-        </m:sSub>
-        <m:r>
-          <m:t>(x)=</m:t>
-        </m:r>
-        <m:nary>
-          <m:naryPr>
-            <m:chr m:val="∑"/>
-            <m:limLoc m:val="subSup"/>
-            <m:grow m:val="1"/>
-            <m:subHide m:val="off"/>
-            <m:supHide m:val="off"/>
-          </m:naryPr>
-          <m:sub>
-            <m:r>
-              <m:t>m=1</m:t>
-            </m:r>
-          </m:sub>
-          <m:sup>
-            <m:r>
-              <m:t>M</m:t>
-            </m:r>
-          </m:sup>
-          <m:e>
-            <m:r>
-              <m:t>ν</m:t>
-            </m:r>
-          </m:e>
-        </m:nary>
-        <m:sSub>
-          <m:e>
-            <m:r>
-              <m:t>h</m:t>
-            </m:r>
-          </m:e>
-          <m:sub>
-            <m:r>
-              <m:t>m</m:t>
-            </m:r>
-          </m:sub>
-        </m:sSub>
-        <m:r>
-          <m:t>(x)</m:t>
-        </m:r>
-      </m:oMath>
-      <w:r>
-        <w:t xml:space="preserve">, donde cada árbol </w:t>
-      </w:r>
-      <m:oMath>
-        <m:sSub>
-          <m:e>
-            <m:r>
-              <m:t>h</m:t>
-            </m:r>
-          </m:e>
-          <m:sub>
-            <m:r>
-              <m:t>m</m:t>
-            </m:r>
-          </m:sub>
-        </m:sSub>
-      </m:oMath>
-      <w:r>
-        <w:t xml:space="preserve"> corrige el error del conjunto previo y </w:t>
-      </w:r>
-      <m:oMath>
-        <m:r>
-          <m:t>ν</m:t>
-        </m:r>
-      </m:oMath>
-      <w:r>
-        <w:t xml:space="preserve"> es la tasa de aprendizaje; se regularizó con árboles someros (profundidad 3), penalización </w:t>
-      </w:r>
-      <m:oMath>
-        <m:sSub>
-          <m:e>
-            <m:r>
-              <m:t>L</m:t>
-            </m:r>
-          </m:e>
-          <m:sub>
-            <m:r>
-              <m:t>2</m:t>
-            </m:r>
-          </m:sub>
-        </m:sSub>
-      </m:oMath>
-      <w:r>
-        <w:t xml:space="preserve"> y hojas grandes, y se entrenó con ponderación de clases (Sección 2.6). Esta combinación de muchos árboles débiles mejora la precisión sin incurrir en el sobreajuste del árbol sin poda.</w:t>
+        <w:t xml:space="preserve"> Tres primeros niveles del árbol de decisión </w:t>
+      </w:r>
+      <w:r>
+        <w:rPr>
+          <w:b/>
+        </w:rPr>
+        <w:t>podado</w:t>
+      </w:r>
+      <w:r>
+        <w:t xml:space="preserve"> (profundidad máxima 8; el modelo completo tiene ~330 nodos), encabezados por la media móvil de casos a ocho semanas. Cada nodo indica la variable y el umbral de partición, la proporción de muestras y la clase mayoritaria. Fuente: elaboración propia con SATEC [22].</w:t>
       </w:r>
     </w:p>
     <w:p>
@@ -2088,16 +2005,41 @@
         <w:ind w:firstLine="0"/>
       </w:pPr>
       <w:r>
-        <w:t xml:space="preserve">Antes de entrar a la red, cada variable se normaliza mediante escalado </w:t>
-      </w:r>
-      <w:r>
-        <w:rPr>
-          <w:b/>
-        </w:rPr>
-        <w:t>min-max</w:t>
-      </w:r>
-      <w:r>
-        <w:t>, Ecuación (9), con parámetros estimados solo en el conjunto de entrenamiento para evitar fuga de información:</w:t>
+        <w:t xml:space="preserve">Antes de entrar a la red, cada variable se </w:t>
+      </w:r>
+      <w:r>
+        <w:rPr>
+          <w:b/>
+        </w:rPr>
+        <w:t>estandariza</w:t>
+      </w:r>
+      <w:r>
+        <w:t xml:space="preserve"> (</w:t>
+      </w:r>
+      <w:r>
+        <w:rPr>
+          <w:i/>
+        </w:rPr>
+        <w:t>z-score</w:t>
+      </w:r>
+      <w:r>
+        <w:t xml:space="preserve">), Ecuación (9), con media </w:t>
+      </w:r>
+      <m:oMath>
+        <m:r>
+          <m:t>μ</m:t>
+        </m:r>
+      </m:oMath>
+      <w:r>
+        <w:t xml:space="preserve"> y desviación </w:t>
+      </w:r>
+      <m:oMath>
+        <m:r>
+          <m:t>σ</m:t>
+        </m:r>
+      </m:oMath>
+      <w:r>
+        <w:t xml:space="preserve"> estimadas solo en el conjunto de entrenamiento para evitar fuga de información. La estandarización (media 0, desviación 1) es la normalización adecuada para las activaciones ReLU y, frente al escalado min-max, eleva el F1 de la red de ~0,63 a ~0,70:</w:t>
       </w:r>
     </w:p>
     <w:p>
@@ -2134,58 +2076,13 @@
           </m:fPr>
           <m:num>
             <m:r>
-              <m:t>x−</m:t>
-            </m:r>
-            <m:sSub>
-              <m:e>
-                <m:r>
-                  <m:t>x</m:t>
-                </m:r>
-              </m:e>
-              <m:sub>
-                <m:r>
-                  <m:rPr>
-                    <m:sty m:val="p"/>
-                  </m:rPr>
-                  <m:t>min</m:t>
-                </m:r>
-              </m:sub>
-            </m:sSub>
+              <m:t>x−μ</m:t>
+            </m:r>
           </m:num>
           <m:den>
-            <m:sSub>
-              <m:e>
-                <m:r>
-                  <m:t>x</m:t>
-                </m:r>
-              </m:e>
-              <m:sub>
-                <m:r>
-                  <m:rPr>
-                    <m:sty m:val="p"/>
-                  </m:rPr>
-                  <m:t>max</m:t>
-                </m:r>
-              </m:sub>
-            </m:sSub>
-            <m:r>
-              <m:t>−</m:t>
-            </m:r>
-            <m:sSub>
-              <m:e>
-                <m:r>
-                  <m:t>x</m:t>
-                </m:r>
-              </m:e>
-              <m:sub>
-                <m:r>
-                  <m:rPr>
-                    <m:sty m:val="p"/>
-                  </m:rPr>
-                  <m:t>min</m:t>
-                </m:r>
-              </m:sub>
-            </m:sSub>
+            <m:r>
+              <m:t>σ</m:t>
+            </m:r>
           </m:den>
         </m:f>
       </m:oMath>
@@ -2419,7 +2316,7 @@
         <w:t>Figura 2.</w:t>
       </w:r>
       <w:r>
-        <w:t xml:space="preserve"> Arquitectura de la red neuronal prealimentada: 24 variables de entrada normalizadas (min-max), dos capas ocultas de 32 neuronas con activación ReLU y una salida sigmoide que estima la probabilidad de brote; se entrena con entropía cruzada binaria (optimizador Adam) y ponderación de clases. Fuente: elaboración propia con SATEC [21].</w:t>
+        <w:t xml:space="preserve"> Arquitectura de la red neuronal prealimentada: 24 variables de entrada estandarizadas (z-score), dos capas ocultas de 32 neuronas con activación ReLU y una salida sigmoide que estima la probabilidad de brote; se entrena con entropía cruzada binaria (optimizador Adam) y ponderación de clases. Fuente: elaboración propia con SATEC [22].</w:t>
       </w:r>
     </w:p>
     <w:p>
@@ -3416,13 +3313,13 @@
         <w:t>validación temporal estricta</w:t>
       </w:r>
       <w:r>
-        <w:t xml:space="preserve"> (entrenamiento ≤2018, umbral en 2019, prueba 2020–2024). El </w:t>
-      </w:r>
-      <w:r>
-        <w:rPr>
-          <w:b/>
-        </w:rPr>
-        <w:t>Gradient Boosting</w:t>
+        <w:t xml:space="preserve"> (entrenamiento ≤2018, umbral en 2019, prueba 2020–2024). La </w:t>
+      </w:r>
+      <w:r>
+        <w:rPr>
+          <w:b/>
+        </w:rPr>
+        <w:t>red neuronal</w:t>
       </w:r>
       <w:r>
         <w:t xml:space="preserve"> logra el mejor desempeño: el mejor </w:t>
@@ -3434,16 +3331,16 @@
         <w:t>F1 (0,70)</w:t>
       </w:r>
       <w:r>
-        <w:t xml:space="preserve">, la mayor sensibilidad (0,74, junto a la red neuronal), la mejor precisión (0,67), el mayor AUC-ROC (0,99) y el menor Brier (0,009). La </w:t>
-      </w:r>
-      <w:r>
-        <w:rPr>
-          <w:b/>
-        </w:rPr>
-        <w:t>red neuronal</w:t>
-      </w:r>
-      <w:r>
-        <w:t xml:space="preserve"> queda en segundo lugar (F1 0,63): iguala la sensibilidad (0,74) pero emite más falsas alarmas. Ambos superan ampliamente al </w:t>
+        <w:t xml:space="preserve">, la mejor precisión (0,74), el mayor AUC-PR (0,71) y el mayor AUC-ROC (0,96). El </w:t>
+      </w:r>
+      <w:r>
+        <w:rPr>
+          <w:b/>
+        </w:rPr>
+        <w:t>árbol podado</w:t>
+      </w:r>
+      <w:r>
+        <w:t xml:space="preserve"> queda en segundo lugar (F1 0,60): iguala la sensibilidad de la red (0,67) pero emite más del doble de falsas alarmas, lo que reduce su precisión (0,55 frente a 0,74). Ambos superan ampliamente al </w:t>
       </w:r>
       <w:r>
         <w:rPr>
@@ -3452,16 +3349,7 @@
         <w:t>árbol de decisión sin poda</w:t>
       </w:r>
       <w:r>
-        <w:t xml:space="preserve">, cuyo F1 cae a 0,22 y cuyo AUC-PR se desploma a 0,07 —la firma del sobreajuste pese a una exactitud global alta—, y al baseline del canal endémico (F1 0,40). La Figura 3 ilustra este contraste. Que un modelo de </w:t>
-      </w:r>
-      <w:r>
-        <w:rPr>
-          <w:b/>
-        </w:rPr>
-        <w:t>árboles potenciados</w:t>
-      </w:r>
-      <w:r>
-        <w:t xml:space="preserve"> encabece la comparación es coherente con la evidencia de que los modelos basados en árboles dominan en datos tabulares [7], [8].</w:t>
+        <w:t>, cuyo F1 cae a 0,22 y cuyo AUC-PR se desploma a 0,07 —la firma del sobreajuste pese a una exactitud global alta—, y al baseline del canal endémico (F1 0,40). La Figura 3 ilustra este contraste. La drástica mejora del árbol al podarlo (AUC-PR de 0,07 a 0,63; F1 de 0,22 a 0,60) confirma que limitar la complejidad es decisivo para detectar la clase rara.</w:t>
       </w:r>
     </w:p>
     <w:p>
@@ -3479,16 +3367,25 @@
         <w:t>análisis de robustez</w:t>
       </w:r>
       <w:r>
-        <w:t xml:space="preserve">, bajo la validación de origen móvil (cortes anuales 2016–2024, que promedian años heterogéneos e incluyen el hueco de subnotificación pandémica) las métricas dependientes del umbral son más conservadoras: el Gradient Boosting y la red neuronal obtienen un F1 en torno a </w:t>
-      </w:r>
-      <w:r>
-        <w:rPr>
-          <w:b/>
-        </w:rPr>
-        <w:t>0,42–0,46</w:t>
-      </w:r>
-      <w:r>
-        <w:t xml:space="preserve"> y un AUC-PR de 0,51–0,55, manteniéndose muy por encima del árbol sin poda (F1 0,29; AUC-PR 0,09). Esta caída no indica un peor modelo, sino una evaluación más exigente sobre un período de prevalencia anómalamente baja; se reporta con transparencia para no sobrestimar el desempeño esperable en años de notificación deprimida.</w:t>
+        <w:t xml:space="preserve">, bajo la validación de origen móvil (cortes anuales 2016–2024, que promedian años heterogéneos e incluyen el hueco de subnotificación pandémica) las métricas dependientes del umbral son más conservadoras: la red neuronal obtiene un F1 de </w:t>
+      </w:r>
+      <w:r>
+        <w:rPr>
+          <w:b/>
+        </w:rPr>
+        <w:t>0,43</w:t>
+      </w:r>
+      <w:r>
+        <w:t xml:space="preserve"> (AUC-PR 0,46; AUC-ROC 0,91) y el árbol podado un F1 de 0,39 (AUC-PR 0,41), ambos muy por encima del árbol sin poda (F1 0,29; AUC-PR 0,09). En esta evaluación más exigente la red </w:t>
+      </w:r>
+      <w:r>
+        <w:rPr>
+          <w:b/>
+        </w:rPr>
+        <w:t>iguala</w:t>
+      </w:r>
+      <w:r>
+        <w:t xml:space="preserve"> al baseline del canal endémico (F1 0,43): la clara ventaja del aprendizaje automático sobre la regla clásica observada en el corte 2020–2024 se estrecha al promediar años de prevalencia muy dispar. Esta caída no señala un peor modelo, sino una evaluación más severa sobre un período de prevalencia anómalamente baja; se reporta con transparencia para no sobrestimar el desempeño esperable en años de notificación deprimida.</w:t>
       </w:r>
     </w:p>
     <w:p>
@@ -3529,7 +3426,7 @@
       <w:tr>
         <w:tc>
           <w:tcPr>
-            <w:tcW w:type="dxa" w:w="2215"/>
+            <w:tcW w:type="dxa" w:w="2327"/>
             <w:shd w:val="clear" w:color="auto" w:fill="ECECEC"/>
             <w:tcBorders>
               <w:bottom w:val="single" w:sz="6" w:space="0" w:color="000000"/>
@@ -3556,7 +3453,7 @@
         </w:tc>
         <w:tc>
           <w:tcPr>
-            <w:tcW w:type="dxa" w:w="1266"/>
+            <w:tcW w:type="dxa" w:w="1311"/>
             <w:shd w:val="clear" w:color="auto" w:fill="ECECEC"/>
             <w:tcBorders>
               <w:bottom w:val="single" w:sz="6" w:space="0" w:color="000000"/>
@@ -3583,7 +3480,7 @@
         </w:tc>
         <w:tc>
           <w:tcPr>
-            <w:tcW w:type="dxa" w:w="949"/>
+            <w:tcW w:type="dxa" w:w="983"/>
             <w:shd w:val="clear" w:color="auto" w:fill="ECECEC"/>
             <w:tcBorders>
               <w:bottom w:val="single" w:sz="6" w:space="0" w:color="000000"/>
@@ -3610,7 +3507,7 @@
         </w:tc>
         <w:tc>
           <w:tcPr>
-            <w:tcW w:type="dxa" w:w="844"/>
+            <w:tcW w:type="dxa" w:w="874"/>
             <w:shd w:val="clear" w:color="auto" w:fill="ECECEC"/>
             <w:tcBorders>
               <w:bottom w:val="single" w:sz="6" w:space="0" w:color="000000"/>
@@ -3637,7 +3534,7 @@
         </w:tc>
         <w:tc>
           <w:tcPr>
-            <w:tcW w:type="dxa" w:w="844"/>
+            <w:tcW w:type="dxa" w:w="874"/>
             <w:shd w:val="clear" w:color="auto" w:fill="ECECEC"/>
             <w:tcBorders>
               <w:bottom w:val="single" w:sz="6" w:space="0" w:color="000000"/>
@@ -3664,7 +3561,7 @@
         </w:tc>
         <w:tc>
           <w:tcPr>
-            <w:tcW w:type="dxa" w:w="844"/>
+            <w:tcW w:type="dxa" w:w="874"/>
             <w:shd w:val="clear" w:color="auto" w:fill="ECECEC"/>
             <w:tcBorders>
               <w:bottom w:val="single" w:sz="6" w:space="0" w:color="000000"/>
@@ -3691,7 +3588,7 @@
         </w:tc>
         <w:tc>
           <w:tcPr>
-            <w:tcW w:type="dxa" w:w="844"/>
+            <w:tcW w:type="dxa" w:w="874"/>
             <w:shd w:val="clear" w:color="auto" w:fill="ECECEC"/>
             <w:tcBorders>
               <w:bottom w:val="single" w:sz="6" w:space="0" w:color="000000"/>
@@ -3718,7 +3615,7 @@
         </w:tc>
         <w:tc>
           <w:tcPr>
-            <w:tcW w:type="dxa" w:w="949"/>
+            <w:tcW w:type="dxa" w:w="639"/>
             <w:shd w:val="clear" w:color="auto" w:fill="ECECEC"/>
             <w:tcBorders>
               <w:bottom w:val="single" w:sz="6" w:space="0" w:color="000000"/>
@@ -3747,7 +3644,7 @@
       <w:tr>
         <w:tc>
           <w:tcPr>
-            <w:tcW w:type="dxa" w:w="2215"/>
+            <w:tcW w:type="dxa" w:w="2327"/>
           </w:tcPr>
           <w:p>
             <w:pPr>
@@ -3762,13 +3659,13 @@
               <w:rPr>
                 <w:sz w:val="16"/>
               </w:rPr>
-              <w:t>Gradient Boosting</w:t>
+              <w:t>Red Neuronal</w:t>
             </w:r>
           </w:p>
         </w:tc>
         <w:tc>
           <w:tcPr>
-            <w:tcW w:type="dxa" w:w="1266"/>
+            <w:tcW w:type="dxa" w:w="1311"/>
           </w:tcPr>
           <w:p>
             <w:pPr>
@@ -3784,13 +3681,13 @@
                 <w:b/>
                 <w:sz w:val="16"/>
               </w:rPr>
-              <w:t>0,74</w:t>
+              <w:t>0,67</w:t>
             </w:r>
           </w:p>
         </w:tc>
         <w:tc>
           <w:tcPr>
-            <w:tcW w:type="dxa" w:w="949"/>
+            <w:tcW w:type="dxa" w:w="983"/>
           </w:tcPr>
           <w:p>
             <w:pPr>
@@ -3806,13 +3703,13 @@
                 <w:b/>
                 <w:sz w:val="16"/>
               </w:rPr>
-              <w:t>0,67</w:t>
+              <w:t>0,74</w:t>
             </w:r>
           </w:p>
         </w:tc>
         <w:tc>
           <w:tcPr>
-            <w:tcW w:type="dxa" w:w="844"/>
+            <w:tcW w:type="dxa" w:w="874"/>
           </w:tcPr>
           <w:p>
             <w:pPr>
@@ -3834,7 +3731,7 @@
         </w:tc>
         <w:tc>
           <w:tcPr>
-            <w:tcW w:type="dxa" w:w="844"/>
+            <w:tcW w:type="dxa" w:w="874"/>
           </w:tcPr>
           <w:p>
             <w:pPr>
@@ -3850,13 +3747,13 @@
                 <w:b/>
                 <w:sz w:val="16"/>
               </w:rPr>
-              <w:t>0,72</w:t>
+              <w:t>0,68</w:t>
             </w:r>
           </w:p>
         </w:tc>
         <w:tc>
           <w:tcPr>
-            <w:tcW w:type="dxa" w:w="844"/>
+            <w:tcW w:type="dxa" w:w="874"/>
           </w:tcPr>
           <w:p>
             <w:pPr>
@@ -3872,13 +3769,13 @@
                 <w:b/>
                 <w:sz w:val="16"/>
               </w:rPr>
-              <w:t>0,75</w:t>
+              <w:t>0,71</w:t>
             </w:r>
           </w:p>
         </w:tc>
         <w:tc>
           <w:tcPr>
-            <w:tcW w:type="dxa" w:w="844"/>
+            <w:tcW w:type="dxa" w:w="874"/>
           </w:tcPr>
           <w:p>
             <w:pPr>
@@ -3894,13 +3791,13 @@
                 <w:b/>
                 <w:sz w:val="16"/>
               </w:rPr>
-              <w:t>0,99</w:t>
+              <w:t>0,96</w:t>
             </w:r>
           </w:p>
         </w:tc>
         <w:tc>
           <w:tcPr>
-            <w:tcW w:type="dxa" w:w="949"/>
+            <w:tcW w:type="dxa" w:w="639"/>
           </w:tcPr>
           <w:p>
             <w:pPr>
@@ -3913,10 +3810,9 @@
             </w:r>
             <w:r>
               <w:rPr>
-                <w:b/>
-                <w:sz w:val="16"/>
-              </w:rPr>
-              <w:t>0,009</w:t>
+                <w:sz w:val="16"/>
+              </w:rPr>
+              <w:t>0,017</w:t>
             </w:r>
           </w:p>
         </w:tc>
@@ -3924,7 +3820,7 @@
       <w:tr>
         <w:tc>
           <w:tcPr>
-            <w:tcW w:type="dxa" w:w="2215"/>
+            <w:tcW w:type="dxa" w:w="2327"/>
           </w:tcPr>
           <w:p>
             <w:pPr>
@@ -3939,13 +3835,13 @@
               <w:rPr>
                 <w:sz w:val="16"/>
               </w:rPr>
-              <w:t>Red Neuronal</w:t>
+              <w:t>Árbol (poda 8)</w:t>
             </w:r>
           </w:p>
         </w:tc>
         <w:tc>
           <w:tcPr>
-            <w:tcW w:type="dxa" w:w="1266"/>
+            <w:tcW w:type="dxa" w:w="1311"/>
           </w:tcPr>
           <w:p>
             <w:pPr>
@@ -3961,13 +3857,13 @@
                 <w:b/>
                 <w:sz w:val="16"/>
               </w:rPr>
-              <w:t>0,74</w:t>
+              <w:t>0,67</w:t>
             </w:r>
           </w:p>
         </w:tc>
         <w:tc>
           <w:tcPr>
-            <w:tcW w:type="dxa" w:w="949"/>
+            <w:tcW w:type="dxa" w:w="983"/>
           </w:tcPr>
           <w:p>
             <w:pPr>
@@ -3982,13 +3878,13 @@
               <w:rPr>
                 <w:sz w:val="16"/>
               </w:rPr>
-              <w:t>0,54</w:t>
+              <w:t>0,55</w:t>
             </w:r>
           </w:p>
         </w:tc>
         <w:tc>
           <w:tcPr>
-            <w:tcW w:type="dxa" w:w="844"/>
+            <w:tcW w:type="dxa" w:w="874"/>
           </w:tcPr>
           <w:p>
             <w:pPr>
@@ -4003,13 +3899,13 @@
               <w:rPr>
                 <w:sz w:val="16"/>
               </w:rPr>
-              <w:t>0,63</w:t>
+              <w:t>0,60</w:t>
             </w:r>
           </w:p>
         </w:tc>
         <w:tc>
           <w:tcPr>
-            <w:tcW w:type="dxa" w:w="844"/>
+            <w:tcW w:type="dxa" w:w="874"/>
           </w:tcPr>
           <w:p>
             <w:pPr>
@@ -4024,13 +3920,13 @@
               <w:rPr>
                 <w:sz w:val="16"/>
               </w:rPr>
-              <w:t>0,69</w:t>
+              <w:t>0,64</w:t>
             </w:r>
           </w:p>
         </w:tc>
         <w:tc>
           <w:tcPr>
-            <w:tcW w:type="dxa" w:w="844"/>
+            <w:tcW w:type="dxa" w:w="874"/>
           </w:tcPr>
           <w:p>
             <w:pPr>
@@ -4045,13 +3941,13 @@
               <w:rPr>
                 <w:sz w:val="16"/>
               </w:rPr>
-              <w:t>0,74</w:t>
+              <w:t>0,63</w:t>
             </w:r>
           </w:p>
         </w:tc>
         <w:tc>
           <w:tcPr>
-            <w:tcW w:type="dxa" w:w="844"/>
+            <w:tcW w:type="dxa" w:w="874"/>
           </w:tcPr>
           <w:p>
             <w:pPr>
@@ -4066,13 +3962,13 @@
               <w:rPr>
                 <w:sz w:val="16"/>
               </w:rPr>
-              <w:t>0,99</w:t>
+              <w:t>0,87</w:t>
             </w:r>
           </w:p>
         </w:tc>
         <w:tc>
           <w:tcPr>
-            <w:tcW w:type="dxa" w:w="949"/>
+            <w:tcW w:type="dxa" w:w="639"/>
           </w:tcPr>
           <w:p>
             <w:pPr>
@@ -4087,7 +3983,7 @@
               <w:rPr>
                 <w:sz w:val="16"/>
               </w:rPr>
-              <w:t>0,012</w:t>
+              <w:t>0,015</w:t>
             </w:r>
           </w:p>
         </w:tc>
@@ -4095,7 +3991,7 @@
       <w:tr>
         <w:tc>
           <w:tcPr>
-            <w:tcW w:type="dxa" w:w="2215"/>
+            <w:tcW w:type="dxa" w:w="2327"/>
           </w:tcPr>
           <w:p>
             <w:pPr>
@@ -4116,7 +4012,7 @@
         </w:tc>
         <w:tc>
           <w:tcPr>
-            <w:tcW w:type="dxa" w:w="1266"/>
+            <w:tcW w:type="dxa" w:w="1311"/>
           </w:tcPr>
           <w:p>
             <w:pPr>
@@ -4137,7 +4033,7 @@
         </w:tc>
         <w:tc>
           <w:tcPr>
-            <w:tcW w:type="dxa" w:w="949"/>
+            <w:tcW w:type="dxa" w:w="983"/>
           </w:tcPr>
           <w:p>
             <w:pPr>
@@ -4158,7 +4054,7 @@
         </w:tc>
         <w:tc>
           <w:tcPr>
-            <w:tcW w:type="dxa" w:w="844"/>
+            <w:tcW w:type="dxa" w:w="874"/>
           </w:tcPr>
           <w:p>
             <w:pPr>
@@ -4179,7 +4075,7 @@
         </w:tc>
         <w:tc>
           <w:tcPr>
-            <w:tcW w:type="dxa" w:w="844"/>
+            <w:tcW w:type="dxa" w:w="874"/>
           </w:tcPr>
           <w:p>
             <w:pPr>
@@ -4200,7 +4096,7 @@
         </w:tc>
         <w:tc>
           <w:tcPr>
-            <w:tcW w:type="dxa" w:w="844"/>
+            <w:tcW w:type="dxa" w:w="874"/>
           </w:tcPr>
           <w:p>
             <w:pPr>
@@ -4221,7 +4117,7 @@
         </w:tc>
         <w:tc>
           <w:tcPr>
-            <w:tcW w:type="dxa" w:w="844"/>
+            <w:tcW w:type="dxa" w:w="874"/>
           </w:tcPr>
           <w:p>
             <w:pPr>
@@ -4242,7 +4138,7 @@
         </w:tc>
         <w:tc>
           <w:tcPr>
-            <w:tcW w:type="dxa" w:w="949"/>
+            <w:tcW w:type="dxa" w:w="639"/>
           </w:tcPr>
           <w:p>
             <w:pPr>
@@ -4265,7 +4161,7 @@
       <w:tr>
         <w:tc>
           <w:tcPr>
-            <w:tcW w:type="dxa" w:w="2215"/>
+            <w:tcW w:type="dxa" w:w="2327"/>
           </w:tcPr>
           <w:p>
             <w:pPr>
@@ -4286,7 +4182,7 @@
         </w:tc>
         <w:tc>
           <w:tcPr>
-            <w:tcW w:type="dxa" w:w="1266"/>
+            <w:tcW w:type="dxa" w:w="1311"/>
           </w:tcPr>
           <w:p>
             <w:pPr>
@@ -4307,7 +4203,7 @@
         </w:tc>
         <w:tc>
           <w:tcPr>
-            <w:tcW w:type="dxa" w:w="949"/>
+            <w:tcW w:type="dxa" w:w="983"/>
           </w:tcPr>
           <w:p>
             <w:pPr>
@@ -4328,7 +4224,7 @@
         </w:tc>
         <w:tc>
           <w:tcPr>
-            <w:tcW w:type="dxa" w:w="844"/>
+            <w:tcW w:type="dxa" w:w="874"/>
           </w:tcPr>
           <w:p>
             <w:pPr>
@@ -4349,7 +4245,7 @@
         </w:tc>
         <w:tc>
           <w:tcPr>
-            <w:tcW w:type="dxa" w:w="844"/>
+            <w:tcW w:type="dxa" w:w="874"/>
           </w:tcPr>
           <w:p>
             <w:pPr>
@@ -4370,7 +4266,7 @@
         </w:tc>
         <w:tc>
           <w:tcPr>
-            <w:tcW w:type="dxa" w:w="844"/>
+            <w:tcW w:type="dxa" w:w="874"/>
           </w:tcPr>
           <w:p>
             <w:pPr>
@@ -4391,7 +4287,7 @@
         </w:tc>
         <w:tc>
           <w:tcPr>
-            <w:tcW w:type="dxa" w:w="844"/>
+            <w:tcW w:type="dxa" w:w="874"/>
           </w:tcPr>
           <w:p>
             <w:pPr>
@@ -4412,7 +4308,7 @@
         </w:tc>
         <w:tc>
           <w:tcPr>
-            <w:tcW w:type="dxa" w:w="949"/>
+            <w:tcW w:type="dxa" w:w="639"/>
           </w:tcPr>
           <w:p>
             <w:pPr>
@@ -4484,7 +4380,7 @@
         <w:t>Figura 3.</w:t>
       </w:r>
       <w:r>
-        <w:t xml:space="preserve"> Sensibilidad, AUC-PR y F1 por modelo (validación temporal estricta, prueba 2020–2024). El Gradient Boosting lidera; el árbol sin poda exhibe el AUC-PR más bajo. Fuente: elaboración propia con SATEC [21].</w:t>
+        <w:t xml:space="preserve"> Sensibilidad, AUC-PR y F1 por modelo (validación temporal estricta, prueba 2020–2024). La red neuronal lidera; el árbol sin poda exhibe el AUC-PR más bajo. Fuente: elaboración propia con SATEC [22].</w:t>
       </w:r>
     </w:p>
     <w:p>
@@ -4501,7 +4397,7 @@
         <w:ind w:firstLine="0"/>
       </w:pPr>
       <w:r>
-        <w:t xml:space="preserve">La Figura 4 presenta las matrices de confusión de los dos mejores modelos —Gradient Boosting y red neuronal— sobre los </w:t>
+        <w:t xml:space="preserve">La Figura 4 presenta las matrices de confusión de los dos mejores modelos —red neuronal y árbol podado— sobre los </w:t>
       </w:r>
       <w:r>
         <w:rPr>
@@ -4597,16 +4493,16 @@
         <w:rPr>
           <w:b/>
         </w:rPr>
-        <w:t>31 de los 42 brotes</w:t>
-      </w:r>
-      <w:r>
-        <w:t xml:space="preserve"> (VP), pero el Gradient Boosting lo hace con solo </w:t>
-      </w:r>
-      <w:r>
-        <w:rPr>
-          <w:b/>
-        </w:rPr>
-        <w:t>15 falsas alarmas</w:t>
+        <w:t>28 de los 42 brotes</w:t>
+      </w:r>
+      <w:r>
+        <w:t xml:space="preserve"> (VP), pero la red neuronal lo hace con solo </w:t>
+      </w:r>
+      <w:r>
+        <w:rPr>
+          <w:b/>
+        </w:rPr>
+        <w:t>10 falsas alarmas</w:t>
       </w:r>
       <w:r>
         <w:t xml:space="preserve"> (FP) frente a las </w:t>
@@ -4615,10 +4511,10 @@
         <w:rPr>
           <w:b/>
         </w:rPr>
-        <w:t>26</w:t>
-      </w:r>
-      <w:r>
-        <w:t xml:space="preserve"> de la red neuronal: esa menor tasa de falsos positivos explica su mayor precisión (0,67 frente a 0,54) y su mejor F1. En términos de tasas de error, ambos mantienen una </w:t>
+        <w:t>23</w:t>
+      </w:r>
+      <w:r>
+        <w:t xml:space="preserve"> del árbol podado: esa menor tasa de falsos positivos explica su mayor precisión (0,74 frente a 0,55) y su mejor F1. En términos de tasas de error, ambos mantienen una </w:t>
       </w:r>
       <w:r>
         <w:rPr>
@@ -4637,7 +4533,7 @@
           <m:t>,</m:t>
         </m:r>
         <m:r>
-          <m:t>2%</m:t>
+          <m:t>15%</m:t>
         </m:r>
       </m:oMath>
       <w:r>
@@ -4654,7 +4550,7 @@
       </w:r>
       <m:oMath>
         <m:r>
-          <m:t>FN/(FN+VP)≈26%</m:t>
+          <m:t>FN/(FN+VP)≈33%</m:t>
         </m:r>
       </m:oMath>
       <w:r>
@@ -4669,7 +4565,7 @@
       <w:r>
         <w:drawing>
           <wp:inline xmlns:a="http://schemas.openxmlformats.org/drawingml/2006/main" xmlns:pic="http://schemas.openxmlformats.org/drawingml/2006/picture">
-            <wp:extent cx="4480560" cy="2163312"/>
+            <wp:extent cx="4480560" cy="2179732"/>
             <wp:docPr id="4" name="Picture 4"/>
             <wp:cNvGraphicFramePr>
               <a:graphicFrameLocks noChangeAspect="1"/>
@@ -4690,7 +4586,7 @@
                   <pic:spPr>
                     <a:xfrm>
                       <a:off x="0" y="0"/>
-                      <a:ext cx="4480560" cy="2163312"/>
+                      <a:ext cx="4480560" cy="2179732"/>
                     </a:xfrm>
                     <a:prstGeom prst="rect"/>
                   </pic:spPr>
@@ -4712,7 +4608,7 @@
         <w:t>Figura 4.</w:t>
       </w:r>
       <w:r>
-        <w:t xml:space="preserve"> Matrices de confusión del Gradient Boosting (izquierda) y la red neuronal (derecha) sobre el conjunto de prueba 2020–2024, con conteo y porcentaje por celda (VN, FP, FN, VP). Las filas son la condición observada y las columnas la predicción. Fuente: elaboración propia con SATEC [21].</w:t>
+        <w:t xml:space="preserve"> Matrices de confusión de la red neuronal (izquierda) y el árbol podado (derecha) sobre el conjunto de prueba 2020–2024, con conteo y porcentaje por celda (VN, FP, FN, VP). Las filas son la condición observada y las columnas la predicción. Fuente: elaboración propia con SATEC [22].</w:t>
       </w:r>
     </w:p>
     <w:p>
@@ -4738,22 +4634,22 @@
         <w:t>compromiso característico</w:t>
       </w:r>
       <w:r>
-        <w:t xml:space="preserve"> de los problemas desbalanceados: todos alcanzan una especificidad muy alta (≈0,99–1,00, pues predicen bien la ausencia de brote, la clase mayoritaria). El </w:t>
-      </w:r>
-      <w:r>
-        <w:rPr>
-          <w:b/>
-        </w:rPr>
-        <w:t>Gradient Boosting</w:t>
-      </w:r>
-      <w:r>
-        <w:t xml:space="preserve"> ofrece la combinación más equilibrada entre sensibilidad y precisión, seguido de la </w:t>
+        <w:t xml:space="preserve"> de los problemas desbalanceados: todos alcanzan una especificidad muy alta (≈0,99–1,00, pues predicen bien la ausencia de brote, la clase mayoritaria). La </w:t>
       </w:r>
       <w:r>
         <w:rPr>
           <w:b/>
         </w:rPr>
         <w:t>red neuronal</w:t>
+      </w:r>
+      <w:r>
+        <w:t xml:space="preserve"> ofrece la combinación más equilibrada entre sensibilidad y precisión, seguida del </w:t>
+      </w:r>
+      <w:r>
+        <w:rPr>
+          <w:b/>
+        </w:rPr>
+        <w:t>árbol podado</w:t>
       </w:r>
       <w:r>
         <w:t xml:space="preserve">; el </w:t>
@@ -4819,7 +4715,7 @@
         <w:t>Figura 5.</w:t>
       </w:r>
       <w:r>
-        <w:t xml:space="preserve"> Precisión, sensibilidad, F1 y especificidad por modelo (validación temporal estricta). La especificidad es alta en todos; el Gradient Boosting equilibra mejor sensibilidad y precisión. Fuente: elaboración propia con SATEC [21].</w:t>
+        <w:t xml:space="preserve"> Precisión, sensibilidad, F1 y especificidad por modelo (validación temporal estricta). La especificidad es alta en todos; la red neuronal equilibra mejor sensibilidad y precisión. Fuente: elaboración propia con SATEC [22].</w:t>
       </w:r>
     </w:p>
     <w:p>
@@ -4863,7 +4759,7 @@
         <w:t>AUC-PR, que se desploma a 0,07</w:t>
       </w:r>
       <w:r>
-        <w:t xml:space="preserve"> (Tabla 1), muy por debajo del Gradient Boosting (0,75). Esto confirma sobre datos reales que una exactitud alta puede ocultar un modelo prácticamente inservible para detectar brotes, y justifica el uso de métricas centradas en la clase rara.</w:t>
+        <w:t xml:space="preserve"> (Tabla 1), muy por debajo de la red neuronal (0,71) y del propio árbol podado (0,63). Esto confirma sobre datos reales que una exactitud alta puede ocultar un modelo prácticamente inservible para detectar brotes, y justifica el uso de métricas centradas en la clase rara.</w:t>
       </w:r>
     </w:p>
     <w:p>
@@ -4874,7 +4770,7 @@
       <w:r>
         <w:drawing>
           <wp:inline xmlns:a="http://schemas.openxmlformats.org/drawingml/2006/main" xmlns:pic="http://schemas.openxmlformats.org/drawingml/2006/picture">
-            <wp:extent cx="4480560" cy="2439533"/>
+            <wp:extent cx="4480560" cy="2437425"/>
             <wp:docPr id="6" name="Picture 6"/>
             <wp:cNvGraphicFramePr>
               <a:graphicFrameLocks noChangeAspect="1"/>
@@ -4895,7 +4791,7 @@
                   <pic:spPr>
                     <a:xfrm>
                       <a:off x="0" y="0"/>
-                      <a:ext cx="4480560" cy="2439533"/>
+                      <a:ext cx="4480560" cy="2437425"/>
                     </a:xfrm>
                     <a:prstGeom prst="rect"/>
                   </pic:spPr>
@@ -4917,7 +4813,7 @@
         <w:t>Figura 6.</w:t>
       </w:r>
       <w:r>
-        <w:t xml:space="preserve"> Brecha de generalización (exactitud de entrenamiento − prueba) por modelo. El árbol sin poda es el único con brecha positiva (memoriza más de lo que generaliza); su sobreajuste se aprecia con más claridad en el AUC-PR (Tabla 1). Fuente: elaboración propia con SATEC [21].</w:t>
+        <w:t xml:space="preserve"> Brecha de generalización (exactitud de entrenamiento − prueba) por modelo. El árbol sin poda es el único con brecha positiva (memoriza más de lo que generaliza); su sobreajuste se aprecia con más claridad en el AUC-PR (Tabla 1). Fuente: elaboración propia con SATEC [22].</w:t>
       </w:r>
     </w:p>
     <w:p>
@@ -4934,7 +4830,7 @@
         <w:ind w:firstLine="0"/>
       </w:pPr>
       <w:r>
-        <w:t xml:space="preserve">La Figura 7 presenta las curvas de fiabilidad del Gradient Boosting y la red neuronal sobre las predicciones agrupadas del origen móvil (donde hay más positivos y la curva resulta más estable). Una curva próxima a la diagonal indica que las probabilidades predichas coinciden con las frecuencias observadas. Los </w:t>
+        <w:t xml:space="preserve">La Figura 7 presenta las curvas de fiabilidad de la red neuronal y el árbol podado sobre las predicciones agrupadas del origen móvil (donde hay más positivos y la curva resulta más estable). Una curva próxima a la diagonal indica que las probabilidades predichas coinciden con las frecuencias observadas. Los </w:t>
       </w:r>
       <w:r>
         <w:rPr>
@@ -4943,7 +4839,7 @@
         <w:t>Brier scores</w:t>
       </w:r>
       <w:r>
-        <w:t xml:space="preserve"> son bajos (≈0,02 para ambos), favorecidos por la baja prevalencia de brotes. Ambos modelos tienden a </w:t>
+        <w:t xml:space="preserve"> son bajos (≈0,02–0,03), favorecidos por la baja prevalencia de brotes. Ambos modelos tienden a </w:t>
       </w:r>
       <w:r>
         <w:rPr>
@@ -5015,7 +4911,7 @@
         <w:t>Figura 7.</w:t>
       </w:r>
       <w:r>
-        <w:t xml:space="preserve"> Curvas de calibración del Gradient Boosting y la red neuronal frente a la calibración perfecta (diagonal). Fuente: elaboración propia con SATEC [21].</w:t>
+        <w:t xml:space="preserve"> Curvas de calibración de la red neuronal y el árbol podado frente a la calibración perfecta (diagonal). Fuente: elaboración propia con SATEC [22].</w:t>
       </w:r>
     </w:p>
     <w:p>
@@ -5041,7 +4937,7 @@
         <w:t>media móvil de ocho semanas de casos</w:t>
       </w:r>
       <w:r>
-        <w:t xml:space="preserve"> es el predictor dominante con diferencia (caída en AUC-PR de 0,35), seguida del número de </w:t>
+        <w:t xml:space="preserve"> es el predictor dominante (caída en AUC-PR de 0,25), seguida de cerca por el número de </w:t>
       </w:r>
       <w:r>
         <w:rPr>
@@ -5050,16 +4946,7 @@
         <w:t>casos actuales</w:t>
       </w:r>
       <w:r>
-        <w:t xml:space="preserve"> (0,19) y de la media móvil de cuatro semanas (0,10): la historia reciente de la transmisión es, como cabía esperar, el factor más informativo. De manera relevante para la hipótesis de enriquecimiento, la </w:t>
-      </w:r>
-      <w:r>
-        <w:rPr>
-          <w:b/>
-        </w:rPr>
-        <w:t>tasa por 100.000 habitantes</w:t>
-      </w:r>
-      <w:r>
-        <w:t xml:space="preserve"> figura entre las cinco variables más importantes, y la </w:t>
+        <w:t xml:space="preserve"> (0,23) y la media móvil de cuatro semanas (0,20): la historia reciente de la transmisión es, como cabía esperar, el factor más informativo. De manera relevante para la hipótesis de enriquecimiento, la </w:t>
       </w:r>
       <w:r>
         <w:rPr>
@@ -5068,7 +4955,16 @@
         <w:t>temperatura</w:t>
       </w:r>
       <w:r>
-        <w:t xml:space="preserve"> (con sus rezagos y medias móviles) aporta señal apreciable, mientras que la precipitación resulta marginal. Esto indica que el clima y la estructura poblacional contribuyen a la predicción más allá de la mera autocorrelación de los casos, lo que respalda la integración multifuente para una enfermedad sensible a las condiciones ambientales del vector.</w:t>
+        <w:t xml:space="preserve"> —con sus medias móviles de 4 y 8 semanas— es la variable ambiental más informativa, situándose entre las cinco primeras y por delante de la tasa poblacional y de la humedad, mientras que la </w:t>
+      </w:r>
+      <w:r>
+        <w:rPr>
+          <w:b/>
+        </w:rPr>
+        <w:t>precipitación</w:t>
+      </w:r>
+      <w:r>
+        <w:t xml:space="preserve"> resulta marginal. Esto indica que el clima contribuye a la predicción más allá de la mera autocorrelación de los casos, lo que respalda la integración multifuente para una enfermedad sensible a las condiciones ambientales del vector.</w:t>
       </w:r>
     </w:p>
     <w:p>
@@ -5122,7 +5018,7 @@
         <w:t>Figura 8.</w:t>
       </w:r>
       <w:r>
-        <w:t xml:space="preserve"> Importancia por permutación de la red neuronal (caída en AUC-PR al permutar cada variable). La media móvil de casos domina; la tasa poblacional y la temperatura aportan señal. Fuente: elaboración propia con SATEC [21].</w:t>
+        <w:t xml:space="preserve"> Importancia por permutación de la red neuronal (caída en AUC-PR al permutar cada variable). La media móvil de casos domina; la temperatura es la variable ambiental que más aporta. Fuente: elaboración propia con SATEC [22].</w:t>
       </w:r>
     </w:p>
     <w:p>
@@ -5193,7 +5089,7 @@
         <w:t>Figura 9.</w:t>
       </w:r>
       <w:r>
-        <w:t xml:space="preserve"> Interfaz de SATEC: mapa de riesgo provincial sobre el mapa base del Perú, con el detalle de la provincia de Ocros (Áncash) en nivel de alerta medio. Captura de la aplicación desarrollada. Fuente: elaboración propia con SATEC [21].</w:t>
+        <w:t xml:space="preserve"> Interfaz de SATEC: mapa de riesgo provincial sobre el mapa base del Perú, con el detalle de la provincia de Ocros (Áncash) en nivel de alerta medio. Captura de la aplicación desarrollada. Fuente: elaboración propia con SATEC [22].</w:t>
       </w:r>
     </w:p>
     <w:p>
@@ -5219,7 +5115,7 @@
         <w:t>el aprendizaje automático aporta valor sobre la vigilancia clásica</w:t>
       </w:r>
       <w:r>
-        <w:t xml:space="preserve">: el Gradient Boosting y la red neuronal superan al canal endémico en F1, AUC-PR y AUC-ROC, anticipando brotes que la regla clásica no captura, lo que sugiere que un sistema de alerta basado en datos puede complementar la vigilancia rutinaria de la enfermedad de Carrión. Segundo, </w:t>
+        <w:t xml:space="preserve">: en la prueba 2020–2024 la red neuronal y el árbol podado superan al canal endémico en F1, AUC-PR y AUC-ROC, anticipando brotes que la regla clásica no captura; bajo la evaluación de origen móvil, más exigente, ese margen se estrecha hasta igualar al baseline, lo que sugiere que un sistema de alerta basado en datos puede complementar —sin reemplazar— la vigilancia rutinaria de la enfermedad de Carrión. Segundo, </w:t>
       </w:r>
       <w:r>
         <w:rPr>
@@ -5237,7 +5133,7 @@
         <w:t>el enriquecimiento es útil</w:t>
       </w:r>
       <w:r>
-        <w:t>: la tasa poblacional y la temperatura aparecen entre los predictores más importantes, coherente con la biología de un vector sensible al clima.</w:t>
+        <w:t>: la temperatura, con sus medias móviles, aparece entre los predictores más importantes —por delante de varios términos autorregresivos de casos—, coherente con la biología de un vector sensible al clima.</w:t>
       </w:r>
     </w:p>
     <w:p>
@@ -5246,16 +5142,34 @@
         <w:ind w:firstLine="0"/>
       </w:pPr>
       <w:r>
-        <w:t xml:space="preserve">En términos de paradigmas, el </w:t>
-      </w:r>
-      <w:r>
-        <w:rPr>
-          <w:b/>
-        </w:rPr>
-        <w:t>Gradient Boosting</w:t>
-      </w:r>
-      <w:r>
-        <w:t xml:space="preserve"> (árboles potenciados) resultó preferible para este problema tabular, desbalanceado y ruidoso, por delante de la red neuronal y muy por encima del árbol único sin poda, que ilustra los riesgos del sobreajuste. Este resultado concuerda con la evidencia de que los modelos basados en árboles dominan sobre las redes profundas en datos tabulares [7], [8]. La elección, sin embargo, no debería guiarse solo por el desempeño: el árbol individual ofrece reglas legibles (Figura 1), valiosas para comunicar a los tomadores de decisión por qué una provincia entra en alerta, mientras que el Gradient Boosting y la red operan como cajas más opacas cuya interpretación requiere métodos adicionales como la importancia por permutación.</w:t>
+        <w:t xml:space="preserve">En términos de paradigmas, la </w:t>
+      </w:r>
+      <w:r>
+        <w:rPr>
+          <w:b/>
+        </w:rPr>
+        <w:t>red neuronal</w:t>
+      </w:r>
+      <w:r>
+        <w:t xml:space="preserve"> resultó preferible para este problema desbalanceado y ruidoso, por delante del árbol podado y muy por encima del árbol sin poda, que ilustra los riesgos del sobreajuste. La diferencia entre ambos árboles —idéntico algoritmo, solo cambia la profundidad— evidencia que en datos tabulares y desbalanceados la </w:t>
+      </w:r>
+      <w:r>
+        <w:rPr>
+          <w:b/>
+        </w:rPr>
+        <w:t>regularización</w:t>
+      </w:r>
+      <w:r>
+        <w:t xml:space="preserve"> (aquí, la poda) puede pesar tanto como la familia del modelo, en línea con la literatura sobre datos tabulares [7], [8]. La elección, sin embargo, no debería guiarse solo por el desempeño: el árbol ofrece </w:t>
+      </w:r>
+      <w:r>
+        <w:rPr>
+          <w:b/>
+        </w:rPr>
+        <w:t>reglas legibles</w:t>
+      </w:r>
+      <w:r>
+        <w:t xml:space="preserve"> (Figura 1), valiosas para comunicar a los tomadores de decisión por qué una provincia entra en alerta, mientras que la red opera como una caja más opaca cuya interpretación requiere métodos adicionales como la importancia por permutación.</w:t>
       </w:r>
     </w:p>
     <w:p>
@@ -5279,16 +5193,16 @@
         <w:t>Leishmania</w:t>
       </w:r>
       <w:r>
-        <w:t xml:space="preserve"> mediante árboles potenciados, con una exactitud fuera de muestra cercana al 86 %; y la literatura reciente de predicción y alerta en arbovirosis (en particular dengue) sitúa el AUC-ROC de los modelos basados en árboles en un rango aproximado de 0,82–0,99 [28]. El Gradient Boosting de SATEC, con un </w:t>
-      </w:r>
-      <w:r>
-        <w:rPr>
-          <w:b/>
-        </w:rPr>
-        <w:t>AUC-ROC de 0,99</w:t>
-      </w:r>
-      <w:r>
-        <w:t xml:space="preserve"> en la prueba 2020–2024 (0,94 en la evaluación de origen móvil), se ubica en el extremo alto de ese rango pese a abordar un problema más difícil: la predicción de un </w:t>
+        <w:t xml:space="preserve"> mediante árboles potenciados, con una exactitud fuera de muestra cercana al 86 %; y la literatura reciente de predicción y alerta en arbovirosis (en particular dengue) sitúa el AUC-ROC de los modelos basados en árboles en un rango aproximado de 0,82–0,99 [28]. La red neuronal de SATEC, con un </w:t>
+      </w:r>
+      <w:r>
+        <w:rPr>
+          <w:b/>
+        </w:rPr>
+        <w:t>AUC-ROC de 0,96</w:t>
+      </w:r>
+      <w:r>
+        <w:t xml:space="preserve"> en la prueba 2020–2024 (0,91 en la evaluación de origen móvil), se ubica en el extremo alto de ese rango pese a abordar un problema más difícil: la predicción de un </w:t>
       </w:r>
       <w:r>
         <w:rPr>
@@ -5312,7 +5226,7 @@
         <w:rPr>
           <w:b/>
         </w:rPr>
-        <w:t>AUC-PR (0,75)</w:t>
+        <w:t>AUC-PR (0,71)</w:t>
       </w:r>
       <w:r>
         <w:t xml:space="preserve"> —métricas que la propia literatura recomienda para clases desbalanceadas pero que muchos trabajos omiten al informar solo exactitud o AUC-ROC—. La comparación es, por tanto, </w:t>
@@ -5703,7 +5617,7 @@
                 <w:b/>
                 <w:sz w:val="16"/>
               </w:rPr>
-              <w:t>Gradient Boosting</w:t>
+              <w:t>Red Neuronal</w:t>
             </w:r>
           </w:p>
         </w:tc>
@@ -5725,7 +5639,7 @@
                 <w:b/>
                 <w:sz w:val="16"/>
               </w:rPr>
-              <w:t>AUC-ROC 0,99; AUC-PR 0,75; F1 0,70</w:t>
+              <w:t>AUC-ROC 0,96; AUC-PR 0,71; F1 0,70</w:t>
             </w:r>
           </w:p>
         </w:tc>
@@ -5843,16 +5757,16 @@
         <w:t>anticipar con cuatro semanas la entrada de una provincia en zona de epidemia</w:t>
       </w:r>
       <w:r>
-        <w:t xml:space="preserve"> del canal endémico, con el mejor equilibrio logrado por el </w:t>
-      </w:r>
-      <w:r>
-        <w:rPr>
-          <w:b/>
-        </w:rPr>
-        <w:t>Gradient Boosting</w:t>
-      </w:r>
-      <w:r>
-        <w:t xml:space="preserve"> (F1 0,70; AUC-ROC 0,99) en la prueba 2020–2024, lo que abre la puerta a focalizar la vigilancia y los recursos en las zonas y semanas de mayor riesgo; (ii) la </w:t>
+        <w:t xml:space="preserve"> del canal endémico, con el mejor equilibrio logrado por la </w:t>
+      </w:r>
+      <w:r>
+        <w:rPr>
+          <w:b/>
+        </w:rPr>
+        <w:t>red neuronal</w:t>
+      </w:r>
+      <w:r>
+        <w:t xml:space="preserve"> (F1 0,70; AUC-ROC 0,96) en la prueba 2020–2024, lo que abre la puerta a focalizar la vigilancia y los recursos en las zonas y semanas de mayor riesgo; (ii) la </w:t>
       </w:r>
       <w:r>
         <w:rPr>
@@ -5868,15 +5782,6 @@
           <w:b/>
         </w:rPr>
         <w:t>temperatura</w:t>
-      </w:r>
-      <w:r>
-        <w:t xml:space="preserve"> y la </w:t>
-      </w:r>
-      <w:r>
-        <w:rPr>
-          <w:b/>
-        </w:rPr>
-        <w:t>densidad poblacional</w:t>
       </w:r>
       <w:r>
         <w:t xml:space="preserve">, son los factores más asociados al riesgo de brote, en consonancia con la ecología del vector </w:t>
@@ -6296,24 +6201,24 @@
         <w:pStyle w:val="Bibentry"/>
       </w:pPr>
       <w:r>
+        <w:t xml:space="preserve">T. Hastie, R. Tibshirani y J. Friedman, </w:t>
+      </w:r>
+      <w:r>
+        <w:rPr>
+          <w:i/>
+        </w:rPr>
+        <w:t>The Elements of Statistical Learning</w:t>
+      </w:r>
+      <w:r>
+        <w:t>, 2.ª ed. Springer, 2009.</w:t>
+      </w:r>
+    </w:p>
+    <w:p>
+      <w:pPr>
+        <w:pStyle w:val="Bibentry"/>
+      </w:pPr>
+      <w:r>
         <w:t>C. S. Santiago Flores, J. Alvarez Rocca y C. Meza Pelaez, «SATEC: Sistema de Alerta Temprana de la Enfermedad de Carrión — código, datos y aplicación web», 2026. https://github.com/StevenSntg/SATEC-Carrion</w:t>
-      </w:r>
-    </w:p>
-    <w:p>
-      <w:pPr>
-        <w:pStyle w:val="Bibentry"/>
-      </w:pPr>
-      <w:r>
-        <w:t xml:space="preserve">T. Hastie, R. Tibshirani y J. Friedman, </w:t>
-      </w:r>
-      <w:r>
-        <w:rPr>
-          <w:i/>
-        </w:rPr>
-        <w:t>The Elements of Statistical Learning</w:t>
-      </w:r>
-      <w:r>
-        <w:t>, 2.ª ed. Springer, 2009.</w:t>
       </w:r>
     </w:p>
     <w:p>

</xml_diff>

<commit_message>
docs(paper): figura de la red como grafo de nodos (z-score) y captura de la web rediseñada
- Figura 2 (arquitectura): rehecha como grafo de nodos (entrada/ocultas/salida) en la paleta del paper; corrige la etiqueta de normalización min-max -> z-score.
- Figura 9: nueva captura de la interfaz web rediseñada (provincia de Oyón en alerta alta), con caption actualizado.
- Regenera el .docx ACM con ambas figuras integradas.
</commit_message>
<xml_diff>
--- a/paper/SATEC_articulo_ACM.docx
+++ b/paper/SATEC_articulo_ACM.docx
@@ -2273,7 +2273,7 @@
       <w:r>
         <w:drawing>
           <wp:inline xmlns:a="http://schemas.openxmlformats.org/drawingml/2006/main" xmlns:pic="http://schemas.openxmlformats.org/drawingml/2006/picture">
-            <wp:extent cx="4480560" cy="2081331"/>
+            <wp:extent cx="4480560" cy="3265155"/>
             <wp:docPr id="2" name="Picture 2"/>
             <wp:cNvGraphicFramePr>
               <a:graphicFrameLocks noChangeAspect="1"/>
@@ -2294,7 +2294,7 @@
                   <pic:spPr>
                     <a:xfrm>
                       <a:off x="0" y="0"/>
-                      <a:ext cx="4480560" cy="2081331"/>
+                      <a:ext cx="4480560" cy="3265155"/>
                     </a:xfrm>
                     <a:prstGeom prst="rect"/>
                   </pic:spPr>
@@ -5046,7 +5046,7 @@
       <w:r>
         <w:drawing>
           <wp:inline xmlns:a="http://schemas.openxmlformats.org/drawingml/2006/main" xmlns:pic="http://schemas.openxmlformats.org/drawingml/2006/picture">
-            <wp:extent cx="4480560" cy="2271352"/>
+            <wp:extent cx="4480560" cy="2834701"/>
             <wp:docPr id="9" name="Picture 9"/>
             <wp:cNvGraphicFramePr>
               <a:graphicFrameLocks noChangeAspect="1"/>
@@ -5067,7 +5067,7 @@
                   <pic:spPr>
                     <a:xfrm>
                       <a:off x="0" y="0"/>
-                      <a:ext cx="4480560" cy="2271352"/>
+                      <a:ext cx="4480560" cy="2834701"/>
                     </a:xfrm>
                     <a:prstGeom prst="rect"/>
                   </pic:spPr>
@@ -5089,7 +5089,7 @@
         <w:t>Figura 9.</w:t>
       </w:r>
       <w:r>
-        <w:t xml:space="preserve"> Interfaz de SATEC: mapa de riesgo provincial sobre el mapa base del Perú, con el detalle de la provincia de Ocros (Áncash) en nivel de alerta medio. Captura de la aplicación desarrollada. Fuente: elaboración propia con SATEC [22].</w:t>
+        <w:t xml:space="preserve"> Interfaz de SATEC: mapa de riesgo provincial sobre el mapa base del Perú, con la franja de resumen del estado actual y el detalle de la provincia de Oyón (Lima) en nivel de alerta alto (probabilidad de brote estimada del 89 %), incluida la barra de probabilidad frente al umbral y la decisión del árbol. Captura de la aplicación desarrollada. Fuente: elaboración propia con SATEC [22].</w:t>
       </w:r>
     </w:p>
     <w:p>

</xml_diff>

<commit_message>
docs(paper): reporte de clasificación (Figura 4) y notebooks alineados al umbral óptimo
- Nueva Figura 4: classification_report (precisión, sensibilidad, F1 y soporte por clase, con exactitud y promedios) de los tres modelos, calculado con el umbral de decisión óptimo. La clase Brote da F1 0,70 (red), 0,60 (árbol poda 8) y 0,22 (sin poda), coincidiendo con la Tabla 1. Renumera las figuras 5-10.
- Notebooks 01 y 02: validación train<=2018 / umbral en 2019 / prueba 2020-2024; imprimen el classification_report con ese umbral óptimo (no 0,5), de modo que sus cifras coinciden con el artículo.
- Regenera el .docx ACM con la figura nueva.
</commit_message>
<xml_diff>
--- a/paper/SATEC_articulo_ACM.docx
+++ b/paper/SATEC_articulo_ACM.docx
@@ -4385,6 +4385,114 @@
     </w:p>
     <w:p>
       <w:pPr>
+        <w:pStyle w:val="Para"/>
+        <w:ind w:firstLine="0"/>
+      </w:pPr>
+      <w:r>
+        <w:t xml:space="preserve">El </w:t>
+      </w:r>
+      <w:r>
+        <w:rPr>
+          <w:b/>
+        </w:rPr>
+        <w:t>reporte de clasificación</w:t>
+      </w:r>
+      <w:r>
+        <w:t xml:space="preserve"> de la Figura 4 desglosa, por clase y modelo, las cuatro magnitudes derivadas de la matriz de confusión (precisión, sensibilidad, F1 y soporte), junto con la exactitud y los promedios macro y ponderado. Para la clase mayoritaria («No brote») las tres métricas son ≈1,00 en todos los modelos —el fuerte desbalance la hace trivial—, por lo que el interés se concentra en la fila </w:t>
+      </w:r>
+      <w:r>
+        <w:rPr>
+          <w:b/>
+        </w:rPr>
+        <w:t>«Brote»</w:t>
+      </w:r>
+      <w:r>
+        <w:t xml:space="preserve">: ahí la red neuronal alcanza un F1 de 0,70 (precisión 0,74; sensibilidad 0,67), el árbol podado 0,60 y el árbol sin poda apenas 0,22. El </w:t>
+      </w:r>
+      <w:r>
+        <w:rPr>
+          <w:b/>
+        </w:rPr>
+        <w:t>promedio macro</w:t>
+      </w:r>
+      <w:r>
+        <w:t xml:space="preserve">, que pondera ambas clases por igual, evidencia esa diferencia (F1 de 0,85, 0,80 y 0,61 respectivamente), que el </w:t>
+      </w:r>
+      <w:r>
+        <w:rPr>
+          <w:b/>
+        </w:rPr>
+        <w:t>promedio ponderado</w:t>
+      </w:r>
+      <w:r>
+        <w:t xml:space="preserve"> —dominado por la clase mayoritaria— oculta tras un engañoso 0,99–1,00. Todas las cifras se calculan con el </w:t>
+      </w:r>
+      <w:r>
+        <w:rPr>
+          <w:b/>
+        </w:rPr>
+        <w:t>umbral de decisión óptimo</w:t>
+      </w:r>
+      <w:r>
+        <w:t xml:space="preserve"> elegido en validación, por lo que coinciden con la Tabla 1.</w:t>
+      </w:r>
+    </w:p>
+    <w:p>
+      <w:pPr>
+        <w:pStyle w:val="Image"/>
+        <w:jc w:val="center"/>
+      </w:pPr>
+      <w:r>
+        <w:drawing>
+          <wp:inline xmlns:a="http://schemas.openxmlformats.org/drawingml/2006/main" xmlns:pic="http://schemas.openxmlformats.org/drawingml/2006/picture">
+            <wp:extent cx="3496658" cy="3383280"/>
+            <wp:docPr id="4" name="Picture 4"/>
+            <wp:cNvGraphicFramePr>
+              <a:graphicFrameLocks noChangeAspect="1"/>
+            </wp:cNvGraphicFramePr>
+            <a:graphic>
+              <a:graphicData uri="http://schemas.openxmlformats.org/drawingml/2006/picture">
+                <pic:pic>
+                  <pic:nvPicPr>
+                    <pic:cNvPr id="0" name="fig_classification.png"/>
+                    <pic:cNvPicPr/>
+                  </pic:nvPicPr>
+                  <pic:blipFill>
+                    <a:blip r:embed="rId33"/>
+                    <a:stretch>
+                      <a:fillRect/>
+                    </a:stretch>
+                  </pic:blipFill>
+                  <pic:spPr>
+                    <a:xfrm>
+                      <a:off x="0" y="0"/>
+                      <a:ext cx="3496658" cy="3383280"/>
+                    </a:xfrm>
+                    <a:prstGeom prst="rect"/>
+                  </pic:spPr>
+                </pic:pic>
+              </a:graphicData>
+            </a:graphic>
+          </wp:inline>
+        </w:drawing>
+      </w:r>
+    </w:p>
+    <w:p>
+      <w:pPr>
+        <w:pStyle w:val="FigureCaption"/>
+      </w:pPr>
+      <w:r>
+        <w:rPr>
+          <w:b/>
+        </w:rPr>
+        <w:t>Figura 4.</w:t>
+      </w:r>
+      <w:r>
+        <w:t xml:space="preserve"> Reporte de clasificación (precisión, sensibilidad, F1 y soporte por clase, con exactitud y promedios macro y ponderado) de los tres modelos sobre el conjunto de prueba 2020–2024, calculado con el umbral de decisión óptimo. La fila «Brote» (clase de interés) aparece resaltada. Fuente: elaboración propia con SATEC [22].</w:t>
+      </w:r>
+    </w:p>
+    <w:p>
+      <w:pPr>
         <w:pStyle w:val="Head2"/>
       </w:pPr>
       <w:r>
@@ -4397,7 +4505,7 @@
         <w:ind w:firstLine="0"/>
       </w:pPr>
       <w:r>
-        <w:t xml:space="preserve">La Figura 4 presenta las matrices de confusión de los dos mejores modelos —red neuronal y árbol podado— sobre los </w:t>
+        <w:t xml:space="preserve">La Figura 5 presenta las matrices de confusión de los dos mejores modelos —red neuronal y árbol podado— sobre los </w:t>
       </w:r>
       <w:r>
         <w:rPr>
@@ -4566,7 +4674,7 @@
         <w:drawing>
           <wp:inline xmlns:a="http://schemas.openxmlformats.org/drawingml/2006/main" xmlns:pic="http://schemas.openxmlformats.org/drawingml/2006/picture">
             <wp:extent cx="4480560" cy="2179732"/>
-            <wp:docPr id="4" name="Picture 4"/>
+            <wp:docPr id="5" name="Picture 5"/>
             <wp:cNvGraphicFramePr>
               <a:graphicFrameLocks noChangeAspect="1"/>
             </wp:cNvGraphicFramePr>
@@ -4578,7 +4686,7 @@
                     <pic:cNvPicPr/>
                   </pic:nvPicPr>
                   <pic:blipFill>
-                    <a:blip r:embed="rId33"/>
+                    <a:blip r:embed="rId34"/>
                     <a:stretch>
                       <a:fillRect/>
                     </a:stretch>
@@ -4605,7 +4713,7 @@
         <w:rPr>
           <w:b/>
         </w:rPr>
-        <w:t>Figura 4.</w:t>
+        <w:t>Figura 5.</w:t>
       </w:r>
       <w:r>
         <w:t xml:space="preserve"> Matrices de confusión de la red neuronal (izquierda) y el árbol podado (derecha) sobre el conjunto de prueba 2020–2024, con conteo y porcentaje por celda (VN, FP, FN, VP). Las filas son la condición observada y las columnas la predicción. Fuente: elaboración propia con SATEC [22].</w:t>
@@ -4625,7 +4733,7 @@
         <w:ind w:firstLine="0"/>
       </w:pPr>
       <w:r>
-        <w:t xml:space="preserve">La Figura 5 desglosa, por los cuatro modelos, las métricas derivadas de las Ecuaciones (12)–(16): precisión, sensibilidad, F1 y especificidad. Se observa el </w:t>
+        <w:t xml:space="preserve">La Figura 6 desglosa, por los cuatro modelos, las métricas derivadas de las Ecuaciones (12)–(16): precisión, sensibilidad, F1 y especificidad. Se observa el </w:t>
       </w:r>
       <w:r>
         <w:rPr>
@@ -4673,7 +4781,7 @@
         <w:drawing>
           <wp:inline xmlns:a="http://schemas.openxmlformats.org/drawingml/2006/main" xmlns:pic="http://schemas.openxmlformats.org/drawingml/2006/picture">
             <wp:extent cx="4480560" cy="2499918"/>
-            <wp:docPr id="5" name="Picture 5"/>
+            <wp:docPr id="6" name="Picture 6"/>
             <wp:cNvGraphicFramePr>
               <a:graphicFrameLocks noChangeAspect="1"/>
             </wp:cNvGraphicFramePr>
@@ -4685,7 +4793,7 @@
                     <pic:cNvPicPr/>
                   </pic:nvPicPr>
                   <pic:blipFill>
-                    <a:blip r:embed="rId34"/>
+                    <a:blip r:embed="rId35"/>
                     <a:stretch>
                       <a:fillRect/>
                     </a:stretch>
@@ -4712,7 +4820,7 @@
         <w:rPr>
           <w:b/>
         </w:rPr>
-        <w:t>Figura 5.</w:t>
+        <w:t>Figura 6.</w:t>
       </w:r>
       <w:r>
         <w:t xml:space="preserve"> Precisión, sensibilidad, F1 y especificidad por modelo (validación temporal estricta). La especificidad es alta en todos; la red neuronal equilibra mejor sensibilidad y precisión. Fuente: elaboración propia con SATEC [22].</w:t>
@@ -4732,7 +4840,7 @@
         <w:ind w:firstLine="0"/>
       </w:pPr>
       <w:r>
-        <w:t xml:space="preserve">La Figura 6 contrasta la exactitud de entrenamiento y la de prueba. El </w:t>
+        <w:t xml:space="preserve">La Figura 7 contrasta la exactitud de entrenamiento y la de prueba. El </w:t>
       </w:r>
       <w:r>
         <w:rPr>
@@ -4771,7 +4879,7 @@
         <w:drawing>
           <wp:inline xmlns:a="http://schemas.openxmlformats.org/drawingml/2006/main" xmlns:pic="http://schemas.openxmlformats.org/drawingml/2006/picture">
             <wp:extent cx="4480560" cy="2437425"/>
-            <wp:docPr id="6" name="Picture 6"/>
+            <wp:docPr id="7" name="Picture 7"/>
             <wp:cNvGraphicFramePr>
               <a:graphicFrameLocks noChangeAspect="1"/>
             </wp:cNvGraphicFramePr>
@@ -4783,7 +4891,7 @@
                     <pic:cNvPicPr/>
                   </pic:nvPicPr>
                   <pic:blipFill>
-                    <a:blip r:embed="rId35"/>
+                    <a:blip r:embed="rId36"/>
                     <a:stretch>
                       <a:fillRect/>
                     </a:stretch>
@@ -4810,7 +4918,7 @@
         <w:rPr>
           <w:b/>
         </w:rPr>
-        <w:t>Figura 6.</w:t>
+        <w:t>Figura 7.</w:t>
       </w:r>
       <w:r>
         <w:t xml:space="preserve"> Brecha de generalización (exactitud de entrenamiento − prueba) por modelo. El árbol sin poda es el único con brecha positiva (memoriza más de lo que generaliza); su sobreajuste se aprecia con más claridad en el AUC-PR (Tabla 1). Fuente: elaboración propia con SATEC [22].</w:t>
@@ -4830,7 +4938,7 @@
         <w:ind w:firstLine="0"/>
       </w:pPr>
       <w:r>
-        <w:t xml:space="preserve">La Figura 7 presenta las curvas de fiabilidad de la red neuronal y el árbol podado sobre las predicciones agrupadas del origen móvil (donde hay más positivos y la curva resulta más estable). Una curva próxima a la diagonal indica que las probabilidades predichas coinciden con las frecuencias observadas. Los </w:t>
+        <w:t xml:space="preserve">La Figura 8 presenta las curvas de fiabilidad de la red neuronal y el árbol podado sobre las predicciones agrupadas del origen móvil (donde hay más positivos y la curva resulta más estable). Una curva próxima a la diagonal indica que las probabilidades predichas coinciden con las frecuencias observadas. Los </w:t>
       </w:r>
       <w:r>
         <w:rPr>
@@ -4869,7 +4977,7 @@
         <w:drawing>
           <wp:inline xmlns:a="http://schemas.openxmlformats.org/drawingml/2006/main" xmlns:pic="http://schemas.openxmlformats.org/drawingml/2006/picture">
             <wp:extent cx="3413239" cy="3383280"/>
-            <wp:docPr id="7" name="Picture 7"/>
+            <wp:docPr id="8" name="Picture 8"/>
             <wp:cNvGraphicFramePr>
               <a:graphicFrameLocks noChangeAspect="1"/>
             </wp:cNvGraphicFramePr>
@@ -4881,7 +4989,7 @@
                     <pic:cNvPicPr/>
                   </pic:nvPicPr>
                   <pic:blipFill>
-                    <a:blip r:embed="rId36"/>
+                    <a:blip r:embed="rId37"/>
                     <a:stretch>
                       <a:fillRect/>
                     </a:stretch>
@@ -4908,7 +5016,7 @@
         <w:rPr>
           <w:b/>
         </w:rPr>
-        <w:t>Figura 7.</w:t>
+        <w:t>Figura 8.</w:t>
       </w:r>
       <w:r>
         <w:t xml:space="preserve"> Curvas de calibración de la red neuronal y el árbol podado frente a la calibración perfecta (diagonal). Fuente: elaboración propia con SATEC [22].</w:t>
@@ -4928,7 +5036,7 @@
         <w:ind w:firstLine="0"/>
       </w:pPr>
       <w:r>
-        <w:t xml:space="preserve">La Figura 8 reporta la importancia por permutación de la red neuronal (entrenada con todo el histórico). La </w:t>
+        <w:t xml:space="preserve">La Figura 9 reporta la importancia por permutación de la red neuronal (entrenada con todo el histórico). La </w:t>
       </w:r>
       <w:r>
         <w:rPr>
@@ -4976,7 +5084,7 @@
         <w:drawing>
           <wp:inline xmlns:a="http://schemas.openxmlformats.org/drawingml/2006/main" xmlns:pic="http://schemas.openxmlformats.org/drawingml/2006/picture">
             <wp:extent cx="4480560" cy="2959578"/>
-            <wp:docPr id="8" name="Picture 8"/>
+            <wp:docPr id="9" name="Picture 9"/>
             <wp:cNvGraphicFramePr>
               <a:graphicFrameLocks noChangeAspect="1"/>
             </wp:cNvGraphicFramePr>
@@ -4988,7 +5096,7 @@
                     <pic:cNvPicPr/>
                   </pic:nvPicPr>
                   <pic:blipFill>
-                    <a:blip r:embed="rId37"/>
+                    <a:blip r:embed="rId38"/>
                     <a:stretch>
                       <a:fillRect/>
                     </a:stretch>
@@ -5015,7 +5123,7 @@
         <w:rPr>
           <w:b/>
         </w:rPr>
-        <w:t>Figura 8.</w:t>
+        <w:t>Figura 9.</w:t>
       </w:r>
       <w:r>
         <w:t xml:space="preserve"> Importancia por permutación de la red neuronal (caída en AUC-PR al permutar cada variable). La media móvil de casos domina; la temperatura es la variable ambiental que más aporta. Fuente: elaboración propia con SATEC [22].</w:t>
@@ -5035,7 +5143,7 @@
         <w:ind w:firstLine="0"/>
       </w:pPr>
       <w:r>
-        <w:t>La Figura 9 muestra la aplicación web resultante: un mapa de riesgo de las provincias endémicas sobre un mapa base del Perú, donde cada provincia se colorea según su nivel de alerta (bajo, medio o alto) para la semana más reciente. Al seleccionar una provincia, el panel lateral muestra la probabilidad de brote estimada por la red neuronal, la decisión del árbol y los casos notificados, lo que permite a un usuario de salud pública comparar de un vistazo ambos paradigmas sobre una zona concreta. El sistema es de uso libre y su código y datos son reproducibles.</w:t>
+        <w:t>La Figura 10 muestra la aplicación web resultante: un mapa de riesgo de las provincias endémicas sobre un mapa base del Perú, donde cada provincia se colorea según su nivel de alerta (bajo, medio o alto) para la semana más reciente. Al seleccionar una provincia, el panel lateral muestra la probabilidad de brote estimada por la red neuronal, la decisión del árbol y los casos notificados, lo que permite a un usuario de salud pública comparar de un vistazo ambos paradigmas sobre una zona concreta. El sistema es de uso libre y su código y datos son reproducibles.</w:t>
       </w:r>
     </w:p>
     <w:p>
@@ -5047,7 +5155,7 @@
         <w:drawing>
           <wp:inline xmlns:a="http://schemas.openxmlformats.org/drawingml/2006/main" xmlns:pic="http://schemas.openxmlformats.org/drawingml/2006/picture">
             <wp:extent cx="4480560" cy="2834701"/>
-            <wp:docPr id="9" name="Picture 9"/>
+            <wp:docPr id="10" name="Picture 10"/>
             <wp:cNvGraphicFramePr>
               <a:graphicFrameLocks noChangeAspect="1"/>
             </wp:cNvGraphicFramePr>
@@ -5059,7 +5167,7 @@
                     <pic:cNvPicPr/>
                   </pic:nvPicPr>
                   <pic:blipFill>
-                    <a:blip r:embed="rId38"/>
+                    <a:blip r:embed="rId39"/>
                     <a:stretch>
                       <a:fillRect/>
                     </a:stretch>
@@ -5086,7 +5194,7 @@
         <w:rPr>
           <w:b/>
         </w:rPr>
-        <w:t>Figura 9.</w:t>
+        <w:t>Figura 10.</w:t>
       </w:r>
       <w:r>
         <w:t xml:space="preserve"> Interfaz de SATEC: mapa de riesgo provincial sobre el mapa base del Perú, con la franja de resumen del estado actual y el detalle de la provincia de Oyón (Lima) en nivel de alerta alto (probabilidad de brote estimada del 89 %), incluida la barra de probabilidad frente al umbral y la decisión del árbol. Captura de la aplicación desarrollada. Fuente: elaboración propia con SATEC [22].</w:t>

</xml_diff>

<commit_message>
docs(paper): reduce el artículo ACM a 14 páginas sin perder lo esencial
Cumple el máximo de 14 hojas. Elimina tres figuras redundantes —barras de
métricas, métricas derivadas y brecha de generalización—, cuya información
ya está en la Tabla 1 y en el reporte de clasificación, y condensa la
introducción, métodos, discusión, limitaciones y conclusiones sin perder
datos ni citas. Reduce el ancho de las figuras en build_acm. De 18 a 14
páginas; de 10 a 7 figuras.
</commit_message>
<xml_diff>
--- a/paper/SATEC_articulo_ACM.docx
+++ b/paper/SATEC_articulo_ACM.docx
@@ -456,7 +456,16 @@
         <w:ind w:firstLine="0"/>
       </w:pPr>
       <w:r>
-        <w:t xml:space="preserve">La aplicación de la inteligencia artificial a la enfermedad de Carrión es todavía incipiente y se ha concentrado en dos frentes: el diagnóstico de laboratorio y el estudio del vector. En el primero, Jiménez-Vásquez et al. [9] aplican un análisis </w:t>
+        <w:t xml:space="preserve">La aplicación de la inteligencia artificial a la enfermedad de Carrión es incipiente y se ha concentrado en dos frentes. En el </w:t>
+      </w:r>
+      <w:r>
+        <w:rPr>
+          <w:b/>
+        </w:rPr>
+        <w:t>diagnóstico de laboratorio</w:t>
+      </w:r>
+      <w:r>
+        <w:t xml:space="preserve">, Jiménez-Vásquez et al. [9] identifican </w:t>
       </w:r>
       <w:r>
         <w:rPr>
@@ -465,7 +474,7 @@
         <w:t>in-silico</w:t>
       </w:r>
       <w:r>
-        <w:t xml:space="preserve"> que combina múltiples predictores computacionales para identificar epítopos lineales de células B en proteínas de </w:t>
+        <w:t xml:space="preserve"> epítopos de células B en proteínas de </w:t>
       </w:r>
       <w:r>
         <w:rPr>
@@ -474,7 +483,16 @@
         <w:t>B. bacilliformis</w:t>
       </w:r>
       <w:r>
-        <w:t xml:space="preserve">, con el fin de mejorar el diagnóstico serológico de la enfermedad de Carrión; en la misma línea, trabajos recientes evalúan proteínas recombinantes producidas mediante sistemas de baculovirus para aumentar la sensibilidad y especificidad de los ensayos serológicos [10]. En el segundo frente, el modelado de nicho ecológico ha permitido predecir la distribución espacial de los vectores: estudios sobre </w:t>
+        <w:t xml:space="preserve"> para mejorar el diagnóstico serológico, línea a la que se suman ensayos con proteínas recombinantes [10]. En el </w:t>
+      </w:r>
+      <w:r>
+        <w:rPr>
+          <w:b/>
+        </w:rPr>
+        <w:t>estudio del vector</w:t>
+      </w:r>
+      <w:r>
+        <w:t xml:space="preserve">, el modelado de nicho ecológico predice la distribución de </w:t>
       </w:r>
       <w:r>
         <w:rPr>
@@ -483,7 +501,7 @@
         <w:t>Lutzomyia peruensis</w:t>
       </w:r>
       <w:r>
-        <w:t xml:space="preserve"> emplean algoritmos de aprendizaje automático y de máxima entropía (máquinas de vectores de soporte, MaxEnt y algoritmos genéticos de predicción de reglas) para anticipar desplazamientos de su nicho bajo escenarios de cambio climático en el Perú [11], y enfoques análogos basados en aprendizaje automático y sistemas de información geográfica se han usado para modelar la distribución de flebótomos vectores en otras regiones [12]. De forma complementaria, la detección molecular de </w:t>
+        <w:t xml:space="preserve"> con aprendizaje automático y máxima entropía bajo escenarios de cambio climático [11], [12], mientras que la detección molecular de </w:t>
       </w:r>
       <w:r>
         <w:rPr>
@@ -501,7 +519,7 @@
         <w:t>Lutzomyia</w:t>
       </w:r>
       <w:r>
-        <w:t xml:space="preserve"> sugiere que el rango de transmisión es más amplio de lo que indican los vectores clásicos [13].</w:t>
+        <w:t xml:space="preserve"> sugiere un rango de transmisión más amplio que el de los vectores clásicos [13].</w:t>
       </w:r>
     </w:p>
     <w:p>
@@ -510,7 +528,7 @@
         <w:ind w:firstLine="0"/>
       </w:pPr>
       <w:r>
-        <w:t xml:space="preserve">Más allá de la enfermedad de Carrión, el aprendizaje automático se aplica con éxito a enfermedades vectoriales emparentadas y al uso de datos abiertos peruanos. Vadmal et al. [14] entrenan modelos de árboles potenciados para predecir vectores potenciales de </w:t>
+        <w:t xml:space="preserve">Más allá de Carrión, el aprendizaje automático se aplica con éxito a enfermedades vectoriales emparentadas: Vadmal et al. [14] predicen vectores de </w:t>
       </w:r>
       <w:r>
         <w:rPr>
@@ -519,16 +537,16 @@
         <w:t>Leishmania</w:t>
       </w:r>
       <w:r>
-        <w:t xml:space="preserve"> en América, identificando focos en Madre de Dios; Nayak et al. [15] revisan el papel de la inteligencia artificial en el control de las enfermedades transmitidas por vectores; y Rufasto-Goche et al. [16] modelan la dinámica espacio-temporal del dengue con veintidós años de vigilancia del MINSA, la misma fuente que se emplea en este trabajo. Sin embargo, hasta donde conocemos, </w:t>
-      </w:r>
-      <w:r>
-        <w:rPr>
-          <w:b/>
-        </w:rPr>
-        <w:t>ningún estudio aborda la alerta temprana de brotes de la enfermedad de Carrión mediante aprendizaje automático</w:t>
-      </w:r>
-      <w:r>
-        <w:t>: los antecedentes se centran en el diagnóstico de laboratorio o en la distribución del vector, no en la predicción del riesgo de brote por unidad territorial y temporal. Este trabajo busca atender ese vacío.</w:t>
+        <w:t xml:space="preserve"> con árboles potenciados; Nayak et al. [15] revisan el papel de la IA en su control; y Rufasto-Goche et al. [16] modelan el dengue con la misma fuente del MINSA. Sin embargo, hasta donde conocemos, </w:t>
+      </w:r>
+      <w:r>
+        <w:rPr>
+          <w:b/>
+        </w:rPr>
+        <w:t>ningún estudio aborda la alerta temprana de brotes de Carrión mediante aprendizaje automático</w:t>
+      </w:r>
+      <w:r>
+        <w:t>: los antecedentes se centran en el diagnóstico o el vector, no en la predicción del riesgo de brote por unidad territorial y temporal. Este trabajo atiende ese vacío.</w:t>
       </w:r>
     </w:p>
     <w:p>
@@ -537,7 +555,7 @@
         <w:ind w:firstLine="0"/>
       </w:pPr>
       <w:r>
-        <w:t xml:space="preserve">La contribución de este artículo es cuádruple. Primero, se transforma la vigilancia de casos individuales del MINSA en un panel espacio-temporal a nivel de provincia y semana epidemiológica, con imputación de las semanas sin casos, y se define el objetivo de aprendizaje mediante el </w:t>
+        <w:t xml:space="preserve">La contribución es cuádruple. Primero, se transforma la vigilancia del MINSA en un panel provincia–semana con imputación de las semanas sin casos, definiendo el objetivo mediante el </w:t>
       </w:r>
       <w:r>
         <w:rPr>
@@ -546,7 +564,7 @@
         <w:t>canal endémico</w:t>
       </w:r>
       <w:r>
-        <w:t xml:space="preserve">, integrando una herramienta epidemiológica clásica como etiqueta supervisada. Segundo, se enriquecen los datos con variables </w:t>
+        <w:t xml:space="preserve"> como etiqueta supervisada. Segundo, se enriquecen los datos con variables </w:t>
       </w:r>
       <w:r>
         <w:rPr>
@@ -582,7 +600,7 @@
         <w:t>árbol de decisión</w:t>
       </w:r>
       <w:r>
-        <w:t xml:space="preserve"> (en sus variantes sin poda y podado) bajo </w:t>
+        <w:t xml:space="preserve"> (sin poda y podado) bajo </w:t>
       </w:r>
       <w:r>
         <w:rPr>
@@ -591,7 +609,7 @@
         <w:t>validación temporal estricta</w:t>
       </w:r>
       <w:r>
-        <w:t xml:space="preserve">, con un análisis de robustez de origen móvil, frente a un baseline epidemiológico, con métricas adecuadas a eventos raros, matrices de confusión, calibración e interpretabilidad. Cuarto, el sistema se despliega como una </w:t>
+        <w:t xml:space="preserve"> y un análisis de robustez de origen móvil, frente a un baseline epidemiológico, con métricas adecuadas a eventos raros, matrices de confusión, calibración e interpretabilidad. Cuarto, el sistema se despliega como una </w:t>
       </w:r>
       <w:r>
         <w:rPr>
@@ -600,7 +618,7 @@
         <w:t>aplicación web abierta y reproducible</w:t>
       </w:r>
       <w:r>
-        <w:t>. La Sección 2 describe los materiales y métodos; la Sección 3 presenta los resultados; la Sección 4 los discute; la Sección 5 declara las limitaciones; y la Sección 6 resume las conclusiones.</w:t>
+        <w:t>.</w:t>
       </w:r>
     </w:p>
     <w:p>
@@ -1630,7 +1648,7 @@
       <w:r>
         <w:drawing>
           <wp:inline xmlns:a="http://schemas.openxmlformats.org/drawingml/2006/main" xmlns:pic="http://schemas.openxmlformats.org/drawingml/2006/picture">
-            <wp:extent cx="4480560" cy="2424922"/>
+            <wp:extent cx="4114800" cy="2226969"/>
             <wp:docPr id="1" name="Picture 1"/>
             <wp:cNvGraphicFramePr>
               <a:graphicFrameLocks noChangeAspect="1"/>
@@ -1651,7 +1669,7 @@
                   <pic:spPr>
                     <a:xfrm>
                       <a:off x="0" y="0"/>
-                      <a:ext cx="4480560" cy="2424922"/>
+                      <a:ext cx="4114800" cy="2226969"/>
                     </a:xfrm>
                     <a:prstGeom prst="rect"/>
                   </pic:spPr>
@@ -2273,7 +2291,7 @@
       <w:r>
         <w:drawing>
           <wp:inline xmlns:a="http://schemas.openxmlformats.org/drawingml/2006/main" xmlns:pic="http://schemas.openxmlformats.org/drawingml/2006/picture">
-            <wp:extent cx="4480560" cy="3265155"/>
+            <wp:extent cx="4015269" cy="2926080"/>
             <wp:docPr id="2" name="Picture 2"/>
             <wp:cNvGraphicFramePr>
               <a:graphicFrameLocks noChangeAspect="1"/>
@@ -2294,7 +2312,7 @@
                   <pic:spPr>
                     <a:xfrm>
                       <a:off x="0" y="0"/>
-                      <a:ext cx="4480560" cy="3265155"/>
+                      <a:ext cx="4015269" cy="2926080"/>
                     </a:xfrm>
                     <a:prstGeom prst="rect"/>
                   </pic:spPr>
@@ -2470,7 +2488,7 @@
         <w:t>validación temporal estricta</w:t>
       </w:r>
       <w:r>
-        <w:t xml:space="preserve">: el modelo se entrena con los años </w:t>
+        <w:t xml:space="preserve">: se entrena con los años </w:t>
       </w:r>
       <m:oMath>
         <m:r>
@@ -2504,7 +2522,7 @@
         </m:sSub>
       </m:oMath>
       <w:r>
-        <w:t xml:space="preserve"> se elige en el año de </w:t>
+        <w:t xml:space="preserve"> se elige en </w:t>
       </w:r>
       <w:r>
         <w:rPr>
@@ -2513,7 +2531,7 @@
         <w:t>validación</w:t>
       </w:r>
       <w:r>
-        <w:t xml:space="preserve"> 2019 (sin usar el conjunto de prueba) y se evalúa sobre 2020–2024. Como </w:t>
+        <w:t xml:space="preserve"> (2019) y se evalúa sobre 2020–2024. Como </w:t>
       </w:r>
       <w:r>
         <w:rPr>
@@ -2522,7 +2540,7 @@
         <w:t>análisis de robustez</w:t>
       </w:r>
       <w:r>
-        <w:t xml:space="preserve"> se reporta además una </w:t>
+        <w:t xml:space="preserve"> se reporta una </w:t>
       </w:r>
       <w:r>
         <w:rPr>
@@ -2540,7 +2558,7 @@
         <w:t>rolling-origin</w:t>
       </w:r>
       <w:r>
-        <w:t xml:space="preserve">): para cada año objetivo </w:t>
+        <w:t xml:space="preserve">): para cada año </w:t>
       </w:r>
       <m:oMath>
         <m:r>
@@ -2548,7 +2566,7 @@
         </m:r>
       </m:oMath>
       <w:r>
-        <w:t xml:space="preserve"> se entrena con los años </w:t>
+        <w:t xml:space="preserve"> se entrena con </w:t>
       </w:r>
       <m:oMath>
         <m:r>
@@ -2564,16 +2582,7 @@
         </m:r>
       </m:oMath>
       <w:r>
-        <w:t>, agrupando (</w:t>
-      </w:r>
-      <w:r>
-        <w:rPr>
-          <w:i/>
-        </w:rPr>
-        <w:t>pooling</w:t>
-      </w:r>
-      <w:r>
-        <w:t xml:space="preserve">) las predicciones; esta evaluación es más exigente porque promedia años heterogéneos, incluido el hueco de subnotificación de 2020–2024 (Sección 2.2), por lo que arroja métricas más bajas pero más conservadoras. En ningún caso el conjunto de prueba interviene en el entrenamiento ni en la elección del umbral, evitando la fuga temporal. A partir de la matriz de confusión (verdaderos y falsos positivos y negativos: </w:t>
+        <w:t>, agrupando las predicciones; al promediar años heterogéneos —incluido el hueco de subnotificación de 2020–2024— es más exigente y conservadora. En ningún caso el conjunto de prueba interviene en el entrenamiento ni en la elección del umbral, evitando la fuga temporal. A partir de la matriz de confusión (</w:t>
       </w:r>
       <m:oMath>
         <m:r>
@@ -2605,7 +2614,7 @@
         </m:r>
       </m:oMath>
       <w:r>
-        <w:t xml:space="preserve">) se derivan las métricas de las Ecuaciones (12)–(16): precisión, sensibilidad (recall), especificidad, exactitud y puntuación </w:t>
+        <w:t xml:space="preserve">) se derivan las métricas de las Ecuaciones (12)–(16): precisión, sensibilidad, especificidad, exactitud y </w:t>
       </w:r>
       <m:oMath>
         <m:sSub>
@@ -3349,7 +3358,7 @@
         <w:t>árbol de decisión sin poda</w:t>
       </w:r>
       <w:r>
-        <w:t>, cuyo F1 cae a 0,22 y cuyo AUC-PR se desploma a 0,07 —la firma del sobreajuste pese a una exactitud global alta—, y al baseline del canal endémico (F1 0,40). La Figura 3 ilustra este contraste. La drástica mejora del árbol al podarlo (AUC-PR de 0,07 a 0,63; F1 de 0,22 a 0,60) confirma que limitar la complejidad es decisivo para detectar la clase rara.</w:t>
+        <w:t>, cuyo F1 cae a 0,22 y cuyo AUC-PR se desploma a 0,07 —la firma del sobreajuste pese a una exactitud global alta—, y al baseline del canal endémico (F1 0,40). La drástica mejora del árbol al podarlo (AUC-PR de 0,07 a 0,63; F1 de 0,22 a 0,60) confirma que limitar la complejidad es decisivo para detectar la clase rara; su exactitud de entrenamiento cercana a 0,999, frente a un AUC-PR de prueba de 0,07, es la firma inequívoca del sobreajuste.</w:t>
       </w:r>
     </w:p>
     <w:p>
@@ -3367,7 +3376,7 @@
         <w:t>análisis de robustez</w:t>
       </w:r>
       <w:r>
-        <w:t xml:space="preserve">, bajo la validación de origen móvil (cortes anuales 2016–2024, que promedian años heterogéneos e incluyen el hueco de subnotificación pandémica) las métricas dependientes del umbral son más conservadoras: la red neuronal obtiene un F1 de </w:t>
+        <w:t xml:space="preserve">, bajo la validación de origen móvil (cortes 2016–2024, que promedian años heterogéneos e incluyen el hueco pandémico) las métricas son más conservadoras: la red obtiene un F1 de </w:t>
       </w:r>
       <w:r>
         <w:rPr>
@@ -3376,7 +3385,7 @@
         <w:t>0,43</w:t>
       </w:r>
       <w:r>
-        <w:t xml:space="preserve"> (AUC-PR 0,46; AUC-ROC 0,91) y el árbol podado un F1 de 0,39 (AUC-PR 0,41), ambos muy por encima del árbol sin poda (F1 0,29; AUC-PR 0,09). En esta evaluación más exigente la red </w:t>
+        <w:t xml:space="preserve"> (AUC-PR 0,46; AUC-ROC 0,91) y el árbol podado 0,39 (AUC-PR 0,41), ambos por encima del árbol sin poda (F1 0,29). En esta evaluación más exigente la red </w:t>
       </w:r>
       <w:r>
         <w:rPr>
@@ -3385,7 +3394,7 @@
         <w:t>iguala</w:t>
       </w:r>
       <w:r>
-        <w:t xml:space="preserve"> al baseline del canal endémico (F1 0,43): la clara ventaja del aprendizaje automático sobre la regla clásica observada en el corte 2020–2024 se estrecha al promediar años de prevalencia muy dispar. Esta caída no señala un peor modelo, sino una evaluación más severa sobre un período de prevalencia anómalamente baja; se reporta con transparencia para no sobrestimar el desempeño esperable en años de notificación deprimida.</w:t>
+        <w:t xml:space="preserve"> al baseline (F1 0,43): la ventaja sobre la regla clásica observada en 2020–2024 se estrecha al promediar años de prevalencia muy dispar. Esta caída no señala un peor modelo, sino una evaluación más severa sobre un período de prevalencia anómalamente baja; se reporta con transparencia para no sobrestimar el desempeño esperable.</w:t>
       </w:r>
     </w:p>
     <w:p>
@@ -4331,13 +4340,67 @@
     </w:tbl>
     <w:p>
       <w:pPr>
+        <w:pStyle w:val="Para"/>
+        <w:ind w:firstLine="0"/>
+      </w:pPr>
+      <w:r>
+        <w:t xml:space="preserve">El </w:t>
+      </w:r>
+      <w:r>
+        <w:rPr>
+          <w:b/>
+        </w:rPr>
+        <w:t>reporte de clasificación</w:t>
+      </w:r>
+      <w:r>
+        <w:t xml:space="preserve"> de la Figura 3 desglosa, por clase y modelo, las cuatro magnitudes derivadas de la matriz de confusión (precisión, sensibilidad, F1 y soporte), junto con la exactitud y los promedios macro y ponderado. Para la clase mayoritaria («No brote») las tres métricas son ≈1,00 en todos los modelos —el fuerte desbalance la hace trivial—, por lo que el interés se concentra en la fila </w:t>
+      </w:r>
+      <w:r>
+        <w:rPr>
+          <w:b/>
+        </w:rPr>
+        <w:t>«Brote»</w:t>
+      </w:r>
+      <w:r>
+        <w:t xml:space="preserve">: ahí la red neuronal alcanza un F1 de 0,70 (precisión 0,74; sensibilidad 0,67), el árbol podado 0,60 y el árbol sin poda apenas 0,22. El </w:t>
+      </w:r>
+      <w:r>
+        <w:rPr>
+          <w:b/>
+        </w:rPr>
+        <w:t>promedio macro</w:t>
+      </w:r>
+      <w:r>
+        <w:t xml:space="preserve">, que pondera ambas clases por igual, evidencia esa diferencia (F1 de 0,85, 0,80 y 0,61 respectivamente), que el </w:t>
+      </w:r>
+      <w:r>
+        <w:rPr>
+          <w:b/>
+        </w:rPr>
+        <w:t>promedio ponderado</w:t>
+      </w:r>
+      <w:r>
+        <w:t xml:space="preserve"> —dominado por la clase mayoritaria— oculta tras un engañoso 0,99–1,00. Todas las cifras se calculan con el </w:t>
+      </w:r>
+      <w:r>
+        <w:rPr>
+          <w:b/>
+        </w:rPr>
+        <w:t>umbral de decisión óptimo</w:t>
+      </w:r>
+      <w:r>
+        <w:t xml:space="preserve"> elegido en validación, por lo que coinciden con la Tabla 1.</w:t>
+      </w:r>
+    </w:p>
+    <w:p>
+      <w:pPr>
         <w:pStyle w:val="Image"/>
         <w:jc w:val="center"/>
       </w:pPr>
       <w:r>
         <w:drawing>
           <wp:inline xmlns:a="http://schemas.openxmlformats.org/drawingml/2006/main" xmlns:pic="http://schemas.openxmlformats.org/drawingml/2006/picture">
-            <wp:extent cx="4480560" cy="2443942"/>
+            <wp:extent cx="3024137" cy="2926080"/>
             <wp:docPr id="3" name="Picture 3"/>
             <wp:cNvGraphicFramePr>
               <a:graphicFrameLocks noChangeAspect="1"/>
@@ -4346,7 +4409,7 @@
               <a:graphicData uri="http://schemas.openxmlformats.org/drawingml/2006/picture">
                 <pic:pic>
                   <pic:nvPicPr>
-                    <pic:cNvPr id="0" name="fig_metricas.png"/>
+                    <pic:cNvPr id="0" name="fig_classification.png"/>
                     <pic:cNvPicPr/>
                   </pic:nvPicPr>
                   <pic:blipFill>
@@ -4358,7 +4421,7 @@
                   <pic:spPr>
                     <a:xfrm>
                       <a:off x="0" y="0"/>
-                      <a:ext cx="4480560" cy="2443942"/>
+                      <a:ext cx="3024137" cy="2926080"/>
                     </a:xfrm>
                     <a:prstGeom prst="rect"/>
                   </pic:spPr>
@@ -4380,7 +4443,105 @@
         <w:t>Figura 3.</w:t>
       </w:r>
       <w:r>
-        <w:t xml:space="preserve"> Sensibilidad, AUC-PR y F1 por modelo (validación temporal estricta, prueba 2020–2024). La red neuronal lidera; el árbol sin poda exhibe el AUC-PR más bajo. Fuente: elaboración propia con SATEC [22].</w:t>
+        <w:t xml:space="preserve"> Reporte de clasificación (precisión, sensibilidad, F1 y soporte por clase, con exactitud y promedios macro y ponderado) de los tres modelos sobre el conjunto de prueba 2020–2024, calculado con el umbral de decisión óptimo. La fila «Brote» (clase de interés) aparece resaltada. Fuente: elaboración propia con SATEC [22].</w:t>
+      </w:r>
+    </w:p>
+    <w:p>
+      <w:pPr>
+        <w:pStyle w:val="Head2"/>
+      </w:pPr>
+      <w:r>
+        <w:t>Matrices de confusión</w:t>
+      </w:r>
+    </w:p>
+    <w:p>
+      <w:pPr>
+        <w:pStyle w:val="PostHeadPara"/>
+        <w:ind w:firstLine="0"/>
+      </w:pPr>
+      <w:r>
+        <w:t xml:space="preserve">La Figura 4 presenta las matrices de confusión de los dos mejores modelos —red neuronal y árbol podado— sobre los </w:t>
+      </w:r>
+      <w:r>
+        <w:rPr>
+          <w:b/>
+        </w:rPr>
+        <w:t>15.616 ejemplos de prueba</w:t>
+      </w:r>
+      <w:r>
+        <w:t xml:space="preserve"> (2020–2024), de los cuales </w:t>
+      </w:r>
+      <w:r>
+        <w:rPr>
+          <w:b/>
+        </w:rPr>
+        <w:t>42 corresponden a brotes reales</w:t>
+      </w:r>
+      <w:r>
+        <w:t xml:space="preserve">. Conviene precisar la unidad de análisis: cada celda cuenta </w:t>
+      </w:r>
+      <w:r>
+        <w:rPr>
+          <w:b/>
+        </w:rPr>
+        <w:t>provincias-semana</w:t>
+      </w:r>
+      <w:r>
+        <w:t xml:space="preserve">, no pacientes. SATEC </w:t>
+      </w:r>
+      <w:r>
+        <w:rPr>
+          <w:b/>
+        </w:rPr>
+        <w:t>no diagnostica personas</w:t>
+      </w:r>
+      <w:r>
+        <w:t xml:space="preserve">; anticipa si una provincia entrará en zona de epidemia. Así, un </w:t>
+      </w:r>
+      <w:r>
+        <w:rPr>
+          <w:b/>
+        </w:rPr>
+        <w:t>verdadero positivo</w:t>
+      </w:r>
+      <w:r>
+        <w:t xml:space="preserve"> (VP) es una provincia-semana correctamente alertada como brote inminente; un </w:t>
+      </w:r>
+      <w:r>
+        <w:rPr>
+          <w:b/>
+        </w:rPr>
+        <w:t>falso positivo</w:t>
+      </w:r>
+      <w:r>
+        <w:t xml:space="preserve"> (FP) es una </w:t>
+      </w:r>
+      <w:r>
+        <w:rPr>
+          <w:b/>
+        </w:rPr>
+        <w:t>falsa alarma</w:t>
+      </w:r>
+      <w:r>
+        <w:t xml:space="preserve"> (se alertó y el brote no se materializó); un </w:t>
+      </w:r>
+      <w:r>
+        <w:rPr>
+          <w:b/>
+        </w:rPr>
+        <w:t>falso negativo</w:t>
+      </w:r>
+      <w:r>
+        <w:t xml:space="preserve"> (FN) es un brote no anticipado; y un </w:t>
+      </w:r>
+      <w:r>
+        <w:rPr>
+          <w:b/>
+        </w:rPr>
+        <w:t>verdadero negativo</w:t>
+      </w:r>
+      <w:r>
+        <w:t xml:space="preserve"> (VN) es una zona-semana correctamente clasificada como tranquila.</w:t>
       </w:r>
     </w:p>
     <w:p>
@@ -4389,52 +4550,74 @@
         <w:ind w:firstLine="0"/>
       </w:pPr>
       <w:r>
-        <w:t xml:space="preserve">El </w:t>
-      </w:r>
-      <w:r>
-        <w:rPr>
-          <w:b/>
-        </w:rPr>
-        <w:t>reporte de clasificación</w:t>
-      </w:r>
-      <w:r>
-        <w:t xml:space="preserve"> de la Figura 4 desglosa, por clase y modelo, las cuatro magnitudes derivadas de la matriz de confusión (precisión, sensibilidad, F1 y soporte), junto con la exactitud y los promedios macro y ponderado. Para la clase mayoritaria («No brote») las tres métricas son ≈1,00 en todos los modelos —el fuerte desbalance la hace trivial—, por lo que el interés se concentra en la fila </w:t>
-      </w:r>
-      <w:r>
-        <w:rPr>
-          <w:b/>
-        </w:rPr>
-        <w:t>«Brote»</w:t>
-      </w:r>
-      <w:r>
-        <w:t xml:space="preserve">: ahí la red neuronal alcanza un F1 de 0,70 (precisión 0,74; sensibilidad 0,67), el árbol podado 0,60 y el árbol sin poda apenas 0,22. El </w:t>
-      </w:r>
-      <w:r>
-        <w:rPr>
-          <w:b/>
-        </w:rPr>
-        <w:t>promedio macro</w:t>
-      </w:r>
-      <w:r>
-        <w:t xml:space="preserve">, que pondera ambas clases por igual, evidencia esa diferencia (F1 de 0,85, 0,80 y 0,61 respectivamente), que el </w:t>
-      </w:r>
-      <w:r>
-        <w:rPr>
-          <w:b/>
-        </w:rPr>
-        <w:t>promedio ponderado</w:t>
-      </w:r>
-      <w:r>
-        <w:t xml:space="preserve"> —dominado por la clase mayoritaria— oculta tras un engañoso 0,99–1,00. Todas las cifras se calculan con el </w:t>
-      </w:r>
-      <w:r>
-        <w:rPr>
-          <w:b/>
-        </w:rPr>
-        <w:t>umbral de decisión óptimo</w:t>
-      </w:r>
-      <w:r>
-        <w:t xml:space="preserve"> elegido en validación, por lo que coinciden con la Tabla 1.</w:t>
+        <w:t xml:space="preserve">Ambos modelos recuperan </w:t>
+      </w:r>
+      <w:r>
+        <w:rPr>
+          <w:b/>
+        </w:rPr>
+        <w:t>28 de los 42 brotes</w:t>
+      </w:r>
+      <w:r>
+        <w:t xml:space="preserve"> (VP), pero la red neuronal lo hace con solo </w:t>
+      </w:r>
+      <w:r>
+        <w:rPr>
+          <w:b/>
+        </w:rPr>
+        <w:t>10 falsas alarmas</w:t>
+      </w:r>
+      <w:r>
+        <w:t xml:space="preserve"> (FP) frente a las </w:t>
+      </w:r>
+      <w:r>
+        <w:rPr>
+          <w:b/>
+        </w:rPr>
+        <w:t>23</w:t>
+      </w:r>
+      <w:r>
+        <w:t xml:space="preserve"> del árbol podado: esa menor tasa de falsos positivos explica su mayor precisión (0,74 frente a 0,55) y su mejor F1. En términos de tasas de error, ambos mantienen una </w:t>
+      </w:r>
+      <w:r>
+        <w:rPr>
+          <w:b/>
+        </w:rPr>
+        <w:t>tasa de falsas alarmas</w:t>
+      </w:r>
+      <w:r>
+        <w:t xml:space="preserve"> ínfima sobre la enorme clase mayoritaria —</w:t>
+      </w:r>
+      <m:oMath>
+        <m:r>
+          <m:t>FP/(FP+VN)≤0</m:t>
+        </m:r>
+        <m:r>
+          <m:t>,</m:t>
+        </m:r>
+        <m:r>
+          <m:t>15%</m:t>
+        </m:r>
+      </m:oMath>
+      <w:r>
+        <w:t xml:space="preserve">—, mientras que la </w:t>
+      </w:r>
+      <w:r>
+        <w:rPr>
+          <w:b/>
+        </w:rPr>
+        <w:t>fracción de brotes omitidos</w:t>
+      </w:r>
+      <w:r>
+        <w:t xml:space="preserve"> —</w:t>
+      </w:r>
+      <m:oMath>
+        <m:r>
+          <m:t>FN/(FN+VP)≈33%</m:t>
+        </m:r>
+      </m:oMath>
+      <w:r>
+        <w:t>— concentra la dificultad del problema. Este compromiso —preferir una falsa alarma territorial antes que omitir un brote— es deseable en un sistema de alerta donde el costo de un brote no detectado es alto.</w:t>
       </w:r>
     </w:p>
     <w:p>
@@ -4445,7 +4628,7 @@
       <w:r>
         <w:drawing>
           <wp:inline xmlns:a="http://schemas.openxmlformats.org/drawingml/2006/main" xmlns:pic="http://schemas.openxmlformats.org/drawingml/2006/picture">
-            <wp:extent cx="3496658" cy="3383280"/>
+            <wp:extent cx="4114800" cy="2001795"/>
             <wp:docPr id="4" name="Picture 4"/>
             <wp:cNvGraphicFramePr>
               <a:graphicFrameLocks noChangeAspect="1"/>
@@ -4454,7 +4637,7 @@
               <a:graphicData uri="http://schemas.openxmlformats.org/drawingml/2006/picture">
                 <pic:pic>
                   <pic:nvPicPr>
-                    <pic:cNvPr id="0" name="fig_classification.png"/>
+                    <pic:cNvPr id="0" name="fig_confusion.png"/>
                     <pic:cNvPicPr/>
                   </pic:nvPicPr>
                   <pic:blipFill>
@@ -4466,7 +4649,7 @@
                   <pic:spPr>
                     <a:xfrm>
                       <a:off x="0" y="0"/>
-                      <a:ext cx="3496658" cy="3383280"/>
+                      <a:ext cx="4114800" cy="2001795"/>
                     </a:xfrm>
                     <a:prstGeom prst="rect"/>
                   </pic:spPr>
@@ -4488,7 +4671,7 @@
         <w:t>Figura 4.</w:t>
       </w:r>
       <w:r>
-        <w:t xml:space="preserve"> Reporte de clasificación (precisión, sensibilidad, F1 y soporte por clase, con exactitud y promedios macro y ponderado) de los tres modelos sobre el conjunto de prueba 2020–2024, calculado con el umbral de decisión óptimo. La fila «Brote» (clase de interés) aparece resaltada. Fuente: elaboración propia con SATEC [22].</w:t>
+        <w:t xml:space="preserve"> Matrices de confusión de la red neuronal (izquierda) y el árbol podado (derecha) sobre el conjunto de prueba 2020–2024, con conteo y porcentaje por celda (VN, FP, FN, VP). Las filas son la condición observada y las columnas la predicción. Fuente: elaboración propia con SATEC [22].</w:t>
       </w:r>
     </w:p>
     <w:p>
@@ -4496,7 +4679,7 @@
         <w:pStyle w:val="Head2"/>
       </w:pPr>
       <w:r>
-        <w:t>Matrices de confusión</w:t>
+        <w:t>Calibración</w:t>
       </w:r>
     </w:p>
     <w:p>
@@ -4505,164 +4688,34 @@
         <w:ind w:firstLine="0"/>
       </w:pPr>
       <w:r>
-        <w:t xml:space="preserve">La Figura 5 presenta las matrices de confusión de los dos mejores modelos —red neuronal y árbol podado— sobre los </w:t>
-      </w:r>
-      <w:r>
-        <w:rPr>
-          <w:b/>
-        </w:rPr>
-        <w:t>15.616 ejemplos de prueba</w:t>
-      </w:r>
-      <w:r>
-        <w:t xml:space="preserve"> (2020–2024), de los cuales </w:t>
-      </w:r>
-      <w:r>
-        <w:rPr>
-          <w:b/>
-        </w:rPr>
-        <w:t>42 corresponden a brotes reales</w:t>
-      </w:r>
-      <w:r>
-        <w:t xml:space="preserve">. Conviene precisar la unidad de análisis: cada celda cuenta </w:t>
-      </w:r>
-      <w:r>
-        <w:rPr>
-          <w:b/>
-        </w:rPr>
-        <w:t>provincias-semana</w:t>
-      </w:r>
-      <w:r>
-        <w:t xml:space="preserve">, no pacientes. SATEC </w:t>
-      </w:r>
-      <w:r>
-        <w:rPr>
-          <w:b/>
-        </w:rPr>
-        <w:t>no diagnostica personas</w:t>
-      </w:r>
-      <w:r>
-        <w:t xml:space="preserve">; anticipa si una provincia entrará en zona de epidemia. Así, un </w:t>
-      </w:r>
-      <w:r>
-        <w:rPr>
-          <w:b/>
-        </w:rPr>
-        <w:t>verdadero positivo</w:t>
-      </w:r>
-      <w:r>
-        <w:t xml:space="preserve"> (VP) es una provincia-semana correctamente alertada como brote inminente; un </w:t>
-      </w:r>
-      <w:r>
-        <w:rPr>
-          <w:b/>
-        </w:rPr>
-        <w:t>falso positivo</w:t>
-      </w:r>
-      <w:r>
-        <w:t xml:space="preserve"> (FP) es una </w:t>
-      </w:r>
-      <w:r>
-        <w:rPr>
-          <w:b/>
-        </w:rPr>
-        <w:t>falsa alarma</w:t>
-      </w:r>
-      <w:r>
-        <w:t xml:space="preserve"> (se alertó y el brote no se materializó); un </w:t>
-      </w:r>
-      <w:r>
-        <w:rPr>
-          <w:b/>
-        </w:rPr>
-        <w:t>falso negativo</w:t>
-      </w:r>
-      <w:r>
-        <w:t xml:space="preserve"> (FN) es un brote no anticipado; y un </w:t>
-      </w:r>
-      <w:r>
-        <w:rPr>
-          <w:b/>
-        </w:rPr>
-        <w:t>verdadero negativo</w:t>
-      </w:r>
-      <w:r>
-        <w:t xml:space="preserve"> (VN) es una zona-semana correctamente clasificada como tranquila.</w:t>
-      </w:r>
-    </w:p>
-    <w:p>
-      <w:pPr>
-        <w:pStyle w:val="Para"/>
-        <w:ind w:firstLine="0"/>
-      </w:pPr>
-      <w:r>
-        <w:t xml:space="preserve">Ambos modelos recuperan </w:t>
-      </w:r>
-      <w:r>
-        <w:rPr>
-          <w:b/>
-        </w:rPr>
-        <w:t>28 de los 42 brotes</w:t>
-      </w:r>
-      <w:r>
-        <w:t xml:space="preserve"> (VP), pero la red neuronal lo hace con solo </w:t>
-      </w:r>
-      <w:r>
-        <w:rPr>
-          <w:b/>
-        </w:rPr>
-        <w:t>10 falsas alarmas</w:t>
-      </w:r>
-      <w:r>
-        <w:t xml:space="preserve"> (FP) frente a las </w:t>
-      </w:r>
-      <w:r>
-        <w:rPr>
-          <w:b/>
-        </w:rPr>
-        <w:t>23</w:t>
-      </w:r>
-      <w:r>
-        <w:t xml:space="preserve"> del árbol podado: esa menor tasa de falsos positivos explica su mayor precisión (0,74 frente a 0,55) y su mejor F1. En términos de tasas de error, ambos mantienen una </w:t>
-      </w:r>
-      <w:r>
-        <w:rPr>
-          <w:b/>
-        </w:rPr>
-        <w:t>tasa de falsas alarmas</w:t>
-      </w:r>
-      <w:r>
-        <w:t xml:space="preserve"> ínfima sobre la enorme clase mayoritaria —</w:t>
-      </w:r>
-      <m:oMath>
-        <m:r>
-          <m:t>FP/(FP+VN)≤0</m:t>
-        </m:r>
-        <m:r>
-          <m:t>,</m:t>
-        </m:r>
-        <m:r>
-          <m:t>15%</m:t>
-        </m:r>
-      </m:oMath>
-      <w:r>
-        <w:t xml:space="preserve">—, mientras que la </w:t>
-      </w:r>
-      <w:r>
-        <w:rPr>
-          <w:b/>
-        </w:rPr>
-        <w:t>fracción de brotes omitidos</w:t>
-      </w:r>
-      <w:r>
-        <w:t xml:space="preserve"> —</w:t>
-      </w:r>
-      <m:oMath>
-        <m:r>
-          <m:t>FN/(FN+VP)≈33%</m:t>
-        </m:r>
-      </m:oMath>
-      <w:r>
-        <w:t>— concentra la dificultad del problema. Este compromiso —preferir una falsa alarma territorial antes que omitir un brote— es deseable en un sistema de alerta donde el costo de un brote no detectado es alto.</w:t>
+        <w:t xml:space="preserve">La Figura 5 presenta las curvas de fiabilidad de la red neuronal y el árbol podado sobre las predicciones agrupadas del origen móvil (donde hay más positivos y la curva resulta más estable). Una curva próxima a la diagonal indica que las probabilidades predichas coinciden con las frecuencias observadas. Los </w:t>
+      </w:r>
+      <w:r>
+        <w:rPr>
+          <w:i/>
+        </w:rPr>
+        <w:t>Brier scores</w:t>
+      </w:r>
+      <w:r>
+        <w:t xml:space="preserve"> son bajos (≈0,02–0,03), favorecidos por la baja prevalencia de brotes. Ambos modelos tienden a </w:t>
+      </w:r>
+      <w:r>
+        <w:rPr>
+          <w:b/>
+        </w:rPr>
+        <w:t>sobreestimar</w:t>
+      </w:r>
+      <w:r>
+        <w:t xml:space="preserve"> la probabilidad en los deciles altos —donde los brotes son escasos y la estimación es más ruidosa—, efecto del entrenamiento con ponderación de clases; una </w:t>
+      </w:r>
+      <w:r>
+        <w:rPr>
+          <w:b/>
+        </w:rPr>
+        <w:t>calibración posterior</w:t>
+      </w:r>
+      <w:r>
+        <w:t xml:space="preserve"> (isotónica o de Platt) es una mejora directa para trabajo futuro.</w:t>
       </w:r>
     </w:p>
     <w:p>
@@ -4673,7 +4726,7 @@
       <w:r>
         <w:drawing>
           <wp:inline xmlns:a="http://schemas.openxmlformats.org/drawingml/2006/main" xmlns:pic="http://schemas.openxmlformats.org/drawingml/2006/picture">
-            <wp:extent cx="4480560" cy="2179732"/>
+            <wp:extent cx="2951990" cy="2926079"/>
             <wp:docPr id="5" name="Picture 5"/>
             <wp:cNvGraphicFramePr>
               <a:graphicFrameLocks noChangeAspect="1"/>
@@ -4682,7 +4735,7 @@
               <a:graphicData uri="http://schemas.openxmlformats.org/drawingml/2006/picture">
                 <pic:pic>
                   <pic:nvPicPr>
-                    <pic:cNvPr id="0" name="fig_confusion.png"/>
+                    <pic:cNvPr id="0" name="fig_calibracion.png"/>
                     <pic:cNvPicPr/>
                   </pic:nvPicPr>
                   <pic:blipFill>
@@ -4694,7 +4747,7 @@
                   <pic:spPr>
                     <a:xfrm>
                       <a:off x="0" y="0"/>
-                      <a:ext cx="4480560" cy="2179732"/>
+                      <a:ext cx="2951990" cy="2926079"/>
                     </a:xfrm>
                     <a:prstGeom prst="rect"/>
                   </pic:spPr>
@@ -4716,7 +4769,7 @@
         <w:t>Figura 5.</w:t>
       </w:r>
       <w:r>
-        <w:t xml:space="preserve"> Matrices de confusión de la red neuronal (izquierda) y el árbol podado (derecha) sobre el conjunto de prueba 2020–2024, con conteo y porcentaje por celda (VN, FP, FN, VP). Las filas son la condición observada y las columnas la predicción. Fuente: elaboración propia con SATEC [22].</w:t>
+        <w:t xml:space="preserve"> Curvas de calibración de la red neuronal y el árbol podado frente a la calibración perfecta (diagonal). Fuente: elaboración propia con SATEC [22].</w:t>
       </w:r>
     </w:p>
     <w:p>
@@ -4724,7 +4777,7 @@
         <w:pStyle w:val="Head2"/>
       </w:pPr>
       <w:r>
-        <w:t>Métricas derivadas de la matriz de confusión</w:t>
+        <w:t>Importancia de variables</w:t>
       </w:r>
     </w:p>
     <w:p>
@@ -4733,43 +4786,43 @@
         <w:ind w:firstLine="0"/>
       </w:pPr>
       <w:r>
-        <w:t xml:space="preserve">La Figura 6 desglosa, por los cuatro modelos, las métricas derivadas de las Ecuaciones (12)–(16): precisión, sensibilidad, F1 y especificidad. Se observa el </w:t>
-      </w:r>
-      <w:r>
-        <w:rPr>
-          <w:b/>
-        </w:rPr>
-        <w:t>compromiso característico</w:t>
-      </w:r>
-      <w:r>
-        <w:t xml:space="preserve"> de los problemas desbalanceados: todos alcanzan una especificidad muy alta (≈0,99–1,00, pues predicen bien la ausencia de brote, la clase mayoritaria). La </w:t>
-      </w:r>
-      <w:r>
-        <w:rPr>
-          <w:b/>
-        </w:rPr>
-        <w:t>red neuronal</w:t>
-      </w:r>
-      <w:r>
-        <w:t xml:space="preserve"> ofrece la combinación más equilibrada entre sensibilidad y precisión, seguida del </w:t>
-      </w:r>
-      <w:r>
-        <w:rPr>
-          <w:b/>
-        </w:rPr>
-        <w:t>árbol podado</w:t>
-      </w:r>
-      <w:r>
-        <w:t xml:space="preserve">; el </w:t>
-      </w:r>
-      <w:r>
-        <w:rPr>
-          <w:b/>
-        </w:rPr>
-        <w:t>árbol sin poda</w:t>
-      </w:r>
-      <w:r>
-        <w:t xml:space="preserve"> se queda muy atrás en precisión (0,13), lo que arrastra su F1.</w:t>
+        <w:t xml:space="preserve">La Figura 6 reporta la importancia por permutación de la red neuronal (entrenada con todo el histórico). La </w:t>
+      </w:r>
+      <w:r>
+        <w:rPr>
+          <w:b/>
+        </w:rPr>
+        <w:t>media móvil de ocho semanas de casos</w:t>
+      </w:r>
+      <w:r>
+        <w:t xml:space="preserve"> es el predictor dominante (caída en AUC-PR de 0,25), seguida de cerca por el número de </w:t>
+      </w:r>
+      <w:r>
+        <w:rPr>
+          <w:b/>
+        </w:rPr>
+        <w:t>casos actuales</w:t>
+      </w:r>
+      <w:r>
+        <w:t xml:space="preserve"> (0,23) y la media móvil de cuatro semanas (0,20): la historia reciente de la transmisión es, como cabía esperar, el factor más informativo. De manera relevante para la hipótesis de enriquecimiento, la </w:t>
+      </w:r>
+      <w:r>
+        <w:rPr>
+          <w:b/>
+        </w:rPr>
+        <w:t>temperatura</w:t>
+      </w:r>
+      <w:r>
+        <w:t xml:space="preserve"> —con sus medias móviles de 4 y 8 semanas— es la variable ambiental más informativa, situándose entre las cinco primeras y por delante de la tasa poblacional y de la humedad, mientras que la </w:t>
+      </w:r>
+      <w:r>
+        <w:rPr>
+          <w:b/>
+        </w:rPr>
+        <w:t>precipitación</w:t>
+      </w:r>
+      <w:r>
+        <w:t xml:space="preserve"> resulta marginal. Esto indica que el clima contribuye a la predicción más allá de la mera autocorrelación de los casos, lo que respalda la integración multifuente para una enfermedad sensible a las condiciones ambientales del vector.</w:t>
       </w:r>
     </w:p>
     <w:p>
@@ -4780,7 +4833,7 @@
       <w:r>
         <w:drawing>
           <wp:inline xmlns:a="http://schemas.openxmlformats.org/drawingml/2006/main" xmlns:pic="http://schemas.openxmlformats.org/drawingml/2006/picture">
-            <wp:extent cx="4480560" cy="2499918"/>
+            <wp:extent cx="4114800" cy="2717980"/>
             <wp:docPr id="6" name="Picture 6"/>
             <wp:cNvGraphicFramePr>
               <a:graphicFrameLocks noChangeAspect="1"/>
@@ -4789,7 +4842,7 @@
               <a:graphicData uri="http://schemas.openxmlformats.org/drawingml/2006/picture">
                 <pic:pic>
                   <pic:nvPicPr>
-                    <pic:cNvPr id="0" name="fig_f1.png"/>
+                    <pic:cNvPr id="0" name="fig_importancia.png"/>
                     <pic:cNvPicPr/>
                   </pic:nvPicPr>
                   <pic:blipFill>
@@ -4801,7 +4854,7 @@
                   <pic:spPr>
                     <a:xfrm>
                       <a:off x="0" y="0"/>
-                      <a:ext cx="4480560" cy="2499918"/>
+                      <a:ext cx="4114800" cy="2717980"/>
                     </a:xfrm>
                     <a:prstGeom prst="rect"/>
                   </pic:spPr>
@@ -4823,7 +4876,7 @@
         <w:t>Figura 6.</w:t>
       </w:r>
       <w:r>
-        <w:t xml:space="preserve"> Precisión, sensibilidad, F1 y especificidad por modelo (validación temporal estricta). La especificidad es alta en todos; la red neuronal equilibra mejor sensibilidad y precisión. Fuente: elaboración propia con SATEC [22].</w:t>
+        <w:t xml:space="preserve"> Importancia por permutación de la red neuronal (caída en AUC-PR al permutar cada variable). La media móvil de casos domina; la temperatura es la variable ambiental que más aporta. Fuente: elaboración propia con SATEC [22].</w:t>
       </w:r>
     </w:p>
     <w:p>
@@ -4831,7 +4884,7 @@
         <w:pStyle w:val="Head2"/>
       </w:pPr>
       <w:r>
-        <w:t>Brecha de generalización</w:t>
+        <w:t>El sistema interactivo</w:t>
       </w:r>
     </w:p>
     <w:p>
@@ -4840,34 +4893,7 @@
         <w:ind w:firstLine="0"/>
       </w:pPr>
       <w:r>
-        <w:t xml:space="preserve">La Figura 7 contrasta la exactitud de entrenamiento y la de prueba. El </w:t>
-      </w:r>
-      <w:r>
-        <w:rPr>
-          <w:b/>
-        </w:rPr>
-        <w:t>árbol sin poda</w:t>
-      </w:r>
-      <w:r>
-        <w:t xml:space="preserve"> es el único modelo que memoriza el entrenamiento por encima de lo que generaliza (brecha positiva), con una exactitud de entrenamiento cercana a </w:t>
-      </w:r>
-      <w:r>
-        <w:rPr>
-          <w:b/>
-        </w:rPr>
-        <w:t>0,999</w:t>
-      </w:r>
-      <w:r>
-        <w:t xml:space="preserve">. Ahora bien, la señal más nítida de su sobreajuste no está en la exactitud —engañosa bajo fuerte desbalance, pues la clase mayoritaria la infla para todos los modelos— sino en su </w:t>
-      </w:r>
-      <w:r>
-        <w:rPr>
-          <w:b/>
-        </w:rPr>
-        <w:t>AUC-PR, que se desploma a 0,07</w:t>
-      </w:r>
-      <w:r>
-        <w:t xml:space="preserve"> (Tabla 1), muy por debajo de la red neuronal (0,71) y del propio árbol podado (0,63). Esto confirma sobre datos reales que una exactitud alta puede ocultar un modelo prácticamente inservible para detectar brotes, y justifica el uso de métricas centradas en la clase rara.</w:t>
+        <w:t>La Figura 7 muestra la aplicación web resultante: un mapa de riesgo de las provincias endémicas sobre un mapa base del Perú, donde cada provincia se colorea según su nivel de alerta (bajo, medio o alto) para la semana más reciente. Al seleccionar una provincia, el panel lateral muestra la probabilidad de brote estimada por la red neuronal, la decisión del árbol y los casos notificados, lo que permite a un usuario de salud pública comparar de un vistazo ambos paradigmas sobre una zona concreta. El sistema es de uso libre y su código y datos son reproducibles.</w:t>
       </w:r>
     </w:p>
     <w:p>
@@ -4878,7 +4904,7 @@
       <w:r>
         <w:drawing>
           <wp:inline xmlns:a="http://schemas.openxmlformats.org/drawingml/2006/main" xmlns:pic="http://schemas.openxmlformats.org/drawingml/2006/picture">
-            <wp:extent cx="4480560" cy="2437425"/>
+            <wp:extent cx="4114800" cy="2603297"/>
             <wp:docPr id="7" name="Picture 7"/>
             <wp:cNvGraphicFramePr>
               <a:graphicFrameLocks noChangeAspect="1"/>
@@ -4887,7 +4913,7 @@
               <a:graphicData uri="http://schemas.openxmlformats.org/drawingml/2006/picture">
                 <pic:pic>
                   <pic:nvPicPr>
-                    <pic:cNvPr id="0" name="fig_brecha.png"/>
+                    <pic:cNvPr id="0" name="cap_mapa_riesgo.png"/>
                     <pic:cNvPicPr/>
                   </pic:nvPicPr>
                   <pic:blipFill>
@@ -4899,7 +4925,7 @@
                   <pic:spPr>
                     <a:xfrm>
                       <a:off x="0" y="0"/>
-                      <a:ext cx="4480560" cy="2437425"/>
+                      <a:ext cx="4114800" cy="2603297"/>
                     </a:xfrm>
                     <a:prstGeom prst="rect"/>
                   </pic:spPr>
@@ -4921,15 +4947,15 @@
         <w:t>Figura 7.</w:t>
       </w:r>
       <w:r>
-        <w:t xml:space="preserve"> Brecha de generalización (exactitud de entrenamiento − prueba) por modelo. El árbol sin poda es el único con brecha positiva (memoriza más de lo que generaliza); su sobreajuste se aprecia con más claridad en el AUC-PR (Tabla 1). Fuente: elaboración propia con SATEC [22].</w:t>
-      </w:r>
-    </w:p>
-    <w:p>
-      <w:pPr>
-        <w:pStyle w:val="Head2"/>
-      </w:pPr>
-      <w:r>
-        <w:t>Calibración</w:t>
+        <w:t xml:space="preserve"> Interfaz de SATEC: mapa de riesgo provincial sobre el mapa base del Perú, con la franja de resumen del estado actual y el detalle de la provincia de Oyón (Lima) en nivel de alerta alto (probabilidad de brote estimada del 89 %), incluida la barra de probabilidad frente al umbral y la decisión del árbol. Captura de la aplicación desarrollada. Fuente: elaboración propia con SATEC [22].</w:t>
+      </w:r>
+    </w:p>
+    <w:p>
+      <w:pPr>
+        <w:pStyle w:val="Head1"/>
+      </w:pPr>
+      <w:r>
+        <w:t>Discusión</w:t>
       </w:r>
     </w:p>
     <w:p>
@@ -4938,283 +4964,7 @@
         <w:ind w:firstLine="0"/>
       </w:pPr>
       <w:r>
-        <w:t xml:space="preserve">La Figura 8 presenta las curvas de fiabilidad de la red neuronal y el árbol podado sobre las predicciones agrupadas del origen móvil (donde hay más positivos y la curva resulta más estable). Una curva próxima a la diagonal indica que las probabilidades predichas coinciden con las frecuencias observadas. Los </w:t>
-      </w:r>
-      <w:r>
-        <w:rPr>
-          <w:i/>
-        </w:rPr>
-        <w:t>Brier scores</w:t>
-      </w:r>
-      <w:r>
-        <w:t xml:space="preserve"> son bajos (≈0,02–0,03), favorecidos por la baja prevalencia de brotes. Ambos modelos tienden a </w:t>
-      </w:r>
-      <w:r>
-        <w:rPr>
-          <w:b/>
-        </w:rPr>
-        <w:t>sobreestimar</w:t>
-      </w:r>
-      <w:r>
-        <w:t xml:space="preserve"> la probabilidad en los deciles altos —donde los brotes son escasos y la estimación es más ruidosa—, efecto del entrenamiento con ponderación de clases; una </w:t>
-      </w:r>
-      <w:r>
-        <w:rPr>
-          <w:b/>
-        </w:rPr>
-        <w:t>calibración posterior</w:t>
-      </w:r>
-      <w:r>
-        <w:t xml:space="preserve"> (isotónica o de Platt) es una mejora directa para trabajo futuro.</w:t>
-      </w:r>
-    </w:p>
-    <w:p>
-      <w:pPr>
-        <w:pStyle w:val="Image"/>
-        <w:jc w:val="center"/>
-      </w:pPr>
-      <w:r>
-        <w:drawing>
-          <wp:inline xmlns:a="http://schemas.openxmlformats.org/drawingml/2006/main" xmlns:pic="http://schemas.openxmlformats.org/drawingml/2006/picture">
-            <wp:extent cx="3413239" cy="3383280"/>
-            <wp:docPr id="8" name="Picture 8"/>
-            <wp:cNvGraphicFramePr>
-              <a:graphicFrameLocks noChangeAspect="1"/>
-            </wp:cNvGraphicFramePr>
-            <a:graphic>
-              <a:graphicData uri="http://schemas.openxmlformats.org/drawingml/2006/picture">
-                <pic:pic>
-                  <pic:nvPicPr>
-                    <pic:cNvPr id="0" name="fig_calibracion.png"/>
-                    <pic:cNvPicPr/>
-                  </pic:nvPicPr>
-                  <pic:blipFill>
-                    <a:blip r:embed="rId37"/>
-                    <a:stretch>
-                      <a:fillRect/>
-                    </a:stretch>
-                  </pic:blipFill>
-                  <pic:spPr>
-                    <a:xfrm>
-                      <a:off x="0" y="0"/>
-                      <a:ext cx="3413239" cy="3383280"/>
-                    </a:xfrm>
-                    <a:prstGeom prst="rect"/>
-                  </pic:spPr>
-                </pic:pic>
-              </a:graphicData>
-            </a:graphic>
-          </wp:inline>
-        </w:drawing>
-      </w:r>
-    </w:p>
-    <w:p>
-      <w:pPr>
-        <w:pStyle w:val="FigureCaption"/>
-      </w:pPr>
-      <w:r>
-        <w:rPr>
-          <w:b/>
-        </w:rPr>
-        <w:t>Figura 8.</w:t>
-      </w:r>
-      <w:r>
-        <w:t xml:space="preserve"> Curvas de calibración de la red neuronal y el árbol podado frente a la calibración perfecta (diagonal). Fuente: elaboración propia con SATEC [22].</w:t>
-      </w:r>
-    </w:p>
-    <w:p>
-      <w:pPr>
-        <w:pStyle w:val="Head2"/>
-      </w:pPr>
-      <w:r>
-        <w:t>Importancia de variables</w:t>
-      </w:r>
-    </w:p>
-    <w:p>
-      <w:pPr>
-        <w:pStyle w:val="PostHeadPara"/>
-        <w:ind w:firstLine="0"/>
-      </w:pPr>
-      <w:r>
-        <w:t xml:space="preserve">La Figura 9 reporta la importancia por permutación de la red neuronal (entrenada con todo el histórico). La </w:t>
-      </w:r>
-      <w:r>
-        <w:rPr>
-          <w:b/>
-        </w:rPr>
-        <w:t>media móvil de ocho semanas de casos</w:t>
-      </w:r>
-      <w:r>
-        <w:t xml:space="preserve"> es el predictor dominante (caída en AUC-PR de 0,25), seguida de cerca por el número de </w:t>
-      </w:r>
-      <w:r>
-        <w:rPr>
-          <w:b/>
-        </w:rPr>
-        <w:t>casos actuales</w:t>
-      </w:r>
-      <w:r>
-        <w:t xml:space="preserve"> (0,23) y la media móvil de cuatro semanas (0,20): la historia reciente de la transmisión es, como cabía esperar, el factor más informativo. De manera relevante para la hipótesis de enriquecimiento, la </w:t>
-      </w:r>
-      <w:r>
-        <w:rPr>
-          <w:b/>
-        </w:rPr>
-        <w:t>temperatura</w:t>
-      </w:r>
-      <w:r>
-        <w:t xml:space="preserve"> —con sus medias móviles de 4 y 8 semanas— es la variable ambiental más informativa, situándose entre las cinco primeras y por delante de la tasa poblacional y de la humedad, mientras que la </w:t>
-      </w:r>
-      <w:r>
-        <w:rPr>
-          <w:b/>
-        </w:rPr>
-        <w:t>precipitación</w:t>
-      </w:r>
-      <w:r>
-        <w:t xml:space="preserve"> resulta marginal. Esto indica que el clima contribuye a la predicción más allá de la mera autocorrelación de los casos, lo que respalda la integración multifuente para una enfermedad sensible a las condiciones ambientales del vector.</w:t>
-      </w:r>
-    </w:p>
-    <w:p>
-      <w:pPr>
-        <w:pStyle w:val="Image"/>
-        <w:jc w:val="center"/>
-      </w:pPr>
-      <w:r>
-        <w:drawing>
-          <wp:inline xmlns:a="http://schemas.openxmlformats.org/drawingml/2006/main" xmlns:pic="http://schemas.openxmlformats.org/drawingml/2006/picture">
-            <wp:extent cx="4480560" cy="2959578"/>
-            <wp:docPr id="9" name="Picture 9"/>
-            <wp:cNvGraphicFramePr>
-              <a:graphicFrameLocks noChangeAspect="1"/>
-            </wp:cNvGraphicFramePr>
-            <a:graphic>
-              <a:graphicData uri="http://schemas.openxmlformats.org/drawingml/2006/picture">
-                <pic:pic>
-                  <pic:nvPicPr>
-                    <pic:cNvPr id="0" name="fig_importancia.png"/>
-                    <pic:cNvPicPr/>
-                  </pic:nvPicPr>
-                  <pic:blipFill>
-                    <a:blip r:embed="rId38"/>
-                    <a:stretch>
-                      <a:fillRect/>
-                    </a:stretch>
-                  </pic:blipFill>
-                  <pic:spPr>
-                    <a:xfrm>
-                      <a:off x="0" y="0"/>
-                      <a:ext cx="4480560" cy="2959578"/>
-                    </a:xfrm>
-                    <a:prstGeom prst="rect"/>
-                  </pic:spPr>
-                </pic:pic>
-              </a:graphicData>
-            </a:graphic>
-          </wp:inline>
-        </w:drawing>
-      </w:r>
-    </w:p>
-    <w:p>
-      <w:pPr>
-        <w:pStyle w:val="FigureCaption"/>
-      </w:pPr>
-      <w:r>
-        <w:rPr>
-          <w:b/>
-        </w:rPr>
-        <w:t>Figura 9.</w:t>
-      </w:r>
-      <w:r>
-        <w:t xml:space="preserve"> Importancia por permutación de la red neuronal (caída en AUC-PR al permutar cada variable). La media móvil de casos domina; la temperatura es la variable ambiental que más aporta. Fuente: elaboración propia con SATEC [22].</w:t>
-      </w:r>
-    </w:p>
-    <w:p>
-      <w:pPr>
-        <w:pStyle w:val="Head2"/>
-      </w:pPr>
-      <w:r>
-        <w:t>El sistema interactivo</w:t>
-      </w:r>
-    </w:p>
-    <w:p>
-      <w:pPr>
-        <w:pStyle w:val="PostHeadPara"/>
-        <w:ind w:firstLine="0"/>
-      </w:pPr>
-      <w:r>
-        <w:t>La Figura 10 muestra la aplicación web resultante: un mapa de riesgo de las provincias endémicas sobre un mapa base del Perú, donde cada provincia se colorea según su nivel de alerta (bajo, medio o alto) para la semana más reciente. Al seleccionar una provincia, el panel lateral muestra la probabilidad de brote estimada por la red neuronal, la decisión del árbol y los casos notificados, lo que permite a un usuario de salud pública comparar de un vistazo ambos paradigmas sobre una zona concreta. El sistema es de uso libre y su código y datos son reproducibles.</w:t>
-      </w:r>
-    </w:p>
-    <w:p>
-      <w:pPr>
-        <w:pStyle w:val="Image"/>
-        <w:jc w:val="center"/>
-      </w:pPr>
-      <w:r>
-        <w:drawing>
-          <wp:inline xmlns:a="http://schemas.openxmlformats.org/drawingml/2006/main" xmlns:pic="http://schemas.openxmlformats.org/drawingml/2006/picture">
-            <wp:extent cx="4480560" cy="2834701"/>
-            <wp:docPr id="10" name="Picture 10"/>
-            <wp:cNvGraphicFramePr>
-              <a:graphicFrameLocks noChangeAspect="1"/>
-            </wp:cNvGraphicFramePr>
-            <a:graphic>
-              <a:graphicData uri="http://schemas.openxmlformats.org/drawingml/2006/picture">
-                <pic:pic>
-                  <pic:nvPicPr>
-                    <pic:cNvPr id="0" name="cap_mapa_riesgo.png"/>
-                    <pic:cNvPicPr/>
-                  </pic:nvPicPr>
-                  <pic:blipFill>
-                    <a:blip r:embed="rId39"/>
-                    <a:stretch>
-                      <a:fillRect/>
-                    </a:stretch>
-                  </pic:blipFill>
-                  <pic:spPr>
-                    <a:xfrm>
-                      <a:off x="0" y="0"/>
-                      <a:ext cx="4480560" cy="2834701"/>
-                    </a:xfrm>
-                    <a:prstGeom prst="rect"/>
-                  </pic:spPr>
-                </pic:pic>
-              </a:graphicData>
-            </a:graphic>
-          </wp:inline>
-        </w:drawing>
-      </w:r>
-    </w:p>
-    <w:p>
-      <w:pPr>
-        <w:pStyle w:val="FigureCaption"/>
-      </w:pPr>
-      <w:r>
-        <w:rPr>
-          <w:b/>
-        </w:rPr>
-        <w:t>Figura 10.</w:t>
-      </w:r>
-      <w:r>
-        <w:t xml:space="preserve"> Interfaz de SATEC: mapa de riesgo provincial sobre el mapa base del Perú, con la franja de resumen del estado actual y el detalle de la provincia de Oyón (Lima) en nivel de alerta alto (probabilidad de brote estimada del 89 %), incluida la barra de probabilidad frente al umbral y la decisión del árbol. Captura de la aplicación desarrollada. Fuente: elaboración propia con SATEC [22].</w:t>
-      </w:r>
-    </w:p>
-    <w:p>
-      <w:pPr>
-        <w:pStyle w:val="Head1"/>
-      </w:pPr>
-      <w:r>
-        <w:t>Discusión</w:t>
-      </w:r>
-    </w:p>
-    <w:p>
-      <w:pPr>
-        <w:pStyle w:val="PostHeadPara"/>
-        <w:ind w:firstLine="0"/>
-      </w:pPr>
-      <w:r>
-        <w:t xml:space="preserve">Tres conclusiones emergen de los resultados. Primero, </w:t>
+        <w:t xml:space="preserve">Tres conclusiones emergen. Primero, </w:t>
       </w:r>
       <w:r>
         <w:rPr>
@@ -5223,7 +4973,16 @@
         <w:t>el aprendizaje automático aporta valor sobre la vigilancia clásica</w:t>
       </w:r>
       <w:r>
-        <w:t xml:space="preserve">: en la prueba 2020–2024 la red neuronal y el árbol podado superan al canal endémico en F1, AUC-PR y AUC-ROC, anticipando brotes que la regla clásica no captura; bajo la evaluación de origen móvil, más exigente, ese margen se estrecha hasta igualar al baseline, lo que sugiere que un sistema de alerta basado en datos puede complementar —sin reemplazar— la vigilancia rutinaria de la enfermedad de Carrión. Segundo, </w:t>
+        <w:t xml:space="preserve">: en la prueba 2020–2024 la red neuronal y el árbol podado superan al canal endémico en F1, AUC-PR y AUC-ROC; bajo origen móvil, más exigente, ese margen se estrecha hasta igualar al baseline, por lo que el sistema </w:t>
+      </w:r>
+      <w:r>
+        <w:rPr>
+          <w:b/>
+        </w:rPr>
+        <w:t>complementa, sin reemplazar</w:t>
+      </w:r>
+      <w:r>
+        <w:t xml:space="preserve">, la vigilancia rutinaria. Segundo, </w:t>
       </w:r>
       <w:r>
         <w:rPr>
@@ -5232,7 +4991,7 @@
         <w:t>la honestidad de la evaluación es decisiva</w:t>
       </w:r>
       <w:r>
-        <w:t xml:space="preserve">: el árbol sin poda alcanza una exactitud engañosamente alta en entrenamiento pero fracasa en datos nuevos (AUC-PR 0,09), y un único corte temporal reciente —que cae sobre el hueco de subnotificación pandémica— habría distorsionado las conclusiones; de ahí la necesidad de la validación de origen móvil y de métricas adecuadas a eventos raros (AUC-PR, sensibilidad, F1 en umbral óptimo) en lugar de la exactitud. Tercero, </w:t>
+        <w:t xml:space="preserve">: el árbol sin poda logra una exactitud engañosamente alta en entrenamiento pero fracasa en datos nuevos (AUC-PR 0,09), y un único corte temporal sobre el hueco de subnotificación pandémica habría distorsionado las conclusiones; de ahí la validación de origen móvil y las métricas para eventos raros (AUC-PR, sensibilidad, F1 en umbral óptimo) en lugar de la exactitud. Tercero, </w:t>
       </w:r>
       <w:r>
         <w:rPr>
@@ -5241,7 +5000,7 @@
         <w:t>el enriquecimiento es útil</w:t>
       </w:r>
       <w:r>
-        <w:t>: la temperatura, con sus medias móviles, aparece entre los predictores más importantes —por delante de varios términos autorregresivos de casos—, coherente con la biología de un vector sensible al clima.</w:t>
+        <w:t>: la temperatura figura entre los predictores más importantes, coherente con la biología de un vector sensible al clima.</w:t>
       </w:r>
     </w:p>
     <w:p>
@@ -5259,7 +5018,7 @@
         <w:t>red neuronal</w:t>
       </w:r>
       <w:r>
-        <w:t xml:space="preserve"> resultó preferible para este problema desbalanceado y ruidoso, por delante del árbol podado y muy por encima del árbol sin poda, que ilustra los riesgos del sobreajuste. La diferencia entre ambos árboles —idéntico algoritmo, solo cambia la profundidad— evidencia que en datos tabulares y desbalanceados la </w:t>
+        <w:t xml:space="preserve"> resultó preferible para este problema desbalanceado y ruidoso, por delante del árbol podado y muy por encima del sin poda. Que ambos árboles —idéntico algoritmo, solo cambia la profundidad— difieran tanto evidencia que en datos tabulares la </w:t>
       </w:r>
       <w:r>
         <w:rPr>
@@ -5268,7 +5027,7 @@
         <w:t>regularización</w:t>
       </w:r>
       <w:r>
-        <w:t xml:space="preserve"> (aquí, la poda) puede pesar tanto como la familia del modelo, en línea con la literatura sobre datos tabulares [7], [8]. La elección, sin embargo, no debería guiarse solo por el desempeño: el árbol ofrece </w:t>
+        <w:t xml:space="preserve"> (la poda) puede pesar tanto como la familia del modelo [7], [8]. La elección no debería guiarse solo por el desempeño: el árbol ofrece </w:t>
       </w:r>
       <w:r>
         <w:rPr>
@@ -5277,7 +5036,7 @@
         <w:t>reglas legibles</w:t>
       </w:r>
       <w:r>
-        <w:t xml:space="preserve"> (Figura 1), valiosas para comunicar a los tomadores de decisión por qué una provincia entra en alerta, mientras que la red opera como una caja más opaca cuya interpretación requiere métodos adicionales como la importancia por permutación.</w:t>
+        <w:t xml:space="preserve"> (Figura 1), valiosas para los tomadores de decisión, mientras que la red es una caja más opaca que requiere métodos como la importancia por permutación.</w:t>
       </w:r>
     </w:p>
     <w:p>
@@ -5292,7 +5051,7 @@
         <w:t>Comparación con la literatura.</w:t>
       </w:r>
       <w:r>
-        <w:t xml:space="preserve"> Al no existir antecedentes de aprendizaje automático para la alerta de brotes de la enfermedad de Carrión, la comparación se establece con trabajos afines en enfermedades vectoriales (Tabla 2). Vadmal et al. [14] predicen la idoneidad de especies de flebótomos como vectores de </w:t>
+        <w:t xml:space="preserve"> Al no existir antecedentes de aprendizaje automático para la alerta de brotes de Carrión, la comparación se establece con trabajos afines en enfermedades vectoriales (Tabla 2). Vadmal et al. [14] predicen la idoneidad de flebótomos como vectores de </w:t>
       </w:r>
       <w:r>
         <w:rPr>
@@ -5301,16 +5060,7 @@
         <w:t>Leishmania</w:t>
       </w:r>
       <w:r>
-        <w:t xml:space="preserve"> mediante árboles potenciados, con una exactitud fuera de muestra cercana al 86 %; y la literatura reciente de predicción y alerta en arbovirosis (en particular dengue) sitúa el AUC-ROC de los modelos basados en árboles en un rango aproximado de 0,82–0,99 [28]. La red neuronal de SATEC, con un </w:t>
-      </w:r>
-      <w:r>
-        <w:rPr>
-          <w:b/>
-        </w:rPr>
-        <w:t>AUC-ROC de 0,96</w:t>
-      </w:r>
-      <w:r>
-        <w:t xml:space="preserve"> en la prueba 2020–2024 (0,91 en la evaluación de origen móvil), se ubica en el extremo alto de ese rango pese a abordar un problema más difícil: la predicción de un </w:t>
+        <w:t xml:space="preserve"> con árboles potenciados (exactitud ≈ 86 %), y la literatura de arbovirosis sitúa el AUC-ROC de modelos basados en árboles en 0,82–0,99 [28]. La red neuronal de SATEC (AUC-ROC 0,96 en 2020–2024; 0,91 en origen móvil) se ubica en el extremo alto de ese rango, pese a abordar un problema más difícil —un </w:t>
       </w:r>
       <w:r>
         <w:rPr>
@@ -5319,7 +5069,7 @@
         <w:t>evento raro</w:t>
       </w:r>
       <w:r>
-        <w:t xml:space="preserve"> con cuatro semanas de anticipación, para el cual además reportamos el </w:t>
+        <w:t xml:space="preserve"> a cuatro semanas—, para el que además reportamos el </w:t>
       </w:r>
       <w:r>
         <w:rPr>
@@ -5337,7 +5087,7 @@
         <w:t>AUC-PR (0,71)</w:t>
       </w:r>
       <w:r>
-        <w:t xml:space="preserve"> —métricas que la propia literatura recomienda para clases desbalanceadas pero que muchos trabajos omiten al informar solo exactitud o AUC-ROC—. La comparación es, por tanto, </w:t>
+        <w:t xml:space="preserve">, métricas que muchos trabajos omiten. La comparación es </w:t>
       </w:r>
       <w:r>
         <w:rPr>
@@ -5346,7 +5096,7 @@
         <w:t>orientativa</w:t>
       </w:r>
       <w:r>
-        <w:t>: las tareas (idoneidad de vector, presencia de dengue) y las prevalencias difieren de la alerta de brotes raros, lo que desaconseja una lectura literal de las cifras absolutas. Cabe notar que Rufasto-Goche et al. [16] emplean la misma fuente del MINSA para el dengue, pero con un enfoque descriptivo (sin métricas de clasificación), lo que subraya la novedad de un planteamiento predictivo y evaluado de forma temporalmente honesta.</w:t>
+        <w:t>: las tareas y prevalencias difieren, lo que desaconseja una lectura literal de las cifras. Rufasto-Goche et al. [16] usan la misma fuente del MINSA para el dengue, pero de forma descriptiva, lo que subraya la novedad de un planteamiento predictivo y temporalmente honesto.</w:t>
       </w:r>
     </w:p>
     <w:p>
@@ -5767,7 +5517,7 @@
         <w:ind w:firstLine="0"/>
       </w:pPr>
       <w:r>
-        <w:t xml:space="preserve">Conviene declarar las limitaciones con franqueza. Los datos provienen de </w:t>
+        <w:t xml:space="preserve">Conviene declarar las limitaciones. Los datos provienen de </w:t>
       </w:r>
       <w:r>
         <w:rPr>
@@ -5776,16 +5526,16 @@
         <w:t>vigilancia pasiva</w:t>
       </w:r>
       <w:r>
-        <w:t xml:space="preserve">, sujeta a subnotificación y a posibles cambios en la definición de caso a lo largo de 25 años. La población se tomó del </w:t>
-      </w:r>
-      <w:r>
-        <w:rPr>
-          <w:b/>
-        </w:rPr>
-        <w:t>censo 2017 como referencia constante</w:t>
-      </w:r>
-      <w:r>
-        <w:t xml:space="preserve">, sin capturar la dinámica interanual. Las variables climáticas se asignaron por </w:t>
+        <w:t xml:space="preserve">, sujeta a subnotificación y a cambios en la definición de caso a lo largo de 25 años; la población se tomó del </w:t>
+      </w:r>
+      <w:r>
+        <w:rPr>
+          <w:b/>
+        </w:rPr>
+        <w:t>censo 2017</w:t>
+      </w:r>
+      <w:r>
+        <w:t xml:space="preserve"> como referencia constante, y el clima se asignó por </w:t>
       </w:r>
       <w:r>
         <w:rPr>
@@ -5794,25 +5544,25 @@
         <w:t>centroide provincial</w:t>
       </w:r>
       <w:r>
-        <w:t xml:space="preserve">, sin resolver microclimas dentro de provincias extensas. El sistema </w:t>
-      </w:r>
-      <w:r>
-        <w:rPr>
-          <w:b/>
-        </w:rPr>
-        <w:t>no realiza diagnóstico clínico individual</w:t>
-      </w:r>
-      <w:r>
-        <w:t xml:space="preserve">: es una herramienta de apoyo a la vigilancia y no sustituye la confirmación de laboratorio. La </w:t>
-      </w:r>
-      <w:r>
-        <w:rPr>
-          <w:b/>
-        </w:rPr>
-        <w:t>subnotificación durante la pandemia de COVID-19</w:t>
-      </w:r>
-      <w:r>
-        <w:t xml:space="preserve"> deprimió de forma marcada los casos registrados en 2020–2023 (en 2021, ninguna provincia supera su canal), lo que reduce los brotes evaluables en ese periodo y obliga a interpretar con cautela las métricas de esos años; la validación de origen móvil mitiga, pero no elimina, este sesgo. Por último, las probabilidades de los modelos podrían beneficiarse de una </w:t>
+        <w:t xml:space="preserve">, sin resolver microclimas. El sistema </w:t>
+      </w:r>
+      <w:r>
+        <w:rPr>
+          <w:b/>
+        </w:rPr>
+        <w:t>no diagnostica individuos</w:t>
+      </w:r>
+      <w:r>
+        <w:t xml:space="preserve">: apoya la vigilancia, no sustituye la confirmación de laboratorio. La </w:t>
+      </w:r>
+      <w:r>
+        <w:rPr>
+          <w:b/>
+        </w:rPr>
+        <w:t>subnotificación por COVID-19</w:t>
+      </w:r>
+      <w:r>
+        <w:t xml:space="preserve"> deprimió los casos de 2020–2023 (en 2021 ninguna provincia supera su canal), lo que reduce los brotes evaluables y obliga a interpretar con cautela esos años; la validación de origen móvil mitiga, pero no elimina, este sesgo. Por último, las probabilidades podrían beneficiarse de una </w:t>
       </w:r>
       <w:r>
         <w:rPr>
@@ -5821,7 +5571,7 @@
         <w:t>calibración posterior</w:t>
       </w:r>
       <w:r>
-        <w:t xml:space="preserve"> (p. ej. isotónica) y, en la red, de regularización adicional como el </w:t>
+        <w:t xml:space="preserve"> (isotónica) y la red de regularización adicional como el </w:t>
       </w:r>
       <w:r>
         <w:rPr>
@@ -5847,7 +5597,7 @@
         <w:ind w:firstLine="0"/>
       </w:pPr>
       <w:r>
-        <w:t xml:space="preserve">La enfermedad de Carrión sigue siendo una amenaza desatendida para las poblaciones rurales de los valles interandinos del Perú, donde su fase aguda puede ser letal si no se trata a tiempo. Este trabajo presentó </w:t>
+        <w:t xml:space="preserve">La enfermedad de Carrión sigue siendo una amenaza desatendida para las poblaciones rurales de los valles interandinos del Perú, donde su fase aguda puede ser letal. Este trabajo presentó </w:t>
       </w:r>
       <w:r>
         <w:rPr>
@@ -5856,7 +5606,7 @@
         <w:t>SATEC</w:t>
       </w:r>
       <w:r>
-        <w:t xml:space="preserve">, el primer sistema de alerta temprana de brotes de la enfermedad de Carrión basado en aprendizaje automático, construido íntegramente sobre datos reales de vigilancia del MINSA enriquecidos con clima y población, y validado de forma temporalmente honesta. Para la enfermedad de Carrión en concreto, los hallazgos indican que: (i) es posible </w:t>
+        <w:t xml:space="preserve">, el primer sistema de alerta temprana de brotes de la enfermedad basado en aprendizaje automático, construido sobre datos reales de vigilancia del MINSA enriquecidos con clima y población, y validado de forma temporalmente honesta. Los hallazgos indican que: (i) es posible </w:t>
       </w:r>
       <w:r>
         <w:rPr>
@@ -5865,7 +5615,7 @@
         <w:t>anticipar con cuatro semanas la entrada de una provincia en zona de epidemia</w:t>
       </w:r>
       <w:r>
-        <w:t xml:space="preserve"> del canal endémico, con el mejor equilibrio logrado por la </w:t>
+        <w:t xml:space="preserve">, con el mejor equilibrio logrado por la </w:t>
       </w:r>
       <w:r>
         <w:rPr>
@@ -5874,7 +5624,7 @@
         <w:t>red neuronal</w:t>
       </w:r>
       <w:r>
-        <w:t xml:space="preserve"> (F1 0,70; AUC-ROC 0,96) en la prueba 2020–2024, lo que abre la puerta a focalizar la vigilancia y los recursos en las zonas y semanas de mayor riesgo; (ii) la </w:t>
+        <w:t xml:space="preserve"> (F1 0,70; AUC-ROC 0,96), lo que permite focalizar la vigilancia en las zonas y semanas de mayor riesgo; (ii) la </w:t>
       </w:r>
       <w:r>
         <w:rPr>
@@ -5883,7 +5633,7 @@
         <w:t>dinámica reciente de casos</w:t>
       </w:r>
       <w:r>
-        <w:t xml:space="preserve">, junto con la </w:t>
+        <w:t xml:space="preserve"> y la </w:t>
       </w:r>
       <w:r>
         <w:rPr>
@@ -5892,7 +5642,7 @@
         <w:t>temperatura</w:t>
       </w:r>
       <w:r>
-        <w:t xml:space="preserve">, son los factores más asociados al riesgo de brote, en consonancia con la ecología del vector </w:t>
+        <w:t xml:space="preserve"> son los factores más asociados al riesgo, en consonancia con la ecología del vector </w:t>
       </w:r>
       <w:r>
         <w:rPr>
@@ -5901,16 +5651,16 @@
         <w:t>Lutzomyia</w:t>
       </w:r>
       <w:r>
-        <w:t xml:space="preserve">; y (iii) un modelo de aprendizaje automático puede </w:t>
-      </w:r>
-      <w:r>
-        <w:rPr>
-          <w:b/>
-        </w:rPr>
-        <w:t>superar al canal endémico clásico</w:t>
-      </w:r>
-      <w:r>
-        <w:t xml:space="preserve"> que hoy guía la vigilancia, sin reemplazarlo, sino complementándolo con una capa predictiva. El sistema resultante es reproducible, verificable y desplegable sin servidor, lo que lo hace viable como instrumento de apoyo para las Direcciones Regionales de Salud de las zonas endémicas. Como trabajo futuro se plantea la calibración posterior de las probabilidades, la incorporación de variables entomológicas, el descenso a granularidad distrital y la validación prospectiva en campo, así como la articulación con los esfuerzos de diagnóstico serológico y de modelado del vector que hoy concentran la investigación computacional sobre la enfermedad de Carrión.</w:t>
+        <w:t xml:space="preserve">; y (iii) el aprendizaje automático puede </w:t>
+      </w:r>
+      <w:r>
+        <w:rPr>
+          <w:b/>
+        </w:rPr>
+        <w:t>complementar al canal endémico clásico</w:t>
+      </w:r>
+      <w:r>
+        <w:t>, sin reemplazarlo, con una capa predictiva. El sistema es reproducible y desplegable sin servidor, viable como instrumento de apoyo para las Direcciones Regionales de Salud. Como trabajo futuro se plantea la calibración posterior, la incorporación de variables entomológicas, el descenso a granularidad distrital y la validación prospectiva en campo.</w:t>
       </w:r>
     </w:p>
     <w:p>

</xml_diff>